<commit_message>
grb fixed and documentation 40%
</commit_message>
<xml_diff>
--- a/docs/Maturski rad - urnek (1).docx
+++ b/docs/Maturski rad - urnek (1).docx
@@ -151,7 +151,7 @@
           </mc:Choice>
           <mc:Fallback>
             <w:pict>
-              <v:rect w14:anchorId="3580E71A" id="Rectangle 26" o:spid="_x0000_s1026" style="position:absolute;margin-left:-27pt;margin-top:-73.05pt;width:423pt;height:81pt;z-index:251660288;visibility:visible;mso-wrap-style:square;mso-width-percent:0;mso-height-percent:0;mso-wrap-distance-left:9pt;mso-wrap-distance-top:0;mso-wrap-distance-right:9pt;mso-wrap-distance-bottom:0;mso-position-horizontal:absolute;mso-position-horizontal-relative:text;mso-position-vertical:absolute;mso-position-vertical-relative:text;mso-width-percent:0;mso-height-percent:0;mso-width-relative:page;mso-height-relative:page;v-text-anchor:top" o:gfxdata="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" strokecolor="white"/>
+              <v:rect w14:anchorId="085E7E5D" id="Rectangle 26" o:spid="_x0000_s1026" style="position:absolute;margin-left:-27pt;margin-top:-73.05pt;width:423pt;height:81pt;z-index:251660288;visibility:visible;mso-wrap-style:square;mso-width-percent:0;mso-height-percent:0;mso-wrap-distance-left:9pt;mso-wrap-distance-top:0;mso-wrap-distance-right:9pt;mso-wrap-distance-bottom:0;mso-position-horizontal:absolute;mso-position-horizontal-relative:text;mso-position-vertical:absolute;mso-position-vertical-relative:text;mso-width-percent:0;mso-height-percent:0;mso-width-relative:page;mso-height-relative:page;v-text-anchor:top" o:gfxdata="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" strokecolor="white"/>
             </w:pict>
           </mc:Fallback>
         </mc:AlternateContent>
@@ -578,13 +578,7 @@
         <w:rPr>
           <w:lang w:val="hr-HR"/>
         </w:rPr>
-        <w:t xml:space="preserve">Zulfić Edin, dipl. ing. el.teh.                    </w:t>
-      </w:r>
-      <w:r>
-        <w:rPr>
-          <w:lang w:val="hr-HR"/>
-        </w:rPr>
-        <w:t xml:space="preserve">                              </w:t>
+        <w:t xml:space="preserve">Zulfić Edin, dipl. ing. el.teh.                                                  </w:t>
       </w:r>
       <w:r>
         <w:rPr>
@@ -635,11 +629,6 @@
           <w:lang w:val="hr-HR"/>
         </w:rPr>
         <w:tab/>
-      </w:r>
-      <w:r>
-        <w:rPr>
-          <w:lang w:val="hr-HR"/>
-        </w:rPr>
         <w:t>Lamija Mujkić</w:t>
       </w:r>
     </w:p>
@@ -740,7 +729,7 @@
           </mc:Choice>
           <mc:Fallback>
             <w:pict>
-              <v:rect w14:anchorId="6CBAA93C" id="Rectangle 25" o:spid="_x0000_s1026" style="position:absolute;margin-left:12pt;margin-top:483.1pt;width:423pt;height:81pt;z-index:251661312;visibility:visible;mso-wrap-style:square;mso-width-percent:0;mso-height-percent:0;mso-wrap-distance-left:9pt;mso-wrap-distance-top:0;mso-wrap-distance-right:9pt;mso-wrap-distance-bottom:0;mso-position-horizontal:absolute;mso-position-horizontal-relative:text;mso-position-vertical:absolute;mso-position-vertical-relative:text;mso-width-percent:0;mso-height-percent:0;mso-width-relative:page;mso-height-relative:page;v-text-anchor:top" o:gfxdata="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" strokecolor="white"/>
+              <v:rect w14:anchorId="686D20C5" id="Rectangle 25" o:spid="_x0000_s1026" style="position:absolute;margin-left:12pt;margin-top:483.1pt;width:423pt;height:81pt;z-index:251661312;visibility:visible;mso-wrap-style:square;mso-width-percent:0;mso-height-percent:0;mso-wrap-distance-left:9pt;mso-wrap-distance-top:0;mso-wrap-distance-right:9pt;mso-wrap-distance-bottom:0;mso-position-horizontal:absolute;mso-position-horizontal-relative:text;mso-position-vertical:absolute;mso-position-vertical-relative:text;mso-width-percent:0;mso-height-percent:0;mso-width-relative:page;mso-height-relative:page;v-text-anchor:top" o:gfxdata="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" strokecolor="white"/>
             </w:pict>
           </mc:Fallback>
         </mc:AlternateContent>
@@ -761,6 +750,12 @@
     <w:bookmarkStart w:id="0" w:name="_Toc247374824" w:displacedByCustomXml="next"/>
     <w:sdt>
       <w:sdtPr>
+        <w:rPr>
+          <w:rFonts w:ascii="Times New Roman" w:eastAsia="Times New Roman" w:hAnsi="Times New Roman" w:cs="Times New Roman"/>
+          <w:color w:val="auto"/>
+          <w:sz w:val="24"/>
+          <w:szCs w:val="24"/>
+        </w:rPr>
         <w:id w:val="304437119"/>
         <w:docPartObj>
           <w:docPartGallery w:val="Table of Contents"/>
@@ -769,13 +764,9 @@
       </w:sdtPr>
       <w:sdtEndPr>
         <w:rPr>
-          <w:rFonts w:ascii="Times New Roman" w:eastAsia="Times New Roman" w:hAnsi="Times New Roman" w:cs="Times New Roman"/>
           <w:b/>
           <w:bCs/>
           <w:noProof/>
-          <w:color w:val="auto"/>
-          <w:sz w:val="24"/>
-          <w:szCs w:val="24"/>
         </w:rPr>
       </w:sdtEndPr>
       <w:sdtContent>
@@ -783,11 +774,9 @@
           <w:pPr>
             <w:pStyle w:val="TOCHeading"/>
           </w:pPr>
-          <w:proofErr w:type="spellStart"/>
           <w:r>
             <w:t>Sadržaj</w:t>
           </w:r>
-          <w:proofErr w:type="spellEnd"/>
         </w:p>
         <w:p/>
         <w:p>
@@ -1483,8 +1472,6 @@
           <w:lang w:val="hr-HR"/>
         </w:rPr>
       </w:pPr>
-      <w:bookmarkStart w:id="1" w:name="_GoBack"/>
-      <w:bookmarkEnd w:id="1"/>
     </w:p>
     <w:p>
       <w:pPr>
@@ -1504,72 +1491,103 @@
         </w:rPr>
         <w:br w:type="page"/>
       </w:r>
-      <w:bookmarkStart w:id="2" w:name="_Toc223797189"/>
+      <w:bookmarkStart w:id="1" w:name="_Toc223797189"/>
       <w:r>
         <w:lastRenderedPageBreak/>
         <w:t>1.</w:t>
       </w:r>
       <w:r>
-        <w:t xml:space="preserve"> </w:t>
-      </w:r>
-      <w:proofErr w:type="spellStart"/>
-      <w:r>
-        <w:t>Uvo</w:t>
+        <w:t xml:space="preserve"> Uvo</w:t>
       </w:r>
       <w:bookmarkEnd w:id="0"/>
       <w:r>
         <w:t>d</w:t>
       </w:r>
-      <w:bookmarkEnd w:id="2"/>
-      <w:proofErr w:type="spellEnd"/>
+      <w:bookmarkEnd w:id="1"/>
     </w:p>
     <w:p>
       <w:pPr>
         <w:jc w:val="both"/>
-      </w:pPr>
-      <w:r>
+        <w:rPr>
+          <w:lang w:val="hr-HR"/>
+        </w:rPr>
+      </w:pPr>
+      <w:r>
+        <w:rPr>
+          <w:lang w:val="hr-HR"/>
+        </w:rPr>
         <w:t>School Bell System predstavlja inovativno rješenje za upravljanje školskim zvonom zasnovano na modernim tehnologijama i mikrokontrolerima. Sistem je razvijen koristeći ESP32 mikrokontroler, koji omogućava bežičnu kontrolu i integraciju sa LED matricom, čime se učenicima i osoblju škole pružaju vizuelne obavijesti i informacije u realnom vremenu. Primarna svrha ovog sistema je automatizacija školskog zvona i olakšavanje upravljanja rasporedom zvona i dodatnim obavještenjima, što značajno smanjuje potrebu za manuelnom kontrolom i povećava efikasnost školskog okruženja.</w:t>
       </w:r>
     </w:p>
     <w:p>
       <w:pPr>
         <w:jc w:val="both"/>
+        <w:rPr>
+          <w:lang w:val="hr-HR"/>
+        </w:rPr>
       </w:pPr>
     </w:p>
     <w:p>
       <w:pPr>
         <w:jc w:val="both"/>
-      </w:pPr>
-      <w:r>
+        <w:rPr>
+          <w:lang w:val="hr-HR"/>
+        </w:rPr>
+      </w:pPr>
+      <w:r>
+        <w:rPr>
+          <w:lang w:val="hr-HR"/>
+        </w:rPr>
         <w:t>Centralni dio sistema čini ESP32 mikrokontroler, koji upravlja relejnim modulom za aktiviranje školskog zvona, čita i prikazuje poruke na LED matrici te pohranjuje sve rasporede u internu memoriju. Zahvaljujući integriranoj WiFi i Bluetooth funkcionalnosti, ESP32 omogućava komunikaciju sa Windows desktop aplikacijom, koja služi kao korisnički interfejs za kreiranje rasporeda, slanje poruka i testiranje zvona. Ovakva arhitektura omogućava da sistem radi u realnom vremenu, a podaci ostaju sačuvani čak i u slučaju nestanka struje, čime se povećava pouzdanost i stabilnost sistema.</w:t>
       </w:r>
     </w:p>
     <w:p>
       <w:pPr>
         <w:jc w:val="both"/>
+        <w:rPr>
+          <w:lang w:val="hr-HR"/>
+        </w:rPr>
       </w:pPr>
     </w:p>
     <w:p>
       <w:pPr>
         <w:jc w:val="both"/>
-      </w:pPr>
-      <w:r>
+        <w:rPr>
+          <w:lang w:val="hr-HR"/>
+        </w:rPr>
+      </w:pPr>
+      <w:r>
+        <w:rPr>
+          <w:lang w:val="hr-HR"/>
+        </w:rPr>
         <w:t>Kako bi se prevazišla ograničenja desktop aplikacije, razvijen je i web interfejs sa sedam stranica – index, obavještenja, raspored, dežurstvo, testiranje zvona, postavke, profil i sistem. Web aplikacija koristi zajedničke CSS i JavaScript fajlove, a komunikacija sa ESP32 uređajem odvija se preko JSON protokola i WiFi mreže. Ovaj pristup omogućava bežični pristup sistemu sa bilo kojeg uređaja u mreži, čime se eliminira potreba za kablovskom vezom i manuelnom interakcijom, te se značajno olakšava upravljanje rasporedima i vizuelnim obavještenjima.</w:t>
       </w:r>
     </w:p>
     <w:p>
       <w:pPr>
         <w:jc w:val="both"/>
+        <w:rPr>
+          <w:lang w:val="hr-HR"/>
+        </w:rPr>
       </w:pPr>
     </w:p>
     <w:p>
       <w:pPr>
         <w:jc w:val="both"/>
-      </w:pPr>
-      <w:r>
+        <w:rPr>
+          <w:lang w:val="hr-HR"/>
+        </w:rPr>
+      </w:pPr>
+      <w:r>
+        <w:rPr>
+          <w:lang w:val="hr-HR"/>
+        </w:rPr>
         <w:t>Kombinacija ESP32 mikrokontrolera, relejnog modula, LED matrice i web aplikacije stvara kompletan i fleksibilan sistem koji može pratiti i prilagođavati se školskom rasporedu, pružajući korisnicima intuitivno i pouzdano iskustvo. Kroz ovaj projekat demonstrirana je primjena modernih tehnologija u svakodnevnim školskim procesima, kao i mogućnost integracije bežične komunikacije i vizuelnih prikaza u automatizovane sisteme za upravljanje informacijama.</w:t>
       </w:r>
       <w:r>
+        <w:rPr>
+          <w:lang w:val="hr-HR"/>
+        </w:rPr>
         <w:br w:type="page"/>
       </w:r>
     </w:p>
@@ -1577,17 +1595,17 @@
       <w:pPr>
         <w:pStyle w:val="Heading1"/>
       </w:pPr>
-      <w:bookmarkStart w:id="3" w:name="_Toc247374825"/>
-      <w:bookmarkStart w:id="4" w:name="_Toc223797190"/>
+      <w:bookmarkStart w:id="2" w:name="_Toc247374825"/>
+      <w:bookmarkStart w:id="3" w:name="_Toc223797190"/>
       <w:r>
         <w:lastRenderedPageBreak/>
         <w:t xml:space="preserve">2. </w:t>
       </w:r>
+      <w:bookmarkEnd w:id="2"/>
+      <w:r>
+        <w:t>Korištene komponente i tehnička osnova</w:t>
+      </w:r>
       <w:bookmarkEnd w:id="3"/>
-      <w:r>
-        <w:t>Korištene komponente i tehnička osnova</w:t>
-      </w:r>
-      <w:bookmarkEnd w:id="4"/>
     </w:p>
     <w:p>
       <w:pPr>
@@ -1859,7 +1877,8 @@
             </w:pPr>
             <w:r>
               <w:rPr>
-                <w:lang w:val="hr-HR" w:eastAsia="bs-Latn-BA"/>
+                <w:noProof/>
+                <w:lang w:val="en-GB" w:eastAsia="en-GB"/>
               </w:rPr>
               <w:drawing>
                 <wp:inline distT="0" distB="0" distL="0" distR="0" wp14:anchorId="25FA5997" wp14:editId="104BBEB0">
@@ -1974,7 +1993,8 @@
             </w:pPr>
             <w:r>
               <w:rPr>
-                <w:lang w:val="hr-HR" w:eastAsia="bs-Latn-BA"/>
+                <w:noProof/>
+                <w:lang w:val="en-GB" w:eastAsia="en-GB"/>
               </w:rPr>
               <w:drawing>
                 <wp:inline distT="0" distB="0" distL="0" distR="0" wp14:anchorId="44DF2EB1" wp14:editId="410F2474">
@@ -2043,15 +2063,7 @@
                 <w:szCs w:val="22"/>
                 <w:lang w:val="hr-HR" w:eastAsia="bs-Latn-BA"/>
               </w:rPr>
-              <w:t>Napojna jedinica (5V, 5A, 25W)</w:t>
-            </w:r>
-            <w:r>
-              <w:rPr>
-                <w:sz w:val="22"/>
-                <w:szCs w:val="22"/>
-                <w:lang w:val="hr-HR" w:eastAsia="bs-Latn-BA"/>
-              </w:rPr>
-              <w:t xml:space="preserve"> služi za napajanje slova na ploči i daje dovoljan napon matrici.</w:t>
+              <w:t>Napojna jedinica (5V, 5A, 25W) služi za napajanje slova na ploči i daje dovoljan napon matrici.</w:t>
             </w:r>
           </w:p>
         </w:tc>
@@ -2208,10 +2220,51 @@
           </w:tcPr>
           <w:p>
             <w:pPr>
+              <w:jc w:val="center"/>
               <w:rPr>
                 <w:lang w:val="hr-HR" w:eastAsia="bs-Latn-BA"/>
               </w:rPr>
             </w:pPr>
+            <w:r>
+              <w:rPr>
+                <w:lang w:val="hr-HR" w:eastAsia="bs-Latn-BA"/>
+              </w:rPr>
+              <w:drawing>
+                <wp:inline distT="0" distB="0" distL="0" distR="0" wp14:anchorId="72CC37B5" wp14:editId="7CEFC992">
+                  <wp:extent cx="1135073" cy="998220"/>
+                  <wp:effectExtent l="0" t="0" r="8255" b="0"/>
+                  <wp:docPr id="2" name="Picture 2"/>
+                  <wp:cNvGraphicFramePr>
+                    <a:graphicFrameLocks xmlns:a="http://schemas.openxmlformats.org/drawingml/2006/main" noChangeAspect="1"/>
+                  </wp:cNvGraphicFramePr>
+                  <a:graphic xmlns:a="http://schemas.openxmlformats.org/drawingml/2006/main">
+                    <a:graphicData uri="http://schemas.openxmlformats.org/drawingml/2006/picture">
+                      <pic:pic xmlns:pic="http://schemas.openxmlformats.org/drawingml/2006/picture">
+                        <pic:nvPicPr>
+                          <pic:cNvPr id="1" name=""/>
+                          <pic:cNvPicPr/>
+                        </pic:nvPicPr>
+                        <pic:blipFill>
+                          <a:blip r:embed="rId13"/>
+                          <a:stretch>
+                            <a:fillRect/>
+                          </a:stretch>
+                        </pic:blipFill>
+                        <pic:spPr>
+                          <a:xfrm>
+                            <a:off x="0" y="0"/>
+                            <a:ext cx="1148135" cy="1009707"/>
+                          </a:xfrm>
+                          <a:prstGeom prst="rect">
+                            <a:avLst/>
+                          </a:prstGeom>
+                        </pic:spPr>
+                      </pic:pic>
+                    </a:graphicData>
+                  </a:graphic>
+                </wp:inline>
+              </w:drawing>
+            </w:r>
           </w:p>
         </w:tc>
         <w:tc>
@@ -2226,6 +2279,14 @@
                 <w:lang w:val="hr-HR" w:eastAsia="bs-Latn-BA"/>
               </w:rPr>
             </w:pPr>
+            <w:r>
+              <w:rPr>
+                <w:sz w:val="22"/>
+                <w:szCs w:val="22"/>
+                <w:lang w:val="hr-HR"/>
+              </w:rPr>
+              <w:t>Relej modul omogućava ESP32 mikrokontroleru da upravlja fizičkim školskim zvonom uključivanjem i isključivanjem strujnog kola.</w:t>
+            </w:r>
           </w:p>
         </w:tc>
       </w:tr>
@@ -2251,17 +2312,17 @@
       <w:r>
         <w:br w:type="page"/>
       </w:r>
-      <w:bookmarkStart w:id="5" w:name="_Toc247374826"/>
-      <w:bookmarkStart w:id="6" w:name="_Toc223797191"/>
+      <w:bookmarkStart w:id="4" w:name="_Toc247374826"/>
+      <w:bookmarkStart w:id="5" w:name="_Toc223797191"/>
       <w:r>
         <w:lastRenderedPageBreak/>
         <w:t xml:space="preserve">2.1. </w:t>
       </w:r>
+      <w:bookmarkEnd w:id="4"/>
+      <w:r>
+        <w:t>Esp32 mikrokontroler</w:t>
+      </w:r>
       <w:bookmarkEnd w:id="5"/>
-      <w:r>
-        <w:t>Esp32 mikrokontroler</w:t>
-      </w:r>
-      <w:bookmarkEnd w:id="6"/>
     </w:p>
     <w:p>
       <w:pPr>
@@ -2539,7 +2600,8 @@
       </w:pPr>
       <w:r>
         <w:rPr>
-          <w:lang w:val="hr-HR"/>
+          <w:noProof/>
+          <w:lang w:val="en-GB" w:eastAsia="en-GB"/>
         </w:rPr>
         <w:drawing>
           <wp:inline distT="0" distB="0" distL="0" distR="0" wp14:anchorId="4A60A108" wp14:editId="780E8D90">
@@ -2557,7 +2619,7 @@
                     <pic:cNvPicPr/>
                   </pic:nvPicPr>
                   <pic:blipFill rotWithShape="1">
-                    <a:blip r:embed="rId13"/>
+                    <a:blip r:embed="rId14"/>
                     <a:srcRect b="1454"/>
                     <a:stretch/>
                   </pic:blipFill>
@@ -2701,7 +2763,7 @@
           <w:lang w:val="hr-HR"/>
         </w:rPr>
       </w:pPr>
-      <w:bookmarkStart w:id="7" w:name="_Toc223797192"/>
+      <w:bookmarkStart w:id="6" w:name="_Toc223797192"/>
       <w:r>
         <w:t xml:space="preserve">2.2. </w:t>
       </w:r>
@@ -2729,7 +2791,7 @@
         </w:rPr>
         <w:t xml:space="preserve"> 32x64 P4 (RGB)</w:t>
       </w:r>
-      <w:bookmarkEnd w:id="7"/>
+      <w:bookmarkEnd w:id="6"/>
     </w:p>
     <w:p>
       <w:pPr>
@@ -2797,7 +2859,7 @@
                     </pic:cNvPicPr>
                   </pic:nvPicPr>
                   <pic:blipFill rotWithShape="1">
-                    <a:blip r:embed="rId14">
+                    <a:blip r:embed="rId15">
                       <a:clrChange>
                         <a:clrFrom>
                           <a:srgbClr val="FFFFFF"/>
@@ -2859,25 +2921,7 @@
           <w:szCs w:val="18"/>
           <w:lang w:val="hr-HR" w:eastAsia="bs-Latn-BA"/>
         </w:rPr>
-        <w:t>Slika 2.2.1. pozadina LED</w:t>
-      </w:r>
-      <w:r>
-        <w:rPr>
-          <w:i/>
-          <w:sz w:val="18"/>
-          <w:szCs w:val="18"/>
-          <w:lang w:val="hr-HR" w:eastAsia="bs-Latn-BA"/>
-        </w:rPr>
-        <w:t xml:space="preserve"> 64x32</w:t>
-      </w:r>
-      <w:r>
-        <w:rPr>
-          <w:i/>
-          <w:sz w:val="18"/>
-          <w:szCs w:val="18"/>
-          <w:lang w:val="hr-HR" w:eastAsia="bs-Latn-BA"/>
-        </w:rPr>
-        <w:t xml:space="preserve">  matrice</w:t>
+        <w:t>Slika 2.2.1. pozadina LED 64x32  matrice</w:t>
       </w:r>
     </w:p>
     <w:p>
@@ -3039,21 +3083,8 @@
             <w:pPr>
               <w:cnfStyle w:val="000000100000" w:firstRow="0" w:lastRow="0" w:firstColumn="0" w:lastColumn="0" w:oddVBand="0" w:evenVBand="0" w:oddHBand="1" w:evenHBand="0" w:firstRowFirstColumn="0" w:firstRowLastColumn="0" w:lastRowFirstColumn="0" w:lastRowLastColumn="0"/>
             </w:pPr>
-            <w:proofErr w:type="spellStart"/>
-            <w:r>
-              <w:t>Ulazno</w:t>
-            </w:r>
-            <w:proofErr w:type="spellEnd"/>
-            <w:r>
-              <w:t xml:space="preserve"> </w:t>
-            </w:r>
-            <w:proofErr w:type="spellStart"/>
-            <w:r>
-              <w:t>napajanje</w:t>
-            </w:r>
-            <w:proofErr w:type="spellEnd"/>
-            <w:r>
-              <w:t xml:space="preserve"> od 5V</w:t>
+            <w:r>
+              <w:t>Ulazno napajanje od 5V</w:t>
             </w:r>
           </w:p>
         </w:tc>
@@ -3088,11 +3119,9 @@
             <w:pPr>
               <w:cnfStyle w:val="000000100000" w:firstRow="0" w:lastRow="0" w:firstColumn="0" w:lastColumn="0" w:oddVBand="0" w:evenVBand="0" w:oddHBand="1" w:evenHBand="0" w:firstRowFirstColumn="0" w:firstRowLastColumn="0" w:lastRowFirstColumn="0" w:lastRowLastColumn="0"/>
             </w:pPr>
-            <w:proofErr w:type="spellStart"/>
             <w:r>
               <w:t>Uzemljenje</w:t>
             </w:r>
-            <w:proofErr w:type="spellEnd"/>
           </w:p>
         </w:tc>
       </w:tr>
@@ -3119,29 +3148,8 @@
             <w:pPr>
               <w:cnfStyle w:val="000000000000" w:firstRow="0" w:lastRow="0" w:firstColumn="0" w:lastColumn="0" w:oddVBand="0" w:evenVBand="0" w:oddHBand="0" w:evenHBand="0" w:firstRowFirstColumn="0" w:firstRowLastColumn="0" w:lastRowFirstColumn="0" w:lastRowLastColumn="0"/>
             </w:pPr>
-            <w:proofErr w:type="spellStart"/>
-            <w:r>
-              <w:t>Podaci</w:t>
-            </w:r>
-            <w:proofErr w:type="spellEnd"/>
-            <w:r>
-              <w:t xml:space="preserve"> </w:t>
-            </w:r>
-            <w:proofErr w:type="spellStart"/>
-            <w:r>
-              <w:t>višeg</w:t>
-            </w:r>
-            <w:proofErr w:type="spellEnd"/>
-            <w:r>
-              <w:t xml:space="preserve"> </w:t>
-            </w:r>
-            <w:proofErr w:type="spellStart"/>
-            <w:r>
-              <w:t>bita</w:t>
-            </w:r>
-            <w:proofErr w:type="spellEnd"/>
-            <w:r>
-              <w:t xml:space="preserve"> R</w:t>
+            <w:r>
+              <w:t>Podaci višeg bita R</w:t>
             </w:r>
           </w:p>
         </w:tc>
@@ -3176,29 +3184,8 @@
             <w:pPr>
               <w:cnfStyle w:val="000000000000" w:firstRow="0" w:lastRow="0" w:firstColumn="0" w:lastColumn="0" w:oddVBand="0" w:evenVBand="0" w:oddHBand="0" w:evenHBand="0" w:firstRowFirstColumn="0" w:firstRowLastColumn="0" w:lastRowFirstColumn="0" w:lastRowLastColumn="0"/>
             </w:pPr>
-            <w:proofErr w:type="spellStart"/>
-            <w:r>
-              <w:t>Podaci</w:t>
-            </w:r>
-            <w:proofErr w:type="spellEnd"/>
-            <w:r>
-              <w:t xml:space="preserve"> </w:t>
-            </w:r>
-            <w:proofErr w:type="spellStart"/>
-            <w:r>
-              <w:t>nižeg</w:t>
-            </w:r>
-            <w:proofErr w:type="spellEnd"/>
-            <w:r>
-              <w:t xml:space="preserve"> </w:t>
-            </w:r>
-            <w:proofErr w:type="spellStart"/>
-            <w:r>
-              <w:t>bita</w:t>
-            </w:r>
-            <w:proofErr w:type="spellEnd"/>
-            <w:r>
-              <w:t xml:space="preserve"> R</w:t>
+            <w:r>
+              <w:t>Podaci nižeg bita R</w:t>
             </w:r>
           </w:p>
         </w:tc>
@@ -3227,29 +3214,8 @@
             <w:pPr>
               <w:cnfStyle w:val="000000100000" w:firstRow="0" w:lastRow="0" w:firstColumn="0" w:lastColumn="0" w:oddVBand="0" w:evenVBand="0" w:oddHBand="1" w:evenHBand="0" w:firstRowFirstColumn="0" w:firstRowLastColumn="0" w:lastRowFirstColumn="0" w:lastRowLastColumn="0"/>
             </w:pPr>
-            <w:proofErr w:type="spellStart"/>
-            <w:r>
-              <w:t>Podaci</w:t>
-            </w:r>
-            <w:proofErr w:type="spellEnd"/>
-            <w:r>
-              <w:t xml:space="preserve"> </w:t>
-            </w:r>
-            <w:proofErr w:type="spellStart"/>
-            <w:r>
-              <w:t>višeg</w:t>
-            </w:r>
-            <w:proofErr w:type="spellEnd"/>
-            <w:r>
-              <w:t xml:space="preserve"> </w:t>
-            </w:r>
-            <w:proofErr w:type="spellStart"/>
-            <w:r>
-              <w:t>bita</w:t>
-            </w:r>
-            <w:proofErr w:type="spellEnd"/>
-            <w:r>
-              <w:t xml:space="preserve"> G</w:t>
+            <w:r>
+              <w:t>Podaci višeg bita G</w:t>
             </w:r>
           </w:p>
         </w:tc>
@@ -3284,29 +3250,8 @@
             <w:pPr>
               <w:cnfStyle w:val="000000100000" w:firstRow="0" w:lastRow="0" w:firstColumn="0" w:lastColumn="0" w:oddVBand="0" w:evenVBand="0" w:oddHBand="1" w:evenHBand="0" w:firstRowFirstColumn="0" w:firstRowLastColumn="0" w:lastRowFirstColumn="0" w:lastRowLastColumn="0"/>
             </w:pPr>
-            <w:proofErr w:type="spellStart"/>
-            <w:r>
-              <w:t>Podaci</w:t>
-            </w:r>
-            <w:proofErr w:type="spellEnd"/>
-            <w:r>
-              <w:t xml:space="preserve"> </w:t>
-            </w:r>
-            <w:proofErr w:type="spellStart"/>
-            <w:r>
-              <w:t>nižeg</w:t>
-            </w:r>
-            <w:proofErr w:type="spellEnd"/>
-            <w:r>
-              <w:t xml:space="preserve"> </w:t>
-            </w:r>
-            <w:proofErr w:type="spellStart"/>
-            <w:r>
-              <w:t>bita</w:t>
-            </w:r>
-            <w:proofErr w:type="spellEnd"/>
-            <w:r>
-              <w:t xml:space="preserve"> G</w:t>
+            <w:r>
+              <w:t>Podaci nižeg bita G</w:t>
             </w:r>
           </w:p>
         </w:tc>
@@ -3334,29 +3279,8 @@
             <w:pPr>
               <w:cnfStyle w:val="000000000000" w:firstRow="0" w:lastRow="0" w:firstColumn="0" w:lastColumn="0" w:oddVBand="0" w:evenVBand="0" w:oddHBand="0" w:evenHBand="0" w:firstRowFirstColumn="0" w:firstRowLastColumn="0" w:lastRowFirstColumn="0" w:lastRowLastColumn="0"/>
             </w:pPr>
-            <w:proofErr w:type="spellStart"/>
-            <w:r>
-              <w:t>Podaci</w:t>
-            </w:r>
-            <w:proofErr w:type="spellEnd"/>
-            <w:r>
-              <w:t xml:space="preserve"> </w:t>
-            </w:r>
-            <w:proofErr w:type="spellStart"/>
-            <w:r>
-              <w:t>višeg</w:t>
-            </w:r>
-            <w:proofErr w:type="spellEnd"/>
-            <w:r>
-              <w:t xml:space="preserve"> </w:t>
-            </w:r>
-            <w:proofErr w:type="spellStart"/>
-            <w:r>
-              <w:t>bita</w:t>
-            </w:r>
-            <w:proofErr w:type="spellEnd"/>
-            <w:r>
-              <w:t xml:space="preserve"> B</w:t>
+            <w:r>
+              <w:t>Podaci višeg bita B</w:t>
             </w:r>
           </w:p>
         </w:tc>
@@ -3391,29 +3315,8 @@
             <w:pPr>
               <w:cnfStyle w:val="000000000000" w:firstRow="0" w:lastRow="0" w:firstColumn="0" w:lastColumn="0" w:oddVBand="0" w:evenVBand="0" w:oddHBand="0" w:evenHBand="0" w:firstRowFirstColumn="0" w:firstRowLastColumn="0" w:lastRowFirstColumn="0" w:lastRowLastColumn="0"/>
             </w:pPr>
-            <w:proofErr w:type="spellStart"/>
-            <w:r>
-              <w:t>Podaci</w:t>
-            </w:r>
-            <w:proofErr w:type="spellEnd"/>
-            <w:r>
-              <w:t xml:space="preserve"> </w:t>
-            </w:r>
-            <w:proofErr w:type="spellStart"/>
-            <w:r>
-              <w:t>nižeg</w:t>
-            </w:r>
-            <w:proofErr w:type="spellEnd"/>
-            <w:r>
-              <w:t xml:space="preserve"> </w:t>
-            </w:r>
-            <w:proofErr w:type="spellStart"/>
-            <w:r>
-              <w:t>bita</w:t>
-            </w:r>
-            <w:proofErr w:type="spellEnd"/>
-            <w:r>
-              <w:t xml:space="preserve"> B</w:t>
+            <w:r>
+              <w:t>Podaci nižeg bita B</w:t>
             </w:r>
           </w:p>
         </w:tc>
@@ -3442,22 +3345,15 @@
             <w:pPr>
               <w:cnfStyle w:val="000000100000" w:firstRow="0" w:lastRow="0" w:firstColumn="0" w:lastColumn="0" w:oddVBand="0" w:evenVBand="0" w:oddHBand="1" w:evenHBand="0" w:firstRowFirstColumn="0" w:firstRowLastColumn="0" w:lastRowFirstColumn="0" w:lastRowLastColumn="0"/>
             </w:pPr>
-            <w:proofErr w:type="spellStart"/>
             <w:r>
               <w:t>Odabir</w:t>
             </w:r>
-            <w:proofErr w:type="spellEnd"/>
             <w:r>
               <w:t xml:space="preserve"> A</w:t>
             </w:r>
             <w:r>
-              <w:t xml:space="preserve"> </w:t>
-            </w:r>
-            <w:proofErr w:type="spellStart"/>
-            <w:r>
-              <w:t>linije</w:t>
-            </w:r>
-            <w:proofErr w:type="spellEnd"/>
+              <w:t xml:space="preserve"> linije</w:t>
+            </w:r>
           </w:p>
         </w:tc>
         <w:tc>
@@ -3491,19 +3387,9 @@
             <w:pPr>
               <w:cnfStyle w:val="000000100000" w:firstRow="0" w:lastRow="0" w:firstColumn="0" w:lastColumn="0" w:oddVBand="0" w:evenVBand="0" w:oddHBand="1" w:evenHBand="0" w:firstRowFirstColumn="0" w:firstRowLastColumn="0" w:lastRowFirstColumn="0" w:lastRowLastColumn="0"/>
             </w:pPr>
-            <w:proofErr w:type="spellStart"/>
-            <w:r>
-              <w:t>Odabir</w:t>
-            </w:r>
-            <w:proofErr w:type="spellEnd"/>
-            <w:r>
-              <w:t xml:space="preserve"> B </w:t>
-            </w:r>
-            <w:proofErr w:type="spellStart"/>
-            <w:r>
-              <w:t>linije</w:t>
-            </w:r>
-            <w:proofErr w:type="spellEnd"/>
+            <w:r>
+              <w:t>Odabir B linije</w:t>
+            </w:r>
           </w:p>
         </w:tc>
       </w:tr>
@@ -3530,19 +3416,9 @@
             <w:pPr>
               <w:cnfStyle w:val="000000000000" w:firstRow="0" w:lastRow="0" w:firstColumn="0" w:lastColumn="0" w:oddVBand="0" w:evenVBand="0" w:oddHBand="0" w:evenHBand="0" w:firstRowFirstColumn="0" w:firstRowLastColumn="0" w:lastRowFirstColumn="0" w:lastRowLastColumn="0"/>
             </w:pPr>
-            <w:proofErr w:type="spellStart"/>
-            <w:r>
-              <w:t>Odabir</w:t>
-            </w:r>
-            <w:proofErr w:type="spellEnd"/>
-            <w:r>
-              <w:t xml:space="preserve"> C </w:t>
-            </w:r>
-            <w:proofErr w:type="spellStart"/>
-            <w:r>
-              <w:t>linije</w:t>
-            </w:r>
-            <w:proofErr w:type="spellEnd"/>
+            <w:r>
+              <w:t>Odabir C linije</w:t>
+            </w:r>
           </w:p>
         </w:tc>
         <w:tc>
@@ -3576,19 +3452,9 @@
             <w:pPr>
               <w:cnfStyle w:val="000000000000" w:firstRow="0" w:lastRow="0" w:firstColumn="0" w:lastColumn="0" w:oddVBand="0" w:evenVBand="0" w:oddHBand="0" w:evenHBand="0" w:firstRowFirstColumn="0" w:firstRowLastColumn="0" w:lastRowFirstColumn="0" w:lastRowLastColumn="0"/>
             </w:pPr>
-            <w:proofErr w:type="spellStart"/>
-            <w:r>
-              <w:t>Odabir</w:t>
-            </w:r>
-            <w:proofErr w:type="spellEnd"/>
-            <w:r>
-              <w:t xml:space="preserve"> D </w:t>
-            </w:r>
-            <w:proofErr w:type="spellStart"/>
-            <w:r>
-              <w:t>linije</w:t>
-            </w:r>
-            <w:proofErr w:type="spellEnd"/>
+            <w:r>
+              <w:t>Odabir D linije</w:t>
+            </w:r>
           </w:p>
         </w:tc>
       </w:tr>
@@ -3616,19 +3482,9 @@
             <w:pPr>
               <w:cnfStyle w:val="000000100000" w:firstRow="0" w:lastRow="0" w:firstColumn="0" w:lastColumn="0" w:oddVBand="0" w:evenVBand="0" w:oddHBand="1" w:evenHBand="0" w:firstRowFirstColumn="0" w:firstRowLastColumn="0" w:lastRowFirstColumn="0" w:lastRowLastColumn="0"/>
             </w:pPr>
-            <w:proofErr w:type="spellStart"/>
-            <w:r>
-              <w:t>Izbor</w:t>
-            </w:r>
-            <w:proofErr w:type="spellEnd"/>
-            <w:r>
-              <w:t xml:space="preserve"> E </w:t>
-            </w:r>
-            <w:proofErr w:type="spellStart"/>
-            <w:r>
-              <w:t>linije</w:t>
-            </w:r>
-            <w:proofErr w:type="spellEnd"/>
+            <w:r>
+              <w:t>Izbor E linije</w:t>
+            </w:r>
           </w:p>
         </w:tc>
         <w:tc>
@@ -3662,19 +3518,9 @@
             <w:pPr>
               <w:cnfStyle w:val="000000100000" w:firstRow="0" w:lastRow="0" w:firstColumn="0" w:lastColumn="0" w:oddVBand="0" w:evenVBand="0" w:oddHBand="1" w:evenHBand="0" w:firstRowFirstColumn="0" w:firstRowLastColumn="0" w:lastRowFirstColumn="0" w:lastRowLastColumn="0"/>
             </w:pPr>
-            <w:proofErr w:type="spellStart"/>
-            <w:r>
-              <w:t>ulaz</w:t>
-            </w:r>
-            <w:proofErr w:type="spellEnd"/>
-            <w:r>
-              <w:t xml:space="preserve"> </w:t>
-            </w:r>
-            <w:proofErr w:type="spellStart"/>
-            <w:r>
-              <w:t>takta</w:t>
-            </w:r>
-            <w:proofErr w:type="spellEnd"/>
+            <w:r>
+              <w:t>ulaz takta</w:t>
+            </w:r>
           </w:p>
         </w:tc>
       </w:tr>
@@ -3867,9 +3713,15 @@
       </w:pPr>
       <w:r>
         <w:rPr>
+          <w:lang w:val="en-GB"/>
+        </w:rPr>
+        <w:t xml:space="preserve">Regulisani ulaz napajanja od 5V, ~4A maks. </w:t>
+      </w:r>
+      <w:r>
+        <w:rPr>
           <w:lang w:val="de-AT"/>
         </w:rPr>
-        <w:t>Regulisani ulaz napajanja od 5V, ~4A maks. (sve LED diode uključene)</w:t>
+        <w:t>(sve LED diode uključene)</w:t>
       </w:r>
     </w:p>
     <w:p>
@@ -3898,35 +3750,9 @@
           <w:numId w:val="8"/>
         </w:numPr>
       </w:pPr>
-      <w:proofErr w:type="spellStart"/>
-      <w:r>
-        <w:t>Unutrašnji</w:t>
-      </w:r>
-      <w:proofErr w:type="spellEnd"/>
-      <w:r>
-        <w:t xml:space="preserve"> </w:t>
-      </w:r>
-      <w:proofErr w:type="spellStart"/>
-      <w:r>
-        <w:t>ekran</w:t>
-      </w:r>
-      <w:proofErr w:type="spellEnd"/>
-      <w:r>
-        <w:t xml:space="preserve">, </w:t>
-      </w:r>
-      <w:proofErr w:type="spellStart"/>
-      <w:r>
-        <w:t>vidljivost</w:t>
-      </w:r>
-      <w:proofErr w:type="spellEnd"/>
-      <w:r>
-        <w:t xml:space="preserve"> od 160 </w:t>
-      </w:r>
-      <w:proofErr w:type="spellStart"/>
-      <w:r>
-        <w:t>stepeni</w:t>
-      </w:r>
-      <w:proofErr w:type="spellEnd"/>
+      <w:r>
+        <w:t>Unutrašnji ekran, vidljivost od 160 stepeni</w:t>
+      </w:r>
     </w:p>
     <w:p>
       <w:pPr>
@@ -3939,96 +3765,17 @@
           <w:lang w:val="hr-HR"/>
         </w:rPr>
       </w:pPr>
-      <w:proofErr w:type="spellStart"/>
-      <w:r>
-        <w:t>Ekrani</w:t>
-      </w:r>
-      <w:proofErr w:type="spellEnd"/>
-      <w:r>
-        <w:t xml:space="preserve"> se </w:t>
-      </w:r>
-      <w:proofErr w:type="spellStart"/>
-      <w:r>
-        <w:t>mogu</w:t>
-      </w:r>
-      <w:proofErr w:type="spellEnd"/>
-      <w:r>
-        <w:t xml:space="preserve"> </w:t>
-      </w:r>
-      <w:proofErr w:type="spellStart"/>
-      <w:r>
-        <w:t>lančano</w:t>
-      </w:r>
-      <w:proofErr w:type="spellEnd"/>
-      <w:r>
-        <w:t>/</w:t>
-      </w:r>
-      <w:proofErr w:type="spellStart"/>
-      <w:r>
-        <w:t>serijski</w:t>
-      </w:r>
-      <w:proofErr w:type="spellEnd"/>
-      <w:r>
-        <w:t xml:space="preserve"> </w:t>
-      </w:r>
-      <w:proofErr w:type="spellStart"/>
-      <w:r>
-        <w:t>povezivati</w:t>
-      </w:r>
-      <w:proofErr w:type="spellEnd"/>
-      <w:r>
-        <w:t xml:space="preserve"> - </w:t>
-      </w:r>
-      <w:proofErr w:type="spellStart"/>
-      <w:r>
-        <w:t>povezivanjem</w:t>
-      </w:r>
-      <w:proofErr w:type="spellEnd"/>
-      <w:r>
-        <w:t xml:space="preserve"> </w:t>
-      </w:r>
-      <w:proofErr w:type="spellStart"/>
-      <w:r>
-        <w:t>jednog</w:t>
-      </w:r>
-      <w:proofErr w:type="spellEnd"/>
-      <w:r>
-        <w:t xml:space="preserve"> </w:t>
-      </w:r>
-      <w:proofErr w:type="spellStart"/>
-      <w:r>
-        <w:t>izlaz</w:t>
+      <w:r>
+        <w:t>Ekrani se mogu lančano/serijski povezivati - povezivanjem jednog</w:t>
+      </w:r>
+      <w:r>
+        <w:t xml:space="preserve"> izlaz</w:t>
       </w:r>
       <w:r>
         <w:t>a</w:t>
       </w:r>
-      <w:proofErr w:type="spellEnd"/>
-      <w:r>
-        <w:t xml:space="preserve"> </w:t>
-      </w:r>
-      <w:proofErr w:type="spellStart"/>
-      <w:r>
-        <w:t>sa</w:t>
-      </w:r>
-      <w:proofErr w:type="spellEnd"/>
-      <w:r>
-        <w:t xml:space="preserve"> </w:t>
-      </w:r>
-      <w:proofErr w:type="spellStart"/>
-      <w:r>
-        <w:t>sljedećim</w:t>
-      </w:r>
-      <w:proofErr w:type="spellEnd"/>
-      <w:r>
-        <w:t xml:space="preserve"> </w:t>
-      </w:r>
-      <w:proofErr w:type="spellStart"/>
-      <w:r>
-        <w:t>ulazom</w:t>
-      </w:r>
-      <w:proofErr w:type="spellEnd"/>
-      <w:r>
-        <w:t xml:space="preserve"> </w:t>
+      <w:r>
+        <w:t xml:space="preserve"> sa sljedećim ulazom </w:t>
       </w:r>
     </w:p>
     <w:p>
@@ -4054,12 +3801,9 @@
           <w:lang w:val="hr-HR"/>
         </w:rPr>
       </w:pPr>
-      <w:bookmarkStart w:id="8" w:name="_Toc223797193"/>
-      <w:r>
-        <w:t>2.3</w:t>
-      </w:r>
-      <w:r>
-        <w:t xml:space="preserve">. </w:t>
+      <w:bookmarkStart w:id="7" w:name="_Toc223797193"/>
+      <w:r>
+        <w:t xml:space="preserve">2.3. </w:t>
       </w:r>
       <w:r>
         <w:rPr>
@@ -4067,7 +3811,7 @@
         </w:rPr>
         <w:t>Napojna jedinica</w:t>
       </w:r>
-      <w:bookmarkEnd w:id="8"/>
+      <w:bookmarkEnd w:id="7"/>
     </w:p>
     <w:p>
       <w:pPr>
@@ -4132,1059 +3876,49 @@
           <w:lang w:val="en-GB"/>
         </w:rPr>
       </w:pPr>
-      <w:proofErr w:type="spellStart"/>
       <w:r>
         <w:rPr>
           <w:lang w:val="en-GB"/>
         </w:rPr>
-        <w:t>Princip</w:t>
-      </w:r>
-      <w:proofErr w:type="spellEnd"/>
-      <w:r>
+        <w:t xml:space="preserve">Princip rada napojne jedinice zasniva se na pretvaranju i regulaciji električne energije. Ulazna struja se kroz transformator, ispravljač i filtere pretvara u jednosmernu struju odgovarajuće snage, dok regulator napona održava konstantan izlazni napon bez obzira na promjene u opterećenju ili ulaznoj struji. </w:t>
+      </w:r>
+    </w:p>
+    <w:p>
+      <w:pPr>
+        <w:jc w:val="both"/>
         <w:rPr>
           <w:lang w:val="en-GB"/>
         </w:rPr>
-        <w:t xml:space="preserve"> </w:t>
-      </w:r>
-      <w:proofErr w:type="spellStart"/>
-      <w:r>
+      </w:pPr>
+    </w:p>
+    <w:p>
+      <w:pPr>
+        <w:jc w:val="both"/>
         <w:rPr>
           <w:lang w:val="en-GB"/>
         </w:rPr>
-        <w:t>rada</w:t>
-      </w:r>
-      <w:proofErr w:type="spellEnd"/>
+      </w:pPr>
       <w:r>
         <w:rPr>
           <w:lang w:val="en-GB"/>
         </w:rPr>
-        <w:t xml:space="preserve"> </w:t>
-      </w:r>
-      <w:proofErr w:type="spellStart"/>
-      <w:r>
+        <w:t>Za naš projekat koristimo napojnu jedinicu od 5 V i 5 A, koja je dovoljna da napaja LED matricu i RGB trake na slovima. Ovaj izbor omogućava sigurno i stabilno napajanje svih LED dioda, bez fluktuacija napona ili prenapona, čime se osigurava pravilno i ujednačeno osvjetljenje i pouzdan rad sistema.</w:t>
+      </w:r>
+    </w:p>
+    <w:p>
+      <w:pPr>
+        <w:jc w:val="both"/>
         <w:rPr>
           <w:lang w:val="en-GB"/>
         </w:rPr>
-        <w:t>napojne</w:t>
-      </w:r>
-      <w:proofErr w:type="spellEnd"/>
-      <w:r>
+      </w:pPr>
+    </w:p>
+    <w:p>
+      <w:pPr>
+        <w:jc w:val="both"/>
         <w:rPr>
           <w:lang w:val="en-GB"/>
         </w:rPr>
-        <w:t xml:space="preserve"> </w:t>
-      </w:r>
-      <w:proofErr w:type="spellStart"/>
-      <w:r>
-        <w:rPr>
-          <w:lang w:val="en-GB"/>
-        </w:rPr>
-        <w:t>jedinice</w:t>
-      </w:r>
-      <w:proofErr w:type="spellEnd"/>
-      <w:r>
-        <w:rPr>
-          <w:lang w:val="en-GB"/>
-        </w:rPr>
-        <w:t xml:space="preserve"> </w:t>
-      </w:r>
-      <w:proofErr w:type="spellStart"/>
-      <w:r>
-        <w:rPr>
-          <w:lang w:val="en-GB"/>
-        </w:rPr>
-        <w:t>zasniva</w:t>
-      </w:r>
-      <w:proofErr w:type="spellEnd"/>
-      <w:r>
-        <w:rPr>
-          <w:lang w:val="en-GB"/>
-        </w:rPr>
-        <w:t xml:space="preserve"> se </w:t>
-      </w:r>
-      <w:proofErr w:type="spellStart"/>
-      <w:r>
-        <w:rPr>
-          <w:lang w:val="en-GB"/>
-        </w:rPr>
-        <w:t>na</w:t>
-      </w:r>
-      <w:proofErr w:type="spellEnd"/>
-      <w:r>
-        <w:rPr>
-          <w:lang w:val="en-GB"/>
-        </w:rPr>
-        <w:t xml:space="preserve"> </w:t>
-      </w:r>
-      <w:proofErr w:type="spellStart"/>
-      <w:r>
-        <w:rPr>
-          <w:lang w:val="en-GB"/>
-        </w:rPr>
-        <w:t>pretvaranju</w:t>
-      </w:r>
-      <w:proofErr w:type="spellEnd"/>
-      <w:r>
-        <w:rPr>
-          <w:lang w:val="en-GB"/>
-        </w:rPr>
-        <w:t xml:space="preserve"> </w:t>
-      </w:r>
-      <w:proofErr w:type="spellStart"/>
-      <w:r>
-        <w:rPr>
-          <w:lang w:val="en-GB"/>
-        </w:rPr>
-        <w:t>i</w:t>
-      </w:r>
-      <w:proofErr w:type="spellEnd"/>
-      <w:r>
-        <w:rPr>
-          <w:lang w:val="en-GB"/>
-        </w:rPr>
-        <w:t xml:space="preserve"> </w:t>
-      </w:r>
-      <w:proofErr w:type="spellStart"/>
-      <w:r>
-        <w:rPr>
-          <w:lang w:val="en-GB"/>
-        </w:rPr>
-        <w:t>regulaciji</w:t>
-      </w:r>
-      <w:proofErr w:type="spellEnd"/>
-      <w:r>
-        <w:rPr>
-          <w:lang w:val="en-GB"/>
-        </w:rPr>
-        <w:t xml:space="preserve"> </w:t>
-      </w:r>
-      <w:proofErr w:type="spellStart"/>
-      <w:r>
-        <w:rPr>
-          <w:lang w:val="en-GB"/>
-        </w:rPr>
-        <w:t>električne</w:t>
-      </w:r>
-      <w:proofErr w:type="spellEnd"/>
-      <w:r>
-        <w:rPr>
-          <w:lang w:val="en-GB"/>
-        </w:rPr>
-        <w:t xml:space="preserve"> </w:t>
-      </w:r>
-      <w:proofErr w:type="spellStart"/>
-      <w:r>
-        <w:rPr>
-          <w:lang w:val="en-GB"/>
-        </w:rPr>
-        <w:t>energije</w:t>
-      </w:r>
-      <w:proofErr w:type="spellEnd"/>
-      <w:r>
-        <w:rPr>
-          <w:lang w:val="en-GB"/>
-        </w:rPr>
-        <w:t xml:space="preserve">. </w:t>
-      </w:r>
-      <w:proofErr w:type="spellStart"/>
-      <w:r>
-        <w:rPr>
-          <w:lang w:val="en-GB"/>
-        </w:rPr>
-        <w:t>Ulazna</w:t>
-      </w:r>
-      <w:proofErr w:type="spellEnd"/>
-      <w:r>
-        <w:rPr>
-          <w:lang w:val="en-GB"/>
-        </w:rPr>
-        <w:t xml:space="preserve"> </w:t>
-      </w:r>
-      <w:proofErr w:type="spellStart"/>
-      <w:r>
-        <w:rPr>
-          <w:lang w:val="en-GB"/>
-        </w:rPr>
-        <w:t>struja</w:t>
-      </w:r>
-      <w:proofErr w:type="spellEnd"/>
-      <w:r>
-        <w:rPr>
-          <w:lang w:val="en-GB"/>
-        </w:rPr>
-        <w:t xml:space="preserve"> se </w:t>
-      </w:r>
-      <w:proofErr w:type="spellStart"/>
-      <w:r>
-        <w:rPr>
-          <w:lang w:val="en-GB"/>
-        </w:rPr>
-        <w:t>kroz</w:t>
-      </w:r>
-      <w:proofErr w:type="spellEnd"/>
-      <w:r>
-        <w:rPr>
-          <w:lang w:val="en-GB"/>
-        </w:rPr>
-        <w:t xml:space="preserve"> </w:t>
-      </w:r>
-      <w:proofErr w:type="spellStart"/>
-      <w:r>
-        <w:rPr>
-          <w:lang w:val="en-GB"/>
-        </w:rPr>
-        <w:t>transformator</w:t>
-      </w:r>
-      <w:proofErr w:type="spellEnd"/>
-      <w:r>
-        <w:rPr>
-          <w:lang w:val="en-GB"/>
-        </w:rPr>
-        <w:t xml:space="preserve">, </w:t>
-      </w:r>
-      <w:proofErr w:type="spellStart"/>
-      <w:r>
-        <w:rPr>
-          <w:lang w:val="en-GB"/>
-        </w:rPr>
-        <w:t>ispravljač</w:t>
-      </w:r>
-      <w:proofErr w:type="spellEnd"/>
-      <w:r>
-        <w:rPr>
-          <w:lang w:val="en-GB"/>
-        </w:rPr>
-        <w:t xml:space="preserve"> </w:t>
-      </w:r>
-      <w:proofErr w:type="spellStart"/>
-      <w:r>
-        <w:rPr>
-          <w:lang w:val="en-GB"/>
-        </w:rPr>
-        <w:t>i</w:t>
-      </w:r>
-      <w:proofErr w:type="spellEnd"/>
-      <w:r>
-        <w:rPr>
-          <w:lang w:val="en-GB"/>
-        </w:rPr>
-        <w:t xml:space="preserve"> </w:t>
-      </w:r>
-      <w:proofErr w:type="spellStart"/>
-      <w:r>
-        <w:rPr>
-          <w:lang w:val="en-GB"/>
-        </w:rPr>
-        <w:t>filtere</w:t>
-      </w:r>
-      <w:proofErr w:type="spellEnd"/>
-      <w:r>
-        <w:rPr>
-          <w:lang w:val="en-GB"/>
-        </w:rPr>
-        <w:t xml:space="preserve"> </w:t>
-      </w:r>
-      <w:proofErr w:type="spellStart"/>
-      <w:r>
-        <w:rPr>
-          <w:lang w:val="en-GB"/>
-        </w:rPr>
-        <w:t>pretvara</w:t>
-      </w:r>
-      <w:proofErr w:type="spellEnd"/>
-      <w:r>
-        <w:rPr>
-          <w:lang w:val="en-GB"/>
-        </w:rPr>
-        <w:t xml:space="preserve"> u </w:t>
-      </w:r>
-      <w:proofErr w:type="spellStart"/>
-      <w:r>
-        <w:rPr>
-          <w:lang w:val="en-GB"/>
-        </w:rPr>
-        <w:t>jednosmernu</w:t>
-      </w:r>
-      <w:proofErr w:type="spellEnd"/>
-      <w:r>
-        <w:rPr>
-          <w:lang w:val="en-GB"/>
-        </w:rPr>
-        <w:t xml:space="preserve"> </w:t>
-      </w:r>
-      <w:proofErr w:type="spellStart"/>
-      <w:r>
-        <w:rPr>
-          <w:lang w:val="en-GB"/>
-        </w:rPr>
-        <w:t>struju</w:t>
-      </w:r>
-      <w:proofErr w:type="spellEnd"/>
-      <w:r>
-        <w:rPr>
-          <w:lang w:val="en-GB"/>
-        </w:rPr>
-        <w:t xml:space="preserve"> </w:t>
-      </w:r>
-      <w:proofErr w:type="spellStart"/>
-      <w:r>
-        <w:rPr>
-          <w:lang w:val="en-GB"/>
-        </w:rPr>
-        <w:t>odgovarajuće</w:t>
-      </w:r>
-      <w:proofErr w:type="spellEnd"/>
-      <w:r>
-        <w:rPr>
-          <w:lang w:val="en-GB"/>
-        </w:rPr>
-        <w:t xml:space="preserve"> </w:t>
-      </w:r>
-      <w:proofErr w:type="spellStart"/>
-      <w:r>
-        <w:rPr>
-          <w:lang w:val="en-GB"/>
-        </w:rPr>
-        <w:t>snage</w:t>
-      </w:r>
-      <w:proofErr w:type="spellEnd"/>
-      <w:r>
-        <w:rPr>
-          <w:lang w:val="en-GB"/>
-        </w:rPr>
-        <w:t xml:space="preserve">, </w:t>
-      </w:r>
-      <w:proofErr w:type="spellStart"/>
-      <w:r>
-        <w:rPr>
-          <w:lang w:val="en-GB"/>
-        </w:rPr>
-        <w:t>dok</w:t>
-      </w:r>
-      <w:proofErr w:type="spellEnd"/>
-      <w:r>
-        <w:rPr>
-          <w:lang w:val="en-GB"/>
-        </w:rPr>
-        <w:t xml:space="preserve"> regulator </w:t>
-      </w:r>
-      <w:proofErr w:type="spellStart"/>
-      <w:r>
-        <w:rPr>
-          <w:lang w:val="en-GB"/>
-        </w:rPr>
-        <w:t>napona</w:t>
-      </w:r>
-      <w:proofErr w:type="spellEnd"/>
-      <w:r>
-        <w:rPr>
-          <w:lang w:val="en-GB"/>
-        </w:rPr>
-        <w:t xml:space="preserve"> </w:t>
-      </w:r>
-      <w:proofErr w:type="spellStart"/>
-      <w:r>
-        <w:rPr>
-          <w:lang w:val="en-GB"/>
-        </w:rPr>
-        <w:t>održava</w:t>
-      </w:r>
-      <w:proofErr w:type="spellEnd"/>
-      <w:r>
-        <w:rPr>
-          <w:lang w:val="en-GB"/>
-        </w:rPr>
-        <w:t xml:space="preserve"> </w:t>
-      </w:r>
-      <w:proofErr w:type="spellStart"/>
-      <w:r>
-        <w:rPr>
-          <w:lang w:val="en-GB"/>
-        </w:rPr>
-        <w:t>konstantan</w:t>
-      </w:r>
-      <w:proofErr w:type="spellEnd"/>
-      <w:r>
-        <w:rPr>
-          <w:lang w:val="en-GB"/>
-        </w:rPr>
-        <w:t xml:space="preserve"> </w:t>
-      </w:r>
-      <w:proofErr w:type="spellStart"/>
-      <w:r>
-        <w:rPr>
-          <w:lang w:val="en-GB"/>
-        </w:rPr>
-        <w:t>izlazni</w:t>
-      </w:r>
-      <w:proofErr w:type="spellEnd"/>
-      <w:r>
-        <w:rPr>
-          <w:lang w:val="en-GB"/>
-        </w:rPr>
-        <w:t xml:space="preserve"> </w:t>
-      </w:r>
-      <w:proofErr w:type="spellStart"/>
-      <w:r>
-        <w:rPr>
-          <w:lang w:val="en-GB"/>
-        </w:rPr>
-        <w:t>napon</w:t>
-      </w:r>
-      <w:proofErr w:type="spellEnd"/>
-      <w:r>
-        <w:rPr>
-          <w:lang w:val="en-GB"/>
-        </w:rPr>
-        <w:t xml:space="preserve"> bez </w:t>
-      </w:r>
-      <w:proofErr w:type="spellStart"/>
-      <w:r>
-        <w:rPr>
-          <w:lang w:val="en-GB"/>
-        </w:rPr>
-        <w:t>obzira</w:t>
-      </w:r>
-      <w:proofErr w:type="spellEnd"/>
-      <w:r>
-        <w:rPr>
-          <w:lang w:val="en-GB"/>
-        </w:rPr>
-        <w:t xml:space="preserve"> </w:t>
-      </w:r>
-      <w:proofErr w:type="spellStart"/>
-      <w:r>
-        <w:rPr>
-          <w:lang w:val="en-GB"/>
-        </w:rPr>
-        <w:t>na</w:t>
-      </w:r>
-      <w:proofErr w:type="spellEnd"/>
-      <w:r>
-        <w:rPr>
-          <w:lang w:val="en-GB"/>
-        </w:rPr>
-        <w:t xml:space="preserve"> </w:t>
-      </w:r>
-      <w:proofErr w:type="spellStart"/>
-      <w:r>
-        <w:rPr>
-          <w:lang w:val="en-GB"/>
-        </w:rPr>
-        <w:t>promjene</w:t>
-      </w:r>
-      <w:proofErr w:type="spellEnd"/>
-      <w:r>
-        <w:rPr>
-          <w:lang w:val="en-GB"/>
-        </w:rPr>
-        <w:t xml:space="preserve"> u </w:t>
-      </w:r>
-      <w:proofErr w:type="spellStart"/>
-      <w:r>
-        <w:rPr>
-          <w:lang w:val="en-GB"/>
-        </w:rPr>
-        <w:t>opterećenju</w:t>
-      </w:r>
-      <w:proofErr w:type="spellEnd"/>
-      <w:r>
-        <w:rPr>
-          <w:lang w:val="en-GB"/>
-        </w:rPr>
-        <w:t xml:space="preserve"> </w:t>
-      </w:r>
-      <w:proofErr w:type="spellStart"/>
-      <w:r>
-        <w:rPr>
-          <w:lang w:val="en-GB"/>
-        </w:rPr>
-        <w:t>ili</w:t>
-      </w:r>
-      <w:proofErr w:type="spellEnd"/>
-      <w:r>
-        <w:rPr>
-          <w:lang w:val="en-GB"/>
-        </w:rPr>
-        <w:t xml:space="preserve"> </w:t>
-      </w:r>
-      <w:proofErr w:type="spellStart"/>
-      <w:r>
-        <w:rPr>
-          <w:lang w:val="en-GB"/>
-        </w:rPr>
-        <w:t>ulaznoj</w:t>
-      </w:r>
-      <w:proofErr w:type="spellEnd"/>
-      <w:r>
-        <w:rPr>
-          <w:lang w:val="en-GB"/>
-        </w:rPr>
-        <w:t xml:space="preserve"> </w:t>
-      </w:r>
-      <w:proofErr w:type="spellStart"/>
-      <w:r>
-        <w:rPr>
-          <w:lang w:val="en-GB"/>
-        </w:rPr>
-        <w:t>struji</w:t>
-      </w:r>
-      <w:proofErr w:type="spellEnd"/>
-      <w:r>
-        <w:rPr>
-          <w:lang w:val="en-GB"/>
-        </w:rPr>
-        <w:t xml:space="preserve">. </w:t>
-      </w:r>
-    </w:p>
-    <w:p>
-      <w:pPr>
-        <w:jc w:val="both"/>
-        <w:rPr>
-          <w:lang w:val="en-GB"/>
-        </w:rPr>
-      </w:pPr>
-    </w:p>
-    <w:p>
-      <w:pPr>
-        <w:jc w:val="both"/>
-        <w:rPr>
-          <w:lang w:val="en-GB"/>
-        </w:rPr>
-      </w:pPr>
-      <w:proofErr w:type="spellStart"/>
-      <w:r>
-        <w:rPr>
-          <w:lang w:val="en-GB"/>
-        </w:rPr>
-        <w:t>Za</w:t>
-      </w:r>
-      <w:proofErr w:type="spellEnd"/>
-      <w:r>
-        <w:rPr>
-          <w:lang w:val="en-GB"/>
-        </w:rPr>
-        <w:t xml:space="preserve"> </w:t>
-      </w:r>
-      <w:proofErr w:type="spellStart"/>
-      <w:r>
-        <w:rPr>
-          <w:lang w:val="en-GB"/>
-        </w:rPr>
-        <w:t>naš</w:t>
-      </w:r>
-      <w:proofErr w:type="spellEnd"/>
-      <w:r>
-        <w:rPr>
-          <w:lang w:val="en-GB"/>
-        </w:rPr>
-        <w:t xml:space="preserve"> </w:t>
-      </w:r>
-      <w:proofErr w:type="spellStart"/>
-      <w:r>
-        <w:rPr>
-          <w:lang w:val="en-GB"/>
-        </w:rPr>
-        <w:t>projekat</w:t>
-      </w:r>
-      <w:proofErr w:type="spellEnd"/>
-      <w:r>
-        <w:rPr>
-          <w:lang w:val="en-GB"/>
-        </w:rPr>
-        <w:t xml:space="preserve"> </w:t>
-      </w:r>
-      <w:proofErr w:type="spellStart"/>
-      <w:r>
-        <w:rPr>
-          <w:lang w:val="en-GB"/>
-        </w:rPr>
-        <w:t>koristimo</w:t>
-      </w:r>
-      <w:proofErr w:type="spellEnd"/>
-      <w:r>
-        <w:rPr>
-          <w:lang w:val="en-GB"/>
-        </w:rPr>
-        <w:t xml:space="preserve"> </w:t>
-      </w:r>
-      <w:proofErr w:type="spellStart"/>
-      <w:r>
-        <w:rPr>
-          <w:lang w:val="en-GB"/>
-        </w:rPr>
-        <w:t>napojnu</w:t>
-      </w:r>
-      <w:proofErr w:type="spellEnd"/>
-      <w:r>
-        <w:rPr>
-          <w:lang w:val="en-GB"/>
-        </w:rPr>
-        <w:t xml:space="preserve"> </w:t>
-      </w:r>
-      <w:proofErr w:type="spellStart"/>
-      <w:r>
-        <w:rPr>
-          <w:lang w:val="en-GB"/>
-        </w:rPr>
-        <w:t>jedinicu</w:t>
-      </w:r>
-      <w:proofErr w:type="spellEnd"/>
-      <w:r>
-        <w:rPr>
-          <w:lang w:val="en-GB"/>
-        </w:rPr>
-        <w:t xml:space="preserve"> od 5 V </w:t>
-      </w:r>
-      <w:proofErr w:type="spellStart"/>
-      <w:r>
-        <w:rPr>
-          <w:lang w:val="en-GB"/>
-        </w:rPr>
-        <w:t>i</w:t>
-      </w:r>
-      <w:proofErr w:type="spellEnd"/>
-      <w:r>
-        <w:rPr>
-          <w:lang w:val="en-GB"/>
-        </w:rPr>
-        <w:t xml:space="preserve"> 5 A, </w:t>
-      </w:r>
-      <w:proofErr w:type="spellStart"/>
-      <w:r>
-        <w:rPr>
-          <w:lang w:val="en-GB"/>
-        </w:rPr>
-        <w:t>koja</w:t>
-      </w:r>
-      <w:proofErr w:type="spellEnd"/>
-      <w:r>
-        <w:rPr>
-          <w:lang w:val="en-GB"/>
-        </w:rPr>
-        <w:t xml:space="preserve"> je </w:t>
-      </w:r>
-      <w:proofErr w:type="spellStart"/>
-      <w:r>
-        <w:rPr>
-          <w:lang w:val="en-GB"/>
-        </w:rPr>
-        <w:t>dovoljna</w:t>
-      </w:r>
-      <w:proofErr w:type="spellEnd"/>
-      <w:r>
-        <w:rPr>
-          <w:lang w:val="en-GB"/>
-        </w:rPr>
-        <w:t xml:space="preserve"> da </w:t>
-      </w:r>
-      <w:proofErr w:type="spellStart"/>
-      <w:r>
-        <w:rPr>
-          <w:lang w:val="en-GB"/>
-        </w:rPr>
-        <w:t>napaja</w:t>
-      </w:r>
-      <w:proofErr w:type="spellEnd"/>
-      <w:r>
-        <w:rPr>
-          <w:lang w:val="en-GB"/>
-        </w:rPr>
-        <w:t xml:space="preserve"> LED </w:t>
-      </w:r>
-      <w:proofErr w:type="spellStart"/>
-      <w:r>
-        <w:rPr>
-          <w:lang w:val="en-GB"/>
-        </w:rPr>
-        <w:t>matricu</w:t>
-      </w:r>
-      <w:proofErr w:type="spellEnd"/>
-      <w:r>
-        <w:rPr>
-          <w:lang w:val="en-GB"/>
-        </w:rPr>
-        <w:t xml:space="preserve"> </w:t>
-      </w:r>
-      <w:proofErr w:type="spellStart"/>
-      <w:r>
-        <w:rPr>
-          <w:lang w:val="en-GB"/>
-        </w:rPr>
-        <w:t>i</w:t>
-      </w:r>
-      <w:proofErr w:type="spellEnd"/>
-      <w:r>
-        <w:rPr>
-          <w:lang w:val="en-GB"/>
-        </w:rPr>
-        <w:t xml:space="preserve"> RGB </w:t>
-      </w:r>
-      <w:proofErr w:type="spellStart"/>
-      <w:r>
-        <w:rPr>
-          <w:lang w:val="en-GB"/>
-        </w:rPr>
-        <w:t>trake</w:t>
-      </w:r>
-      <w:proofErr w:type="spellEnd"/>
-      <w:r>
-        <w:rPr>
-          <w:lang w:val="en-GB"/>
-        </w:rPr>
-        <w:t xml:space="preserve"> </w:t>
-      </w:r>
-      <w:proofErr w:type="spellStart"/>
-      <w:r>
-        <w:rPr>
-          <w:lang w:val="en-GB"/>
-        </w:rPr>
-        <w:t>na</w:t>
-      </w:r>
-      <w:proofErr w:type="spellEnd"/>
-      <w:r>
-        <w:rPr>
-          <w:lang w:val="en-GB"/>
-        </w:rPr>
-        <w:t xml:space="preserve"> </w:t>
-      </w:r>
-      <w:proofErr w:type="spellStart"/>
-      <w:r>
-        <w:rPr>
-          <w:lang w:val="en-GB"/>
-        </w:rPr>
-        <w:t>slovima</w:t>
-      </w:r>
-      <w:proofErr w:type="spellEnd"/>
-      <w:r>
-        <w:rPr>
-          <w:lang w:val="en-GB"/>
-        </w:rPr>
-        <w:t xml:space="preserve">. </w:t>
-      </w:r>
-      <w:proofErr w:type="spellStart"/>
-      <w:r>
-        <w:rPr>
-          <w:lang w:val="en-GB"/>
-        </w:rPr>
-        <w:t>Ovaj</w:t>
-      </w:r>
-      <w:proofErr w:type="spellEnd"/>
-      <w:r>
-        <w:rPr>
-          <w:lang w:val="en-GB"/>
-        </w:rPr>
-        <w:t xml:space="preserve"> </w:t>
-      </w:r>
-      <w:proofErr w:type="spellStart"/>
-      <w:r>
-        <w:rPr>
-          <w:lang w:val="en-GB"/>
-        </w:rPr>
-        <w:t>izbor</w:t>
-      </w:r>
-      <w:proofErr w:type="spellEnd"/>
-      <w:r>
-        <w:rPr>
-          <w:lang w:val="en-GB"/>
-        </w:rPr>
-        <w:t xml:space="preserve"> </w:t>
-      </w:r>
-      <w:proofErr w:type="spellStart"/>
-      <w:r>
-        <w:rPr>
-          <w:lang w:val="en-GB"/>
-        </w:rPr>
-        <w:t>omogućava</w:t>
-      </w:r>
-      <w:proofErr w:type="spellEnd"/>
-      <w:r>
-        <w:rPr>
-          <w:lang w:val="en-GB"/>
-        </w:rPr>
-        <w:t xml:space="preserve"> </w:t>
-      </w:r>
-      <w:proofErr w:type="spellStart"/>
-      <w:r>
-        <w:rPr>
-          <w:lang w:val="en-GB"/>
-        </w:rPr>
-        <w:t>sigurno</w:t>
-      </w:r>
-      <w:proofErr w:type="spellEnd"/>
-      <w:r>
-        <w:rPr>
-          <w:lang w:val="en-GB"/>
-        </w:rPr>
-        <w:t xml:space="preserve"> </w:t>
-      </w:r>
-      <w:proofErr w:type="spellStart"/>
-      <w:r>
-        <w:rPr>
-          <w:lang w:val="en-GB"/>
-        </w:rPr>
-        <w:t>i</w:t>
-      </w:r>
-      <w:proofErr w:type="spellEnd"/>
-      <w:r>
-        <w:rPr>
-          <w:lang w:val="en-GB"/>
-        </w:rPr>
-        <w:t xml:space="preserve"> </w:t>
-      </w:r>
-      <w:proofErr w:type="spellStart"/>
-      <w:r>
-        <w:rPr>
-          <w:lang w:val="en-GB"/>
-        </w:rPr>
-        <w:t>stabilno</w:t>
-      </w:r>
-      <w:proofErr w:type="spellEnd"/>
-      <w:r>
-        <w:rPr>
-          <w:lang w:val="en-GB"/>
-        </w:rPr>
-        <w:t xml:space="preserve"> </w:t>
-      </w:r>
-      <w:proofErr w:type="spellStart"/>
-      <w:r>
-        <w:rPr>
-          <w:lang w:val="en-GB"/>
-        </w:rPr>
-        <w:t>napajanje</w:t>
-      </w:r>
-      <w:proofErr w:type="spellEnd"/>
-      <w:r>
-        <w:rPr>
-          <w:lang w:val="en-GB"/>
-        </w:rPr>
-        <w:t xml:space="preserve"> </w:t>
-      </w:r>
-      <w:proofErr w:type="spellStart"/>
-      <w:r>
-        <w:rPr>
-          <w:lang w:val="en-GB"/>
-        </w:rPr>
-        <w:t>svih</w:t>
-      </w:r>
-      <w:proofErr w:type="spellEnd"/>
-      <w:r>
-        <w:rPr>
-          <w:lang w:val="en-GB"/>
-        </w:rPr>
-        <w:t xml:space="preserve"> LED </w:t>
-      </w:r>
-      <w:proofErr w:type="spellStart"/>
-      <w:r>
-        <w:rPr>
-          <w:lang w:val="en-GB"/>
-        </w:rPr>
-        <w:t>dioda</w:t>
-      </w:r>
-      <w:proofErr w:type="spellEnd"/>
-      <w:r>
-        <w:rPr>
-          <w:lang w:val="en-GB"/>
-        </w:rPr>
-        <w:t xml:space="preserve">, bez </w:t>
-      </w:r>
-      <w:proofErr w:type="spellStart"/>
-      <w:r>
-        <w:rPr>
-          <w:lang w:val="en-GB"/>
-        </w:rPr>
-        <w:t>fluktuacija</w:t>
-      </w:r>
-      <w:proofErr w:type="spellEnd"/>
-      <w:r>
-        <w:rPr>
-          <w:lang w:val="en-GB"/>
-        </w:rPr>
-        <w:t xml:space="preserve"> </w:t>
-      </w:r>
-      <w:proofErr w:type="spellStart"/>
-      <w:r>
-        <w:rPr>
-          <w:lang w:val="en-GB"/>
-        </w:rPr>
-        <w:t>napona</w:t>
-      </w:r>
-      <w:proofErr w:type="spellEnd"/>
-      <w:r>
-        <w:rPr>
-          <w:lang w:val="en-GB"/>
-        </w:rPr>
-        <w:t xml:space="preserve"> </w:t>
-      </w:r>
-      <w:proofErr w:type="spellStart"/>
-      <w:r>
-        <w:rPr>
-          <w:lang w:val="en-GB"/>
-        </w:rPr>
-        <w:t>ili</w:t>
-      </w:r>
-      <w:proofErr w:type="spellEnd"/>
-      <w:r>
-        <w:rPr>
-          <w:lang w:val="en-GB"/>
-        </w:rPr>
-        <w:t xml:space="preserve"> </w:t>
-      </w:r>
-      <w:proofErr w:type="spellStart"/>
-      <w:r>
-        <w:rPr>
-          <w:lang w:val="en-GB"/>
-        </w:rPr>
-        <w:t>prenapona</w:t>
-      </w:r>
-      <w:proofErr w:type="spellEnd"/>
-      <w:r>
-        <w:rPr>
-          <w:lang w:val="en-GB"/>
-        </w:rPr>
-        <w:t xml:space="preserve">, </w:t>
-      </w:r>
-      <w:proofErr w:type="spellStart"/>
-      <w:r>
-        <w:rPr>
-          <w:lang w:val="en-GB"/>
-        </w:rPr>
-        <w:t>čime</w:t>
-      </w:r>
-      <w:proofErr w:type="spellEnd"/>
-      <w:r>
-        <w:rPr>
-          <w:lang w:val="en-GB"/>
-        </w:rPr>
-        <w:t xml:space="preserve"> se </w:t>
-      </w:r>
-      <w:proofErr w:type="spellStart"/>
-      <w:r>
-        <w:rPr>
-          <w:lang w:val="en-GB"/>
-        </w:rPr>
-        <w:t>osigurava</w:t>
-      </w:r>
-      <w:proofErr w:type="spellEnd"/>
-      <w:r>
-        <w:rPr>
-          <w:lang w:val="en-GB"/>
-        </w:rPr>
-        <w:t xml:space="preserve"> </w:t>
-      </w:r>
-      <w:proofErr w:type="spellStart"/>
-      <w:r>
-        <w:rPr>
-          <w:lang w:val="en-GB"/>
-        </w:rPr>
-        <w:t>pravilno</w:t>
-      </w:r>
-      <w:proofErr w:type="spellEnd"/>
-      <w:r>
-        <w:rPr>
-          <w:lang w:val="en-GB"/>
-        </w:rPr>
-        <w:t xml:space="preserve"> </w:t>
-      </w:r>
-      <w:proofErr w:type="spellStart"/>
-      <w:r>
-        <w:rPr>
-          <w:lang w:val="en-GB"/>
-        </w:rPr>
-        <w:t>i</w:t>
-      </w:r>
-      <w:proofErr w:type="spellEnd"/>
-      <w:r>
-        <w:rPr>
-          <w:lang w:val="en-GB"/>
-        </w:rPr>
-        <w:t xml:space="preserve"> </w:t>
-      </w:r>
-      <w:proofErr w:type="spellStart"/>
-      <w:r>
-        <w:rPr>
-          <w:lang w:val="en-GB"/>
-        </w:rPr>
-        <w:t>ujednačeno</w:t>
-      </w:r>
-      <w:proofErr w:type="spellEnd"/>
-      <w:r>
-        <w:rPr>
-          <w:lang w:val="en-GB"/>
-        </w:rPr>
-        <w:t xml:space="preserve"> </w:t>
-      </w:r>
-      <w:proofErr w:type="spellStart"/>
-      <w:r>
-        <w:rPr>
-          <w:lang w:val="en-GB"/>
-        </w:rPr>
-        <w:t>osvjetljenje</w:t>
-      </w:r>
-      <w:proofErr w:type="spellEnd"/>
-      <w:r>
-        <w:rPr>
-          <w:lang w:val="en-GB"/>
-        </w:rPr>
-        <w:t xml:space="preserve"> </w:t>
-      </w:r>
-      <w:proofErr w:type="spellStart"/>
-      <w:r>
-        <w:rPr>
-          <w:lang w:val="en-GB"/>
-        </w:rPr>
-        <w:t>i</w:t>
-      </w:r>
-      <w:proofErr w:type="spellEnd"/>
-      <w:r>
-        <w:rPr>
-          <w:lang w:val="en-GB"/>
-        </w:rPr>
-        <w:t xml:space="preserve"> </w:t>
-      </w:r>
-      <w:proofErr w:type="spellStart"/>
-      <w:r>
-        <w:rPr>
-          <w:lang w:val="en-GB"/>
-        </w:rPr>
-        <w:t>pouzdan</w:t>
-      </w:r>
-      <w:proofErr w:type="spellEnd"/>
-      <w:r>
-        <w:rPr>
-          <w:lang w:val="en-GB"/>
-        </w:rPr>
-        <w:t xml:space="preserve"> rad </w:t>
-      </w:r>
-      <w:proofErr w:type="spellStart"/>
-      <w:r>
-        <w:rPr>
-          <w:lang w:val="en-GB"/>
-        </w:rPr>
-        <w:t>sistema</w:t>
-      </w:r>
-      <w:proofErr w:type="spellEnd"/>
-      <w:r>
-        <w:rPr>
-          <w:lang w:val="en-GB"/>
-        </w:rPr>
-        <w:t>.</w:t>
-      </w:r>
-    </w:p>
-    <w:p>
-      <w:pPr>
-        <w:jc w:val="both"/>
-        <w:rPr>
-          <w:lang w:val="en-GB"/>
-        </w:rPr>
-      </w:pPr>
-    </w:p>
-    <w:p>
-      <w:pPr>
-        <w:jc w:val="both"/>
-        <w:rPr>
-          <w:lang w:val="en-GB"/>
-        </w:rPr>
       </w:pPr>
     </w:p>
     <w:p>
@@ -5204,7 +3938,7 @@
       <w:pPr>
         <w:pStyle w:val="Heading1"/>
       </w:pPr>
-      <w:bookmarkStart w:id="9" w:name="_Toc223797194"/>
+      <w:bookmarkStart w:id="8" w:name="_Toc223797194"/>
       <w:r>
         <w:lastRenderedPageBreak/>
         <w:t>3</w:t>
@@ -5215,7 +3949,7 @@
       <w:r>
         <w:t>Hardversko rješenje za School Bell System s LED reklamom</w:t>
       </w:r>
-      <w:bookmarkEnd w:id="9"/>
+      <w:bookmarkEnd w:id="8"/>
     </w:p>
     <w:p>
       <w:pPr>
@@ -5258,7 +3992,7 @@
                     <pic:cNvPicPr preferRelativeResize="0"/>
                   </pic:nvPicPr>
                   <pic:blipFill rotWithShape="1">
-                    <a:blip r:embed="rId15"/>
+                    <a:blip r:embed="rId16"/>
                     <a:srcRect b="6184"/>
                     <a:stretch/>
                   </pic:blipFill>
@@ -5319,7 +4053,7 @@
       <w:pPr>
         <w:pStyle w:val="Heading1"/>
       </w:pPr>
-      <w:bookmarkStart w:id="10" w:name="_Toc223797195"/>
+      <w:bookmarkStart w:id="9" w:name="_Toc223797195"/>
       <w:r>
         <w:lastRenderedPageBreak/>
         <w:t>4</w:t>
@@ -5328,35 +4062,433 @@
         <w:t xml:space="preserve">. </w:t>
       </w:r>
       <w:r>
-        <w:t>Softversko</w:t>
-      </w:r>
-      <w:r>
-        <w:t xml:space="preserve"> rješenje za School Bell System s LED reklamom</w:t>
-      </w:r>
+        <w:t>Softversko rješenje za School Bell System s LED reklamom</w:t>
+      </w:r>
+      <w:bookmarkEnd w:id="9"/>
+    </w:p>
+    <w:p>
+      <w:pPr>
+        <w:jc w:val="both"/>
+        <w:rPr>
+          <w:lang w:val="bs-Latn-BA" w:eastAsia="bs-Latn-BA"/>
+        </w:rPr>
+      </w:pPr>
+      <w:r>
+        <w:rPr>
+          <w:lang w:val="bs-Latn-BA" w:eastAsia="bs-Latn-BA"/>
+        </w:rPr>
+        <w:t>Softversko rješenje</w:t>
+      </w:r>
+      <w:r>
+        <w:rPr>
+          <w:lang w:val="bs-Latn-BA" w:eastAsia="bs-Latn-BA"/>
+        </w:rPr>
+        <w:t xml:space="preserve"> sastoji se iz dvije aplikacije</w:t>
+      </w:r>
+      <w:r>
+        <w:rPr>
+          <w:lang w:val="bs-Latn-BA" w:eastAsia="bs-Latn-BA"/>
+        </w:rPr>
+        <w:t xml:space="preserve"> kreirane na dvije različite platforme u dva različita okruženja. Za njihovu izradu korišteni su označeni (markup) jezici, poput HTML-a, CSS-a i JavaScript-a</w:t>
+      </w:r>
+      <w:r>
+        <w:rPr>
+          <w:lang w:val="bs-Latn-BA" w:eastAsia="bs-Latn-BA"/>
+        </w:rPr>
+        <w:t>, kao</w:t>
+      </w:r>
+      <w:r>
+        <w:rPr>
+          <w:lang w:val="bs-Latn-BA" w:eastAsia="bs-Latn-BA"/>
+        </w:rPr>
+        <w:t xml:space="preserve"> i programski jezik C#.</w:t>
+      </w:r>
+      <w:r>
+        <w:rPr>
+          <w:lang w:val="bs-Latn-BA" w:eastAsia="bs-Latn-BA"/>
+        </w:rPr>
+        <w:t xml:space="preserve"> Također, za izradu aplikacija korištena su sva različita editora: Microsoft Visual Studio 2022 (Windows aplikacija) i Visual Studio Code (Web-aplikacija). U nastavku slijedi objašnjenje tih platformi.</w:t>
+      </w:r>
+    </w:p>
+    <w:p>
+      <w:pPr>
+        <w:jc w:val="both"/>
+        <w:rPr>
+          <w:lang w:val="bs-Latn-BA" w:eastAsia="bs-Latn-BA"/>
+        </w:rPr>
+      </w:pPr>
+    </w:p>
+    <w:p>
+      <w:pPr>
+        <w:pStyle w:val="Heading2"/>
+      </w:pPr>
+      <w:r>
+        <w:t xml:space="preserve">4.1. </w:t>
+      </w:r>
+      <w:r>
+        <w:t>Microsoft Visual Studio</w:t>
+      </w:r>
+    </w:p>
+    <w:p>
+      <w:pPr>
+        <w:jc w:val="both"/>
+        <w:rPr>
+          <w:lang w:val="bs-Latn-BA" w:eastAsia="bs-Latn-BA"/>
+        </w:rPr>
+      </w:pPr>
+      <w:r>
+        <w:rPr>
+          <w:lang w:val="bs-Latn-BA" w:eastAsia="bs-Latn-BA"/>
+        </w:rPr>
+        <w:t>Microsoft Visual Studio je integ</w:t>
+      </w:r>
+      <w:r>
+        <w:rPr>
+          <w:lang w:val="bs-Latn-BA" w:eastAsia="bs-Latn-BA"/>
+        </w:rPr>
+        <w:t>risano</w:t>
+      </w:r>
+      <w:r>
+        <w:rPr>
+          <w:lang w:val="bs-Latn-BA" w:eastAsia="bs-Latn-BA"/>
+        </w:rPr>
+        <w:t xml:space="preserve"> razvojno okruženje (IDE) koga je razvio Microsoft. Koristi se za razvoj računarskih programa za Windows, web-s</w:t>
+      </w:r>
+      <w:r>
+        <w:rPr>
+          <w:lang w:val="bs-Latn-BA" w:eastAsia="bs-Latn-BA"/>
+        </w:rPr>
+        <w:t xml:space="preserve">tranica, aplikacija i druge usluge. </w:t>
+      </w:r>
+      <w:r>
+        <w:rPr>
+          <w:lang w:val="bs-Latn-BA" w:eastAsia="bs-Latn-BA"/>
+        </w:rPr>
+        <w:t xml:space="preserve">Visual Studio sadrži uređivač izvornog kôda koji podržava IntelliSense (komponenta koja predlaže ostatak kôda) kao i refaktoriranje </w:t>
+      </w:r>
+      <w:bookmarkStart w:id="10" w:name="_GoBack"/>
       <w:bookmarkEnd w:id="10"/>
-    </w:p>
-    <w:p>
-      <w:pPr>
-        <w:tabs>
-          <w:tab w:val="left" w:pos="5472"/>
-        </w:tabs>
+      <w:r>
         <w:rPr>
           <w:lang w:val="bs-Latn-BA" w:eastAsia="bs-Latn-BA"/>
         </w:rPr>
-      </w:pPr>
-    </w:p>
-    <w:p>
-      <w:pPr>
-        <w:pStyle w:val="Heading1"/>
-      </w:pPr>
-      <w:r>
+        <w:t xml:space="preserve">kôda. Integrirani program za otklanjanje grešaka (debugger) radi na nivou izvornog i mašinskog koda. Program također sadrži alate poput dizajnera oblika koji se koristi za pravljenje aplikacija s grafičkom korisničkim interfejsom, web-dizajnera, dizajnera klasa i dizajnera shema baza podataka. </w:t>
+      </w:r>
+    </w:p>
+    <w:p>
+      <w:pPr>
+        <w:jc w:val="both"/>
+        <w:rPr>
+          <w:lang w:val="bs-Latn-BA" w:eastAsia="bs-Latn-BA"/>
+        </w:rPr>
+      </w:pPr>
+    </w:p>
+    <w:p>
+      <w:pPr>
+        <w:jc w:val="both"/>
+        <w:rPr>
+          <w:lang w:val="bs-Latn-BA" w:eastAsia="bs-Latn-BA"/>
+        </w:rPr>
+      </w:pPr>
+      <w:r>
+        <w:rPr>
+          <w:lang w:val="bs-Latn-BA" w:eastAsia="bs-Latn-BA"/>
+        </w:rPr>
+        <w:t>Visual Studio podržava različite programske jezike i dozvoljava uređivaču kôda i debuggeru da podržava (u različitoj mjeri) gotovo bilo koji programski jezik, pod uvjetom da usluga za taj jezik postoji. Ugrađeni jezici su C, C++ i C++/CLI (preko Visual C++), VB.NET (preko Visual Basic .NET)-a, C# (preko Visual C#) i F# (počevši od programa Visual Studio 2010]).</w:t>
+      </w:r>
+    </w:p>
+    <w:p>
+      <w:pPr>
+        <w:jc w:val="both"/>
+        <w:rPr>
+          <w:lang w:val="bs-Latn-BA" w:eastAsia="bs-Latn-BA"/>
+        </w:rPr>
+      </w:pPr>
+    </w:p>
+    <w:p>
+      <w:pPr>
+        <w:rPr>
+          <w:lang w:val="bs-Latn-BA" w:eastAsia="bs-Latn-BA"/>
+        </w:rPr>
+      </w:pPr>
+      <w:r>
+        <w:rPr>
+          <w:noProof/>
+          <w:lang w:val="en-GB" w:eastAsia="en-GB"/>
+        </w:rPr>
+        <w:drawing>
+          <wp:anchor distT="0" distB="0" distL="114300" distR="114300" simplePos="0" relativeHeight="251662336" behindDoc="0" locked="0" layoutInCell="1" allowOverlap="1" wp14:anchorId="2A1EC156" wp14:editId="78EBCF10">
+            <wp:simplePos x="0" y="0"/>
+            <wp:positionH relativeFrom="column">
+              <wp:posOffset>1751330</wp:posOffset>
+            </wp:positionH>
+            <wp:positionV relativeFrom="paragraph">
+              <wp:posOffset>5715</wp:posOffset>
+            </wp:positionV>
+            <wp:extent cx="4008120" cy="2141220"/>
+            <wp:effectExtent l="0" t="0" r="0" b="0"/>
+            <wp:wrapSquare wrapText="bothSides"/>
+            <wp:docPr id="12" name="Picture 12" descr="Snimak ekrana programa Visual Studio 2013. Uređuje se izvorni kôd u programskom jeziku C++"/>
+            <wp:cNvGraphicFramePr>
+              <a:graphicFrameLocks xmlns:a="http://schemas.openxmlformats.org/drawingml/2006/main" noChangeAspect="1"/>
+            </wp:cNvGraphicFramePr>
+            <a:graphic xmlns:a="http://schemas.openxmlformats.org/drawingml/2006/main">
+              <a:graphicData uri="http://schemas.openxmlformats.org/drawingml/2006/picture">
+                <pic:pic xmlns:pic="http://schemas.openxmlformats.org/drawingml/2006/picture">
+                  <pic:nvPicPr>
+                    <pic:cNvPr id="0" name="Picture 3" descr="Snimak ekrana programa Visual Studio 2013. Uređuje se izvorni kôd u programskom jeziku C++"/>
+                    <pic:cNvPicPr>
+                      <a:picLocks noChangeAspect="1" noChangeArrowheads="1"/>
+                    </pic:cNvPicPr>
+                  </pic:nvPicPr>
+                  <pic:blipFill>
+                    <a:blip r:embed="rId17">
+                      <a:extLst>
+                        <a:ext uri="{28A0092B-C50C-407E-A947-70E740481C1C}">
+                          <a14:useLocalDpi xmlns:a14="http://schemas.microsoft.com/office/drawing/2010/main" val="0"/>
+                        </a:ext>
+                      </a:extLst>
+                    </a:blip>
+                    <a:srcRect/>
+                    <a:stretch>
+                      <a:fillRect/>
+                    </a:stretch>
+                  </pic:blipFill>
+                  <pic:spPr bwMode="auto">
+                    <a:xfrm>
+                      <a:off x="0" y="0"/>
+                      <a:ext cx="4008120" cy="2141220"/>
+                    </a:xfrm>
+                    <a:prstGeom prst="rect">
+                      <a:avLst/>
+                    </a:prstGeom>
+                    <a:noFill/>
+                    <a:ln>
+                      <a:noFill/>
+                    </a:ln>
+                  </pic:spPr>
+                </pic:pic>
+              </a:graphicData>
+            </a:graphic>
+            <wp14:sizeRelH relativeFrom="margin">
+              <wp14:pctWidth>0</wp14:pctWidth>
+            </wp14:sizeRelH>
+            <wp14:sizeRelV relativeFrom="margin">
+              <wp14:pctHeight>0</wp14:pctHeight>
+            </wp14:sizeRelV>
+          </wp:anchor>
+        </w:drawing>
+      </w:r>
+    </w:p>
+    <w:p>
+      <w:pPr>
+        <w:rPr>
+          <w:lang w:val="bs-Latn-BA" w:eastAsia="bs-Latn-BA"/>
+        </w:rPr>
+      </w:pPr>
+      <w:r>
+        <w:rPr>
+          <w:noProof/>
+          <w:lang w:val="en-GB" w:eastAsia="en-GB"/>
+        </w:rPr>
+        <w:drawing>
+          <wp:anchor distT="0" distB="0" distL="114300" distR="114300" simplePos="0" relativeHeight="251663360" behindDoc="0" locked="0" layoutInCell="1" allowOverlap="1" wp14:anchorId="1BEB22C0" wp14:editId="26A0E4FC">
+            <wp:simplePos x="0" y="0"/>
+            <wp:positionH relativeFrom="column">
+              <wp:posOffset>-121920</wp:posOffset>
+            </wp:positionH>
+            <wp:positionV relativeFrom="paragraph">
+              <wp:posOffset>135255</wp:posOffset>
+            </wp:positionV>
+            <wp:extent cx="1819275" cy="1493520"/>
+            <wp:effectExtent l="0" t="0" r="9525" b="0"/>
+            <wp:wrapSquare wrapText="bothSides"/>
+            <wp:docPr id="3" name="Picture 3" descr="Visualstudio 2022 Community(J) : Microsoft : Free Download, Borrow, and  Streaming : Internet Archive"/>
+            <wp:cNvGraphicFramePr>
+              <a:graphicFrameLocks xmlns:a="http://schemas.openxmlformats.org/drawingml/2006/main" noChangeAspect="1"/>
+            </wp:cNvGraphicFramePr>
+            <a:graphic xmlns:a="http://schemas.openxmlformats.org/drawingml/2006/main">
+              <a:graphicData uri="http://schemas.openxmlformats.org/drawingml/2006/picture">
+                <pic:pic xmlns:pic="http://schemas.openxmlformats.org/drawingml/2006/picture">
+                  <pic:nvPicPr>
+                    <pic:cNvPr id="0" name="Picture 1" descr="Visualstudio 2022 Community(J) : Microsoft : Free Download, Borrow, and  Streaming : Internet Archive"/>
+                    <pic:cNvPicPr>
+                      <a:picLocks noChangeAspect="1" noChangeArrowheads="1"/>
+                    </pic:cNvPicPr>
+                  </pic:nvPicPr>
+                  <pic:blipFill rotWithShape="1">
+                    <a:blip r:embed="rId18">
+                      <a:clrChange>
+                        <a:clrFrom>
+                          <a:srgbClr val="F0F0F0"/>
+                        </a:clrFrom>
+                        <a:clrTo>
+                          <a:srgbClr val="F0F0F0">
+                            <a:alpha val="0"/>
+                          </a:srgbClr>
+                        </a:clrTo>
+                      </a:clrChange>
+                      <a:extLst>
+                        <a:ext uri="{28A0092B-C50C-407E-A947-70E740481C1C}">
+                          <a14:useLocalDpi xmlns:a14="http://schemas.microsoft.com/office/drawing/2010/main" val="0"/>
+                        </a:ext>
+                      </a:extLst>
+                    </a:blip>
+                    <a:srcRect l="20636" r="22082"/>
+                    <a:stretch/>
+                  </pic:blipFill>
+                  <pic:spPr bwMode="auto">
+                    <a:xfrm>
+                      <a:off x="0" y="0"/>
+                      <a:ext cx="1819275" cy="1493520"/>
+                    </a:xfrm>
+                    <a:prstGeom prst="rect">
+                      <a:avLst/>
+                    </a:prstGeom>
+                    <a:noFill/>
+                    <a:ln>
+                      <a:noFill/>
+                    </a:ln>
+                    <a:extLst>
+                      <a:ext uri="{53640926-AAD7-44D8-BBD7-CCE9431645EC}">
+                        <a14:shadowObscured xmlns:a14="http://schemas.microsoft.com/office/drawing/2010/main"/>
+                      </a:ext>
+                    </a:extLst>
+                  </pic:spPr>
+                </pic:pic>
+              </a:graphicData>
+            </a:graphic>
+          </wp:anchor>
+        </w:drawing>
+      </w:r>
+    </w:p>
+    <w:p>
+      <w:pPr>
+        <w:rPr>
+          <w:lang w:val="bs-Latn-BA" w:eastAsia="bs-Latn-BA"/>
+        </w:rPr>
+      </w:pPr>
+    </w:p>
+    <w:p>
+      <w:pPr>
+        <w:jc w:val="center"/>
+        <w:rPr>
+          <w:i/>
+          <w:sz w:val="18"/>
+          <w:szCs w:val="18"/>
+          <w:lang w:val="bs-Latn-BA" w:eastAsia="bs-Latn-BA"/>
+        </w:rPr>
+      </w:pPr>
+      <w:r>
+        <w:rPr>
+          <w:i/>
+          <w:sz w:val="18"/>
+          <w:szCs w:val="18"/>
+          <w:lang w:val="bs-Latn-BA" w:eastAsia="bs-Latn-BA"/>
+        </w:rPr>
+        <w:t>Slika 4.1.1. izgled Microsoft Visual Studio okruženja</w:t>
+      </w:r>
+    </w:p>
+    <w:p>
+      <w:pPr>
+        <w:jc w:val="center"/>
+        <w:rPr>
+          <w:i/>
+          <w:sz w:val="18"/>
+          <w:szCs w:val="18"/>
+          <w:lang w:val="bs-Latn-BA" w:eastAsia="bs-Latn-BA"/>
+        </w:rPr>
+      </w:pPr>
+    </w:p>
+    <w:p>
+      <w:pPr>
+        <w:jc w:val="center"/>
+        <w:rPr>
+          <w:i/>
+          <w:sz w:val="18"/>
+          <w:szCs w:val="18"/>
+          <w:lang w:val="bs-Latn-BA" w:eastAsia="bs-Latn-BA"/>
+        </w:rPr>
+      </w:pPr>
+    </w:p>
+    <w:p>
+      <w:pPr>
+        <w:jc w:val="both"/>
+        <w:rPr>
+          <w:lang w:val="bs-Latn-BA" w:eastAsia="bs-Latn-BA"/>
+        </w:rPr>
+      </w:pPr>
+      <w:r>
+        <w:rPr>
+          <w:lang w:val="bs-Latn-BA" w:eastAsia="bs-Latn-BA"/>
+        </w:rPr>
+        <w:t>.NET je platforma otvorenog koda za izradu desktop, web i mobilnih aplikacija koje se mogu izvorno pokretati na bilo kojem operativnom sistemu. .NET sistem uključuje alate, biblioteke i jezike koji podržavaju moderan, skalabilan i visoko performansni razvoj softvera. Aktivna zajednica programera održava i podržava .NET platformu.</w:t>
+      </w:r>
+    </w:p>
+    <w:p>
+      <w:pPr>
+        <w:rPr>
+          <w:lang w:val="bs-Latn-BA" w:eastAsia="bs-Latn-BA"/>
+        </w:rPr>
+      </w:pPr>
+    </w:p>
+    <w:p>
+      <w:pPr>
+        <w:rPr>
+          <w:lang w:val="bs-Latn-BA" w:eastAsia="bs-Latn-BA"/>
+        </w:rPr>
+      </w:pPr>
+    </w:p>
+    <w:p>
+      <w:pPr>
+        <w:rPr>
+          <w:lang w:val="bs-Latn-BA" w:eastAsia="bs-Latn-BA"/>
+        </w:rPr>
+      </w:pPr>
+    </w:p>
+    <w:p>
+      <w:pPr>
+        <w:rPr>
+          <w:lang w:val="bs-Latn-BA" w:eastAsia="bs-Latn-BA"/>
+        </w:rPr>
+      </w:pPr>
+    </w:p>
+    <w:p>
+      <w:pPr>
+        <w:rPr>
+          <w:lang w:val="bs-Latn-BA" w:eastAsia="bs-Latn-BA"/>
+        </w:rPr>
+      </w:pPr>
+    </w:p>
+    <w:p>
+      <w:pPr>
+        <w:rPr>
+          <w:lang w:val="bs-Latn-BA" w:eastAsia="bs-Latn-BA"/>
+        </w:rPr>
+      </w:pPr>
+    </w:p>
+    <w:p>
+      <w:pPr>
+        <w:rPr>
+          <w:lang w:val="bs-Latn-BA" w:eastAsia="bs-Latn-BA"/>
+        </w:rPr>
+      </w:pPr>
+    </w:p>
+    <w:p>
+      <w:r>
+        <w:rPr>
+          <w:lang w:val="bs-Latn-BA" w:eastAsia="bs-Latn-BA"/>
+        </w:rPr>
         <w:br w:type="page"/>
       </w:r>
       <w:bookmarkStart w:id="11" w:name="_Toc247374830"/>
       <w:bookmarkStart w:id="12" w:name="_Toc223797196"/>
       <w:r>
         <w:lastRenderedPageBreak/>
-        <w:t>4. Zaključak</w:t>
+        <w:t>5</w:t>
+      </w:r>
+      <w:r>
+        <w:t>. Zaključak</w:t>
       </w:r>
       <w:bookmarkEnd w:id="11"/>
       <w:bookmarkEnd w:id="12"/>
@@ -5469,7 +4601,13 @@
           <w:lang w:val="hr-HR"/>
         </w:rPr>
         <w:lastRenderedPageBreak/>
-        <w:t>5. Literatura</w:t>
+        <w:t>6</w:t>
+      </w:r>
+      <w:r>
+        <w:rPr>
+          <w:lang w:val="hr-HR"/>
+        </w:rPr>
+        <w:t>. Literatura</w:t>
       </w:r>
       <w:bookmarkEnd w:id="13"/>
       <w:bookmarkEnd w:id="14"/>
@@ -5494,7 +4632,7 @@
         </w:rPr>
         <w:t xml:space="preserve">[1] </w:t>
       </w:r>
-      <w:hyperlink r:id="rId16" w:history="1">
+      <w:hyperlink r:id="rId19" w:history="1">
         <w:r>
           <w:rPr>
             <w:rStyle w:val="Hyperlink"/>
@@ -5526,7 +4664,7 @@
         </w:rPr>
         <w:t xml:space="preserve">[2] </w:t>
       </w:r>
-      <w:hyperlink r:id="rId17" w:history="1">
+      <w:hyperlink r:id="rId20" w:history="1">
         <w:r>
           <w:rPr>
             <w:rStyle w:val="Hyperlink"/>
@@ -5558,7 +4696,7 @@
         </w:rPr>
         <w:t xml:space="preserve">[3] </w:t>
       </w:r>
-      <w:hyperlink r:id="rId18" w:history="1">
+      <w:hyperlink r:id="rId21" w:history="1">
         <w:r>
           <w:rPr>
             <w:rStyle w:val="Hyperlink"/>
@@ -5590,7 +4728,7 @@
         </w:rPr>
         <w:t xml:space="preserve">[4] </w:t>
       </w:r>
-      <w:hyperlink r:id="rId19" w:history="1">
+      <w:hyperlink r:id="rId22" w:history="1">
         <w:r>
           <w:rPr>
             <w:rStyle w:val="Hyperlink"/>
@@ -5630,7 +4768,7 @@
         </w:rPr>
         <w:t xml:space="preserve">] </w:t>
       </w:r>
-      <w:hyperlink r:id="rId20" w:history="1">
+      <w:hyperlink r:id="rId23" w:history="1">
         <w:r>
           <w:rPr>
             <w:rStyle w:val="Hyperlink"/>
@@ -6066,7 +5204,7 @@
           </mc:Choice>
           <mc:Fallback>
             <w:pict>
-              <v:shapetype w14:anchorId="68900526" id="_x0000_t32" coordsize="21600,21600" o:spt="32" o:oned="t" path="m,l21600,21600e" filled="f">
+              <v:shapetype w14:anchorId="3BF745F0" id="_x0000_t32" coordsize="21600,21600" o:spt="32" o:oned="t" path="m,l21600,21600e" filled="f">
                 <v:path arrowok="t" fillok="f" o:connecttype="none"/>
                 <o:lock v:ext="edit" shapetype="t"/>
               </v:shapetype>
@@ -6162,7 +5300,7 @@
           </mc:Choice>
           <mc:Fallback>
             <w:pict>
-              <v:shape w14:anchorId="5E3222D8" id="Straight Arrow Connector 8" o:spid="_x0000_s1026" type="#_x0000_t32" style="position:absolute;margin-left:-.95pt;margin-top:64.95pt;width:454.7pt;height:0;z-index:251659264;visibility:visible;mso-wrap-style:square;mso-width-percent:0;mso-height-percent:0;mso-wrap-distance-left:9pt;mso-wrap-distance-top:-3e-5mm;mso-wrap-distance-right:9pt;mso-wrap-distance-bottom:-3e-5mm;mso-position-horizontal:absolute;mso-position-horizontal-relative:text;mso-position-vertical:absolute;mso-position-vertical-relative:text;mso-width-percent:0;mso-height-percent:0;mso-width-relative:page;mso-height-relative:page" o:gfxdata="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"/>
+              <v:shape w14:anchorId="35642180" id="Straight Arrow Connector 8" o:spid="_x0000_s1026" type="#_x0000_t32" style="position:absolute;margin-left:-.95pt;margin-top:64.95pt;width:454.7pt;height:0;z-index:251659264;visibility:visible;mso-wrap-style:square;mso-width-percent:0;mso-height-percent:0;mso-wrap-distance-left:9pt;mso-wrap-distance-top:-3e-5mm;mso-wrap-distance-right:9pt;mso-wrap-distance-bottom:-3e-5mm;mso-position-horizontal:absolute;mso-position-horizontal-relative:text;mso-position-vertical:absolute;mso-position-vertical-relative:text;mso-width-percent:0;mso-height-percent:0;mso-width-relative:page;mso-height-relative:page" o:gfxdata="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"/>
             </w:pict>
           </mc:Fallback>
         </mc:AlternateContent>
@@ -6236,7 +5374,7 @@
           </mc:Choice>
           <mc:Fallback>
             <w:pict>
-              <v:shape w14:anchorId="78F90E35" id="Straight Arrow Connector 7" o:spid="_x0000_s1026" type="#_x0000_t32" style="position:absolute;margin-left:-.95pt;margin-top:46.2pt;width:454.7pt;height:0;z-index:251658240;visibility:visible;mso-wrap-style:square;mso-width-percent:0;mso-height-percent:0;mso-wrap-distance-left:9pt;mso-wrap-distance-top:-3e-5mm;mso-wrap-distance-right:9pt;mso-wrap-distance-bottom:-3e-5mm;mso-position-horizontal:absolute;mso-position-horizontal-relative:text;mso-position-vertical:absolute;mso-position-vertical-relative:text;mso-width-percent:0;mso-height-percent:0;mso-width-relative:page;mso-height-relative:page" o:gfxdata="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"/>
+              <v:shape w14:anchorId="6F7BA30E" id="Straight Arrow Connector 7" o:spid="_x0000_s1026" type="#_x0000_t32" style="position:absolute;margin-left:-.95pt;margin-top:46.2pt;width:454.7pt;height:0;z-index:251658240;visibility:visible;mso-wrap-style:square;mso-width-percent:0;mso-height-percent:0;mso-wrap-distance-left:9pt;mso-wrap-distance-top:-3e-5mm;mso-wrap-distance-right:9pt;mso-wrap-distance-bottom:-3e-5mm;mso-position-horizontal:absolute;mso-position-horizontal-relative:text;mso-position-vertical:absolute;mso-position-vertical-relative:text;mso-width-percent:0;mso-height-percent:0;mso-width-relative:page;mso-height-relative:page" o:gfxdata="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"/>
             </w:pict>
           </mc:Fallback>
         </mc:AlternateContent>
@@ -6310,7 +5448,7 @@
           </mc:Choice>
           <mc:Fallback>
             <w:pict>
-              <v:shape w14:anchorId="2773CEEE" id="Straight Arrow Connector 6" o:spid="_x0000_s1026" type="#_x0000_t32" style="position:absolute;margin-left:-.95pt;margin-top:27.45pt;width:454.7pt;height:0;z-index:251657216;visibility:visible;mso-wrap-style:square;mso-width-percent:0;mso-height-percent:0;mso-wrap-distance-left:9pt;mso-wrap-distance-top:-3e-5mm;mso-wrap-distance-right:9pt;mso-wrap-distance-bottom:-3e-5mm;mso-position-horizontal:absolute;mso-position-horizontal-relative:text;mso-position-vertical:absolute;mso-position-vertical-relative:text;mso-width-percent:0;mso-height-percent:0;mso-width-relative:page;mso-height-relative:page" o:gfxdata="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"/>
+              <v:shape w14:anchorId="3D5F7E6C" id="Straight Arrow Connector 6" o:spid="_x0000_s1026" type="#_x0000_t32" style="position:absolute;margin-left:-.95pt;margin-top:27.45pt;width:454.7pt;height:0;z-index:251657216;visibility:visible;mso-wrap-style:square;mso-width-percent:0;mso-height-percent:0;mso-wrap-distance-left:9pt;mso-wrap-distance-top:-3e-5mm;mso-wrap-distance-right:9pt;mso-wrap-distance-bottom:-3e-5mm;mso-position-horizontal:absolute;mso-position-horizontal-relative:text;mso-position-vertical:absolute;mso-position-vertical-relative:text;mso-width-percent:0;mso-height-percent:0;mso-width-relative:page;mso-height-relative:page" o:gfxdata="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"/>
             </w:pict>
           </mc:Fallback>
         </mc:AlternateContent>
@@ -6384,7 +5522,7 @@
           </mc:Choice>
           <mc:Fallback>
             <w:pict>
-              <v:shape w14:anchorId="07DBE409" id="Straight Arrow Connector 5" o:spid="_x0000_s1026" type="#_x0000_t32" style="position:absolute;margin-left:-.95pt;margin-top:9.45pt;width:454.7pt;height:0;z-index:251656192;visibility:visible;mso-wrap-style:square;mso-width-percent:0;mso-height-percent:0;mso-wrap-distance-left:9pt;mso-wrap-distance-top:-3e-5mm;mso-wrap-distance-right:9pt;mso-wrap-distance-bottom:-3e-5mm;mso-position-horizontal:absolute;mso-position-horizontal-relative:text;mso-position-vertical:absolute;mso-position-vertical-relative:text;mso-width-percent:0;mso-height-percent:0;mso-width-relative:page;mso-height-relative:page" o:gfxdata="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"/>
+              <v:shape w14:anchorId="04B662EF" id="Straight Arrow Connector 5" o:spid="_x0000_s1026" type="#_x0000_t32" style="position:absolute;margin-left:-.95pt;margin-top:9.45pt;width:454.7pt;height:0;z-index:251656192;visibility:visible;mso-wrap-style:square;mso-width-percent:0;mso-height-percent:0;mso-wrap-distance-left:9pt;mso-wrap-distance-top:-3e-5mm;mso-wrap-distance-right:9pt;mso-wrap-distance-bottom:-3e-5mm;mso-position-horizontal:absolute;mso-position-horizontal-relative:text;mso-position-vertical:absolute;mso-position-vertical-relative:text;mso-width-percent:0;mso-height-percent:0;mso-width-relative:page;mso-height-relative:page" o:gfxdata="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"/>
             </w:pict>
           </mc:Fallback>
         </mc:AlternateContent>
@@ -8763,7 +7901,7 @@
 </file>
 
 <file path=customXml/itemProps1.xml><?xml version="1.0" encoding="utf-8"?>
-<ds:datastoreItem xmlns:ds="http://schemas.openxmlformats.org/officeDocument/2006/customXml" ds:itemID="{96BCA694-E3FD-403B-A468-24F1484F3B27}">
+<ds:datastoreItem xmlns:ds="http://schemas.openxmlformats.org/officeDocument/2006/customXml" ds:itemID="{5D1A8458-101A-4869-900C-8301651B2D1E}">
   <ds:schemaRefs>
     <ds:schemaRef ds:uri="http://schemas.openxmlformats.org/officeDocument/2006/bibliography"/>
   </ds:schemaRefs>

</xml_diff>

<commit_message>
documentation 45% + login .net fix
</commit_message>
<xml_diff>
--- a/docs/Maturski rad - urnek (1).docx
+++ b/docs/Maturski rad - urnek (1).docx
@@ -15,7 +15,7 @@
           <w:lang w:val="en-GB" w:eastAsia="en-GB"/>
         </w:rPr>
         <w:drawing>
-          <wp:anchor distT="0" distB="0" distL="114300" distR="114300" simplePos="0" relativeHeight="251654144" behindDoc="1" locked="0" layoutInCell="1" allowOverlap="1">
+          <wp:anchor distT="0" distB="0" distL="114300" distR="114300" simplePos="0" relativeHeight="251652096" behindDoc="1" locked="0" layoutInCell="1" allowOverlap="1">
             <wp:simplePos x="0" y="0"/>
             <wp:positionH relativeFrom="column">
               <wp:posOffset>1157605</wp:posOffset>
@@ -93,7 +93,7 @@
         <mc:AlternateContent>
           <mc:Choice Requires="wps">
             <w:drawing>
-              <wp:anchor distT="0" distB="0" distL="114300" distR="114300" simplePos="0" relativeHeight="251660288" behindDoc="0" locked="0" layoutInCell="1" allowOverlap="1">
+              <wp:anchor distT="0" distB="0" distL="114300" distR="114300" simplePos="0" relativeHeight="251658240" behindDoc="0" locked="0" layoutInCell="1" allowOverlap="1">
                 <wp:simplePos x="0" y="0"/>
                 <wp:positionH relativeFrom="column">
                   <wp:posOffset>-342900</wp:posOffset>
@@ -151,7 +151,7 @@
           </mc:Choice>
           <mc:Fallback>
             <w:pict>
-              <v:rect w14:anchorId="085E7E5D" id="Rectangle 26" o:spid="_x0000_s1026" style="position:absolute;margin-left:-27pt;margin-top:-73.05pt;width:423pt;height:81pt;z-index:251660288;visibility:visible;mso-wrap-style:square;mso-width-percent:0;mso-height-percent:0;mso-wrap-distance-left:9pt;mso-wrap-distance-top:0;mso-wrap-distance-right:9pt;mso-wrap-distance-bottom:0;mso-position-horizontal:absolute;mso-position-horizontal-relative:text;mso-position-vertical:absolute;mso-position-vertical-relative:text;mso-width-percent:0;mso-height-percent:0;mso-width-relative:page;mso-height-relative:page;v-text-anchor:top" o:gfxdata="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" strokecolor="white"/>
+              <v:rect w14:anchorId="102AE756" id="Rectangle 26" o:spid="_x0000_s1026" style="position:absolute;margin-left:-27pt;margin-top:-73.05pt;width:423pt;height:81pt;z-index:251658240;visibility:visible;mso-wrap-style:square;mso-width-percent:0;mso-height-percent:0;mso-wrap-distance-left:9pt;mso-wrap-distance-top:0;mso-wrap-distance-right:9pt;mso-wrap-distance-bottom:0;mso-position-horizontal:absolute;mso-position-horizontal-relative:text;mso-position-vertical:absolute;mso-position-vertical-relative:text;mso-width-percent:0;mso-height-percent:0;mso-width-relative:page;mso-height-relative:page;v-text-anchor:top" o:gfxdata="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" strokecolor="white"/>
             </w:pict>
           </mc:Fallback>
         </mc:AlternateContent>
@@ -671,7 +671,7 @@
         <mc:AlternateContent>
           <mc:Choice Requires="wps">
             <w:drawing>
-              <wp:anchor distT="0" distB="0" distL="114300" distR="114300" simplePos="0" relativeHeight="251661312" behindDoc="0" locked="0" layoutInCell="1" allowOverlap="1">
+              <wp:anchor distT="0" distB="0" distL="114300" distR="114300" simplePos="0" relativeHeight="251659264" behindDoc="0" locked="0" layoutInCell="1" allowOverlap="1">
                 <wp:simplePos x="0" y="0"/>
                 <wp:positionH relativeFrom="column">
                   <wp:posOffset>152400</wp:posOffset>
@@ -729,7 +729,7 @@
           </mc:Choice>
           <mc:Fallback>
             <w:pict>
-              <v:rect w14:anchorId="686D20C5" id="Rectangle 25" o:spid="_x0000_s1026" style="position:absolute;margin-left:12pt;margin-top:483.1pt;width:423pt;height:81pt;z-index:251661312;visibility:visible;mso-wrap-style:square;mso-width-percent:0;mso-height-percent:0;mso-wrap-distance-left:9pt;mso-wrap-distance-top:0;mso-wrap-distance-right:9pt;mso-wrap-distance-bottom:0;mso-position-horizontal:absolute;mso-position-horizontal-relative:text;mso-position-vertical:absolute;mso-position-vertical-relative:text;mso-width-percent:0;mso-height-percent:0;mso-width-relative:page;mso-height-relative:page;v-text-anchor:top" o:gfxdata="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" strokecolor="white"/>
+              <v:rect w14:anchorId="34698DC2" id="Rectangle 25" o:spid="_x0000_s1026" style="position:absolute;margin-left:12pt;margin-top:483.1pt;width:423pt;height:81pt;z-index:251659264;visibility:visible;mso-wrap-style:square;mso-width-percent:0;mso-height-percent:0;mso-wrap-distance-left:9pt;mso-wrap-distance-top:0;mso-wrap-distance-right:9pt;mso-wrap-distance-bottom:0;mso-position-horizontal:absolute;mso-position-horizontal-relative:text;mso-position-vertical:absolute;mso-position-vertical-relative:text;mso-width-percent:0;mso-height-percent:0;mso-width-relative:page;mso-height-relative:page;v-text-anchor:top" o:gfxdata="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" strokecolor="white"/>
             </w:pict>
           </mc:Fallback>
         </mc:AlternateContent>
@@ -802,7 +802,7 @@
           <w:r>
             <w:fldChar w:fldCharType="separate"/>
           </w:r>
-          <w:hyperlink w:anchor="_Toc223797189" w:history="1">
+          <w:hyperlink w:anchor="_Toc223818033" w:history="1">
             <w:r>
               <w:rPr>
                 <w:rStyle w:val="Hyperlink"/>
@@ -829,7 +829,7 @@
                 <w:noProof/>
                 <w:webHidden/>
               </w:rPr>
-              <w:instrText xml:space="preserve"> PAGEREF _Toc223797189 \h </w:instrText>
+              <w:instrText xml:space="preserve"> PAGEREF _Toc223818033 \h </w:instrText>
             </w:r>
             <w:r>
               <w:rPr>
@@ -874,7 +874,7 @@
               <w:lang w:val="en-GB" w:eastAsia="en-GB"/>
             </w:rPr>
           </w:pPr>
-          <w:hyperlink w:anchor="_Toc223797190" w:history="1">
+          <w:hyperlink w:anchor="_Toc223818034" w:history="1">
             <w:r>
               <w:rPr>
                 <w:rStyle w:val="Hyperlink"/>
@@ -901,7 +901,7 @@
                 <w:noProof/>
                 <w:webHidden/>
               </w:rPr>
-              <w:instrText xml:space="preserve"> PAGEREF _Toc223797190 \h </w:instrText>
+              <w:instrText xml:space="preserve"> PAGEREF _Toc223818034 \h </w:instrText>
             </w:r>
             <w:r>
               <w:rPr>
@@ -946,7 +946,7 @@
               <w:lang w:val="en-GB" w:eastAsia="en-GB"/>
             </w:rPr>
           </w:pPr>
-          <w:hyperlink w:anchor="_Toc223797191" w:history="1">
+          <w:hyperlink w:anchor="_Toc223818035" w:history="1">
             <w:r>
               <w:rPr>
                 <w:rStyle w:val="Hyperlink"/>
@@ -973,7 +973,7 @@
                 <w:noProof/>
                 <w:webHidden/>
               </w:rPr>
-              <w:instrText xml:space="preserve"> PAGEREF _Toc223797191 \h </w:instrText>
+              <w:instrText xml:space="preserve"> PAGEREF _Toc223818035 \h </w:instrText>
             </w:r>
             <w:r>
               <w:rPr>
@@ -1018,7 +1018,7 @@
               <w:lang w:val="en-GB" w:eastAsia="en-GB"/>
             </w:rPr>
           </w:pPr>
-          <w:hyperlink w:anchor="_Toc223797192" w:history="1">
+          <w:hyperlink w:anchor="_Toc223818036" w:history="1">
             <w:r>
               <w:rPr>
                 <w:rStyle w:val="Hyperlink"/>
@@ -1053,7 +1053,7 @@
                 <w:noProof/>
                 <w:webHidden/>
               </w:rPr>
-              <w:instrText xml:space="preserve"> PAGEREF _Toc223797192 \h </w:instrText>
+              <w:instrText xml:space="preserve"> PAGEREF _Toc223818036 \h </w:instrText>
             </w:r>
             <w:r>
               <w:rPr>
@@ -1098,7 +1098,7 @@
               <w:lang w:val="en-GB" w:eastAsia="en-GB"/>
             </w:rPr>
           </w:pPr>
-          <w:hyperlink w:anchor="_Toc223797193" w:history="1">
+          <w:hyperlink w:anchor="_Toc223818037" w:history="1">
             <w:r>
               <w:rPr>
                 <w:rStyle w:val="Hyperlink"/>
@@ -1133,7 +1133,7 @@
                 <w:noProof/>
                 <w:webHidden/>
               </w:rPr>
-              <w:instrText xml:space="preserve"> PAGEREF _Toc223797193 \h </w:instrText>
+              <w:instrText xml:space="preserve"> PAGEREF _Toc223818037 \h </w:instrText>
             </w:r>
             <w:r>
               <w:rPr>
@@ -1178,13 +1178,13 @@
               <w:lang w:val="en-GB" w:eastAsia="en-GB"/>
             </w:rPr>
           </w:pPr>
-          <w:hyperlink w:anchor="_Toc223797194" w:history="1">
+          <w:hyperlink w:anchor="_Toc223818038" w:history="1">
             <w:r>
               <w:rPr>
                 <w:rStyle w:val="Hyperlink"/>
                 <w:noProof/>
               </w:rPr>
-              <w:t>3. Hardversko rješenje za School Bell System s LED reklamom</w:t>
+              <w:t>3. Korištene tehnologije</w:t>
             </w:r>
             <w:r>
               <w:rPr>
@@ -1205,7 +1205,7 @@
                 <w:noProof/>
                 <w:webHidden/>
               </w:rPr>
-              <w:instrText xml:space="preserve"> PAGEREF _Toc223797194 \h </w:instrText>
+              <w:instrText xml:space="preserve"> PAGEREF _Toc223818038 \h </w:instrText>
             </w:r>
             <w:r>
               <w:rPr>
@@ -1226,6 +1226,222 @@
                 <w:webHidden/>
               </w:rPr>
               <w:t>8</w:t>
+            </w:r>
+            <w:r>
+              <w:rPr>
+                <w:noProof/>
+                <w:webHidden/>
+              </w:rPr>
+              <w:fldChar w:fldCharType="end"/>
+            </w:r>
+          </w:hyperlink>
+        </w:p>
+        <w:p>
+          <w:pPr>
+            <w:pStyle w:val="TOC2"/>
+            <w:tabs>
+              <w:tab w:val="right" w:leader="dot" w:pos="9062"/>
+            </w:tabs>
+            <w:rPr>
+              <w:rFonts w:asciiTheme="minorHAnsi" w:eastAsiaTheme="minorEastAsia" w:hAnsiTheme="minorHAnsi" w:cstheme="minorBidi"/>
+              <w:noProof/>
+              <w:sz w:val="22"/>
+              <w:szCs w:val="22"/>
+              <w:lang w:val="en-GB" w:eastAsia="en-GB"/>
+            </w:rPr>
+          </w:pPr>
+          <w:hyperlink w:anchor="_Toc223818039" w:history="1">
+            <w:r>
+              <w:rPr>
+                <w:rStyle w:val="Hyperlink"/>
+                <w:noProof/>
+              </w:rPr>
+              <w:t>3.1. Microsoft Visual Studio</w:t>
+            </w:r>
+            <w:r>
+              <w:rPr>
+                <w:noProof/>
+                <w:webHidden/>
+              </w:rPr>
+              <w:tab/>
+            </w:r>
+            <w:r>
+              <w:rPr>
+                <w:noProof/>
+                <w:webHidden/>
+              </w:rPr>
+              <w:fldChar w:fldCharType="begin"/>
+            </w:r>
+            <w:r>
+              <w:rPr>
+                <w:noProof/>
+                <w:webHidden/>
+              </w:rPr>
+              <w:instrText xml:space="preserve"> PAGEREF _Toc223818039 \h </w:instrText>
+            </w:r>
+            <w:r>
+              <w:rPr>
+                <w:noProof/>
+                <w:webHidden/>
+              </w:rPr>
+            </w:r>
+            <w:r>
+              <w:rPr>
+                <w:noProof/>
+                <w:webHidden/>
+              </w:rPr>
+              <w:fldChar w:fldCharType="separate"/>
+            </w:r>
+            <w:r>
+              <w:rPr>
+                <w:noProof/>
+                <w:webHidden/>
+              </w:rPr>
+              <w:t>8</w:t>
+            </w:r>
+            <w:r>
+              <w:rPr>
+                <w:noProof/>
+                <w:webHidden/>
+              </w:rPr>
+              <w:fldChar w:fldCharType="end"/>
+            </w:r>
+          </w:hyperlink>
+        </w:p>
+        <w:p>
+          <w:pPr>
+            <w:pStyle w:val="TOC2"/>
+            <w:tabs>
+              <w:tab w:val="right" w:leader="dot" w:pos="9062"/>
+            </w:tabs>
+            <w:rPr>
+              <w:rFonts w:asciiTheme="minorHAnsi" w:eastAsiaTheme="minorEastAsia" w:hAnsiTheme="minorHAnsi" w:cstheme="minorBidi"/>
+              <w:noProof/>
+              <w:sz w:val="22"/>
+              <w:szCs w:val="22"/>
+              <w:lang w:val="en-GB" w:eastAsia="en-GB"/>
+            </w:rPr>
+          </w:pPr>
+          <w:hyperlink w:anchor="_Toc223818040" w:history="1">
+            <w:r>
+              <w:rPr>
+                <w:rStyle w:val="Hyperlink"/>
+                <w:noProof/>
+              </w:rPr>
+              <w:t>3.2. Visual Studio Code</w:t>
+            </w:r>
+            <w:r>
+              <w:rPr>
+                <w:noProof/>
+                <w:webHidden/>
+              </w:rPr>
+              <w:tab/>
+            </w:r>
+            <w:r>
+              <w:rPr>
+                <w:noProof/>
+                <w:webHidden/>
+              </w:rPr>
+              <w:fldChar w:fldCharType="begin"/>
+            </w:r>
+            <w:r>
+              <w:rPr>
+                <w:noProof/>
+                <w:webHidden/>
+              </w:rPr>
+              <w:instrText xml:space="preserve"> PAGEREF _Toc223818040 \h </w:instrText>
+            </w:r>
+            <w:r>
+              <w:rPr>
+                <w:noProof/>
+                <w:webHidden/>
+              </w:rPr>
+            </w:r>
+            <w:r>
+              <w:rPr>
+                <w:noProof/>
+                <w:webHidden/>
+              </w:rPr>
+              <w:fldChar w:fldCharType="separate"/>
+            </w:r>
+            <w:r>
+              <w:rPr>
+                <w:noProof/>
+                <w:webHidden/>
+              </w:rPr>
+              <w:t>9</w:t>
+            </w:r>
+            <w:r>
+              <w:rPr>
+                <w:noProof/>
+                <w:webHidden/>
+              </w:rPr>
+              <w:fldChar w:fldCharType="end"/>
+            </w:r>
+          </w:hyperlink>
+        </w:p>
+        <w:p>
+          <w:pPr>
+            <w:pStyle w:val="TOC2"/>
+            <w:tabs>
+              <w:tab w:val="right" w:leader="dot" w:pos="9062"/>
+            </w:tabs>
+            <w:rPr>
+              <w:rFonts w:asciiTheme="minorHAnsi" w:eastAsiaTheme="minorEastAsia" w:hAnsiTheme="minorHAnsi" w:cstheme="minorBidi"/>
+              <w:noProof/>
+              <w:sz w:val="22"/>
+              <w:szCs w:val="22"/>
+              <w:lang w:val="en-GB" w:eastAsia="en-GB"/>
+            </w:rPr>
+          </w:pPr>
+          <w:hyperlink w:anchor="_Toc223818041" w:history="1">
+            <w:r>
+              <w:rPr>
+                <w:rStyle w:val="Hyperlink"/>
+                <w:noProof/>
+              </w:rPr>
+              <w:t>3.3. Arduino IDE</w:t>
+            </w:r>
+            <w:r>
+              <w:rPr>
+                <w:noProof/>
+                <w:webHidden/>
+              </w:rPr>
+              <w:tab/>
+            </w:r>
+            <w:r>
+              <w:rPr>
+                <w:noProof/>
+                <w:webHidden/>
+              </w:rPr>
+              <w:fldChar w:fldCharType="begin"/>
+            </w:r>
+            <w:r>
+              <w:rPr>
+                <w:noProof/>
+                <w:webHidden/>
+              </w:rPr>
+              <w:instrText xml:space="preserve"> PAGEREF _Toc223818041 \h </w:instrText>
+            </w:r>
+            <w:r>
+              <w:rPr>
+                <w:noProof/>
+                <w:webHidden/>
+              </w:rPr>
+            </w:r>
+            <w:r>
+              <w:rPr>
+                <w:noProof/>
+                <w:webHidden/>
+              </w:rPr>
+              <w:fldChar w:fldCharType="separate"/>
+            </w:r>
+            <w:r>
+              <w:rPr>
+                <w:noProof/>
+                <w:webHidden/>
+              </w:rPr>
+              <w:t>10</w:t>
             </w:r>
             <w:r>
               <w:rPr>
@@ -1250,13 +1466,13 @@
               <w:lang w:val="en-GB" w:eastAsia="en-GB"/>
             </w:rPr>
           </w:pPr>
-          <w:hyperlink w:anchor="_Toc223797195" w:history="1">
+          <w:hyperlink w:anchor="_Toc223818042" w:history="1">
             <w:r>
               <w:rPr>
                 <w:rStyle w:val="Hyperlink"/>
                 <w:noProof/>
               </w:rPr>
-              <w:t>4. Softversko rješenje za School Bell System s LED reklamom</w:t>
+              <w:t>4. Hardversko rješenje za School Bell System s LED reklamom</w:t>
             </w:r>
             <w:r>
               <w:rPr>
@@ -1277,7 +1493,7 @@
                 <w:noProof/>
                 <w:webHidden/>
               </w:rPr>
-              <w:instrText xml:space="preserve"> PAGEREF _Toc223797195 \h </w:instrText>
+              <w:instrText xml:space="preserve"> PAGEREF _Toc223818042 \h </w:instrText>
             </w:r>
             <w:r>
               <w:rPr>
@@ -1297,7 +1513,7 @@
                 <w:noProof/>
                 <w:webHidden/>
               </w:rPr>
-              <w:t>9</w:t>
+              <w:t>11</w:t>
             </w:r>
             <w:r>
               <w:rPr>
@@ -1322,13 +1538,13 @@
               <w:lang w:val="en-GB" w:eastAsia="en-GB"/>
             </w:rPr>
           </w:pPr>
-          <w:hyperlink w:anchor="_Toc223797196" w:history="1">
+          <w:hyperlink w:anchor="_Toc223818043" w:history="1">
             <w:r>
               <w:rPr>
                 <w:rStyle w:val="Hyperlink"/>
                 <w:noProof/>
               </w:rPr>
-              <w:t>4. Zaključak</w:t>
+              <w:t>5. Softversko rješenje za School Bell System s LED reklamom</w:t>
             </w:r>
             <w:r>
               <w:rPr>
@@ -1349,7 +1565,7 @@
                 <w:noProof/>
                 <w:webHidden/>
               </w:rPr>
-              <w:instrText xml:space="preserve"> PAGEREF _Toc223797196 \h </w:instrText>
+              <w:instrText xml:space="preserve"> PAGEREF _Toc223818043 \h </w:instrText>
             </w:r>
             <w:r>
               <w:rPr>
@@ -1369,7 +1585,79 @@
                 <w:noProof/>
                 <w:webHidden/>
               </w:rPr>
-              <w:t>10</w:t>
+              <w:t>12</w:t>
+            </w:r>
+            <w:r>
+              <w:rPr>
+                <w:noProof/>
+                <w:webHidden/>
+              </w:rPr>
+              <w:fldChar w:fldCharType="end"/>
+            </w:r>
+          </w:hyperlink>
+        </w:p>
+        <w:p>
+          <w:pPr>
+            <w:pStyle w:val="TOC2"/>
+            <w:tabs>
+              <w:tab w:val="right" w:leader="dot" w:pos="9062"/>
+            </w:tabs>
+            <w:rPr>
+              <w:rFonts w:asciiTheme="minorHAnsi" w:eastAsiaTheme="minorEastAsia" w:hAnsiTheme="minorHAnsi" w:cstheme="minorBidi"/>
+              <w:noProof/>
+              <w:sz w:val="22"/>
+              <w:szCs w:val="22"/>
+              <w:lang w:val="en-GB" w:eastAsia="en-GB"/>
+            </w:rPr>
+          </w:pPr>
+          <w:hyperlink w:anchor="_Toc223818044" w:history="1">
+            <w:r>
+              <w:rPr>
+                <w:rStyle w:val="Hyperlink"/>
+                <w:noProof/>
+              </w:rPr>
+              <w:t>5.1. Windows .NET aplikacija</w:t>
+            </w:r>
+            <w:r>
+              <w:rPr>
+                <w:noProof/>
+                <w:webHidden/>
+              </w:rPr>
+              <w:tab/>
+            </w:r>
+            <w:r>
+              <w:rPr>
+                <w:noProof/>
+                <w:webHidden/>
+              </w:rPr>
+              <w:fldChar w:fldCharType="begin"/>
+            </w:r>
+            <w:r>
+              <w:rPr>
+                <w:noProof/>
+                <w:webHidden/>
+              </w:rPr>
+              <w:instrText xml:space="preserve"> PAGEREF _Toc223818044 \h </w:instrText>
+            </w:r>
+            <w:r>
+              <w:rPr>
+                <w:noProof/>
+                <w:webHidden/>
+              </w:rPr>
+            </w:r>
+            <w:r>
+              <w:rPr>
+                <w:noProof/>
+                <w:webHidden/>
+              </w:rPr>
+              <w:fldChar w:fldCharType="separate"/>
+            </w:r>
+            <w:r>
+              <w:rPr>
+                <w:noProof/>
+                <w:webHidden/>
+              </w:rPr>
+              <w:t>12</w:t>
             </w:r>
             <w:r>
               <w:rPr>
@@ -1394,14 +1682,86 @@
               <w:lang w:val="en-GB" w:eastAsia="en-GB"/>
             </w:rPr>
           </w:pPr>
-          <w:hyperlink w:anchor="_Toc223797197" w:history="1">
+          <w:hyperlink w:anchor="_Toc223818045" w:history="1">
             <w:r>
               <w:rPr>
                 <w:rStyle w:val="Hyperlink"/>
                 <w:noProof/>
+              </w:rPr>
+              <w:t>6. Zaključak</w:t>
+            </w:r>
+            <w:r>
+              <w:rPr>
+                <w:noProof/>
+                <w:webHidden/>
+              </w:rPr>
+              <w:tab/>
+            </w:r>
+            <w:r>
+              <w:rPr>
+                <w:noProof/>
+                <w:webHidden/>
+              </w:rPr>
+              <w:fldChar w:fldCharType="begin"/>
+            </w:r>
+            <w:r>
+              <w:rPr>
+                <w:noProof/>
+                <w:webHidden/>
+              </w:rPr>
+              <w:instrText xml:space="preserve"> PAGEREF _Toc223818045 \h </w:instrText>
+            </w:r>
+            <w:r>
+              <w:rPr>
+                <w:noProof/>
+                <w:webHidden/>
+              </w:rPr>
+            </w:r>
+            <w:r>
+              <w:rPr>
+                <w:noProof/>
+                <w:webHidden/>
+              </w:rPr>
+              <w:fldChar w:fldCharType="separate"/>
+            </w:r>
+            <w:r>
+              <w:rPr>
+                <w:noProof/>
+                <w:webHidden/>
+              </w:rPr>
+              <w:t>14</w:t>
+            </w:r>
+            <w:r>
+              <w:rPr>
+                <w:noProof/>
+                <w:webHidden/>
+              </w:rPr>
+              <w:fldChar w:fldCharType="end"/>
+            </w:r>
+          </w:hyperlink>
+        </w:p>
+        <w:p>
+          <w:pPr>
+            <w:pStyle w:val="TOC1"/>
+            <w:tabs>
+              <w:tab w:val="right" w:leader="dot" w:pos="9062"/>
+            </w:tabs>
+            <w:rPr>
+              <w:rFonts w:asciiTheme="minorHAnsi" w:eastAsiaTheme="minorEastAsia" w:hAnsiTheme="minorHAnsi" w:cstheme="minorBidi"/>
+              <w:noProof/>
+              <w:sz w:val="22"/>
+              <w:szCs w:val="22"/>
+              <w:lang w:val="en-GB" w:eastAsia="en-GB"/>
+            </w:rPr>
+          </w:pPr>
+          <w:hyperlink w:anchor="_Toc223818046" w:history="1">
+            <w:r>
+              <w:rPr>
+                <w:rStyle w:val="Hyperlink"/>
+                <w:noProof/>
                 <w:lang w:val="hr-HR"/>
               </w:rPr>
-              <w:t>5. Literatura</w:t>
+              <w:t>7. Literatura</w:t>
             </w:r>
             <w:r>
               <w:rPr>
@@ -1422,7 +1782,7 @@
                 <w:noProof/>
                 <w:webHidden/>
               </w:rPr>
-              <w:instrText xml:space="preserve"> PAGEREF _Toc223797197 \h </w:instrText>
+              <w:instrText xml:space="preserve"> PAGEREF _Toc223818046 \h </w:instrText>
             </w:r>
             <w:r>
               <w:rPr>
@@ -1442,7 +1802,7 @@
                 <w:noProof/>
                 <w:webHidden/>
               </w:rPr>
-              <w:t>11</w:t>
+              <w:t>15</w:t>
             </w:r>
             <w:r>
               <w:rPr>
@@ -1472,6 +1832,8 @@
           <w:lang w:val="hr-HR"/>
         </w:rPr>
       </w:pPr>
+      <w:bookmarkStart w:id="1" w:name="_GoBack"/>
+      <w:bookmarkEnd w:id="1"/>
     </w:p>
     <w:p>
       <w:pPr>
@@ -1491,7 +1853,7 @@
         </w:rPr>
         <w:br w:type="page"/>
       </w:r>
-      <w:bookmarkStart w:id="1" w:name="_Toc223797189"/>
+      <w:bookmarkStart w:id="2" w:name="_Toc223818033"/>
       <w:r>
         <w:lastRenderedPageBreak/>
         <w:t>1.</w:t>
@@ -1503,7 +1865,7 @@
       <w:r>
         <w:t>d</w:t>
       </w:r>
-      <w:bookmarkEnd w:id="1"/>
+      <w:bookmarkEnd w:id="2"/>
     </w:p>
     <w:p>
       <w:pPr>
@@ -1595,17 +1957,20 @@
       <w:pPr>
         <w:pStyle w:val="Heading1"/>
       </w:pPr>
-      <w:bookmarkStart w:id="2" w:name="_Toc247374825"/>
-      <w:bookmarkStart w:id="3" w:name="_Toc223797190"/>
+      <w:bookmarkStart w:id="3" w:name="_Toc247374825"/>
+      <w:bookmarkStart w:id="4" w:name="_Toc223818034"/>
       <w:r>
         <w:lastRenderedPageBreak/>
         <w:t xml:space="preserve">2. </w:t>
       </w:r>
-      <w:bookmarkEnd w:id="2"/>
-      <w:r>
-        <w:t>Korištene komponente i tehnička osnova</w:t>
-      </w:r>
       <w:bookmarkEnd w:id="3"/>
+      <w:r>
+        <w:t xml:space="preserve">Korištene komponente i </w:t>
+      </w:r>
+      <w:r>
+        <w:t>tehnička osnova</w:t>
+      </w:r>
+      <w:bookmarkEnd w:id="4"/>
     </w:p>
     <w:p>
       <w:pPr>
@@ -1735,7 +2100,7 @@
                 <w:lang w:val="en-GB" w:eastAsia="en-GB"/>
               </w:rPr>
               <w:drawing>
-                <wp:inline distT="0" distB="0" distL="0" distR="0" wp14:anchorId="6A2CAD3D" wp14:editId="4EFEF498">
+                <wp:inline distT="0" distB="0" distL="0" distR="0" wp14:anchorId="0E4AB1E1" wp14:editId="6296B7C3">
                   <wp:extent cx="1043940" cy="1043940"/>
                   <wp:effectExtent l="0" t="0" r="0" b="0"/>
                   <wp:docPr id="11" name="Picture 11" descr="ESP32-DevKitC-S1 Espressif Systems | Mouser Hungary"/>
@@ -1881,7 +2246,7 @@
                 <w:lang w:val="en-GB" w:eastAsia="en-GB"/>
               </w:rPr>
               <w:drawing>
-                <wp:inline distT="0" distB="0" distL="0" distR="0" wp14:anchorId="25FA5997" wp14:editId="104BBEB0">
+                <wp:inline distT="0" distB="0" distL="0" distR="0" wp14:anchorId="4B14A86E" wp14:editId="728E4FB6">
                   <wp:extent cx="1306567" cy="1165860"/>
                   <wp:effectExtent l="0" t="0" r="0" b="0"/>
                   <wp:docPr id="15" name="Picture 15"/>
@@ -1997,7 +2362,7 @@
                 <w:lang w:val="en-GB" w:eastAsia="en-GB"/>
               </w:rPr>
               <w:drawing>
-                <wp:inline distT="0" distB="0" distL="0" distR="0" wp14:anchorId="44DF2EB1" wp14:editId="410F2474">
+                <wp:inline distT="0" distB="0" distL="0" distR="0" wp14:anchorId="5894EB75" wp14:editId="6419C889">
                   <wp:extent cx="1090716" cy="960120"/>
                   <wp:effectExtent l="0" t="0" r="0" b="0"/>
                   <wp:docPr id="16" name="Picture 16"/>
@@ -2113,7 +2478,7 @@
                 <w:lang w:val="en-GB" w:eastAsia="en-GB"/>
               </w:rPr>
               <w:drawing>
-                <wp:inline distT="0" distB="0" distL="0" distR="0" wp14:anchorId="7CF63C0C" wp14:editId="0D6A8442">
+                <wp:inline distT="0" distB="0" distL="0" distR="0" wp14:anchorId="4C2F123A" wp14:editId="44DB0879">
                   <wp:extent cx="944880" cy="944880"/>
                   <wp:effectExtent l="0" t="0" r="7620" b="7620"/>
                   <wp:docPr id="17" name="Picture 17" descr="School Ring Time Bell 8 inch Stainless Steel Electric Bell Ring Factory  Agencies School Home Use 220V 35W : Amazon.com.au: Home Improvement"/>
@@ -2227,10 +2592,11 @@
             </w:pPr>
             <w:r>
               <w:rPr>
-                <w:lang w:val="hr-HR" w:eastAsia="bs-Latn-BA"/>
+                <w:noProof/>
+                <w:lang w:val="en-GB" w:eastAsia="en-GB"/>
               </w:rPr>
               <w:drawing>
-                <wp:inline distT="0" distB="0" distL="0" distR="0" wp14:anchorId="72CC37B5" wp14:editId="7CEFC992">
+                <wp:inline distT="0" distB="0" distL="0" distR="0" wp14:anchorId="21E0D5C9" wp14:editId="497652F7">
                   <wp:extent cx="1135073" cy="998220"/>
                   <wp:effectExtent l="0" t="0" r="8255" b="0"/>
                   <wp:docPr id="2" name="Picture 2"/>
@@ -2312,17 +2678,17 @@
       <w:r>
         <w:br w:type="page"/>
       </w:r>
-      <w:bookmarkStart w:id="4" w:name="_Toc247374826"/>
-      <w:bookmarkStart w:id="5" w:name="_Toc223797191"/>
+      <w:bookmarkStart w:id="5" w:name="_Toc247374826"/>
+      <w:bookmarkStart w:id="6" w:name="_Toc223818035"/>
       <w:r>
         <w:lastRenderedPageBreak/>
         <w:t xml:space="preserve">2.1. </w:t>
       </w:r>
-      <w:bookmarkEnd w:id="4"/>
+      <w:bookmarkEnd w:id="5"/>
       <w:r>
         <w:t>Esp32 mikrokontroler</w:t>
       </w:r>
-      <w:bookmarkEnd w:id="5"/>
+      <w:bookmarkEnd w:id="6"/>
     </w:p>
     <w:p>
       <w:pPr>
@@ -2604,7 +2970,7 @@
           <w:lang w:val="en-GB" w:eastAsia="en-GB"/>
         </w:rPr>
         <w:drawing>
-          <wp:inline distT="0" distB="0" distL="0" distR="0" wp14:anchorId="4A60A108" wp14:editId="780E8D90">
+          <wp:inline distT="0" distB="0" distL="0" distR="0" wp14:anchorId="5B59AA7E" wp14:editId="19EE78AB">
             <wp:extent cx="4381595" cy="2324100"/>
             <wp:effectExtent l="0" t="0" r="0" b="0"/>
             <wp:docPr id="1" name="Picture 1"/>
@@ -2763,7 +3129,7 @@
           <w:lang w:val="hr-HR"/>
         </w:rPr>
       </w:pPr>
-      <w:bookmarkStart w:id="6" w:name="_Toc223797192"/>
+      <w:bookmarkStart w:id="7" w:name="_Toc223818036"/>
       <w:r>
         <w:t xml:space="preserve">2.2. </w:t>
       </w:r>
@@ -2791,7 +3157,7 @@
         </w:rPr>
         <w:t xml:space="preserve"> 32x64 P4 (RGB)</w:t>
       </w:r>
-      <w:bookmarkEnd w:id="6"/>
+      <w:bookmarkEnd w:id="7"/>
     </w:p>
     <w:p>
       <w:pPr>
@@ -2842,7 +3208,7 @@
           <w:lang w:val="en-GB" w:eastAsia="en-GB"/>
         </w:rPr>
         <w:drawing>
-          <wp:inline distT="0" distB="0" distL="0" distR="0" wp14:anchorId="6159CF76" wp14:editId="4D78CF56">
+          <wp:inline distT="0" distB="0" distL="0" distR="0" wp14:anchorId="6C980A3D" wp14:editId="1FCDC95D">
             <wp:extent cx="5218583" cy="2255520"/>
             <wp:effectExtent l="0" t="0" r="0" b="0"/>
             <wp:docPr id="19" name="Picture 19" descr="RGB Full-Color LED Matrix Panel, 4mm Pitch, 64×32 Pixels, Adjustable  Brightness | RGB-Matrix-P4-64x32"/>
@@ -3801,7 +4167,7 @@
           <w:lang w:val="hr-HR"/>
         </w:rPr>
       </w:pPr>
-      <w:bookmarkStart w:id="7" w:name="_Toc223797193"/>
+      <w:bookmarkStart w:id="8" w:name="_Toc223818037"/>
       <w:r>
         <w:t xml:space="preserve">2.3. </w:t>
       </w:r>
@@ -3811,7 +4177,7 @@
         </w:rPr>
         <w:t>Napojna jedinica</w:t>
       </w:r>
-      <w:bookmarkEnd w:id="7"/>
+      <w:bookmarkEnd w:id="8"/>
     </w:p>
     <w:p>
       <w:pPr>
@@ -3923,13 +4289,29 @@
     </w:p>
     <w:p>
       <w:pPr>
-        <w:rPr>
-          <w:lang w:val="hr-HR"/>
-        </w:rPr>
-      </w:pPr>
-      <w:r>
-        <w:rPr>
-          <w:lang w:val="hr-HR"/>
+        <w:jc w:val="both"/>
+        <w:rPr>
+          <w:lang w:val="en-GB"/>
+        </w:rPr>
+      </w:pPr>
+    </w:p>
+    <w:p>
+      <w:pPr>
+        <w:jc w:val="both"/>
+        <w:rPr>
+          <w:lang w:val="en-GB"/>
+        </w:rPr>
+      </w:pPr>
+    </w:p>
+    <w:p>
+      <w:pPr>
+        <w:rPr>
+          <w:lang w:val="en-GB"/>
+        </w:rPr>
+      </w:pPr>
+      <w:r>
+        <w:rPr>
+          <w:lang w:val="en-GB"/>
         </w:rPr>
         <w:br w:type="page"/>
       </w:r>
@@ -3938,10 +4320,1056 @@
       <w:pPr>
         <w:pStyle w:val="Heading1"/>
       </w:pPr>
-      <w:bookmarkStart w:id="8" w:name="_Toc223797194"/>
+      <w:bookmarkStart w:id="9" w:name="_Toc223818038"/>
       <w:r>
         <w:lastRenderedPageBreak/>
-        <w:t>3</w:t>
+        <w:t>3. Korištene tehnologije</w:t>
+      </w:r>
+      <w:bookmarkEnd w:id="9"/>
+    </w:p>
+    <w:p>
+      <w:pPr>
+        <w:rPr>
+          <w:lang w:val="bs-Latn-BA" w:eastAsia="bs-Latn-BA"/>
+        </w:rPr>
+      </w:pPr>
+    </w:p>
+    <w:p>
+      <w:pPr>
+        <w:jc w:val="both"/>
+        <w:rPr>
+          <w:lang w:val="hr-HR"/>
+        </w:rPr>
+      </w:pPr>
+      <w:r>
+        <w:rPr>
+          <w:lang w:val="hr-HR"/>
+        </w:rPr>
+        <w:t>U izradi ovog maturskog rada korišten je niz tehnologija i razvojnih okruženja koja su omogućila realizaciju funkcionalnosti sistema. Ključnu ulogu u razvoju imali su programski jezici C++ i C#, koji su korišteni za implementaciju logike mikrokontrolerskog sistema i desktop aplikacije. Pored njih, značajnu ulogu imao je i JavaScript, dok su za izradu korisničkog interfejsa web aplikacije korišteni označivački (markup) jezici HTML i CSS. Za praćenje promjena u kodu i međusobnu koordinaciju razvoja korišten je GitHub, pri čemu su izmjene slane i preuzimane putem PowerShell-a, omogućavajući efikasnu saradnju između članova tima.</w:t>
+      </w:r>
+    </w:p>
+    <w:p>
+      <w:pPr>
+        <w:jc w:val="both"/>
+        <w:rPr>
+          <w:lang w:val="hr-HR"/>
+        </w:rPr>
+      </w:pPr>
+    </w:p>
+    <w:p>
+      <w:pPr>
+        <w:jc w:val="both"/>
+        <w:rPr>
+          <w:lang w:val="hr-HR"/>
+        </w:rPr>
+      </w:pPr>
+      <w:r>
+        <w:rPr>
+          <w:lang w:val="hr-HR"/>
+        </w:rPr>
+        <w:t>Za razvoj i testiranje softvera korišteno je više razvojnih platformi. Microsoft Visual Studio korišten je za razvoj desktop aplikacije u .NET okruženju koristeći C#, dok je Visual Studio Code pružao efikasno okruženje za rad sa HTML, CSS i JavaScript tehnologijama. Programiranje i komunikacija sa ESP32 mikrokontrolerom realizovana je pomoću Arduino IDE, koja omogućava jednostavno pisanje, kompajliranje i učitavanje programa na mikrokontroler.</w:t>
+      </w:r>
+    </w:p>
+    <w:p>
+      <w:pPr>
+        <w:jc w:val="both"/>
+        <w:rPr>
+          <w:lang w:val="hr-HR"/>
+        </w:rPr>
+      </w:pPr>
+    </w:p>
+    <w:p>
+      <w:pPr>
+        <w:jc w:val="both"/>
+        <w:rPr>
+          <w:lang w:val="hr-HR"/>
+        </w:rPr>
+      </w:pPr>
+      <w:r>
+        <w:rPr>
+          <w:lang w:val="hr-HR"/>
+        </w:rPr>
+        <w:t>U nastavku slijedi detaljnije objašnjenje korištenih platformi i alata.</w:t>
+      </w:r>
+    </w:p>
+    <w:p>
+      <w:pPr>
+        <w:jc w:val="both"/>
+        <w:rPr>
+          <w:lang w:val="hr-HR"/>
+        </w:rPr>
+      </w:pPr>
+    </w:p>
+    <w:p>
+      <w:pPr>
+        <w:pStyle w:val="Heading2"/>
+      </w:pPr>
+      <w:bookmarkStart w:id="10" w:name="_Toc223818039"/>
+      <w:r>
+        <w:t xml:space="preserve">3.1. </w:t>
+      </w:r>
+      <w:r>
+        <w:t>Microsoft Visual Studio</w:t>
+      </w:r>
+      <w:bookmarkEnd w:id="10"/>
+      <w:r>
+        <w:t xml:space="preserve"> </w:t>
+      </w:r>
+    </w:p>
+    <w:p>
+      <w:pPr>
+        <w:jc w:val="both"/>
+        <w:rPr>
+          <w:lang w:val="bs-Latn-BA" w:eastAsia="bs-Latn-BA"/>
+        </w:rPr>
+      </w:pPr>
+      <w:r>
+        <w:rPr>
+          <w:lang w:val="bs-Latn-BA" w:eastAsia="bs-Latn-BA"/>
+        </w:rPr>
+        <w:t>Microsoft Visual Studio je integ</w:t>
+      </w:r>
+      <w:r>
+        <w:rPr>
+          <w:lang w:val="bs-Latn-BA" w:eastAsia="bs-Latn-BA"/>
+        </w:rPr>
+        <w:t>risano</w:t>
+      </w:r>
+      <w:r>
+        <w:rPr>
+          <w:lang w:val="bs-Latn-BA" w:eastAsia="bs-Latn-BA"/>
+        </w:rPr>
+        <w:t xml:space="preserve"> razvojno okruženje (IDE) koga je razvio Microsoft. Koristi se za razvoj računarskih programa za Windows, web-s</w:t>
+      </w:r>
+      <w:r>
+        <w:rPr>
+          <w:lang w:val="bs-Latn-BA" w:eastAsia="bs-Latn-BA"/>
+        </w:rPr>
+        <w:t xml:space="preserve">tranice, aplikacije i druge usluge. </w:t>
+      </w:r>
+      <w:r>
+        <w:rPr>
+          <w:lang w:val="bs-Latn-BA" w:eastAsia="bs-Latn-BA"/>
+        </w:rPr>
+        <w:t xml:space="preserve">Visual Studio sadrži uređivač izvornog kôda koji podržava IntelliSense (komponenta koja predlaže ostatak kôda) kao i refaktoriranje kôda. Integrirani program za otklanjanje grešaka (debugger) radi na nivou izvornog i mašinskog koda. Program također sadrži alate poput dizajnera oblika koji se koristi za pravljenje aplikacija s grafičkom korisničkim interfejsom, web-dizajnera, dizajnera klasa i dizajnera shema baza podataka. </w:t>
+      </w:r>
+    </w:p>
+    <w:p>
+      <w:pPr>
+        <w:jc w:val="both"/>
+        <w:rPr>
+          <w:lang w:val="bs-Latn-BA" w:eastAsia="bs-Latn-BA"/>
+        </w:rPr>
+      </w:pPr>
+    </w:p>
+    <w:p>
+      <w:pPr>
+        <w:jc w:val="both"/>
+        <w:rPr>
+          <w:lang w:val="bs-Latn-BA" w:eastAsia="bs-Latn-BA"/>
+        </w:rPr>
+      </w:pPr>
+      <w:r>
+        <w:rPr>
+          <w:lang w:val="bs-Latn-BA" w:eastAsia="bs-Latn-BA"/>
+        </w:rPr>
+        <w:t xml:space="preserve">Visual Studio podržava različite programske jezike i dozvoljava uređivaču kôda i debuggeru da podržava (u različitoj mjeri) gotovo bilo koji programski jezik, pod </w:t>
+      </w:r>
+      <w:r>
+        <w:rPr>
+          <w:lang w:val="bs-Latn-BA" w:eastAsia="bs-Latn-BA"/>
+        </w:rPr>
+        <w:t>uslovom</w:t>
+      </w:r>
+      <w:r>
+        <w:rPr>
+          <w:lang w:val="bs-Latn-BA" w:eastAsia="bs-Latn-BA"/>
+        </w:rPr>
+        <w:t xml:space="preserve"> da usluga za taj jezik postoji. Ugrađeni jezici su C, C++ i C++/CLI (preko Visual C++), VB.NET (preko Visual Basic .NET)-a, C# (preko Visual C#) i F# (počevši</w:t>
+      </w:r>
+      <w:r>
+        <w:rPr>
+          <w:lang w:val="bs-Latn-BA" w:eastAsia="bs-Latn-BA"/>
+        </w:rPr>
+        <w:t xml:space="preserve"> od programa Visual Studio 2010</w:t>
+      </w:r>
+      <w:r>
+        <w:rPr>
+          <w:lang w:val="bs-Latn-BA" w:eastAsia="bs-Latn-BA"/>
+        </w:rPr>
+        <w:t>).</w:t>
+      </w:r>
+    </w:p>
+    <w:p>
+      <w:pPr>
+        <w:jc w:val="both"/>
+        <w:rPr>
+          <w:lang w:val="bs-Latn-BA" w:eastAsia="bs-Latn-BA"/>
+        </w:rPr>
+      </w:pPr>
+    </w:p>
+    <w:p>
+      <w:pPr>
+        <w:jc w:val="both"/>
+        <w:rPr>
+          <w:lang w:val="bs-Latn-BA" w:eastAsia="bs-Latn-BA"/>
+        </w:rPr>
+      </w:pPr>
+      <w:r>
+        <w:rPr>
+          <w:noProof/>
+          <w:lang w:val="en-GB" w:eastAsia="en-GB"/>
+        </w:rPr>
+        <mc:AlternateContent>
+          <mc:Choice Requires="wpg">
+            <w:drawing>
+              <wp:inline distT="0" distB="0" distL="0" distR="0" wp14:anchorId="34B2AA5C" wp14:editId="453E6064">
+                <wp:extent cx="5745480" cy="2141220"/>
+                <wp:effectExtent l="0" t="0" r="7620" b="0"/>
+                <wp:docPr id="23" name="Group 23"/>
+                <wp:cNvGraphicFramePr/>
+                <a:graphic xmlns:a="http://schemas.openxmlformats.org/drawingml/2006/main">
+                  <a:graphicData uri="http://schemas.microsoft.com/office/word/2010/wordprocessingGroup">
+                    <wpg:wgp>
+                      <wpg:cNvGrpSpPr/>
+                      <wpg:grpSpPr>
+                        <a:xfrm>
+                          <a:off x="0" y="0"/>
+                          <a:ext cx="5745480" cy="2141220"/>
+                          <a:chOff x="0" y="0"/>
+                          <a:chExt cx="5882640" cy="2141220"/>
+                        </a:xfrm>
+                      </wpg:grpSpPr>
+                      <pic:pic xmlns:pic="http://schemas.openxmlformats.org/drawingml/2006/picture">
+                        <pic:nvPicPr>
+                          <pic:cNvPr id="12" name="Picture 12" descr="Snimak ekrana programa Visual Studio 2013. Uređuje se izvorni kôd u programskom jeziku C++"/>
+                          <pic:cNvPicPr>
+                            <a:picLocks noChangeAspect="1"/>
+                          </pic:cNvPicPr>
+                        </pic:nvPicPr>
+                        <pic:blipFill>
+                          <a:blip r:embed="rId16">
+                            <a:extLst>
+                              <a:ext uri="{28A0092B-C50C-407E-A947-70E740481C1C}">
+                                <a14:useLocalDpi xmlns:a14="http://schemas.microsoft.com/office/drawing/2010/main" val="0"/>
+                              </a:ext>
+                            </a:extLst>
+                          </a:blip>
+                          <a:srcRect/>
+                          <a:stretch>
+                            <a:fillRect/>
+                          </a:stretch>
+                        </pic:blipFill>
+                        <pic:spPr bwMode="auto">
+                          <a:xfrm>
+                            <a:off x="1874520" y="0"/>
+                            <a:ext cx="4008120" cy="2141220"/>
+                          </a:xfrm>
+                          <a:prstGeom prst="rect">
+                            <a:avLst/>
+                          </a:prstGeom>
+                          <a:noFill/>
+                          <a:ln>
+                            <a:noFill/>
+                          </a:ln>
+                        </pic:spPr>
+                      </pic:pic>
+                      <pic:pic xmlns:pic="http://schemas.openxmlformats.org/drawingml/2006/picture">
+                        <pic:nvPicPr>
+                          <pic:cNvPr id="3" name="Picture 3" descr="Visualstudio 2022 Community(J) : Microsoft : Free Download, Borrow, and  Streaming : Internet Archive"/>
+                          <pic:cNvPicPr>
+                            <a:picLocks noChangeAspect="1"/>
+                          </pic:cNvPicPr>
+                        </pic:nvPicPr>
+                        <pic:blipFill rotWithShape="1">
+                          <a:blip r:embed="rId17">
+                            <a:clrChange>
+                              <a:clrFrom>
+                                <a:srgbClr val="F0F0F0"/>
+                              </a:clrFrom>
+                              <a:clrTo>
+                                <a:srgbClr val="F0F0F0">
+                                  <a:alpha val="0"/>
+                                </a:srgbClr>
+                              </a:clrTo>
+                            </a:clrChange>
+                            <a:extLst>
+                              <a:ext uri="{28A0092B-C50C-407E-A947-70E740481C1C}">
+                                <a14:useLocalDpi xmlns:a14="http://schemas.microsoft.com/office/drawing/2010/main" val="0"/>
+                              </a:ext>
+                            </a:extLst>
+                          </a:blip>
+                          <a:srcRect l="20636" r="22082"/>
+                          <a:stretch/>
+                        </pic:blipFill>
+                        <pic:spPr bwMode="auto">
+                          <a:xfrm>
+                            <a:off x="0" y="304800"/>
+                            <a:ext cx="1819275" cy="1493520"/>
+                          </a:xfrm>
+                          <a:prstGeom prst="rect">
+                            <a:avLst/>
+                          </a:prstGeom>
+                          <a:noFill/>
+                          <a:ln>
+                            <a:noFill/>
+                          </a:ln>
+                          <a:extLst>
+                            <a:ext uri="{53640926-AAD7-44D8-BBD7-CCE9431645EC}">
+                              <a14:shadowObscured xmlns:a14="http://schemas.microsoft.com/office/drawing/2010/main"/>
+                            </a:ext>
+                          </a:extLst>
+                        </pic:spPr>
+                      </pic:pic>
+                    </wpg:wgp>
+                  </a:graphicData>
+                </a:graphic>
+              </wp:inline>
+            </w:drawing>
+          </mc:Choice>
+          <mc:Fallback>
+            <w:pict>
+              <v:group w14:anchorId="05CBC2FC" id="Group 23" o:spid="_x0000_s1026" style="width:452.4pt;height:168.6pt;mso-position-horizontal-relative:char;mso-position-vertical-relative:line" coordsize="58826,21412" o:gfxdata="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">
+                <v:shapetype id="_x0000_t75" coordsize="21600,21600" o:spt="75" o:preferrelative="t" path="m@4@5l@4@11@9@11@9@5xe" filled="f" stroked="f">
+                  <v:stroke joinstyle="miter"/>
+                  <v:formulas>
+                    <v:f eqn="if lineDrawn pixelLineWidth 0"/>
+                    <v:f eqn="sum @0 1 0"/>
+                    <v:f eqn="sum 0 0 @1"/>
+                    <v:f eqn="prod @2 1 2"/>
+                    <v:f eqn="prod @3 21600 pixelWidth"/>
+                    <v:f eqn="prod @3 21600 pixelHeight"/>
+                    <v:f eqn="sum @0 0 1"/>
+                    <v:f eqn="prod @6 1 2"/>
+                    <v:f eqn="prod @7 21600 pixelWidth"/>
+                    <v:f eqn="sum @8 21600 0"/>
+                    <v:f eqn="prod @7 21600 pixelHeight"/>
+                    <v:f eqn="sum @10 21600 0"/>
+                  </v:formulas>
+                  <v:path o:extrusionok="f" gradientshapeok="t" o:connecttype="rect"/>
+                  <o:lock v:ext="edit" aspectratio="t"/>
+                </v:shapetype>
+                <v:shape id="Picture 12" o:spid="_x0000_s1027" type="#_x0000_t75" alt="Snimak ekrana programa Visual Studio 2013. Uređuje se izvorni kôd u programskom jeziku C++" style="position:absolute;left:18745;width:40081;height:21412;visibility:visible;mso-wrap-style:square" o:gfxdata="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">
+                  <v:imagedata r:id="rId18" o:title="Snimak ekrana programa Visual Studio 2013"/>
+                  <v:path arrowok="t"/>
+                </v:shape>
+                <v:shape id="Picture 3" o:spid="_x0000_s1028" type="#_x0000_t75" alt="Visualstudio 2022 Community(J) : Microsoft : Free Download, Borrow, and  Streaming : Internet Archive" style="position:absolute;top:3048;width:18192;height:14935;visibility:visible;mso-wrap-style:square" o:gfxdata="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">
+                  <v:imagedata r:id="rId19" o:title=" Internet Archive" cropleft="13524f" cropright="14472f" chromakey="#f0f0f0"/>
+                  <v:path arrowok="t"/>
+                </v:shape>
+                <w10:anchorlock/>
+              </v:group>
+            </w:pict>
+          </mc:Fallback>
+        </mc:AlternateContent>
+      </w:r>
+    </w:p>
+    <w:p>
+      <w:pPr>
+        <w:jc w:val="center"/>
+        <w:rPr>
+          <w:i/>
+          <w:sz w:val="18"/>
+          <w:szCs w:val="18"/>
+          <w:lang w:val="bs-Latn-BA" w:eastAsia="bs-Latn-BA"/>
+        </w:rPr>
+      </w:pPr>
+      <w:r>
+        <w:rPr>
+          <w:i/>
+          <w:sz w:val="18"/>
+          <w:szCs w:val="18"/>
+          <w:lang w:val="bs-Latn-BA" w:eastAsia="bs-Latn-BA"/>
+        </w:rPr>
+        <w:t>Slika 3</w:t>
+      </w:r>
+      <w:r>
+        <w:rPr>
+          <w:i/>
+          <w:sz w:val="18"/>
+          <w:szCs w:val="18"/>
+          <w:lang w:val="bs-Latn-BA" w:eastAsia="bs-Latn-BA"/>
+        </w:rPr>
+        <w:t>.1.1. izgled Microsoft Visual Studio okruženja</w:t>
+      </w:r>
+    </w:p>
+    <w:p>
+      <w:pPr>
+        <w:jc w:val="center"/>
+        <w:rPr>
+          <w:i/>
+          <w:sz w:val="18"/>
+          <w:szCs w:val="18"/>
+          <w:lang w:val="bs-Latn-BA" w:eastAsia="bs-Latn-BA"/>
+        </w:rPr>
+      </w:pPr>
+    </w:p>
+    <w:p>
+      <w:pPr>
+        <w:jc w:val="center"/>
+        <w:rPr>
+          <w:i/>
+          <w:sz w:val="18"/>
+          <w:szCs w:val="18"/>
+          <w:lang w:val="bs-Latn-BA" w:eastAsia="bs-Latn-BA"/>
+        </w:rPr>
+      </w:pPr>
+    </w:p>
+    <w:p>
+      <w:pPr>
+        <w:jc w:val="both"/>
+        <w:rPr>
+          <w:lang w:val="bs-Latn-BA" w:eastAsia="bs-Latn-BA"/>
+        </w:rPr>
+      </w:pPr>
+      <w:r>
+        <w:rPr>
+          <w:lang w:val="bs-Latn-BA" w:eastAsia="bs-Latn-BA"/>
+        </w:rPr>
+        <w:t>.NET je platforma otvorenog koda za izradu desktop, web i mobilnih aplikacija koje se mogu izvorno pokretati na bilo kojem operativnom sistemu. .NET sistem uključuje alate, biblioteke i jezike koji podržavaju moderan, skalabilan i visoko performansni razvoj softvera. Aktivna zajednica programera od</w:t>
+      </w:r>
+      <w:r>
+        <w:rPr>
+          <w:lang w:val="bs-Latn-BA" w:eastAsia="bs-Latn-BA"/>
+        </w:rPr>
+        <w:t>ržava i podržava .NET platformu u kojoj je i naša prvobitna aplikacija izvedena.</w:t>
+      </w:r>
+    </w:p>
+    <w:p>
+      <w:pPr>
+        <w:rPr>
+          <w:lang w:val="bs-Latn-BA"/>
+        </w:rPr>
+      </w:pPr>
+    </w:p>
+    <w:p>
+      <w:pPr>
+        <w:pStyle w:val="Heading2"/>
+      </w:pPr>
+      <w:bookmarkStart w:id="11" w:name="_Toc223818040"/>
+      <w:r>
+        <w:t>3.2. Visual Studio Code</w:t>
+      </w:r>
+      <w:bookmarkEnd w:id="11"/>
+    </w:p>
+    <w:p>
+      <w:pPr>
+        <w:jc w:val="both"/>
+        <w:rPr>
+          <w:lang w:val="bs-Latn-BA"/>
+        </w:rPr>
+      </w:pPr>
+      <w:r>
+        <w:rPr>
+          <w:lang w:val="bs-Latn-BA"/>
+        </w:rPr>
+        <w:t xml:space="preserve">Visual Studio Code ( prev . Visual Studio Code , skraćeno VS Code ) je uređivač izvornog koda koji je razvio Microsoft </w:t>
+      </w:r>
+      <w:r>
+        <w:rPr>
+          <w:lang w:val="bs-Latn-BA"/>
+        </w:rPr>
+        <w:t>za Windows , Linux i Mac OS . Podržava otklanjanje grešaka</w:t>
+      </w:r>
+      <w:r>
+        <w:rPr>
+          <w:lang w:val="bs-Latn-BA"/>
+        </w:rPr>
+        <w:t>,</w:t>
+      </w:r>
+      <w:r>
+        <w:rPr>
+          <w:lang w:val="bs-Latn-BA"/>
+        </w:rPr>
+        <w:t xml:space="preserve"> ugrađenu Git kontrolu i GitHub, isticanje sintakse, inteligentno dovršavanje koda</w:t>
+      </w:r>
+      <w:r>
+        <w:rPr>
+          <w:lang w:val="bs-Latn-BA"/>
+        </w:rPr>
+        <w:t>, isječke i refaktorisan</w:t>
+      </w:r>
+      <w:r>
+        <w:rPr>
+          <w:lang w:val="bs-Latn-BA"/>
+        </w:rPr>
+        <w:t>je koda</w:t>
+      </w:r>
+      <w:r>
+        <w:rPr>
+          <w:lang w:val="bs-Latn-BA"/>
+        </w:rPr>
+        <w:t>. Visoko je prilagodljiv, omogućavajući korisnicima da mijen</w:t>
+      </w:r>
+      <w:r>
+        <w:rPr>
+          <w:lang w:val="bs-Latn-BA"/>
+        </w:rPr>
+        <w:t>jaju temu, prečice na tastaturi</w:t>
+      </w:r>
+      <w:r>
+        <w:rPr>
+          <w:lang w:val="bs-Latn-BA"/>
+        </w:rPr>
+        <w:t xml:space="preserve">, postavke i instaliraju dodatke za dodatne funkcionalnosti. Izvorni kod je besplatan i otvorenog koda i objavljen </w:t>
+      </w:r>
+      <w:r>
+        <w:rPr>
+          <w:lang w:val="bs-Latn-BA"/>
+        </w:rPr>
+        <w:t xml:space="preserve">je pod permisivnom MIT licencom. </w:t>
+      </w:r>
+      <w:r>
+        <w:rPr>
+          <w:lang w:val="bs-Latn-BA"/>
+        </w:rPr>
+        <w:t xml:space="preserve">Kompajlirani binarni fajlovi su besplatni i besplatni za ličnu ili komercijalnu upotrebu. </w:t>
+      </w:r>
+    </w:p>
+    <w:p>
+      <w:pPr>
+        <w:jc w:val="both"/>
+        <w:rPr>
+          <w:lang w:val="bs-Latn-BA"/>
+        </w:rPr>
+      </w:pPr>
+    </w:p>
+    <w:p>
+      <w:pPr>
+        <w:jc w:val="both"/>
+        <w:rPr>
+          <w:lang w:val="bs-Latn-BA"/>
+        </w:rPr>
+      </w:pPr>
+      <w:r>
+        <w:rPr>
+          <w:noProof/>
+          <w:lang w:val="en-GB" w:eastAsia="en-GB"/>
+        </w:rPr>
+        <mc:AlternateContent>
+          <mc:Choice Requires="wpg">
+            <w:drawing>
+              <wp:inline distT="0" distB="0" distL="0" distR="0" wp14:anchorId="0504B56C" wp14:editId="20B0A297">
+                <wp:extent cx="5753100" cy="2545080"/>
+                <wp:effectExtent l="0" t="0" r="0" b="7620"/>
+                <wp:docPr id="22" name="Group 22"/>
+                <wp:cNvGraphicFramePr/>
+                <a:graphic xmlns:a="http://schemas.openxmlformats.org/drawingml/2006/main">
+                  <a:graphicData uri="http://schemas.microsoft.com/office/word/2010/wordprocessingGroup">
+                    <wpg:wgp>
+                      <wpg:cNvGrpSpPr/>
+                      <wpg:grpSpPr>
+                        <a:xfrm>
+                          <a:off x="0" y="0"/>
+                          <a:ext cx="5753100" cy="2545080"/>
+                          <a:chOff x="0" y="0"/>
+                          <a:chExt cx="5429250" cy="2491740"/>
+                        </a:xfrm>
+                      </wpg:grpSpPr>
+                      <pic:pic xmlns:pic="http://schemas.openxmlformats.org/drawingml/2006/picture">
+                        <pic:nvPicPr>
+                          <pic:cNvPr id="21" name="Picture 21" descr="nedefinirano"/>
+                          <pic:cNvPicPr>
+                            <a:picLocks noChangeAspect="1"/>
+                          </pic:cNvPicPr>
+                        </pic:nvPicPr>
+                        <pic:blipFill>
+                          <a:blip r:embed="rId20">
+                            <a:extLst>
+                              <a:ext uri="{28A0092B-C50C-407E-A947-70E740481C1C}">
+                                <a14:useLocalDpi xmlns:a14="http://schemas.microsoft.com/office/drawing/2010/main" val="0"/>
+                              </a:ext>
+                            </a:extLst>
+                          </a:blip>
+                          <a:srcRect/>
+                          <a:stretch>
+                            <a:fillRect/>
+                          </a:stretch>
+                        </pic:blipFill>
+                        <pic:spPr bwMode="auto">
+                          <a:xfrm>
+                            <a:off x="0" y="670560"/>
+                            <a:ext cx="1143000" cy="1143000"/>
+                          </a:xfrm>
+                          <a:prstGeom prst="rect">
+                            <a:avLst/>
+                          </a:prstGeom>
+                          <a:noFill/>
+                          <a:ln>
+                            <a:noFill/>
+                          </a:ln>
+                        </pic:spPr>
+                      </pic:pic>
+                      <pic:pic xmlns:pic="http://schemas.openxmlformats.org/drawingml/2006/picture">
+                        <pic:nvPicPr>
+                          <pic:cNvPr id="20" name="Picture 20"/>
+                          <pic:cNvPicPr>
+                            <a:picLocks noChangeAspect="1"/>
+                          </pic:cNvPicPr>
+                        </pic:nvPicPr>
+                        <pic:blipFill>
+                          <a:blip r:embed="rId21">
+                            <a:extLst>
+                              <a:ext uri="{28A0092B-C50C-407E-A947-70E740481C1C}">
+                                <a14:useLocalDpi xmlns:a14="http://schemas.microsoft.com/office/drawing/2010/main" val="0"/>
+                              </a:ext>
+                            </a:extLst>
+                          </a:blip>
+                          <a:stretch>
+                            <a:fillRect/>
+                          </a:stretch>
+                        </pic:blipFill>
+                        <pic:spPr>
+                          <a:xfrm>
+                            <a:off x="1569720" y="0"/>
+                            <a:ext cx="3859530" cy="2491740"/>
+                          </a:xfrm>
+                          <a:prstGeom prst="rect">
+                            <a:avLst/>
+                          </a:prstGeom>
+                        </pic:spPr>
+                      </pic:pic>
+                    </wpg:wgp>
+                  </a:graphicData>
+                </a:graphic>
+              </wp:inline>
+            </w:drawing>
+          </mc:Choice>
+          <mc:Fallback>
+            <w:pict>
+              <v:group w14:anchorId="6844A667" id="Group 22" o:spid="_x0000_s1026" style="width:453pt;height:200.4pt;mso-position-horizontal-relative:char;mso-position-vertical-relative:line" coordsize="54292,24917" o:gfxdata="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">
+                <v:shape id="Picture 21" o:spid="_x0000_s1027" type="#_x0000_t75" alt="nedefinirano" style="position:absolute;top:6705;width:11430;height:11430;visibility:visible;mso-wrap-style:square" o:gfxdata="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">
+                  <v:imagedata r:id="rId22" o:title="nedefinirano"/>
+                  <v:path arrowok="t"/>
+                </v:shape>
+                <v:shape id="Picture 20" o:spid="_x0000_s1028" type="#_x0000_t75" style="position:absolute;left:15697;width:38595;height:24917;visibility:visible;mso-wrap-style:square" o:gfxdata="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">
+                  <v:imagedata r:id="rId23" o:title=""/>
+                  <v:path arrowok="t"/>
+                </v:shape>
+                <w10:anchorlock/>
+              </v:group>
+            </w:pict>
+          </mc:Fallback>
+        </mc:AlternateContent>
+      </w:r>
+    </w:p>
+    <w:p>
+      <w:pPr>
+        <w:jc w:val="center"/>
+        <w:rPr>
+          <w:i/>
+          <w:sz w:val="18"/>
+          <w:szCs w:val="18"/>
+          <w:lang w:val="bs-Latn-BA" w:eastAsia="bs-Latn-BA"/>
+        </w:rPr>
+      </w:pPr>
+      <w:r>
+        <w:rPr>
+          <w:i/>
+          <w:sz w:val="18"/>
+          <w:szCs w:val="18"/>
+          <w:lang w:val="bs-Latn-BA" w:eastAsia="bs-Latn-BA"/>
+        </w:rPr>
+        <w:t>Slika 3</w:t>
+      </w:r>
+      <w:r>
+        <w:rPr>
+          <w:i/>
+          <w:sz w:val="18"/>
+          <w:szCs w:val="18"/>
+          <w:lang w:val="bs-Latn-BA" w:eastAsia="bs-Latn-BA"/>
+        </w:rPr>
+        <w:t>.2</w:t>
+      </w:r>
+      <w:r>
+        <w:rPr>
+          <w:i/>
+          <w:sz w:val="18"/>
+          <w:szCs w:val="18"/>
+          <w:lang w:val="bs-Latn-BA" w:eastAsia="bs-Latn-BA"/>
+        </w:rPr>
+        <w:t xml:space="preserve">.1. izgled Visual Studio </w:t>
+      </w:r>
+      <w:r>
+        <w:rPr>
+          <w:i/>
+          <w:sz w:val="18"/>
+          <w:szCs w:val="18"/>
+          <w:lang w:val="bs-Latn-BA" w:eastAsia="bs-Latn-BA"/>
+        </w:rPr>
+        <w:t xml:space="preserve">Code </w:t>
+      </w:r>
+      <w:r>
+        <w:rPr>
+          <w:i/>
+          <w:sz w:val="18"/>
+          <w:szCs w:val="18"/>
+          <w:lang w:val="bs-Latn-BA" w:eastAsia="bs-Latn-BA"/>
+        </w:rPr>
+        <w:t>okruženja</w:t>
+      </w:r>
+    </w:p>
+    <w:p>
+      <w:pPr>
+        <w:jc w:val="center"/>
+        <w:rPr>
+          <w:i/>
+          <w:sz w:val="18"/>
+          <w:szCs w:val="18"/>
+          <w:lang w:val="bs-Latn-BA"/>
+        </w:rPr>
+      </w:pPr>
+    </w:p>
+    <w:p>
+      <w:pPr>
+        <w:tabs>
+          <w:tab w:val="left" w:pos="1836"/>
+          <w:tab w:val="right" w:pos="9072"/>
+        </w:tabs>
+        <w:rPr>
+          <w:lang w:val="bs-Latn-BA"/>
+        </w:rPr>
+      </w:pPr>
+      <w:r>
+        <w:rPr>
+          <w:lang w:val="bs-Latn-BA"/>
+        </w:rPr>
+        <w:tab/>
+      </w:r>
+    </w:p>
+    <w:p>
+      <w:pPr>
+        <w:tabs>
+          <w:tab w:val="left" w:pos="1836"/>
+          <w:tab w:val="right" w:pos="9072"/>
+        </w:tabs>
+        <w:jc w:val="both"/>
+        <w:rPr>
+          <w:lang w:val="bs-Latn-BA"/>
+        </w:rPr>
+      </w:pPr>
+      <w:r>
+        <w:rPr>
+          <w:lang w:val="bs-Latn-BA"/>
+        </w:rPr>
+        <w:t>Visual Studio Code pruža niz funkcija koje olakšavaju efikasan rad s kodom. Jedna od ključnih je source control, koja omogućava praćenje promjena i upravljanje projektima putem Git-a i drugih sistema verzioniranja. Okruženje podržava brojne programske jezike poput Python-a, C++, JavaScript-a i nudi osnovne funkcije poput isticanja sintakse, uparivanja zagrada i preklapanja dijelova koda.</w:t>
+      </w:r>
+    </w:p>
+    <w:p>
+      <w:pPr>
+        <w:tabs>
+          <w:tab w:val="left" w:pos="1836"/>
+          <w:tab w:val="right" w:pos="9072"/>
+        </w:tabs>
+        <w:jc w:val="both"/>
+        <w:rPr>
+          <w:lang w:val="bs-Latn-BA"/>
+        </w:rPr>
+      </w:pPr>
+    </w:p>
+    <w:p>
+      <w:pPr>
+        <w:tabs>
+          <w:tab w:val="left" w:pos="1836"/>
+          <w:tab w:val="right" w:pos="9072"/>
+        </w:tabs>
+        <w:jc w:val="both"/>
+        <w:rPr>
+          <w:lang w:val="bs-Latn-BA"/>
+        </w:rPr>
+      </w:pPr>
+      <w:r>
+        <w:rPr>
+          <w:lang w:val="bs-Latn-BA"/>
+        </w:rPr>
+        <w:t>IntelliSense pomaže programerima automatskim dovršavanjem koda, prijedlozima za varijable i funkcije te otkrivanjem grešaka. Pored toga, VS Code nudi refaktorisanje koda, kodne isječke, integrisani Git i mogućnost prilagođavanja korisničkog sučelja instalacijom ekstenzija, promjenom tema i korištenjem prečica na tastaturi.</w:t>
+      </w:r>
+    </w:p>
+    <w:p>
+      <w:pPr>
+        <w:tabs>
+          <w:tab w:val="left" w:pos="1836"/>
+          <w:tab w:val="right" w:pos="9072"/>
+        </w:tabs>
+        <w:jc w:val="both"/>
+        <w:rPr>
+          <w:lang w:val="bs-Latn-BA"/>
+        </w:rPr>
+      </w:pPr>
+    </w:p>
+    <w:p>
+      <w:pPr>
+        <w:pStyle w:val="Heading2"/>
+      </w:pPr>
+      <w:bookmarkStart w:id="12" w:name="_Toc223818041"/>
+      <w:r>
+        <w:lastRenderedPageBreak/>
+        <w:t>3.3. Arduino IDE</w:t>
+      </w:r>
+      <w:bookmarkEnd w:id="12"/>
+    </w:p>
+    <w:p>
+      <w:pPr>
+        <w:jc w:val="both"/>
+        <w:rPr>
+          <w:lang w:val="bs-Latn-BA"/>
+        </w:rPr>
+      </w:pPr>
+      <w:r>
+        <w:rPr>
+          <w:lang w:val="bs-Latn-BA"/>
+        </w:rPr>
+        <w:t>Za programiranje Arduina ili bilo kog drugog mikrokontrolera potreban nam je softver u koji možemo pisati i prenositi kod. Ovaj zadatak obavlja Arduino IDE. Zbog varijacija u vrsti operativnog sistema instaliranog u Windowsu, Mac OS X-u i Linuxu, postojala je potreba za razvojem platforme koja bi dobro funkcionirala za svaki operativni sistem. IDE, što se odnosi na integrirano razvojno okruženje (Integrated Development Environment), je softver koji se koristi za pisanje kodova koji kontroliraju Arduino u programskim jezicima poput C i C++.</w:t>
+      </w:r>
+    </w:p>
+    <w:p>
+      <w:pPr>
+        <w:jc w:val="both"/>
+        <w:rPr>
+          <w:lang w:val="bs-Latn-BA"/>
+        </w:rPr>
+      </w:pPr>
+    </w:p>
+    <w:p>
+      <w:pPr>
+        <w:jc w:val="both"/>
+        <w:rPr>
+          <w:lang w:val="bs-Latn-BA"/>
+        </w:rPr>
+      </w:pPr>
+      <w:r>
+        <w:rPr>
+          <w:lang w:val="bs-Latn-BA"/>
+        </w:rPr>
+        <w:t>Arduino IDE je vrlo jednostavan i ta jednostavnost je vjerovatno jedan od glavnih razloga zašto je Arduino postao toliko popularan. Tokom godina, mnoge korisne funkcije su do</w:t>
+      </w:r>
+      <w:r>
+        <w:rPr>
+          <w:lang w:val="bs-Latn-BA"/>
+        </w:rPr>
+        <w:t>dane u Arduino IDE i sada možemo</w:t>
+      </w:r>
+      <w:r>
+        <w:rPr>
+          <w:lang w:val="bs-Latn-BA"/>
+        </w:rPr>
+        <w:t xml:space="preserve"> upravljati bibliotekama i pločama trećih strana</w:t>
+      </w:r>
+      <w:r>
+        <w:rPr>
+          <w:lang w:val="bs-Latn-BA"/>
+        </w:rPr>
+        <w:t xml:space="preserve"> iz IDE-a, a da i dalje zadržimo</w:t>
+      </w:r>
+      <w:r>
+        <w:rPr>
+          <w:lang w:val="bs-Latn-BA"/>
+        </w:rPr>
+        <w:t xml:space="preserve"> jednostavnost programiranja ploče. Glavni prozor Arduino IDE-a prikazan je ispod.</w:t>
+      </w:r>
+      <w:r>
+        <w:rPr>
+          <w:lang w:val="bs-Latn-BA"/>
+        </w:rPr>
+        <w:tab/>
+      </w:r>
+    </w:p>
+    <w:p>
+      <w:pPr>
+        <w:jc w:val="both"/>
+        <w:rPr>
+          <w:lang w:val="bs-Latn-BA"/>
+        </w:rPr>
+      </w:pPr>
+    </w:p>
+    <w:p>
+      <w:pPr>
+        <w:jc w:val="center"/>
+      </w:pPr>
+      <w:r>
+        <w:drawing>
+          <wp:inline distT="0" distB="0" distL="0" distR="0" wp14:anchorId="335A30BB" wp14:editId="260C406A">
+            <wp:extent cx="5044440" cy="2935361"/>
+            <wp:effectExtent l="0" t="0" r="3810" b="0"/>
+            <wp:docPr id="24" name="Picture 24"/>
+            <wp:cNvGraphicFramePr>
+              <a:graphicFrameLocks xmlns:a="http://schemas.openxmlformats.org/drawingml/2006/main" noChangeAspect="1"/>
+            </wp:cNvGraphicFramePr>
+            <a:graphic xmlns:a="http://schemas.openxmlformats.org/drawingml/2006/main">
+              <a:graphicData uri="http://schemas.openxmlformats.org/drawingml/2006/picture">
+                <pic:pic xmlns:pic="http://schemas.openxmlformats.org/drawingml/2006/picture">
+                  <pic:nvPicPr>
+                    <pic:cNvPr id="1" name=""/>
+                    <pic:cNvPicPr/>
+                  </pic:nvPicPr>
+                  <pic:blipFill>
+                    <a:blip r:embed="rId24"/>
+                    <a:stretch>
+                      <a:fillRect/>
+                    </a:stretch>
+                  </pic:blipFill>
+                  <pic:spPr>
+                    <a:xfrm>
+                      <a:off x="0" y="0"/>
+                      <a:ext cx="5053125" cy="2940415"/>
+                    </a:xfrm>
+                    <a:prstGeom prst="rect">
+                      <a:avLst/>
+                    </a:prstGeom>
+                  </pic:spPr>
+                </pic:pic>
+              </a:graphicData>
+            </a:graphic>
+          </wp:inline>
+        </w:drawing>
+      </w:r>
+    </w:p>
+    <w:p>
+      <w:pPr>
+        <w:jc w:val="center"/>
+        <w:rPr>
+          <w:i/>
+          <w:sz w:val="18"/>
+          <w:szCs w:val="18"/>
+          <w:lang w:val="bs-Latn-BA" w:eastAsia="bs-Latn-BA"/>
+        </w:rPr>
+      </w:pPr>
+      <w:r>
+        <w:rPr>
+          <w:i/>
+          <w:sz w:val="18"/>
+          <w:szCs w:val="18"/>
+          <w:lang w:val="bs-Latn-BA" w:eastAsia="bs-Latn-BA"/>
+        </w:rPr>
+        <w:t>Slika 3</w:t>
+      </w:r>
+      <w:r>
+        <w:rPr>
+          <w:i/>
+          <w:sz w:val="18"/>
+          <w:szCs w:val="18"/>
+          <w:lang w:val="bs-Latn-BA" w:eastAsia="bs-Latn-BA"/>
+        </w:rPr>
+        <w:t>.3</w:t>
+      </w:r>
+      <w:r>
+        <w:rPr>
+          <w:i/>
+          <w:sz w:val="18"/>
+          <w:szCs w:val="18"/>
+          <w:lang w:val="bs-Latn-BA" w:eastAsia="bs-Latn-BA"/>
+        </w:rPr>
+        <w:t xml:space="preserve">.1. izgled </w:t>
+      </w:r>
+      <w:r>
+        <w:rPr>
+          <w:i/>
+          <w:sz w:val="18"/>
+          <w:szCs w:val="18"/>
+          <w:lang w:val="bs-Latn-BA" w:eastAsia="bs-Latn-BA"/>
+        </w:rPr>
+        <w:t>Arduino IDE</w:t>
+      </w:r>
+      <w:r>
+        <w:rPr>
+          <w:i/>
+          <w:sz w:val="18"/>
+          <w:szCs w:val="18"/>
+          <w:lang w:val="bs-Latn-BA" w:eastAsia="bs-Latn-BA"/>
+        </w:rPr>
+        <w:t xml:space="preserve"> okruženja</w:t>
+      </w:r>
+    </w:p>
+    <w:p/>
+    <w:p>
+      <w:pPr>
+        <w:jc w:val="both"/>
+      </w:pPr>
+      <w:r>
+        <w:t>Pored osnovne funkcionalnosti pisanja i učitavanja koda na mikrokontroler, Arduino IDE nudi niz korisnih opcija i alata koji olakšavaju razvoj i testiranje. Najvažnije značajke Arduino IDE-a uključuju:</w:t>
+      </w:r>
+    </w:p>
+    <w:p>
+      <w:pPr>
+        <w:jc w:val="both"/>
+      </w:pPr>
+    </w:p>
+    <w:p>
+      <w:pPr>
+        <w:pStyle w:val="ListParagraph"/>
+        <w:numPr>
+          <w:ilvl w:val="0"/>
+          <w:numId w:val="10"/>
+        </w:numPr>
+        <w:jc w:val="both"/>
+      </w:pPr>
+      <w:r>
+        <w:t xml:space="preserve">Serial Monitor </w:t>
+      </w:r>
+    </w:p>
+    <w:p>
+      <w:pPr>
+        <w:pStyle w:val="ListParagraph"/>
+        <w:numPr>
+          <w:ilvl w:val="0"/>
+          <w:numId w:val="10"/>
+        </w:numPr>
+        <w:jc w:val="both"/>
+      </w:pPr>
+      <w:r>
+        <w:t>Libraries (biblioteke)</w:t>
+      </w:r>
+    </w:p>
+    <w:p>
+      <w:pPr>
+        <w:pStyle w:val="ListParagraph"/>
+        <w:numPr>
+          <w:ilvl w:val="0"/>
+          <w:numId w:val="10"/>
+        </w:numPr>
+        <w:jc w:val="both"/>
+      </w:pPr>
+      <w:r>
+        <w:t xml:space="preserve">Boards (ploče) </w:t>
+      </w:r>
+    </w:p>
+    <w:p>
+      <w:pPr>
+        <w:pStyle w:val="ListParagraph"/>
+        <w:numPr>
+          <w:ilvl w:val="0"/>
+          <w:numId w:val="10"/>
+        </w:numPr>
+        <w:jc w:val="both"/>
+      </w:pPr>
+      <w:r>
+        <w:t xml:space="preserve">Primjeri koda </w:t>
+      </w:r>
+    </w:p>
+    <w:p>
+      <w:pPr>
+        <w:pStyle w:val="ListParagraph"/>
+        <w:numPr>
+          <w:ilvl w:val="0"/>
+          <w:numId w:val="10"/>
+        </w:numPr>
+        <w:jc w:val="both"/>
+      </w:pPr>
+      <w:r>
+        <w:t>Jednostavan interfejs</w:t>
+      </w:r>
+      <w:r>
+        <w:br w:type="page"/>
+      </w:r>
+    </w:p>
+    <w:p>
+      <w:pPr>
+        <w:pStyle w:val="Heading1"/>
+      </w:pPr>
+      <w:bookmarkStart w:id="13" w:name="_Toc223818042"/>
+      <w:r>
+        <w:lastRenderedPageBreak/>
+        <w:t>4</w:t>
       </w:r>
       <w:r>
         <w:t xml:space="preserve">. </w:t>
@@ -3949,7 +5377,7 @@
       <w:r>
         <w:t>Hardversko rješenje za School Bell System s LED reklamom</w:t>
       </w:r>
-      <w:bookmarkEnd w:id="8"/>
+      <w:bookmarkEnd w:id="13"/>
     </w:p>
     <w:p>
       <w:pPr>
@@ -3979,7 +5407,7 @@
           <w:lang w:val="en-GB" w:eastAsia="en-GB"/>
         </w:rPr>
         <w:drawing>
-          <wp:inline distT="114300" distB="114300" distL="114300" distR="114300" wp14:anchorId="2EB6FE8B" wp14:editId="3D4FEE57">
+          <wp:inline distT="114300" distB="114300" distL="114300" distR="114300" wp14:anchorId="3F0FEB1D" wp14:editId="60BB91BF">
             <wp:extent cx="3019425" cy="2225040"/>
             <wp:effectExtent l="0" t="0" r="9525" b="3810"/>
             <wp:docPr id="4" name="image1.png"/>
@@ -3992,7 +5420,7 @@
                     <pic:cNvPicPr preferRelativeResize="0"/>
                   </pic:nvPicPr>
                   <pic:blipFill rotWithShape="1">
-                    <a:blip r:embed="rId16"/>
+                    <a:blip r:embed="rId25"/>
                     <a:srcRect b="6184"/>
                     <a:stretch/>
                   </pic:blipFill>
@@ -4053,10 +5481,10 @@
       <w:pPr>
         <w:pStyle w:val="Heading1"/>
       </w:pPr>
-      <w:bookmarkStart w:id="9" w:name="_Toc223797195"/>
+      <w:bookmarkStart w:id="14" w:name="_Toc223818043"/>
       <w:r>
         <w:lastRenderedPageBreak/>
-        <w:t>4</w:t>
+        <w:t>5</w:t>
       </w:r>
       <w:r>
         <w:t xml:space="preserve">. </w:t>
@@ -4064,7 +5492,7 @@
       <w:r>
         <w:t>Softversko rješenje za School Bell System s LED reklamom</w:t>
       </w:r>
-      <w:bookmarkEnd w:id="9"/>
+      <w:bookmarkEnd w:id="14"/>
     </w:p>
     <w:p>
       <w:pPr>
@@ -4101,13 +5529,61 @@
         <w:rPr>
           <w:lang w:val="bs-Latn-BA" w:eastAsia="bs-Latn-BA"/>
         </w:rPr>
-        <w:t xml:space="preserve"> i programski jezik C#.</w:t>
-      </w:r>
-      <w:r>
-        <w:rPr>
-          <w:lang w:val="bs-Latn-BA" w:eastAsia="bs-Latn-BA"/>
-        </w:rPr>
-        <w:t xml:space="preserve"> Također, za izradu aplikacija korištena su sva različita editora: Microsoft Visual Studio 2022 (Windows aplikacija) i Visual Studio Code (Web-aplikacija). U nastavku slijedi objašnjenje tih platformi.</w:t>
+        <w:t xml:space="preserve"> i programski jezik C#</w:t>
+      </w:r>
+      <w:r>
+        <w:rPr>
+          <w:lang w:val="bs-Latn-BA" w:eastAsia="bs-Latn-BA"/>
+        </w:rPr>
+        <w:t>, te programski jezik C++</w:t>
+      </w:r>
+      <w:r>
+        <w:rPr>
+          <w:lang w:val="bs-Latn-BA" w:eastAsia="bs-Latn-BA"/>
+        </w:rPr>
+        <w:t>.</w:t>
+      </w:r>
+      <w:r>
+        <w:rPr>
+          <w:lang w:val="bs-Latn-BA" w:eastAsia="bs-Latn-BA"/>
+        </w:rPr>
+        <w:t xml:space="preserve"> Također, za </w:t>
+      </w:r>
+      <w:r>
+        <w:rPr>
+          <w:lang w:val="bs-Latn-BA" w:eastAsia="bs-Latn-BA"/>
+        </w:rPr>
+        <w:t>izradu aplikacija korištena su d</w:t>
+      </w:r>
+      <w:r>
+        <w:rPr>
+          <w:lang w:val="bs-Latn-BA" w:eastAsia="bs-Latn-BA"/>
+        </w:rPr>
+        <w:t>va različita editora: Microsoft Visual Studio 2022 (Windows aplikacija) i Visua</w:t>
+      </w:r>
+      <w:r>
+        <w:rPr>
+          <w:lang w:val="bs-Latn-BA" w:eastAsia="bs-Latn-BA"/>
+        </w:rPr>
+        <w:t xml:space="preserve">l Studio Code (Web-aplikacija). Razlika između dvije aplikacije jeste u samom povezivanju s ESP32 mikrokontrolerom i samim slanjem podataka na isti. Njegov rad definisan je kroz .ino fajl programiran unutar ArduinoIDE okruženja. </w:t>
+      </w:r>
+      <w:r>
+        <w:rPr>
+          <w:lang w:val="bs-Latn-BA" w:eastAsia="bs-Latn-BA"/>
+        </w:rPr>
+        <w:t xml:space="preserve">U </w:t>
+      </w:r>
+      <w:r>
+        <w:rPr>
+          <w:lang w:val="bs-Latn-BA" w:eastAsia="bs-Latn-BA"/>
+        </w:rPr>
+        <w:t>nastavku slijedi objašnjenje svih</w:t>
+      </w:r>
+      <w:r>
+        <w:rPr>
+          <w:lang w:val="bs-Latn-BA" w:eastAsia="bs-Latn-BA"/>
+        </w:rPr>
+        <w:t xml:space="preserve"> platformi.</w:t>
       </w:r>
     </w:p>
     <w:p>
@@ -4122,113 +5598,40 @@
       <w:pPr>
         <w:pStyle w:val="Heading2"/>
       </w:pPr>
-      <w:r>
-        <w:t xml:space="preserve">4.1. </w:t>
-      </w:r>
-      <w:r>
-        <w:t>Microsoft Visual Studio</w:t>
-      </w:r>
-    </w:p>
-    <w:p>
-      <w:pPr>
-        <w:jc w:val="both"/>
-        <w:rPr>
-          <w:lang w:val="bs-Latn-BA" w:eastAsia="bs-Latn-BA"/>
-        </w:rPr>
-      </w:pPr>
-      <w:r>
-        <w:rPr>
-          <w:lang w:val="bs-Latn-BA" w:eastAsia="bs-Latn-BA"/>
-        </w:rPr>
-        <w:t>Microsoft Visual Studio je integ</w:t>
-      </w:r>
-      <w:r>
-        <w:rPr>
-          <w:lang w:val="bs-Latn-BA" w:eastAsia="bs-Latn-BA"/>
-        </w:rPr>
-        <w:t>risano</w:t>
-      </w:r>
-      <w:r>
-        <w:rPr>
-          <w:lang w:val="bs-Latn-BA" w:eastAsia="bs-Latn-BA"/>
-        </w:rPr>
-        <w:t xml:space="preserve"> razvojno okruženje (IDE) koga je razvio Microsoft. Koristi se za razvoj računarskih programa za Windows, web-s</w:t>
-      </w:r>
-      <w:r>
-        <w:rPr>
-          <w:lang w:val="bs-Latn-BA" w:eastAsia="bs-Latn-BA"/>
-        </w:rPr>
-        <w:t xml:space="preserve">tranica, aplikacija i druge usluge. </w:t>
-      </w:r>
-      <w:r>
-        <w:rPr>
-          <w:lang w:val="bs-Latn-BA" w:eastAsia="bs-Latn-BA"/>
-        </w:rPr>
-        <w:t xml:space="preserve">Visual Studio sadrži uređivač izvornog kôda koji podržava IntelliSense (komponenta koja predlaže ostatak kôda) kao i refaktoriranje </w:t>
-      </w:r>
-      <w:bookmarkStart w:id="10" w:name="_GoBack"/>
-      <w:bookmarkEnd w:id="10"/>
-      <w:r>
-        <w:rPr>
-          <w:lang w:val="bs-Latn-BA" w:eastAsia="bs-Latn-BA"/>
-        </w:rPr>
-        <w:t xml:space="preserve">kôda. Integrirani program za otklanjanje grešaka (debugger) radi na nivou izvornog i mašinskog koda. Program također sadrži alate poput dizajnera oblika koji se koristi za pravljenje aplikacija s grafičkom korisničkim interfejsom, web-dizajnera, dizajnera klasa i dizajnera shema baza podataka. </w:t>
-      </w:r>
-    </w:p>
-    <w:p>
-      <w:pPr>
-        <w:jc w:val="both"/>
-        <w:rPr>
-          <w:lang w:val="bs-Latn-BA" w:eastAsia="bs-Latn-BA"/>
-        </w:rPr>
-      </w:pPr>
-    </w:p>
-    <w:p>
-      <w:pPr>
-        <w:jc w:val="both"/>
-        <w:rPr>
-          <w:lang w:val="bs-Latn-BA" w:eastAsia="bs-Latn-BA"/>
-        </w:rPr>
-      </w:pPr>
-      <w:r>
-        <w:rPr>
-          <w:lang w:val="bs-Latn-BA" w:eastAsia="bs-Latn-BA"/>
-        </w:rPr>
-        <w:t>Visual Studio podržava različite programske jezike i dozvoljava uređivaču kôda i debuggeru da podržava (u različitoj mjeri) gotovo bilo koji programski jezik, pod uvjetom da usluga za taj jezik postoji. Ugrađeni jezici su C, C++ i C++/CLI (preko Visual C++), VB.NET (preko Visual Basic .NET)-a, C# (preko Visual C#) i F# (počevši od programa Visual Studio 2010]).</w:t>
-      </w:r>
-    </w:p>
-    <w:p>
-      <w:pPr>
-        <w:jc w:val="both"/>
-        <w:rPr>
-          <w:lang w:val="bs-Latn-BA" w:eastAsia="bs-Latn-BA"/>
-        </w:rPr>
-      </w:pPr>
-    </w:p>
-    <w:p>
-      <w:pPr>
-        <w:rPr>
-          <w:lang w:val="bs-Latn-BA" w:eastAsia="bs-Latn-BA"/>
-        </w:rPr>
-      </w:pPr>
-      <w:r>
-        <w:rPr>
-          <w:noProof/>
-          <w:lang w:val="en-GB" w:eastAsia="en-GB"/>
+      <w:bookmarkStart w:id="15" w:name="_Toc223818044"/>
+      <w:r>
+        <w:t>5</w:t>
+      </w:r>
+      <w:r>
+        <w:t xml:space="preserve">.1. </w:t>
+      </w:r>
+      <w:r>
+        <w:t>Windows .NET aplikacija</w:t>
+      </w:r>
+      <w:bookmarkEnd w:id="15"/>
+    </w:p>
+    <w:p>
+      <w:pPr>
+        <w:rPr>
+          <w:lang w:val="bs-Latn-BA" w:eastAsia="bs-Latn-BA"/>
+        </w:rPr>
+      </w:pPr>
+    </w:p>
+    <w:p>
+      <w:pPr>
+        <w:rPr>
+          <w:lang w:val="bs-Latn-BA" w:eastAsia="bs-Latn-BA"/>
+        </w:rPr>
+      </w:pPr>
+      <w:r>
+        <w:rPr>
+          <w:lang w:val="bs-Latn-BA" w:eastAsia="bs-Latn-BA"/>
         </w:rPr>
         <w:drawing>
-          <wp:anchor distT="0" distB="0" distL="114300" distR="114300" simplePos="0" relativeHeight="251662336" behindDoc="0" locked="0" layoutInCell="1" allowOverlap="1" wp14:anchorId="2A1EC156" wp14:editId="78EBCF10">
-            <wp:simplePos x="0" y="0"/>
-            <wp:positionH relativeFrom="column">
-              <wp:posOffset>1751330</wp:posOffset>
-            </wp:positionH>
-            <wp:positionV relativeFrom="paragraph">
-              <wp:posOffset>5715</wp:posOffset>
-            </wp:positionV>
-            <wp:extent cx="4008120" cy="2141220"/>
+          <wp:inline distT="0" distB="0" distL="0" distR="0" wp14:anchorId="16D340E7" wp14:editId="416DA2B4">
+            <wp:extent cx="5760720" cy="3148965"/>
             <wp:effectExtent l="0" t="0" r="0" b="0"/>
-            <wp:wrapSquare wrapText="bothSides"/>
-            <wp:docPr id="12" name="Picture 12" descr="Snimak ekrana programa Visual Studio 2013. Uređuje se izvorni kôd u programskom jeziku C++"/>
+            <wp:docPr id="14" name="Picture 14"/>
             <wp:cNvGraphicFramePr>
               <a:graphicFrameLocks xmlns:a="http://schemas.openxmlformats.org/drawingml/2006/main" noChangeAspect="1"/>
             </wp:cNvGraphicFramePr>
@@ -4236,47 +5639,28 @@
               <a:graphicData uri="http://schemas.openxmlformats.org/drawingml/2006/picture">
                 <pic:pic xmlns:pic="http://schemas.openxmlformats.org/drawingml/2006/picture">
                   <pic:nvPicPr>
-                    <pic:cNvPr id="0" name="Picture 3" descr="Snimak ekrana programa Visual Studio 2013. Uređuje se izvorni kôd u programskom jeziku C++"/>
-                    <pic:cNvPicPr>
-                      <a:picLocks noChangeAspect="1" noChangeArrowheads="1"/>
-                    </pic:cNvPicPr>
+                    <pic:cNvPr id="1" name=""/>
+                    <pic:cNvPicPr/>
                   </pic:nvPicPr>
                   <pic:blipFill>
-                    <a:blip r:embed="rId17">
-                      <a:extLst>
-                        <a:ext uri="{28A0092B-C50C-407E-A947-70E740481C1C}">
-                          <a14:useLocalDpi xmlns:a14="http://schemas.microsoft.com/office/drawing/2010/main" val="0"/>
-                        </a:ext>
-                      </a:extLst>
-                    </a:blip>
-                    <a:srcRect/>
+                    <a:blip r:embed="rId26"/>
                     <a:stretch>
                       <a:fillRect/>
                     </a:stretch>
                   </pic:blipFill>
-                  <pic:spPr bwMode="auto">
+                  <pic:spPr>
                     <a:xfrm>
                       <a:off x="0" y="0"/>
-                      <a:ext cx="4008120" cy="2141220"/>
+                      <a:ext cx="5760720" cy="3148965"/>
                     </a:xfrm>
                     <a:prstGeom prst="rect">
                       <a:avLst/>
                     </a:prstGeom>
-                    <a:noFill/>
-                    <a:ln>
-                      <a:noFill/>
-                    </a:ln>
                   </pic:spPr>
                 </pic:pic>
               </a:graphicData>
             </a:graphic>
-            <wp14:sizeRelH relativeFrom="margin">
-              <wp14:pctWidth>0</wp14:pctWidth>
-            </wp14:sizeRelH>
-            <wp14:sizeRelV relativeFrom="margin">
-              <wp14:pctHeight>0</wp14:pctHeight>
-            </wp14:sizeRelV>
-          </wp:anchor>
+          </wp:inline>
         </w:drawing>
       </w:r>
     </w:p>
@@ -4286,24 +5670,37 @@
           <w:lang w:val="bs-Latn-BA" w:eastAsia="bs-Latn-BA"/>
         </w:rPr>
       </w:pPr>
-      <w:r>
-        <w:rPr>
-          <w:noProof/>
-          <w:lang w:val="en-GB" w:eastAsia="en-GB"/>
-        </w:rPr>
+    </w:p>
+    <w:p>
+      <w:pPr>
+        <w:rPr>
+          <w:lang w:val="bs-Latn-BA" w:eastAsia="bs-Latn-BA"/>
+        </w:rPr>
+      </w:pPr>
+    </w:p>
+    <w:p>
+      <w:pPr>
+        <w:rPr>
+          <w:lang w:val="bs-Latn-BA" w:eastAsia="bs-Latn-BA"/>
+        </w:rPr>
+      </w:pPr>
+    </w:p>
+    <w:p>
+      <w:pPr>
+        <w:rPr>
+          <w:lang w:val="bs-Latn-BA" w:eastAsia="bs-Latn-BA"/>
+        </w:rPr>
+      </w:pPr>
+      <w:r>
+        <w:rPr>
+          <w:lang w:val="bs-Latn-BA"/>
+        </w:rPr>
+        <w:lastRenderedPageBreak/>
         <w:drawing>
-          <wp:anchor distT="0" distB="0" distL="114300" distR="114300" simplePos="0" relativeHeight="251663360" behindDoc="0" locked="0" layoutInCell="1" allowOverlap="1" wp14:anchorId="1BEB22C0" wp14:editId="26A0E4FC">
-            <wp:simplePos x="0" y="0"/>
-            <wp:positionH relativeFrom="column">
-              <wp:posOffset>-121920</wp:posOffset>
-            </wp:positionH>
-            <wp:positionV relativeFrom="paragraph">
-              <wp:posOffset>135255</wp:posOffset>
-            </wp:positionV>
-            <wp:extent cx="1819275" cy="1493520"/>
-            <wp:effectExtent l="0" t="0" r="9525" b="0"/>
-            <wp:wrapSquare wrapText="bothSides"/>
-            <wp:docPr id="3" name="Picture 3" descr="Visualstudio 2022 Community(J) : Microsoft : Free Download, Borrow, and  Streaming : Internet Archive"/>
+          <wp:inline distT="0" distB="0" distL="0" distR="0" wp14:anchorId="2607A37E" wp14:editId="0E17D2EC">
+            <wp:extent cx="5760720" cy="3100070"/>
+            <wp:effectExtent l="0" t="0" r="0" b="5080"/>
+            <wp:docPr id="18" name="Picture 18"/>
             <wp:cNvGraphicFramePr>
               <a:graphicFrameLocks xmlns:a="http://schemas.openxmlformats.org/drawingml/2006/main" noChangeAspect="1"/>
             </wp:cNvGraphicFramePr>
@@ -4311,54 +5708,28 @@
               <a:graphicData uri="http://schemas.openxmlformats.org/drawingml/2006/picture">
                 <pic:pic xmlns:pic="http://schemas.openxmlformats.org/drawingml/2006/picture">
                   <pic:nvPicPr>
-                    <pic:cNvPr id="0" name="Picture 1" descr="Visualstudio 2022 Community(J) : Microsoft : Free Download, Borrow, and  Streaming : Internet Archive"/>
-                    <pic:cNvPicPr>
-                      <a:picLocks noChangeAspect="1" noChangeArrowheads="1"/>
-                    </pic:cNvPicPr>
+                    <pic:cNvPr id="1" name=""/>
+                    <pic:cNvPicPr/>
                   </pic:nvPicPr>
-                  <pic:blipFill rotWithShape="1">
-                    <a:blip r:embed="rId18">
-                      <a:clrChange>
-                        <a:clrFrom>
-                          <a:srgbClr val="F0F0F0"/>
-                        </a:clrFrom>
-                        <a:clrTo>
-                          <a:srgbClr val="F0F0F0">
-                            <a:alpha val="0"/>
-                          </a:srgbClr>
-                        </a:clrTo>
-                      </a:clrChange>
-                      <a:extLst>
-                        <a:ext uri="{28A0092B-C50C-407E-A947-70E740481C1C}">
-                          <a14:useLocalDpi xmlns:a14="http://schemas.microsoft.com/office/drawing/2010/main" val="0"/>
-                        </a:ext>
-                      </a:extLst>
-                    </a:blip>
-                    <a:srcRect l="20636" r="22082"/>
-                    <a:stretch/>
+                  <pic:blipFill>
+                    <a:blip r:embed="rId27"/>
+                    <a:stretch>
+                      <a:fillRect/>
+                    </a:stretch>
                   </pic:blipFill>
-                  <pic:spPr bwMode="auto">
+                  <pic:spPr>
                     <a:xfrm>
                       <a:off x="0" y="0"/>
-                      <a:ext cx="1819275" cy="1493520"/>
+                      <a:ext cx="5760720" cy="3100070"/>
                     </a:xfrm>
                     <a:prstGeom prst="rect">
                       <a:avLst/>
                     </a:prstGeom>
-                    <a:noFill/>
-                    <a:ln>
-                      <a:noFill/>
-                    </a:ln>
-                    <a:extLst>
-                      <a:ext uri="{53640926-AAD7-44D8-BBD7-CCE9431645EC}">
-                        <a14:shadowObscured xmlns:a14="http://schemas.microsoft.com/office/drawing/2010/main"/>
-                      </a:ext>
-                    </a:extLst>
                   </pic:spPr>
                 </pic:pic>
               </a:graphicData>
             </a:graphic>
-          </wp:anchor>
+          </wp:inline>
         </w:drawing>
       </w:r>
     </w:p>
@@ -4369,129 +5740,25 @@
         </w:rPr>
       </w:pPr>
     </w:p>
-    <w:p>
-      <w:pPr>
-        <w:jc w:val="center"/>
-        <w:rPr>
-          <w:i/>
-          <w:sz w:val="18"/>
-          <w:szCs w:val="18"/>
-          <w:lang w:val="bs-Latn-BA" w:eastAsia="bs-Latn-BA"/>
-        </w:rPr>
-      </w:pPr>
-      <w:r>
-        <w:rPr>
-          <w:i/>
-          <w:sz w:val="18"/>
-          <w:szCs w:val="18"/>
-          <w:lang w:val="bs-Latn-BA" w:eastAsia="bs-Latn-BA"/>
-        </w:rPr>
-        <w:t>Slika 4.1.1. izgled Microsoft Visual Studio okruženja</w:t>
-      </w:r>
-    </w:p>
-    <w:p>
-      <w:pPr>
-        <w:jc w:val="center"/>
-        <w:rPr>
-          <w:i/>
-          <w:sz w:val="18"/>
-          <w:szCs w:val="18"/>
-          <w:lang w:val="bs-Latn-BA" w:eastAsia="bs-Latn-BA"/>
-        </w:rPr>
-      </w:pPr>
-    </w:p>
-    <w:p>
-      <w:pPr>
-        <w:jc w:val="center"/>
-        <w:rPr>
-          <w:i/>
-          <w:sz w:val="18"/>
-          <w:szCs w:val="18"/>
-          <w:lang w:val="bs-Latn-BA" w:eastAsia="bs-Latn-BA"/>
-        </w:rPr>
-      </w:pPr>
-    </w:p>
-    <w:p>
-      <w:pPr>
-        <w:jc w:val="both"/>
-        <w:rPr>
-          <w:lang w:val="bs-Latn-BA" w:eastAsia="bs-Latn-BA"/>
-        </w:rPr>
-      </w:pPr>
-      <w:r>
-        <w:rPr>
-          <w:lang w:val="bs-Latn-BA" w:eastAsia="bs-Latn-BA"/>
-        </w:rPr>
-        <w:t>.NET je platforma otvorenog koda za izradu desktop, web i mobilnih aplikacija koje se mogu izvorno pokretati na bilo kojem operativnom sistemu. .NET sistem uključuje alate, biblioteke i jezike koji podržavaju moderan, skalabilan i visoko performansni razvoj softvera. Aktivna zajednica programera održava i podržava .NET platformu.</w:t>
-      </w:r>
-    </w:p>
-    <w:p>
-      <w:pPr>
-        <w:rPr>
-          <w:lang w:val="bs-Latn-BA" w:eastAsia="bs-Latn-BA"/>
-        </w:rPr>
-      </w:pPr>
-    </w:p>
-    <w:p>
-      <w:pPr>
-        <w:rPr>
-          <w:lang w:val="bs-Latn-BA" w:eastAsia="bs-Latn-BA"/>
-        </w:rPr>
-      </w:pPr>
-    </w:p>
-    <w:p>
-      <w:pPr>
-        <w:rPr>
-          <w:lang w:val="bs-Latn-BA" w:eastAsia="bs-Latn-BA"/>
-        </w:rPr>
-      </w:pPr>
-    </w:p>
-    <w:p>
-      <w:pPr>
-        <w:rPr>
-          <w:lang w:val="bs-Latn-BA" w:eastAsia="bs-Latn-BA"/>
-        </w:rPr>
-      </w:pPr>
-    </w:p>
-    <w:p>
-      <w:pPr>
-        <w:rPr>
-          <w:lang w:val="bs-Latn-BA" w:eastAsia="bs-Latn-BA"/>
-        </w:rPr>
-      </w:pPr>
-    </w:p>
-    <w:p>
-      <w:pPr>
-        <w:rPr>
-          <w:lang w:val="bs-Latn-BA" w:eastAsia="bs-Latn-BA"/>
-        </w:rPr>
-      </w:pPr>
-    </w:p>
-    <w:p>
-      <w:pPr>
-        <w:rPr>
-          <w:lang w:val="bs-Latn-BA" w:eastAsia="bs-Latn-BA"/>
-        </w:rPr>
-      </w:pPr>
-    </w:p>
-    <w:p>
-      <w:r>
-        <w:rPr>
-          <w:lang w:val="bs-Latn-BA" w:eastAsia="bs-Latn-BA"/>
-        </w:rPr>
+    <w:p/>
+    <w:p>
+      <w:pPr>
+        <w:pStyle w:val="Heading1"/>
+      </w:pPr>
+      <w:r>
         <w:br w:type="page"/>
       </w:r>
-      <w:bookmarkStart w:id="11" w:name="_Toc247374830"/>
-      <w:bookmarkStart w:id="12" w:name="_Toc223797196"/>
+      <w:bookmarkStart w:id="16" w:name="_Toc247374830"/>
+      <w:bookmarkStart w:id="17" w:name="_Toc223818045"/>
       <w:r>
         <w:lastRenderedPageBreak/>
-        <w:t>5</w:t>
+        <w:t>6</w:t>
       </w:r>
       <w:r>
         <w:t>. Zaključak</w:t>
       </w:r>
-      <w:bookmarkEnd w:id="11"/>
-      <w:bookmarkEnd w:id="12"/>
+      <w:bookmarkEnd w:id="16"/>
+      <w:bookmarkEnd w:id="17"/>
     </w:p>
     <w:p>
       <w:pPr>
@@ -4594,14 +5861,14 @@
         </w:rPr>
         <w:br w:type="page"/>
       </w:r>
-      <w:bookmarkStart w:id="13" w:name="_Toc247374831"/>
-      <w:bookmarkStart w:id="14" w:name="_Toc223797197"/>
+      <w:bookmarkStart w:id="18" w:name="_Toc247374831"/>
+      <w:bookmarkStart w:id="19" w:name="_Toc223818046"/>
       <w:r>
         <w:rPr>
           <w:lang w:val="hr-HR"/>
         </w:rPr>
         <w:lastRenderedPageBreak/>
-        <w:t>6</w:t>
+        <w:t>7</w:t>
       </w:r>
       <w:r>
         <w:rPr>
@@ -4609,8 +5876,8 @@
         </w:rPr>
         <w:t>. Literatura</w:t>
       </w:r>
-      <w:bookmarkEnd w:id="13"/>
-      <w:bookmarkEnd w:id="14"/>
+      <w:bookmarkEnd w:id="18"/>
+      <w:bookmarkEnd w:id="19"/>
     </w:p>
     <w:p>
       <w:pPr>
@@ -4632,7 +5899,7 @@
         </w:rPr>
         <w:t xml:space="preserve">[1] </w:t>
       </w:r>
-      <w:hyperlink r:id="rId19" w:history="1">
+      <w:hyperlink r:id="rId28" w:history="1">
         <w:r>
           <w:rPr>
             <w:rStyle w:val="Hyperlink"/>
@@ -4664,7 +5931,7 @@
         </w:rPr>
         <w:t xml:space="preserve">[2] </w:t>
       </w:r>
-      <w:hyperlink r:id="rId20" w:history="1">
+      <w:hyperlink r:id="rId29" w:history="1">
         <w:r>
           <w:rPr>
             <w:rStyle w:val="Hyperlink"/>
@@ -4696,7 +5963,7 @@
         </w:rPr>
         <w:t xml:space="preserve">[3] </w:t>
       </w:r>
-      <w:hyperlink r:id="rId21" w:history="1">
+      <w:hyperlink r:id="rId30" w:history="1">
         <w:r>
           <w:rPr>
             <w:rStyle w:val="Hyperlink"/>
@@ -4728,7 +5995,7 @@
         </w:rPr>
         <w:t xml:space="preserve">[4] </w:t>
       </w:r>
-      <w:hyperlink r:id="rId22" w:history="1">
+      <w:hyperlink r:id="rId31" w:history="1">
         <w:r>
           <w:rPr>
             <w:rStyle w:val="Hyperlink"/>
@@ -4748,8 +6015,7 @@
         <w:ind w:left="697" w:hanging="340"/>
         <w:rPr>
           <w:rStyle w:val="FontStyle42"/>
-          <w:szCs w:val="20"/>
-          <w:lang w:val="hr-HR" w:eastAsia="hr-HR"/>
+          <w:sz w:val="24"/>
         </w:rPr>
       </w:pPr>
       <w:r>
@@ -4768,23 +6034,16 @@
         </w:rPr>
         <w:t xml:space="preserve">] </w:t>
       </w:r>
-      <w:hyperlink r:id="rId23" w:history="1">
+      <w:hyperlink r:id="rId32" w:history="1">
         <w:r>
           <w:rPr>
             <w:rStyle w:val="Hyperlink"/>
-            <w:lang w:val="hr-HR" w:eastAsia="hr-HR"/>
+            <w:sz w:val="20"/>
+            <w:szCs w:val="20"/>
           </w:rPr>
-          <w:t>http://www.wikipedia.org</w:t>
+          <w:t>https://en.wikipedia.org/</w:t>
         </w:r>
       </w:hyperlink>
-      <w:r>
-        <w:rPr>
-          <w:rStyle w:val="FontStyle42"/>
-          <w:szCs w:val="20"/>
-          <w:lang w:val="hr-HR" w:eastAsia="hr-HR"/>
-        </w:rPr>
-        <w:t xml:space="preserve"> </w:t>
-      </w:r>
     </w:p>
     <w:p>
       <w:pPr>
@@ -4806,6 +6065,20 @@
         </w:rPr>
         <w:t>[6]</w:t>
       </w:r>
+      <w:r>
+        <w:t xml:space="preserve"> </w:t>
+      </w:r>
+      <w:hyperlink r:id="rId33" w:history="1">
+        <w:r>
+          <w:rPr>
+            <w:rStyle w:val="Hyperlink"/>
+            <w:sz w:val="20"/>
+            <w:szCs w:val="20"/>
+            <w:lang w:val="hr-HR" w:eastAsia="hr-HR"/>
+          </w:rPr>
+          <w:t>https://www.webopedia.com/</w:t>
+        </w:r>
+      </w:hyperlink>
     </w:p>
     <w:p>
       <w:pPr>
@@ -4827,6 +6100,23 @@
         </w:rPr>
         <w:t>[7]</w:t>
       </w:r>
+      <w:r>
+        <w:t xml:space="preserve"> </w:t>
+      </w:r>
+      <w:hyperlink r:id="rId34" w:history="1">
+        <w:r>
+          <w:rPr>
+            <w:rStyle w:val="Hyperlink"/>
+            <w:sz w:val="20"/>
+            <w:szCs w:val="20"/>
+            <w:lang w:val="hr-HR" w:eastAsia="hr-HR"/>
+          </w:rPr>
+          <w:t>https://code.visualstudio.com/</w:t>
+        </w:r>
+      </w:hyperlink>
+      <w:r>
+        <w:t xml:space="preserve"> </w:t>
+      </w:r>
     </w:p>
     <w:p>
       <w:pPr>
@@ -4848,6 +6138,20 @@
         </w:rPr>
         <w:t>[8]</w:t>
       </w:r>
+      <w:r>
+        <w:t xml:space="preserve"> </w:t>
+      </w:r>
+      <w:hyperlink r:id="rId35" w:history="1">
+        <w:r>
+          <w:rPr>
+            <w:rStyle w:val="Hyperlink"/>
+            <w:sz w:val="20"/>
+            <w:szCs w:val="20"/>
+            <w:lang w:val="hr-HR" w:eastAsia="hr-HR"/>
+          </w:rPr>
+          <w:t>https://www.geeksforgeeks.org/</w:t>
+        </w:r>
+      </w:hyperlink>
     </w:p>
     <w:p>
       <w:pPr>
@@ -4877,17 +6181,165 @@
         <w:spacing w:before="82" w:line="240" w:lineRule="auto"/>
         <w:ind w:left="697" w:hanging="340"/>
         <w:rPr>
-          <w:lang w:val="hr-HR" w:eastAsia="hr-HR"/>
-        </w:rPr>
-      </w:pPr>
-      <w:r>
-        <w:rPr>
           <w:rStyle w:val="FontStyle42"/>
           <w:szCs w:val="20"/>
           <w:lang w:val="hr-HR" w:eastAsia="hr-HR"/>
         </w:rPr>
+      </w:pPr>
+      <w:r>
+        <w:rPr>
+          <w:rStyle w:val="FontStyle42"/>
+          <w:szCs w:val="20"/>
+          <w:lang w:val="hr-HR" w:eastAsia="hr-HR"/>
+        </w:rPr>
         <w:t>[10]</w:t>
       </w:r>
+    </w:p>
+    <w:p>
+      <w:pPr>
+        <w:pStyle w:val="Style23"/>
+        <w:widowControl/>
+        <w:spacing w:before="82" w:line="240" w:lineRule="auto"/>
+        <w:ind w:left="697" w:hanging="340"/>
+        <w:rPr>
+          <w:lang w:val="hr-HR" w:eastAsia="hr-HR"/>
+        </w:rPr>
+      </w:pPr>
+      <w:r>
+        <w:rPr>
+          <w:rStyle w:val="FontStyle42"/>
+          <w:szCs w:val="20"/>
+          <w:lang w:val="hr-HR" w:eastAsia="hr-HR"/>
+        </w:rPr>
+        <w:t>[11</w:t>
+      </w:r>
+      <w:r>
+        <w:rPr>
+          <w:rStyle w:val="FontStyle42"/>
+          <w:szCs w:val="20"/>
+          <w:lang w:val="hr-HR" w:eastAsia="hr-HR"/>
+        </w:rPr>
+        <w:t>]</w:t>
+      </w:r>
+    </w:p>
+    <w:p>
+      <w:pPr>
+        <w:pStyle w:val="Style23"/>
+        <w:widowControl/>
+        <w:spacing w:before="82" w:line="240" w:lineRule="auto"/>
+        <w:ind w:left="697" w:hanging="340"/>
+        <w:rPr>
+          <w:lang w:val="hr-HR" w:eastAsia="hr-HR"/>
+        </w:rPr>
+      </w:pPr>
+      <w:r>
+        <w:rPr>
+          <w:rStyle w:val="FontStyle42"/>
+          <w:szCs w:val="20"/>
+          <w:lang w:val="hr-HR" w:eastAsia="hr-HR"/>
+        </w:rPr>
+        <w:t>[12</w:t>
+      </w:r>
+      <w:r>
+        <w:rPr>
+          <w:rStyle w:val="FontStyle42"/>
+          <w:szCs w:val="20"/>
+          <w:lang w:val="hr-HR" w:eastAsia="hr-HR"/>
+        </w:rPr>
+        <w:t>]</w:t>
+      </w:r>
+    </w:p>
+    <w:p>
+      <w:pPr>
+        <w:pStyle w:val="Style23"/>
+        <w:widowControl/>
+        <w:spacing w:before="82" w:line="240" w:lineRule="auto"/>
+        <w:ind w:left="697" w:hanging="340"/>
+        <w:rPr>
+          <w:lang w:val="hr-HR" w:eastAsia="hr-HR"/>
+        </w:rPr>
+      </w:pPr>
+      <w:r>
+        <w:rPr>
+          <w:rStyle w:val="FontStyle42"/>
+          <w:szCs w:val="20"/>
+          <w:lang w:val="hr-HR" w:eastAsia="hr-HR"/>
+        </w:rPr>
+        <w:t>[13</w:t>
+      </w:r>
+      <w:r>
+        <w:rPr>
+          <w:rStyle w:val="FontStyle42"/>
+          <w:szCs w:val="20"/>
+          <w:lang w:val="hr-HR" w:eastAsia="hr-HR"/>
+        </w:rPr>
+        <w:t>]</w:t>
+      </w:r>
+    </w:p>
+    <w:p>
+      <w:pPr>
+        <w:pStyle w:val="Style23"/>
+        <w:widowControl/>
+        <w:spacing w:before="82" w:line="240" w:lineRule="auto"/>
+        <w:ind w:left="697" w:hanging="340"/>
+        <w:rPr>
+          <w:lang w:val="hr-HR" w:eastAsia="hr-HR"/>
+        </w:rPr>
+      </w:pPr>
+      <w:r>
+        <w:rPr>
+          <w:rStyle w:val="FontStyle42"/>
+          <w:szCs w:val="20"/>
+          <w:lang w:val="hr-HR" w:eastAsia="hr-HR"/>
+        </w:rPr>
+        <w:t>[14</w:t>
+      </w:r>
+      <w:r>
+        <w:rPr>
+          <w:rStyle w:val="FontStyle42"/>
+          <w:szCs w:val="20"/>
+          <w:lang w:val="hr-HR" w:eastAsia="hr-HR"/>
+        </w:rPr>
+        <w:t>]</w:t>
+      </w:r>
+    </w:p>
+    <w:p>
+      <w:pPr>
+        <w:pStyle w:val="Style23"/>
+        <w:widowControl/>
+        <w:spacing w:before="82" w:line="240" w:lineRule="auto"/>
+        <w:ind w:left="697" w:hanging="340"/>
+        <w:rPr>
+          <w:lang w:val="hr-HR" w:eastAsia="hr-HR"/>
+        </w:rPr>
+      </w:pPr>
+      <w:r>
+        <w:rPr>
+          <w:rStyle w:val="FontStyle42"/>
+          <w:szCs w:val="20"/>
+          <w:lang w:val="hr-HR" w:eastAsia="hr-HR"/>
+        </w:rPr>
+        <w:t>[15</w:t>
+      </w:r>
+      <w:r>
+        <w:rPr>
+          <w:rStyle w:val="FontStyle42"/>
+          <w:szCs w:val="20"/>
+          <w:lang w:val="hr-HR" w:eastAsia="hr-HR"/>
+        </w:rPr>
+        <w:t>]</w:t>
+      </w:r>
+    </w:p>
+    <w:p>
+      <w:pPr>
+        <w:pStyle w:val="Style23"/>
+        <w:widowControl/>
+        <w:spacing w:before="82" w:line="240" w:lineRule="auto"/>
+        <w:ind w:left="697" w:hanging="340"/>
+        <w:rPr>
+          <w:lang w:val="hr-HR" w:eastAsia="hr-HR"/>
+        </w:rPr>
+      </w:pPr>
     </w:p>
     <w:p>
       <w:pPr>
@@ -5143,7 +6595,7 @@
         <mc:AlternateContent>
           <mc:Choice Requires="wps">
             <w:drawing>
-              <wp:anchor distT="4294967295" distB="4294967295" distL="114300" distR="114300" simplePos="0" relativeHeight="251655168" behindDoc="0" locked="0" layoutInCell="1" allowOverlap="1">
+              <wp:anchor distT="4294967295" distB="4294967295" distL="114300" distR="114300" simplePos="0" relativeHeight="251653120" behindDoc="0" locked="0" layoutInCell="1" allowOverlap="1">
                 <wp:simplePos x="0" y="0"/>
                 <wp:positionH relativeFrom="column">
                   <wp:posOffset>-12065</wp:posOffset>
@@ -5204,11 +6656,11 @@
           </mc:Choice>
           <mc:Fallback>
             <w:pict>
-              <v:shapetype w14:anchorId="3BF745F0" id="_x0000_t32" coordsize="21600,21600" o:spt="32" o:oned="t" path="m,l21600,21600e" filled="f">
+              <v:shapetype w14:anchorId="7A732339" id="_x0000_t32" coordsize="21600,21600" o:spt="32" o:oned="t" path="m,l21600,21600e" filled="f">
                 <v:path arrowok="t" fillok="f" o:connecttype="none"/>
                 <o:lock v:ext="edit" shapetype="t"/>
               </v:shapetype>
-              <v:shape id="Straight Arrow Connector 9" o:spid="_x0000_s1026" type="#_x0000_t32" style="position:absolute;margin-left:-.95pt;margin-top:16.55pt;width:454.7pt;height:0;z-index:251655168;visibility:visible;mso-wrap-style:square;mso-width-percent:0;mso-height-percent:0;mso-wrap-distance-left:9pt;mso-wrap-distance-top:-3e-5mm;mso-wrap-distance-right:9pt;mso-wrap-distance-bottom:-3e-5mm;mso-position-horizontal:absolute;mso-position-horizontal-relative:text;mso-position-vertical:absolute;mso-position-vertical-relative:text;mso-width-percent:0;mso-height-percent:0;mso-width-relative:page;mso-height-relative:page" o:gfxdata="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"/>
+              <v:shape id="Straight Arrow Connector 9" o:spid="_x0000_s1026" type="#_x0000_t32" style="position:absolute;margin-left:-.95pt;margin-top:16.55pt;width:454.7pt;height:0;z-index:251653120;visibility:visible;mso-wrap-style:square;mso-width-percent:0;mso-height-percent:0;mso-wrap-distance-left:9pt;mso-wrap-distance-top:-3e-5mm;mso-wrap-distance-right:9pt;mso-wrap-distance-bottom:-3e-5mm;mso-position-horizontal:absolute;mso-position-horizontal-relative:text;mso-position-vertical:absolute;mso-position-vertical-relative:text;mso-width-percent:0;mso-height-percent:0;mso-width-relative:page;mso-height-relative:page" o:gfxdata="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"/>
             </w:pict>
           </mc:Fallback>
         </mc:AlternateContent>
@@ -5239,7 +6691,7 @@
         <mc:AlternateContent>
           <mc:Choice Requires="wps">
             <w:drawing>
-              <wp:anchor distT="4294967295" distB="4294967295" distL="114300" distR="114300" simplePos="0" relativeHeight="251659264" behindDoc="0" locked="0" layoutInCell="1" allowOverlap="1">
+              <wp:anchor distT="4294967295" distB="4294967295" distL="114300" distR="114300" simplePos="0" relativeHeight="251657216" behindDoc="0" locked="0" layoutInCell="1" allowOverlap="1">
                 <wp:simplePos x="0" y="0"/>
                 <wp:positionH relativeFrom="column">
                   <wp:posOffset>-12065</wp:posOffset>
@@ -5300,7 +6752,7 @@
           </mc:Choice>
           <mc:Fallback>
             <w:pict>
-              <v:shape w14:anchorId="35642180" id="Straight Arrow Connector 8" o:spid="_x0000_s1026" type="#_x0000_t32" style="position:absolute;margin-left:-.95pt;margin-top:64.95pt;width:454.7pt;height:0;z-index:251659264;visibility:visible;mso-wrap-style:square;mso-width-percent:0;mso-height-percent:0;mso-wrap-distance-left:9pt;mso-wrap-distance-top:-3e-5mm;mso-wrap-distance-right:9pt;mso-wrap-distance-bottom:-3e-5mm;mso-position-horizontal:absolute;mso-position-horizontal-relative:text;mso-position-vertical:absolute;mso-position-vertical-relative:text;mso-width-percent:0;mso-height-percent:0;mso-width-relative:page;mso-height-relative:page" o:gfxdata="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"/>
+              <v:shape w14:anchorId="27911BC9" id="Straight Arrow Connector 8" o:spid="_x0000_s1026" type="#_x0000_t32" style="position:absolute;margin-left:-.95pt;margin-top:64.95pt;width:454.7pt;height:0;z-index:251657216;visibility:visible;mso-wrap-style:square;mso-width-percent:0;mso-height-percent:0;mso-wrap-distance-left:9pt;mso-wrap-distance-top:-3e-5mm;mso-wrap-distance-right:9pt;mso-wrap-distance-bottom:-3e-5mm;mso-position-horizontal:absolute;mso-position-horizontal-relative:text;mso-position-vertical:absolute;mso-position-vertical-relative:text;mso-width-percent:0;mso-height-percent:0;mso-width-relative:page;mso-height-relative:page" o:gfxdata="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"/>
             </w:pict>
           </mc:Fallback>
         </mc:AlternateContent>
@@ -5313,7 +6765,7 @@
         <mc:AlternateContent>
           <mc:Choice Requires="wps">
             <w:drawing>
-              <wp:anchor distT="4294967295" distB="4294967295" distL="114300" distR="114300" simplePos="0" relativeHeight="251658240" behindDoc="0" locked="0" layoutInCell="1" allowOverlap="1">
+              <wp:anchor distT="4294967295" distB="4294967295" distL="114300" distR="114300" simplePos="0" relativeHeight="251656192" behindDoc="0" locked="0" layoutInCell="1" allowOverlap="1">
                 <wp:simplePos x="0" y="0"/>
                 <wp:positionH relativeFrom="column">
                   <wp:posOffset>-12065</wp:posOffset>
@@ -5374,7 +6826,7 @@
           </mc:Choice>
           <mc:Fallback>
             <w:pict>
-              <v:shape w14:anchorId="6F7BA30E" id="Straight Arrow Connector 7" o:spid="_x0000_s1026" type="#_x0000_t32" style="position:absolute;margin-left:-.95pt;margin-top:46.2pt;width:454.7pt;height:0;z-index:251658240;visibility:visible;mso-wrap-style:square;mso-width-percent:0;mso-height-percent:0;mso-wrap-distance-left:9pt;mso-wrap-distance-top:-3e-5mm;mso-wrap-distance-right:9pt;mso-wrap-distance-bottom:-3e-5mm;mso-position-horizontal:absolute;mso-position-horizontal-relative:text;mso-position-vertical:absolute;mso-position-vertical-relative:text;mso-width-percent:0;mso-height-percent:0;mso-width-relative:page;mso-height-relative:page" o:gfxdata="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"/>
+              <v:shape w14:anchorId="0F6A3952" id="Straight Arrow Connector 7" o:spid="_x0000_s1026" type="#_x0000_t32" style="position:absolute;margin-left:-.95pt;margin-top:46.2pt;width:454.7pt;height:0;z-index:251656192;visibility:visible;mso-wrap-style:square;mso-width-percent:0;mso-height-percent:0;mso-wrap-distance-left:9pt;mso-wrap-distance-top:-3e-5mm;mso-wrap-distance-right:9pt;mso-wrap-distance-bottom:-3e-5mm;mso-position-horizontal:absolute;mso-position-horizontal-relative:text;mso-position-vertical:absolute;mso-position-vertical-relative:text;mso-width-percent:0;mso-height-percent:0;mso-width-relative:page;mso-height-relative:page" o:gfxdata="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"/>
             </w:pict>
           </mc:Fallback>
         </mc:AlternateContent>
@@ -5387,7 +6839,7 @@
         <mc:AlternateContent>
           <mc:Choice Requires="wps">
             <w:drawing>
-              <wp:anchor distT="4294967295" distB="4294967295" distL="114300" distR="114300" simplePos="0" relativeHeight="251657216" behindDoc="0" locked="0" layoutInCell="1" allowOverlap="1">
+              <wp:anchor distT="4294967295" distB="4294967295" distL="114300" distR="114300" simplePos="0" relativeHeight="251655168" behindDoc="0" locked="0" layoutInCell="1" allowOverlap="1">
                 <wp:simplePos x="0" y="0"/>
                 <wp:positionH relativeFrom="column">
                   <wp:posOffset>-12065</wp:posOffset>
@@ -5448,7 +6900,7 @@
           </mc:Choice>
           <mc:Fallback>
             <w:pict>
-              <v:shape w14:anchorId="3D5F7E6C" id="Straight Arrow Connector 6" o:spid="_x0000_s1026" type="#_x0000_t32" style="position:absolute;margin-left:-.95pt;margin-top:27.45pt;width:454.7pt;height:0;z-index:251657216;visibility:visible;mso-wrap-style:square;mso-width-percent:0;mso-height-percent:0;mso-wrap-distance-left:9pt;mso-wrap-distance-top:-3e-5mm;mso-wrap-distance-right:9pt;mso-wrap-distance-bottom:-3e-5mm;mso-position-horizontal:absolute;mso-position-horizontal-relative:text;mso-position-vertical:absolute;mso-position-vertical-relative:text;mso-width-percent:0;mso-height-percent:0;mso-width-relative:page;mso-height-relative:page" o:gfxdata="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"/>
+              <v:shape w14:anchorId="2FD01AB1" id="Straight Arrow Connector 6" o:spid="_x0000_s1026" type="#_x0000_t32" style="position:absolute;margin-left:-.95pt;margin-top:27.45pt;width:454.7pt;height:0;z-index:251655168;visibility:visible;mso-wrap-style:square;mso-width-percent:0;mso-height-percent:0;mso-wrap-distance-left:9pt;mso-wrap-distance-top:-3e-5mm;mso-wrap-distance-right:9pt;mso-wrap-distance-bottom:-3e-5mm;mso-position-horizontal:absolute;mso-position-horizontal-relative:text;mso-position-vertical:absolute;mso-position-vertical-relative:text;mso-width-percent:0;mso-height-percent:0;mso-width-relative:page;mso-height-relative:page" o:gfxdata="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"/>
             </w:pict>
           </mc:Fallback>
         </mc:AlternateContent>
@@ -5461,7 +6913,7 @@
         <mc:AlternateContent>
           <mc:Choice Requires="wps">
             <w:drawing>
-              <wp:anchor distT="4294967295" distB="4294967295" distL="114300" distR="114300" simplePos="0" relativeHeight="251656192" behindDoc="0" locked="0" layoutInCell="1" allowOverlap="1">
+              <wp:anchor distT="4294967295" distB="4294967295" distL="114300" distR="114300" simplePos="0" relativeHeight="251654144" behindDoc="0" locked="0" layoutInCell="1" allowOverlap="1">
                 <wp:simplePos x="0" y="0"/>
                 <wp:positionH relativeFrom="column">
                   <wp:posOffset>-12065</wp:posOffset>
@@ -5522,7 +6974,7 @@
           </mc:Choice>
           <mc:Fallback>
             <w:pict>
-              <v:shape w14:anchorId="04B662EF" id="Straight Arrow Connector 5" o:spid="_x0000_s1026" type="#_x0000_t32" style="position:absolute;margin-left:-.95pt;margin-top:9.45pt;width:454.7pt;height:0;z-index:251656192;visibility:visible;mso-wrap-style:square;mso-width-percent:0;mso-height-percent:0;mso-wrap-distance-left:9pt;mso-wrap-distance-top:-3e-5mm;mso-wrap-distance-right:9pt;mso-wrap-distance-bottom:-3e-5mm;mso-position-horizontal:absolute;mso-position-horizontal-relative:text;mso-position-vertical:absolute;mso-position-vertical-relative:text;mso-width-percent:0;mso-height-percent:0;mso-width-relative:page;mso-height-relative:page" o:gfxdata="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"/>
+              <v:shape w14:anchorId="3C178839" id="Straight Arrow Connector 5" o:spid="_x0000_s1026" type="#_x0000_t32" style="position:absolute;margin-left:-.95pt;margin-top:9.45pt;width:454.7pt;height:0;z-index:251654144;visibility:visible;mso-wrap-style:square;mso-width-percent:0;mso-height-percent:0;mso-wrap-distance-left:9pt;mso-wrap-distance-top:-3e-5mm;mso-wrap-distance-right:9pt;mso-wrap-distance-bottom:-3e-5mm;mso-position-horizontal:absolute;mso-position-horizontal-relative:text;mso-position-vertical:absolute;mso-position-vertical-relative:text;mso-width-percent:0;mso-height-percent:0;mso-width-relative:page;mso-height-relative:page" o:gfxdata="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"/>
             </w:pict>
           </mc:Fallback>
         </mc:AlternateContent>
@@ -5683,9 +7135,9 @@
 <file path=word/numbering.xml><?xml version="1.0" encoding="utf-8"?>
 <w:numbering xmlns:wpc="http://schemas.microsoft.com/office/word/2010/wordprocessingCanvas" xmlns:cx="http://schemas.microsoft.com/office/drawing/2014/chartex" xmlns:mc="http://schemas.openxmlformats.org/markup-compatibility/2006" xmlns:o="urn:schemas-microsoft-com:office:office" xmlns:r="http://schemas.openxmlformats.org/officeDocument/2006/relationships" xmlns:m="http://schemas.openxmlformats.org/officeDocument/2006/math" xmlns:v="urn:schemas-microsoft-com:vml" xmlns:wp14="http://schemas.microsoft.com/office/word/2010/wordprocessingDrawing" xmlns:wp="http://schemas.openxmlformats.org/drawingml/2006/wordprocessingDrawing" xmlns:w10="urn:schemas-microsoft-com:office:word" xmlns:w="http://schemas.openxmlformats.org/wordprocessingml/2006/main" xmlns:w14="http://schemas.microsoft.com/office/word/2010/wordml" xmlns:w15="http://schemas.microsoft.com/office/word/2012/wordml" xmlns:w16se="http://schemas.microsoft.com/office/word/2015/wordml/symex" xmlns:wpg="http://schemas.microsoft.com/office/word/2010/wordprocessingGroup" xmlns:wpi="http://schemas.microsoft.com/office/word/2010/wordprocessingInk" xmlns:wne="http://schemas.microsoft.com/office/word/2006/wordml" xmlns:wps="http://schemas.microsoft.com/office/word/2010/wordprocessingShape" mc:Ignorable="w14 w15 w16se wp14">
   <w:abstractNum w:abstractNumId="0" w15:restartNumberingAfterBreak="0">
-    <w:nsid w:val="1A782087"/>
+    <w:nsid w:val="19C12DD2"/>
     <w:multiLevelType w:val="hybridMultilevel"/>
-    <w:tmpl w:val="0B4A7664"/>
+    <w:tmpl w:val="3CDC15AC"/>
     <w:lvl w:ilvl="0" w:tplc="5DD06B14">
       <w:start w:val="2"/>
       <w:numFmt w:val="bullet"/>
@@ -5796,6 +7248,119 @@
     </w:lvl>
   </w:abstractNum>
   <w:abstractNum w:abstractNumId="1" w15:restartNumberingAfterBreak="0">
+    <w:nsid w:val="1A782087"/>
+    <w:multiLevelType w:val="hybridMultilevel"/>
+    <w:tmpl w:val="0B4A7664"/>
+    <w:lvl w:ilvl="0" w:tplc="5DD06B14">
+      <w:start w:val="2"/>
+      <w:numFmt w:val="bullet"/>
+      <w:lvlText w:val="-"/>
+      <w:lvlJc w:val="left"/>
+      <w:pPr>
+        <w:ind w:left="720" w:hanging="360"/>
+      </w:pPr>
+      <w:rPr>
+        <w:rFonts w:ascii="Times New Roman" w:eastAsia="Times New Roman" w:hAnsi="Times New Roman" w:cs="Times New Roman" w:hint="default"/>
+      </w:rPr>
+    </w:lvl>
+    <w:lvl w:ilvl="1" w:tplc="08090003" w:tentative="1">
+      <w:start w:val="1"/>
+      <w:numFmt w:val="bullet"/>
+      <w:lvlText w:val="o"/>
+      <w:lvlJc w:val="left"/>
+      <w:pPr>
+        <w:ind w:left="1440" w:hanging="360"/>
+      </w:pPr>
+      <w:rPr>
+        <w:rFonts w:ascii="Courier New" w:hAnsi="Courier New" w:cs="Courier New" w:hint="default"/>
+      </w:rPr>
+    </w:lvl>
+    <w:lvl w:ilvl="2" w:tplc="08090005" w:tentative="1">
+      <w:start w:val="1"/>
+      <w:numFmt w:val="bullet"/>
+      <w:lvlText w:val=""/>
+      <w:lvlJc w:val="left"/>
+      <w:pPr>
+        <w:ind w:left="2160" w:hanging="360"/>
+      </w:pPr>
+      <w:rPr>
+        <w:rFonts w:ascii="Wingdings" w:hAnsi="Wingdings" w:hint="default"/>
+      </w:rPr>
+    </w:lvl>
+    <w:lvl w:ilvl="3" w:tplc="08090001" w:tentative="1">
+      <w:start w:val="1"/>
+      <w:numFmt w:val="bullet"/>
+      <w:lvlText w:val=""/>
+      <w:lvlJc w:val="left"/>
+      <w:pPr>
+        <w:ind w:left="2880" w:hanging="360"/>
+      </w:pPr>
+      <w:rPr>
+        <w:rFonts w:ascii="Symbol" w:hAnsi="Symbol" w:hint="default"/>
+      </w:rPr>
+    </w:lvl>
+    <w:lvl w:ilvl="4" w:tplc="08090003" w:tentative="1">
+      <w:start w:val="1"/>
+      <w:numFmt w:val="bullet"/>
+      <w:lvlText w:val="o"/>
+      <w:lvlJc w:val="left"/>
+      <w:pPr>
+        <w:ind w:left="3600" w:hanging="360"/>
+      </w:pPr>
+      <w:rPr>
+        <w:rFonts w:ascii="Courier New" w:hAnsi="Courier New" w:cs="Courier New" w:hint="default"/>
+      </w:rPr>
+    </w:lvl>
+    <w:lvl w:ilvl="5" w:tplc="08090005" w:tentative="1">
+      <w:start w:val="1"/>
+      <w:numFmt w:val="bullet"/>
+      <w:lvlText w:val=""/>
+      <w:lvlJc w:val="left"/>
+      <w:pPr>
+        <w:ind w:left="4320" w:hanging="360"/>
+      </w:pPr>
+      <w:rPr>
+        <w:rFonts w:ascii="Wingdings" w:hAnsi="Wingdings" w:hint="default"/>
+      </w:rPr>
+    </w:lvl>
+    <w:lvl w:ilvl="6" w:tplc="08090001" w:tentative="1">
+      <w:start w:val="1"/>
+      <w:numFmt w:val="bullet"/>
+      <w:lvlText w:val=""/>
+      <w:lvlJc w:val="left"/>
+      <w:pPr>
+        <w:ind w:left="5040" w:hanging="360"/>
+      </w:pPr>
+      <w:rPr>
+        <w:rFonts w:ascii="Symbol" w:hAnsi="Symbol" w:hint="default"/>
+      </w:rPr>
+    </w:lvl>
+    <w:lvl w:ilvl="7" w:tplc="08090003" w:tentative="1">
+      <w:start w:val="1"/>
+      <w:numFmt w:val="bullet"/>
+      <w:lvlText w:val="o"/>
+      <w:lvlJc w:val="left"/>
+      <w:pPr>
+        <w:ind w:left="5760" w:hanging="360"/>
+      </w:pPr>
+      <w:rPr>
+        <w:rFonts w:ascii="Courier New" w:hAnsi="Courier New" w:cs="Courier New" w:hint="default"/>
+      </w:rPr>
+    </w:lvl>
+    <w:lvl w:ilvl="8" w:tplc="08090005" w:tentative="1">
+      <w:start w:val="1"/>
+      <w:numFmt w:val="bullet"/>
+      <w:lvlText w:val=""/>
+      <w:lvlJc w:val="left"/>
+      <w:pPr>
+        <w:ind w:left="6480" w:hanging="360"/>
+      </w:pPr>
+      <w:rPr>
+        <w:rFonts w:ascii="Wingdings" w:hAnsi="Wingdings" w:hint="default"/>
+      </w:rPr>
+    </w:lvl>
+  </w:abstractNum>
+  <w:abstractNum w:abstractNumId="2" w15:restartNumberingAfterBreak="0">
     <w:nsid w:val="282C487B"/>
     <w:multiLevelType w:val="hybridMultilevel"/>
     <w:tmpl w:val="D18C91DA"/>
@@ -5935,7 +7500,120 @@
       </w:rPr>
     </w:lvl>
   </w:abstractNum>
-  <w:abstractNum w:abstractNumId="2" w15:restartNumberingAfterBreak="0">
+  <w:abstractNum w:abstractNumId="3" w15:restartNumberingAfterBreak="0">
+    <w:nsid w:val="386D7FB0"/>
+    <w:multiLevelType w:val="hybridMultilevel"/>
+    <w:tmpl w:val="A6A802C2"/>
+    <w:lvl w:ilvl="0" w:tplc="08090001">
+      <w:start w:val="1"/>
+      <w:numFmt w:val="bullet"/>
+      <w:lvlText w:val=""/>
+      <w:lvlJc w:val="left"/>
+      <w:pPr>
+        <w:ind w:left="720" w:hanging="360"/>
+      </w:pPr>
+      <w:rPr>
+        <w:rFonts w:ascii="Symbol" w:hAnsi="Symbol" w:hint="default"/>
+      </w:rPr>
+    </w:lvl>
+    <w:lvl w:ilvl="1" w:tplc="08090003" w:tentative="1">
+      <w:start w:val="1"/>
+      <w:numFmt w:val="bullet"/>
+      <w:lvlText w:val="o"/>
+      <w:lvlJc w:val="left"/>
+      <w:pPr>
+        <w:ind w:left="1440" w:hanging="360"/>
+      </w:pPr>
+      <w:rPr>
+        <w:rFonts w:ascii="Courier New" w:hAnsi="Courier New" w:cs="Courier New" w:hint="default"/>
+      </w:rPr>
+    </w:lvl>
+    <w:lvl w:ilvl="2" w:tplc="08090005" w:tentative="1">
+      <w:start w:val="1"/>
+      <w:numFmt w:val="bullet"/>
+      <w:lvlText w:val=""/>
+      <w:lvlJc w:val="left"/>
+      <w:pPr>
+        <w:ind w:left="2160" w:hanging="360"/>
+      </w:pPr>
+      <w:rPr>
+        <w:rFonts w:ascii="Wingdings" w:hAnsi="Wingdings" w:hint="default"/>
+      </w:rPr>
+    </w:lvl>
+    <w:lvl w:ilvl="3" w:tplc="08090001" w:tentative="1">
+      <w:start w:val="1"/>
+      <w:numFmt w:val="bullet"/>
+      <w:lvlText w:val=""/>
+      <w:lvlJc w:val="left"/>
+      <w:pPr>
+        <w:ind w:left="2880" w:hanging="360"/>
+      </w:pPr>
+      <w:rPr>
+        <w:rFonts w:ascii="Symbol" w:hAnsi="Symbol" w:hint="default"/>
+      </w:rPr>
+    </w:lvl>
+    <w:lvl w:ilvl="4" w:tplc="08090003" w:tentative="1">
+      <w:start w:val="1"/>
+      <w:numFmt w:val="bullet"/>
+      <w:lvlText w:val="o"/>
+      <w:lvlJc w:val="left"/>
+      <w:pPr>
+        <w:ind w:left="3600" w:hanging="360"/>
+      </w:pPr>
+      <w:rPr>
+        <w:rFonts w:ascii="Courier New" w:hAnsi="Courier New" w:cs="Courier New" w:hint="default"/>
+      </w:rPr>
+    </w:lvl>
+    <w:lvl w:ilvl="5" w:tplc="08090005" w:tentative="1">
+      <w:start w:val="1"/>
+      <w:numFmt w:val="bullet"/>
+      <w:lvlText w:val=""/>
+      <w:lvlJc w:val="left"/>
+      <w:pPr>
+        <w:ind w:left="4320" w:hanging="360"/>
+      </w:pPr>
+      <w:rPr>
+        <w:rFonts w:ascii="Wingdings" w:hAnsi="Wingdings" w:hint="default"/>
+      </w:rPr>
+    </w:lvl>
+    <w:lvl w:ilvl="6" w:tplc="08090001" w:tentative="1">
+      <w:start w:val="1"/>
+      <w:numFmt w:val="bullet"/>
+      <w:lvlText w:val=""/>
+      <w:lvlJc w:val="left"/>
+      <w:pPr>
+        <w:ind w:left="5040" w:hanging="360"/>
+      </w:pPr>
+      <w:rPr>
+        <w:rFonts w:ascii="Symbol" w:hAnsi="Symbol" w:hint="default"/>
+      </w:rPr>
+    </w:lvl>
+    <w:lvl w:ilvl="7" w:tplc="08090003" w:tentative="1">
+      <w:start w:val="1"/>
+      <w:numFmt w:val="bullet"/>
+      <w:lvlText w:val="o"/>
+      <w:lvlJc w:val="left"/>
+      <w:pPr>
+        <w:ind w:left="5760" w:hanging="360"/>
+      </w:pPr>
+      <w:rPr>
+        <w:rFonts w:ascii="Courier New" w:hAnsi="Courier New" w:cs="Courier New" w:hint="default"/>
+      </w:rPr>
+    </w:lvl>
+    <w:lvl w:ilvl="8" w:tplc="08090005" w:tentative="1">
+      <w:start w:val="1"/>
+      <w:numFmt w:val="bullet"/>
+      <w:lvlText w:val=""/>
+      <w:lvlJc w:val="left"/>
+      <w:pPr>
+        <w:ind w:left="6480" w:hanging="360"/>
+      </w:pPr>
+      <w:rPr>
+        <w:rFonts w:ascii="Wingdings" w:hAnsi="Wingdings" w:hint="default"/>
+      </w:rPr>
+    </w:lvl>
+  </w:abstractNum>
+  <w:abstractNum w:abstractNumId="4" w15:restartNumberingAfterBreak="0">
     <w:nsid w:val="43067BD4"/>
     <w:multiLevelType w:val="hybridMultilevel"/>
     <w:tmpl w:val="7BB8C598"/>
@@ -6075,7 +7753,7 @@
       </w:rPr>
     </w:lvl>
   </w:abstractNum>
-  <w:abstractNum w:abstractNumId="3" w15:restartNumberingAfterBreak="0">
+  <w:abstractNum w:abstractNumId="5" w15:restartNumberingAfterBreak="0">
     <w:nsid w:val="4CA34940"/>
     <w:multiLevelType w:val="hybridMultilevel"/>
     <w:tmpl w:val="9E547AC4"/>
@@ -6215,7 +7893,7 @@
       </w:rPr>
     </w:lvl>
   </w:abstractNum>
-  <w:abstractNum w:abstractNumId="4" w15:restartNumberingAfterBreak="0">
+  <w:abstractNum w:abstractNumId="6" w15:restartNumberingAfterBreak="0">
     <w:nsid w:val="4D614E43"/>
     <w:multiLevelType w:val="hybridMultilevel"/>
     <w:tmpl w:val="5DF27BB0"/>
@@ -6355,7 +8033,7 @@
       </w:rPr>
     </w:lvl>
   </w:abstractNum>
-  <w:abstractNum w:abstractNumId="5" w15:restartNumberingAfterBreak="0">
+  <w:abstractNum w:abstractNumId="7" w15:restartNumberingAfterBreak="0">
     <w:nsid w:val="5BBC127A"/>
     <w:multiLevelType w:val="hybridMultilevel"/>
     <w:tmpl w:val="F0AE0908"/>
@@ -6495,7 +8173,7 @@
       </w:rPr>
     </w:lvl>
   </w:abstractNum>
-  <w:abstractNum w:abstractNumId="6" w15:restartNumberingAfterBreak="0">
+  <w:abstractNum w:abstractNumId="8" w15:restartNumberingAfterBreak="0">
     <w:nsid w:val="5E6C1C71"/>
     <w:multiLevelType w:val="hybridMultilevel"/>
     <w:tmpl w:val="A75AC7C0"/>
@@ -6635,7 +8313,7 @@
       </w:rPr>
     </w:lvl>
   </w:abstractNum>
-  <w:abstractNum w:abstractNumId="7" w15:restartNumberingAfterBreak="0">
+  <w:abstractNum w:abstractNumId="9" w15:restartNumberingAfterBreak="0">
     <w:nsid w:val="778A3808"/>
     <w:multiLevelType w:val="hybridMultilevel"/>
     <w:tmpl w:val="6BF02EEA"/>
@@ -6749,27 +8427,33 @@
     </w:lvl>
   </w:abstractNum>
   <w:num w:numId="1">
+    <w:abstractNumId w:val="7"/>
+  </w:num>
+  <w:num w:numId="2">
     <w:abstractNumId w:val="5"/>
   </w:num>
-  <w:num w:numId="2">
+  <w:num w:numId="3">
+    <w:abstractNumId w:val="2"/>
+  </w:num>
+  <w:num w:numId="4">
+    <w:abstractNumId w:val="8"/>
+  </w:num>
+  <w:num w:numId="5">
+    <w:abstractNumId w:val="6"/>
+  </w:num>
+  <w:num w:numId="6">
+    <w:abstractNumId w:val="4"/>
+  </w:num>
+  <w:num w:numId="7">
+    <w:abstractNumId w:val="9"/>
+  </w:num>
+  <w:num w:numId="8">
+    <w:abstractNumId w:val="1"/>
+  </w:num>
+  <w:num w:numId="9">
     <w:abstractNumId w:val="3"/>
   </w:num>
-  <w:num w:numId="3">
-    <w:abstractNumId w:val="1"/>
-  </w:num>
-  <w:num w:numId="4">
-    <w:abstractNumId w:val="6"/>
-  </w:num>
-  <w:num w:numId="5">
-    <w:abstractNumId w:val="4"/>
-  </w:num>
-  <w:num w:numId="6">
-    <w:abstractNumId w:val="2"/>
-  </w:num>
-  <w:num w:numId="7">
-    <w:abstractNumId w:val="7"/>
-  </w:num>
-  <w:num w:numId="8">
+  <w:num w:numId="10">
     <w:abstractNumId w:val="0"/>
   </w:num>
 </w:numbering>
@@ -7901,7 +9585,7 @@
 </file>
 
 <file path=customXml/itemProps1.xml><?xml version="1.0" encoding="utf-8"?>
-<ds:datastoreItem xmlns:ds="http://schemas.openxmlformats.org/officeDocument/2006/customXml" ds:itemID="{5D1A8458-101A-4869-900C-8301651B2D1E}">
+<ds:datastoreItem xmlns:ds="http://schemas.openxmlformats.org/officeDocument/2006/customXml" ds:itemID="{427963A8-8EE1-4BA6-AE3C-0AB4BA79FF38}">
   <ds:schemaRefs>
     <ds:schemaRef ds:uri="http://schemas.openxmlformats.org/officeDocument/2006/bibliography"/>
   </ds:schemaRefs>

</xml_diff>

<commit_message>
Modified documentation, grb and web-server
</commit_message>
<xml_diff>
--- a/docs/Maturski rad - urnek (1).docx
+++ b/docs/Maturski rad - urnek (1).docx
@@ -151,7 +151,7 @@
           </mc:Choice>
           <mc:Fallback>
             <w:pict>
-              <v:rect w14:anchorId="7F97FBE4" id="Rectangle 26" o:spid="_x0000_s1026" style="position:absolute;margin-left:-27pt;margin-top:-73.05pt;width:423pt;height:81pt;z-index:251658240;visibility:visible;mso-wrap-style:square;mso-width-percent:0;mso-height-percent:0;mso-wrap-distance-left:9pt;mso-wrap-distance-top:0;mso-wrap-distance-right:9pt;mso-wrap-distance-bottom:0;mso-position-horizontal:absolute;mso-position-horizontal-relative:text;mso-position-vertical:absolute;mso-position-vertical-relative:text;mso-width-percent:0;mso-height-percent:0;mso-width-relative:page;mso-height-relative:page;v-text-anchor:top" o:gfxdata="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" strokecolor="white"/>
+              <v:rect w14:anchorId="0D8DC3F3" id="Rectangle 26" o:spid="_x0000_s1026" style="position:absolute;margin-left:-27pt;margin-top:-73.05pt;width:423pt;height:81pt;z-index:251658240;visibility:visible;mso-wrap-style:square;mso-width-percent:0;mso-height-percent:0;mso-wrap-distance-left:9pt;mso-wrap-distance-top:0;mso-wrap-distance-right:9pt;mso-wrap-distance-bottom:0;mso-position-horizontal:absolute;mso-position-horizontal-relative:text;mso-position-vertical:absolute;mso-position-vertical-relative:text;mso-width-percent:0;mso-height-percent:0;mso-width-relative:page;mso-height-relative:page;v-text-anchor:top" o:gfxdata="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" strokecolor="white"/>
             </w:pict>
           </mc:Fallback>
         </mc:AlternateContent>
@@ -729,7 +729,7 @@
           </mc:Choice>
           <mc:Fallback>
             <w:pict>
-              <v:rect w14:anchorId="5F0C71FE" id="Rectangle 25" o:spid="_x0000_s1026" style="position:absolute;margin-left:12pt;margin-top:483.1pt;width:423pt;height:81pt;z-index:251659264;visibility:visible;mso-wrap-style:square;mso-width-percent:0;mso-height-percent:0;mso-wrap-distance-left:9pt;mso-wrap-distance-top:0;mso-wrap-distance-right:9pt;mso-wrap-distance-bottom:0;mso-position-horizontal:absolute;mso-position-horizontal-relative:text;mso-position-vertical:absolute;mso-position-vertical-relative:text;mso-width-percent:0;mso-height-percent:0;mso-width-relative:page;mso-height-relative:page;v-text-anchor:top" o:gfxdata="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" strokecolor="white"/>
+              <v:rect w14:anchorId="55507025" id="Rectangle 25" o:spid="_x0000_s1026" style="position:absolute;margin-left:12pt;margin-top:483.1pt;width:423pt;height:81pt;z-index:251659264;visibility:visible;mso-wrap-style:square;mso-width-percent:0;mso-height-percent:0;mso-wrap-distance-left:9pt;mso-wrap-distance-top:0;mso-wrap-distance-right:9pt;mso-wrap-distance-bottom:0;mso-position-horizontal:absolute;mso-position-horizontal-relative:text;mso-position-vertical:absolute;mso-position-vertical-relative:text;mso-width-percent:0;mso-height-percent:0;mso-width-relative:page;mso-height-relative:page;v-text-anchor:top" o:gfxdata="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" strokecolor="white"/>
             </w:pict>
           </mc:Fallback>
         </mc:AlternateContent>
@@ -774,11 +774,9 @@
           <w:pPr>
             <w:pStyle w:val="TOCHeading"/>
           </w:pPr>
-          <w:proofErr w:type="spellStart"/>
           <w:r>
             <w:t>Sadržaj</w:t>
           </w:r>
-          <w:proofErr w:type="spellEnd"/>
         </w:p>
         <w:p/>
         <w:p>
@@ -804,7 +802,7 @@
           <w:r>
             <w:fldChar w:fldCharType="separate"/>
           </w:r>
-          <w:hyperlink w:anchor="_Toc223859589" w:history="1">
+          <w:hyperlink w:anchor="_Toc224141959" w:history="1">
             <w:r>
               <w:rPr>
                 <w:rStyle w:val="Hyperlink"/>
@@ -831,7 +829,7 @@
                 <w:noProof/>
                 <w:webHidden/>
               </w:rPr>
-              <w:instrText xml:space="preserve"> PAGEREF _Toc223859589 \h </w:instrText>
+              <w:instrText xml:space="preserve"> PAGEREF _Toc224141959 \h </w:instrText>
             </w:r>
             <w:r>
               <w:rPr>
@@ -876,7 +874,7 @@
               <w:lang w:val="en-GB" w:eastAsia="en-GB"/>
             </w:rPr>
           </w:pPr>
-          <w:hyperlink w:anchor="_Toc223859590" w:history="1">
+          <w:hyperlink w:anchor="_Toc224141960" w:history="1">
             <w:r>
               <w:rPr>
                 <w:rStyle w:val="Hyperlink"/>
@@ -903,7 +901,7 @@
                 <w:noProof/>
                 <w:webHidden/>
               </w:rPr>
-              <w:instrText xml:space="preserve"> PAGEREF _Toc223859590 \h </w:instrText>
+              <w:instrText xml:space="preserve"> PAGEREF _Toc224141960 \h </w:instrText>
             </w:r>
             <w:r>
               <w:rPr>
@@ -948,7 +946,7 @@
               <w:lang w:val="en-GB" w:eastAsia="en-GB"/>
             </w:rPr>
           </w:pPr>
-          <w:hyperlink w:anchor="_Toc223859591" w:history="1">
+          <w:hyperlink w:anchor="_Toc224141961" w:history="1">
             <w:r>
               <w:rPr>
                 <w:rStyle w:val="Hyperlink"/>
@@ -975,7 +973,7 @@
                 <w:noProof/>
                 <w:webHidden/>
               </w:rPr>
-              <w:instrText xml:space="preserve"> PAGEREF _Toc223859591 \h </w:instrText>
+              <w:instrText xml:space="preserve"> PAGEREF _Toc224141961 \h </w:instrText>
             </w:r>
             <w:r>
               <w:rPr>
@@ -1020,7 +1018,7 @@
               <w:lang w:val="en-GB" w:eastAsia="en-GB"/>
             </w:rPr>
           </w:pPr>
-          <w:hyperlink w:anchor="_Toc223859592" w:history="1">
+          <w:hyperlink w:anchor="_Toc224141962" w:history="1">
             <w:r>
               <w:rPr>
                 <w:rStyle w:val="Hyperlink"/>
@@ -1055,7 +1053,7 @@
                 <w:noProof/>
                 <w:webHidden/>
               </w:rPr>
-              <w:instrText xml:space="preserve"> PAGEREF _Toc223859592 \h </w:instrText>
+              <w:instrText xml:space="preserve"> PAGEREF _Toc224141962 \h </w:instrText>
             </w:r>
             <w:r>
               <w:rPr>
@@ -1100,7 +1098,7 @@
               <w:lang w:val="en-GB" w:eastAsia="en-GB"/>
             </w:rPr>
           </w:pPr>
-          <w:hyperlink w:anchor="_Toc223859593" w:history="1">
+          <w:hyperlink w:anchor="_Toc224141963" w:history="1">
             <w:r>
               <w:rPr>
                 <w:rStyle w:val="Hyperlink"/>
@@ -1135,7 +1133,7 @@
                 <w:noProof/>
                 <w:webHidden/>
               </w:rPr>
-              <w:instrText xml:space="preserve"> PAGEREF _Toc223859593 \h </w:instrText>
+              <w:instrText xml:space="preserve"> PAGEREF _Toc224141963 \h </w:instrText>
             </w:r>
             <w:r>
               <w:rPr>
@@ -1180,7 +1178,7 @@
               <w:lang w:val="en-GB" w:eastAsia="en-GB"/>
             </w:rPr>
           </w:pPr>
-          <w:hyperlink w:anchor="_Toc223859594" w:history="1">
+          <w:hyperlink w:anchor="_Toc224141964" w:history="1">
             <w:r>
               <w:rPr>
                 <w:rStyle w:val="Hyperlink"/>
@@ -1207,7 +1205,7 @@
                 <w:noProof/>
                 <w:webHidden/>
               </w:rPr>
-              <w:instrText xml:space="preserve"> PAGEREF _Toc223859594 \h </w:instrText>
+              <w:instrText xml:space="preserve"> PAGEREF _Toc224141964 \h </w:instrText>
             </w:r>
             <w:r>
               <w:rPr>
@@ -1252,7 +1250,7 @@
               <w:lang w:val="en-GB" w:eastAsia="en-GB"/>
             </w:rPr>
           </w:pPr>
-          <w:hyperlink w:anchor="_Toc223859595" w:history="1">
+          <w:hyperlink w:anchor="_Toc224141965" w:history="1">
             <w:r>
               <w:rPr>
                 <w:rStyle w:val="Hyperlink"/>
@@ -1279,7 +1277,7 @@
                 <w:noProof/>
                 <w:webHidden/>
               </w:rPr>
-              <w:instrText xml:space="preserve"> PAGEREF _Toc223859595 \h </w:instrText>
+              <w:instrText xml:space="preserve"> PAGEREF _Toc224141965 \h </w:instrText>
             </w:r>
             <w:r>
               <w:rPr>
@@ -1324,7 +1322,7 @@
               <w:lang w:val="en-GB" w:eastAsia="en-GB"/>
             </w:rPr>
           </w:pPr>
-          <w:hyperlink w:anchor="_Toc223859596" w:history="1">
+          <w:hyperlink w:anchor="_Toc224141966" w:history="1">
             <w:r>
               <w:rPr>
                 <w:rStyle w:val="Hyperlink"/>
@@ -1351,7 +1349,7 @@
                 <w:noProof/>
                 <w:webHidden/>
               </w:rPr>
-              <w:instrText xml:space="preserve"> PAGEREF _Toc223859596 \h </w:instrText>
+              <w:instrText xml:space="preserve"> PAGEREF _Toc224141966 \h </w:instrText>
             </w:r>
             <w:r>
               <w:rPr>
@@ -1396,7 +1394,7 @@
               <w:lang w:val="en-GB" w:eastAsia="en-GB"/>
             </w:rPr>
           </w:pPr>
-          <w:hyperlink w:anchor="_Toc223859597" w:history="1">
+          <w:hyperlink w:anchor="_Toc224141967" w:history="1">
             <w:r>
               <w:rPr>
                 <w:rStyle w:val="Hyperlink"/>
@@ -1423,7 +1421,7 @@
                 <w:noProof/>
                 <w:webHidden/>
               </w:rPr>
-              <w:instrText xml:space="preserve"> PAGEREF _Toc223859597 \h </w:instrText>
+              <w:instrText xml:space="preserve"> PAGEREF _Toc224141967 \h </w:instrText>
             </w:r>
             <w:r>
               <w:rPr>
@@ -1468,7 +1466,7 @@
               <w:lang w:val="en-GB" w:eastAsia="en-GB"/>
             </w:rPr>
           </w:pPr>
-          <w:hyperlink w:anchor="_Toc223859598" w:history="1">
+          <w:hyperlink w:anchor="_Toc224141968" w:history="1">
             <w:r>
               <w:rPr>
                 <w:rStyle w:val="Hyperlink"/>
@@ -1495,7 +1493,7 @@
                 <w:noProof/>
                 <w:webHidden/>
               </w:rPr>
-              <w:instrText xml:space="preserve"> PAGEREF _Toc223859598 \h </w:instrText>
+              <w:instrText xml:space="preserve"> PAGEREF _Toc224141968 \h </w:instrText>
             </w:r>
             <w:r>
               <w:rPr>
@@ -1540,7 +1538,7 @@
               <w:lang w:val="en-GB" w:eastAsia="en-GB"/>
             </w:rPr>
           </w:pPr>
-          <w:hyperlink w:anchor="_Toc223859599" w:history="1">
+          <w:hyperlink w:anchor="_Toc224141969" w:history="1">
             <w:r>
               <w:rPr>
                 <w:rStyle w:val="Hyperlink"/>
@@ -1567,7 +1565,7 @@
                 <w:noProof/>
                 <w:webHidden/>
               </w:rPr>
-              <w:instrText xml:space="preserve"> PAGEREF _Toc223859599 \h </w:instrText>
+              <w:instrText xml:space="preserve"> PAGEREF _Toc224141969 \h </w:instrText>
             </w:r>
             <w:r>
               <w:rPr>
@@ -1612,7 +1610,7 @@
               <w:lang w:val="en-GB" w:eastAsia="en-GB"/>
             </w:rPr>
           </w:pPr>
-          <w:hyperlink w:anchor="_Toc223859600" w:history="1">
+          <w:hyperlink w:anchor="_Toc224141970" w:history="1">
             <w:r>
               <w:rPr>
                 <w:rStyle w:val="Hyperlink"/>
@@ -1639,7 +1637,7 @@
                 <w:noProof/>
                 <w:webHidden/>
               </w:rPr>
-              <w:instrText xml:space="preserve"> PAGEREF _Toc223859600 \h </w:instrText>
+              <w:instrText xml:space="preserve"> PAGEREF _Toc224141970 \h </w:instrText>
             </w:r>
             <w:r>
               <w:rPr>
@@ -1684,7 +1682,7 @@
               <w:lang w:val="en-GB" w:eastAsia="en-GB"/>
             </w:rPr>
           </w:pPr>
-          <w:hyperlink w:anchor="_Toc223859601" w:history="1">
+          <w:hyperlink w:anchor="_Toc224141971" w:history="1">
             <w:r>
               <w:rPr>
                 <w:rStyle w:val="Hyperlink"/>
@@ -1711,7 +1709,7 @@
                 <w:noProof/>
                 <w:webHidden/>
               </w:rPr>
-              <w:instrText xml:space="preserve"> PAGEREF _Toc223859601 \h </w:instrText>
+              <w:instrText xml:space="preserve"> PAGEREF _Toc224141971 \h </w:instrText>
             </w:r>
             <w:r>
               <w:rPr>
@@ -1756,7 +1754,7 @@
               <w:lang w:val="en-GB" w:eastAsia="en-GB"/>
             </w:rPr>
           </w:pPr>
-          <w:hyperlink w:anchor="_Toc223859602" w:history="1">
+          <w:hyperlink w:anchor="_Toc224141972" w:history="1">
             <w:r>
               <w:rPr>
                 <w:rStyle w:val="Hyperlink"/>
@@ -1783,7 +1781,7 @@
                 <w:noProof/>
                 <w:webHidden/>
               </w:rPr>
-              <w:instrText xml:space="preserve"> PAGEREF _Toc223859602 \h </w:instrText>
+              <w:instrText xml:space="preserve"> PAGEREF _Toc224141972 \h </w:instrText>
             </w:r>
             <w:r>
               <w:rPr>
@@ -1828,7 +1826,7 @@
               <w:lang w:val="en-GB" w:eastAsia="en-GB"/>
             </w:rPr>
           </w:pPr>
-          <w:hyperlink w:anchor="_Toc223859603" w:history="1">
+          <w:hyperlink w:anchor="_Toc224141973" w:history="1">
             <w:r>
               <w:rPr>
                 <w:rStyle w:val="Hyperlink"/>
@@ -1855,7 +1853,7 @@
                 <w:noProof/>
                 <w:webHidden/>
               </w:rPr>
-              <w:instrText xml:space="preserve"> PAGEREF _Toc223859603 \h </w:instrText>
+              <w:instrText xml:space="preserve"> PAGEREF _Toc224141973 \h </w:instrText>
             </w:r>
             <w:r>
               <w:rPr>
@@ -1900,7 +1898,7 @@
               <w:lang w:val="en-GB" w:eastAsia="en-GB"/>
             </w:rPr>
           </w:pPr>
-          <w:hyperlink w:anchor="_Toc223859604" w:history="1">
+          <w:hyperlink w:anchor="_Toc224141974" w:history="1">
             <w:r>
               <w:rPr>
                 <w:rStyle w:val="Hyperlink"/>
@@ -1927,7 +1925,7 @@
                 <w:noProof/>
                 <w:webHidden/>
               </w:rPr>
-              <w:instrText xml:space="preserve"> PAGEREF _Toc223859604 \h </w:instrText>
+              <w:instrText xml:space="preserve"> PAGEREF _Toc224141974 \h </w:instrText>
             </w:r>
             <w:r>
               <w:rPr>
@@ -1972,7 +1970,7 @@
               <w:lang w:val="en-GB" w:eastAsia="en-GB"/>
             </w:rPr>
           </w:pPr>
-          <w:hyperlink w:anchor="_Toc223859605" w:history="1">
+          <w:hyperlink w:anchor="_Toc224141975" w:history="1">
             <w:r>
               <w:rPr>
                 <w:rStyle w:val="Hyperlink"/>
@@ -1999,7 +1997,7 @@
                 <w:noProof/>
                 <w:webHidden/>
               </w:rPr>
-              <w:instrText xml:space="preserve"> PAGEREF _Toc223859605 \h </w:instrText>
+              <w:instrText xml:space="preserve"> PAGEREF _Toc224141975 \h </w:instrText>
             </w:r>
             <w:r>
               <w:rPr>
@@ -2044,7 +2042,7 @@
               <w:lang w:val="en-GB" w:eastAsia="en-GB"/>
             </w:rPr>
           </w:pPr>
-          <w:hyperlink w:anchor="_Toc223859606" w:history="1">
+          <w:hyperlink w:anchor="_Toc224141976" w:history="1">
             <w:r>
               <w:rPr>
                 <w:rStyle w:val="Hyperlink"/>
@@ -2071,7 +2069,7 @@
                 <w:noProof/>
                 <w:webHidden/>
               </w:rPr>
-              <w:instrText xml:space="preserve"> PAGEREF _Toc223859606 \h </w:instrText>
+              <w:instrText xml:space="preserve"> PAGEREF _Toc224141976 \h </w:instrText>
             </w:r>
             <w:r>
               <w:rPr>
@@ -2116,7 +2114,7 @@
               <w:lang w:val="en-GB" w:eastAsia="en-GB"/>
             </w:rPr>
           </w:pPr>
-          <w:hyperlink w:anchor="_Toc223859607" w:history="1">
+          <w:hyperlink w:anchor="_Toc224141977" w:history="1">
             <w:r>
               <w:rPr>
                 <w:rStyle w:val="Hyperlink"/>
@@ -2143,7 +2141,7 @@
                 <w:noProof/>
                 <w:webHidden/>
               </w:rPr>
-              <w:instrText xml:space="preserve"> PAGEREF _Toc223859607 \h </w:instrText>
+              <w:instrText xml:space="preserve"> PAGEREF _Toc224141977 \h </w:instrText>
             </w:r>
             <w:r>
               <w:rPr>
@@ -2188,7 +2186,7 @@
               <w:lang w:val="en-GB" w:eastAsia="en-GB"/>
             </w:rPr>
           </w:pPr>
-          <w:hyperlink w:anchor="_Toc223859608" w:history="1">
+          <w:hyperlink w:anchor="_Toc224141978" w:history="1">
             <w:r>
               <w:rPr>
                 <w:rStyle w:val="Hyperlink"/>
@@ -2216,7 +2214,7 @@
                 <w:noProof/>
                 <w:webHidden/>
               </w:rPr>
-              <w:instrText xml:space="preserve"> PAGEREF _Toc223859608 \h </w:instrText>
+              <w:instrText xml:space="preserve"> PAGEREF _Toc224141978 \h </w:instrText>
             </w:r>
             <w:r>
               <w:rPr>
@@ -2266,8 +2264,6 @@
           <w:lang w:val="hr-HR"/>
         </w:rPr>
       </w:pPr>
-      <w:bookmarkStart w:id="1" w:name="_GoBack"/>
-      <w:bookmarkEnd w:id="1"/>
     </w:p>
     <w:p>
       <w:pPr>
@@ -2287,7 +2283,7 @@
         </w:rPr>
         <w:br w:type="page"/>
       </w:r>
-      <w:bookmarkStart w:id="2" w:name="_Toc223859589"/>
+      <w:bookmarkStart w:id="1" w:name="_Toc224141959"/>
       <w:r>
         <w:lastRenderedPageBreak/>
         <w:t>1.</w:t>
@@ -2299,86 +2295,130 @@
       <w:r>
         <w:t>d</w:t>
       </w:r>
-      <w:bookmarkEnd w:id="2"/>
-    </w:p>
-    <w:p>
-      <w:pPr>
-        <w:jc w:val="both"/>
-        <w:rPr>
-          <w:lang w:val="hr-HR"/>
-        </w:rPr>
-      </w:pPr>
-      <w:r>
-        <w:rPr>
-          <w:lang w:val="hr-HR"/>
-        </w:rPr>
-        <w:t>School Bell System predstavlja inovativno rješenje za upravljanje školskim zvonom zasnovano na modernim tehnologijama i mikrokontrolerima. Sistem je razvijen koristeći ESP32 mikrokontroler, koji omogućava bežičnu kontrolu i integraciju sa LED matricom, čime se učenicima i osoblju škole pružaju vizuelne obavijesti i informacije u realnom vremenu. Primarna svrha ovog sistema je automatizacija školskog zvona i olakšavanje upravljanja rasporedom zvona i dodatnim obavještenjima, što značajno smanjuje potrebu za manuelnom kontrolom i povećava efikasnost školskog okruženja.</w:t>
-      </w:r>
-    </w:p>
-    <w:p>
-      <w:pPr>
-        <w:jc w:val="both"/>
-        <w:rPr>
-          <w:lang w:val="hr-HR"/>
-        </w:rPr>
-      </w:pPr>
-    </w:p>
-    <w:p>
-      <w:pPr>
-        <w:jc w:val="both"/>
-        <w:rPr>
-          <w:lang w:val="hr-HR"/>
-        </w:rPr>
-      </w:pPr>
-      <w:r>
-        <w:rPr>
-          <w:lang w:val="hr-HR"/>
-        </w:rPr>
-        <w:t>Centralni dio sistema čini ESP32 mikrokontroler, koji upravlja relejnim modulom za aktiviranje školskog zvona, čita i prikazuje poruke na LED matrici te pohranjuje sve rasporede u internu memoriju. Zahvaljujući integriranoj WiFi i Bluetooth funkcionalnosti, ESP32 omogućava komunikaciju sa Windows desktop aplikacijom, koja služi kao korisnički interfejs za kreiranje rasporeda, slanje poruka i testiranje zvona. Ovakva arhitektura omogućava da sistem radi u realnom vremenu, a podaci ostaju sačuvani čak i u slučaju nestanka struje, čime se povećava pouzdanost i stabilnost sistema.</w:t>
-      </w:r>
-    </w:p>
-    <w:p>
-      <w:pPr>
-        <w:jc w:val="both"/>
-        <w:rPr>
-          <w:lang w:val="hr-HR"/>
-        </w:rPr>
-      </w:pPr>
-    </w:p>
-    <w:p>
-      <w:pPr>
-        <w:jc w:val="both"/>
-        <w:rPr>
-          <w:lang w:val="hr-HR"/>
-        </w:rPr>
-      </w:pPr>
-      <w:r>
-        <w:rPr>
-          <w:lang w:val="hr-HR"/>
-        </w:rPr>
-        <w:t>Kako bi se prevazišla ograničenja desktop aplikacije, razvijen je i web interfejs sa sedam stranica – index, obavještenja, raspored, dežurstvo, testiranje zvona, postavke, profil i sistem. Web aplikacija koristi zajedničke CSS i JavaScript fajlove, a komunikacija sa ESP32 uređajem odvija se preko JSON protokola i WiFi mreže. Ovaj pristup omogućava bežični pristup sistemu sa bilo kojeg uređaja u mreži, čime se eliminira potreba za kablovskom vezom i manuelnom interakcijom, te se značajno olakšava upravljanje rasporedima i vizuelnim obavještenjima.</w:t>
-      </w:r>
-    </w:p>
-    <w:p>
-      <w:pPr>
-        <w:jc w:val="both"/>
-        <w:rPr>
-          <w:lang w:val="hr-HR"/>
-        </w:rPr>
-      </w:pPr>
-    </w:p>
-    <w:p>
-      <w:pPr>
-        <w:jc w:val="both"/>
-        <w:rPr>
-          <w:lang w:val="hr-HR"/>
-        </w:rPr>
-      </w:pPr>
-      <w:r>
-        <w:rPr>
-          <w:lang w:val="hr-HR"/>
-        </w:rPr>
-        <w:t>Kombinacija ESP32 mikrokontrolera, relejnog modula, LED matrice i web aplikacije stvara kompletan i fleksibilan sistem koji može pratiti i prilagođavati se školskom rasporedu, pružajući korisnicima intuitivno i pouzdano iskustvo. Kroz ovaj projekat demonstrirana je primjena modernih tehnologija u svakodnevnim školskim procesima, kao i mogućnost integracije bežične komunikacije i vizuelnih prikaza u automatizovane sisteme za upravljanje informacijama.</w:t>
+      <w:bookmarkEnd w:id="1"/>
+    </w:p>
+    <w:p>
+      <w:pPr>
+        <w:jc w:val="both"/>
+        <w:rPr>
+          <w:lang w:val="hr-HR"/>
+        </w:rPr>
+      </w:pPr>
+      <w:r>
+        <w:rPr>
+          <w:lang w:val="hr-HR"/>
+        </w:rPr>
+        <w:t>Četiri godine pohađamo ovu školu i dobro poznajemo njene hodnike, učionice i dnevni ritam nastave. Ipak, čak i uz toliko iskustva, određena obavještenja i rasporedi skraćene nastave često ostaju nepoznanica do posljednje minute. Često se dešava da učenici ili posjetioci škole ne znaju gdje se trebaju nalaziti, posebno u situacijama kada se u hodnicima istovremeno nalazi veliki broj ljudi. Tokom međusmjena, kada se približno pedeset učenika kreće hodnicima u isto vrijeme, lako može doći do konfuzije, a pravovremeno informisanje postaje gotovo nemoguće.</w:t>
+      </w:r>
+    </w:p>
+    <w:p>
+      <w:pPr>
+        <w:jc w:val="both"/>
+        <w:rPr>
+          <w:lang w:val="hr-HR"/>
+        </w:rPr>
+      </w:pPr>
+    </w:p>
+    <w:p>
+      <w:pPr>
+        <w:jc w:val="both"/>
+        <w:rPr>
+          <w:lang w:val="hr-HR"/>
+        </w:rPr>
+      </w:pPr>
+      <w:r>
+        <w:rPr>
+          <w:lang w:val="hr-HR"/>
+        </w:rPr>
+        <w:t>Problem je naročito vidljiv kod posjetilaca, gostujućih predavača ili novih učenika, koji nemaju iskustvo kretanja unutar škole. Oni se često suočavaju s nejasnim rasporedom i moraju se oslanjati na druge učenike ili nastavno osoblje kako bi saznali gdje trebaju biti. Slično važi i za situacije kada nastavnici moraju pratiti promjene rasporeda ili posebno obavještenja, kao što su promjene termina nastave, testiranja ili vanredna obavještenja. U takvim okolnostima ručno praćenje rasporeda i obavještenja može biti zamorno, nepraktično i sklono greškama.</w:t>
+      </w:r>
+    </w:p>
+    <w:p>
+      <w:pPr>
+        <w:jc w:val="both"/>
+        <w:rPr>
+          <w:lang w:val="hr-HR"/>
+        </w:rPr>
+      </w:pPr>
+    </w:p>
+    <w:p>
+      <w:pPr>
+        <w:jc w:val="both"/>
+        <w:rPr>
+          <w:lang w:val="hr-HR"/>
+        </w:rPr>
+      </w:pPr>
+      <w:r>
+        <w:rPr>
+          <w:lang w:val="hr-HR"/>
+        </w:rPr>
+        <w:t>Zbog ovih izazova, ideja projekta „School Bell System“ proizašla je iz stvarne potrebe da se upravljanje školskim rasporedom i obavještenjima pojednostavi i učini dostupnim u realnom vremenu. Sistem je zamišljen tako da učenicima, nastavnicima i posjetiocima pruži jednostavan, pregledan i pouzdan način praćenja svih relevantnih informacija. Ideja nije samo da se automatizuje zvono, već i da se omogući pravovremeno obavještavanje o događanjima unutar škole, uključujući raspored skraćene nastave, testove, posebne obavijesti i hitne situacije.</w:t>
+      </w:r>
+    </w:p>
+    <w:p>
+      <w:pPr>
+        <w:jc w:val="both"/>
+        <w:rPr>
+          <w:lang w:val="hr-HR"/>
+        </w:rPr>
+      </w:pPr>
+    </w:p>
+    <w:p>
+      <w:pPr>
+        <w:jc w:val="both"/>
+        <w:rPr>
+          <w:lang w:val="hr-HR"/>
+        </w:rPr>
+      </w:pPr>
+      <w:r>
+        <w:rPr>
+          <w:lang w:val="hr-HR"/>
+        </w:rPr>
+        <w:t>Primarna svrha sistema je stvoriti okruženje u kojem svi korisnici – bilo da su učenici, nastavnici ili posjetioci – imaju pristup ažurnim informacijama bez potrebe za dodatnim pitanjima, provjerama ili čekanjem. Time se ne samo smanjuje konfuzija i stres u hodnicima, već se i poboljšava efikasnost svakodnevnog školskog života. Učenici mogu planirati svoje vrijeme između časova, a nastavno osoblje može lakše organizovati aktivnosti i pratiti promjene u rasporedu.</w:t>
+      </w:r>
+    </w:p>
+    <w:p>
+      <w:pPr>
+        <w:jc w:val="both"/>
+        <w:rPr>
+          <w:lang w:val="hr-HR"/>
+        </w:rPr>
+      </w:pPr>
+    </w:p>
+    <w:p>
+      <w:pPr>
+        <w:jc w:val="both"/>
+        <w:rPr>
+          <w:lang w:val="hr-HR"/>
+        </w:rPr>
+      </w:pPr>
+      <w:r>
+        <w:rPr>
+          <w:lang w:val="hr-HR"/>
+        </w:rPr>
+        <w:t>Ovaj projekat takođe demonstrira kako primjena jednostavnih, ali praktičnih tehnologija može značajno unaprijediti svakodnevne procese u školskom okruženju. Ideja je da sistem bude intuitivan i jednostavan za korištenje, tako da njegova primjena ne zahtijeva dodatnu obuku niti tehničko predznanje korisnika. Cilj je omogućiti da informacije budu dostupne svima u realnom vremenu, a da pritom cijeli proces bude automatizovan i pouzdan.</w:t>
+      </w:r>
+    </w:p>
+    <w:p>
+      <w:pPr>
+        <w:jc w:val="both"/>
+        <w:rPr>
+          <w:lang w:val="hr-HR"/>
+        </w:rPr>
+      </w:pPr>
+    </w:p>
+    <w:p>
+      <w:pPr>
+        <w:jc w:val="both"/>
+        <w:rPr>
+          <w:lang w:val="hr-HR"/>
+        </w:rPr>
+      </w:pPr>
+      <w:r>
+        <w:rPr>
+          <w:lang w:val="hr-HR"/>
+        </w:rPr>
+        <w:t>Kombinacija ovih funkcionalnosti – automatsko zvono, prikaz obavještenja i upravljanje rasporedom – predstavlja kompletno rješenje za jednu od svakodnevnih, ali značajnih problema unutar škole. Uvođenjem ovog sistema, škola dobija način da na moderan i efikasan način informiše sve korisnike i smanji potrebu za manuelnom kontrolom. To omogućava bolju organizaciju i poboljšava ukupno iskustvo učenika i osoblja u školskom okruženju, čineći svakodnevne aktivnosti jasnijim i preglednijim.</w:t>
       </w:r>
       <w:r>
         <w:rPr>
@@ -2391,20 +2431,20 @@
       <w:pPr>
         <w:pStyle w:val="Heading1"/>
       </w:pPr>
-      <w:bookmarkStart w:id="3" w:name="_Toc247374825"/>
-      <w:bookmarkStart w:id="4" w:name="_Toc223859590"/>
+      <w:bookmarkStart w:id="2" w:name="_Toc247374825"/>
+      <w:bookmarkStart w:id="3" w:name="_Toc224141960"/>
       <w:r>
         <w:lastRenderedPageBreak/>
         <w:t xml:space="preserve">2. </w:t>
       </w:r>
+      <w:bookmarkEnd w:id="2"/>
+      <w:r>
+        <w:t xml:space="preserve">Korištene komponente i </w:t>
+      </w:r>
+      <w:r>
+        <w:t>tehnička osnova</w:t>
+      </w:r>
       <w:bookmarkEnd w:id="3"/>
-      <w:r>
-        <w:t xml:space="preserve">Korištene komponente i </w:t>
-      </w:r>
-      <w:r>
-        <w:t>tehnička osnova</w:t>
-      </w:r>
-      <w:bookmarkEnd w:id="4"/>
     </w:p>
     <w:p>
       <w:pPr>
@@ -2534,7 +2574,7 @@
                 <w:lang w:val="en-GB" w:eastAsia="en-GB"/>
               </w:rPr>
               <w:drawing>
-                <wp:inline distT="0" distB="0" distL="0" distR="0" wp14:anchorId="4DCA278B" wp14:editId="5F5BE925">
+                <wp:inline distT="0" distB="0" distL="0" distR="0" wp14:anchorId="738C1997" wp14:editId="60BEB169">
                   <wp:extent cx="1043940" cy="1043940"/>
                   <wp:effectExtent l="0" t="0" r="0" b="0"/>
                   <wp:docPr id="11" name="Picture 11" descr="ESP32-DevKitC-S1 Espressif Systems | Mouser Hungary"/>
@@ -2680,7 +2720,7 @@
                 <w:lang w:val="en-GB" w:eastAsia="en-GB"/>
               </w:rPr>
               <w:drawing>
-                <wp:inline distT="0" distB="0" distL="0" distR="0" wp14:anchorId="640C0EA0" wp14:editId="3D99F654">
+                <wp:inline distT="0" distB="0" distL="0" distR="0" wp14:anchorId="0EA8F738" wp14:editId="0320CC4E">
                   <wp:extent cx="1306567" cy="1165860"/>
                   <wp:effectExtent l="0" t="0" r="0" b="0"/>
                   <wp:docPr id="15" name="Picture 15"/>
@@ -2796,7 +2836,7 @@
                 <w:lang w:val="en-GB" w:eastAsia="en-GB"/>
               </w:rPr>
               <w:drawing>
-                <wp:inline distT="0" distB="0" distL="0" distR="0" wp14:anchorId="568BC510" wp14:editId="4B13DAC4">
+                <wp:inline distT="0" distB="0" distL="0" distR="0" wp14:anchorId="1C4A7F37" wp14:editId="70FF2145">
                   <wp:extent cx="1090716" cy="960120"/>
                   <wp:effectExtent l="0" t="0" r="0" b="0"/>
                   <wp:docPr id="16" name="Picture 16"/>
@@ -2912,7 +2952,7 @@
                 <w:lang w:val="en-GB" w:eastAsia="en-GB"/>
               </w:rPr>
               <w:drawing>
-                <wp:inline distT="0" distB="0" distL="0" distR="0" wp14:anchorId="53BC76E1" wp14:editId="0029823D">
+                <wp:inline distT="0" distB="0" distL="0" distR="0" wp14:anchorId="06AC3F11" wp14:editId="18FC3157">
                   <wp:extent cx="944880" cy="944880"/>
                   <wp:effectExtent l="0" t="0" r="7620" b="7620"/>
                   <wp:docPr id="17" name="Picture 17" descr="School Ring Time Bell 8 inch Stainless Steel Electric Bell Ring Factory  Agencies School Home Use 220V 35W : Amazon.com.au: Home Improvement"/>
@@ -3030,7 +3070,7 @@
                 <w:lang w:val="en-GB" w:eastAsia="en-GB"/>
               </w:rPr>
               <w:drawing>
-                <wp:inline distT="0" distB="0" distL="0" distR="0" wp14:anchorId="5376123C" wp14:editId="73A66ADA">
+                <wp:inline distT="0" distB="0" distL="0" distR="0" wp14:anchorId="1DFD98FF" wp14:editId="24E31F91">
                   <wp:extent cx="1135073" cy="998220"/>
                   <wp:effectExtent l="0" t="0" r="8255" b="0"/>
                   <wp:docPr id="2" name="Picture 2"/>
@@ -3136,7 +3176,7 @@
                 <w:lang w:val="en-GB" w:eastAsia="en-GB"/>
               </w:rPr>
               <w:drawing>
-                <wp:inline distT="0" distB="0" distL="0" distR="0" wp14:anchorId="525E1A5D" wp14:editId="7F2654A6">
+                <wp:inline distT="0" distB="0" distL="0" distR="0" wp14:anchorId="383EC89B" wp14:editId="5BA2AE5C">
                   <wp:extent cx="982980" cy="982980"/>
                   <wp:effectExtent l="0" t="0" r="0" b="0"/>
                   <wp:docPr id="13" name="Picture 13" descr="USB LED TRAKA 5050 5VDC 30PCS/M IP20 RGB 3m | ELMARK"/>
@@ -3231,17 +3271,17 @@
       <w:r>
         <w:br w:type="page"/>
       </w:r>
-      <w:bookmarkStart w:id="5" w:name="_Toc247374826"/>
-      <w:bookmarkStart w:id="6" w:name="_Toc223859591"/>
+      <w:bookmarkStart w:id="4" w:name="_Toc247374826"/>
+      <w:bookmarkStart w:id="5" w:name="_Toc224141961"/>
       <w:r>
         <w:lastRenderedPageBreak/>
         <w:t xml:space="preserve">2.1. </w:t>
       </w:r>
+      <w:bookmarkEnd w:id="4"/>
+      <w:r>
+        <w:t>Esp32 mikrokontroler</w:t>
+      </w:r>
       <w:bookmarkEnd w:id="5"/>
-      <w:r>
-        <w:t>Esp32 mikrokontroler</w:t>
-      </w:r>
-      <w:bookmarkEnd w:id="6"/>
     </w:p>
     <w:p>
       <w:pPr>
@@ -3523,7 +3563,7 @@
           <w:lang w:val="en-GB" w:eastAsia="en-GB"/>
         </w:rPr>
         <w:drawing>
-          <wp:inline distT="0" distB="0" distL="0" distR="0" wp14:anchorId="7C8A4F99" wp14:editId="611CA4FB">
+          <wp:inline distT="0" distB="0" distL="0" distR="0" wp14:anchorId="0B07E747" wp14:editId="494038D4">
             <wp:extent cx="4381595" cy="2324100"/>
             <wp:effectExtent l="0" t="0" r="0" b="0"/>
             <wp:docPr id="1" name="Picture 1"/>
@@ -3682,7 +3722,7 @@
           <w:lang w:val="hr-HR"/>
         </w:rPr>
       </w:pPr>
-      <w:bookmarkStart w:id="7" w:name="_Toc223859592"/>
+      <w:bookmarkStart w:id="6" w:name="_Toc224141962"/>
       <w:r>
         <w:t xml:space="preserve">2.2. </w:t>
       </w:r>
@@ -3710,7 +3750,7 @@
         </w:rPr>
         <w:t xml:space="preserve"> 32x64 P4 (RGB)</w:t>
       </w:r>
-      <w:bookmarkEnd w:id="7"/>
+      <w:bookmarkEnd w:id="6"/>
     </w:p>
     <w:p>
       <w:pPr>
@@ -3761,7 +3801,7 @@
           <w:lang w:val="en-GB" w:eastAsia="en-GB"/>
         </w:rPr>
         <w:drawing>
-          <wp:inline distT="0" distB="0" distL="0" distR="0" wp14:anchorId="22F20987" wp14:editId="3A643970">
+          <wp:inline distT="0" distB="0" distL="0" distR="0" wp14:anchorId="3FD0F309" wp14:editId="4E0867D3">
             <wp:extent cx="5218583" cy="2255520"/>
             <wp:effectExtent l="0" t="0" r="0" b="0"/>
             <wp:docPr id="19" name="Picture 19" descr="RGB Full-Color LED Matrix Panel, 4mm Pitch, 64×32 Pixels, Adjustable  Brightness | RGB-Matrix-P4-64x32"/>
@@ -4002,21 +4042,8 @@
             <w:pPr>
               <w:cnfStyle w:val="000000100000" w:firstRow="0" w:lastRow="0" w:firstColumn="0" w:lastColumn="0" w:oddVBand="0" w:evenVBand="0" w:oddHBand="1" w:evenHBand="0" w:firstRowFirstColumn="0" w:firstRowLastColumn="0" w:lastRowFirstColumn="0" w:lastRowLastColumn="0"/>
             </w:pPr>
-            <w:proofErr w:type="spellStart"/>
-            <w:r>
-              <w:t>Ulazno</w:t>
-            </w:r>
-            <w:proofErr w:type="spellEnd"/>
-            <w:r>
-              <w:t xml:space="preserve"> </w:t>
-            </w:r>
-            <w:proofErr w:type="spellStart"/>
-            <w:r>
-              <w:t>napajanje</w:t>
-            </w:r>
-            <w:proofErr w:type="spellEnd"/>
-            <w:r>
-              <w:t xml:space="preserve"> od 5V</w:t>
+            <w:r>
+              <w:t>Ulazno napajanje od 5V</w:t>
             </w:r>
           </w:p>
         </w:tc>
@@ -4051,11 +4078,9 @@
             <w:pPr>
               <w:cnfStyle w:val="000000100000" w:firstRow="0" w:lastRow="0" w:firstColumn="0" w:lastColumn="0" w:oddVBand="0" w:evenVBand="0" w:oddHBand="1" w:evenHBand="0" w:firstRowFirstColumn="0" w:firstRowLastColumn="0" w:lastRowFirstColumn="0" w:lastRowLastColumn="0"/>
             </w:pPr>
-            <w:proofErr w:type="spellStart"/>
             <w:r>
               <w:t>Uzemljenje</w:t>
             </w:r>
-            <w:proofErr w:type="spellEnd"/>
           </w:p>
         </w:tc>
       </w:tr>
@@ -4082,29 +4107,8 @@
             <w:pPr>
               <w:cnfStyle w:val="000000000000" w:firstRow="0" w:lastRow="0" w:firstColumn="0" w:lastColumn="0" w:oddVBand="0" w:evenVBand="0" w:oddHBand="0" w:evenHBand="0" w:firstRowFirstColumn="0" w:firstRowLastColumn="0" w:lastRowFirstColumn="0" w:lastRowLastColumn="0"/>
             </w:pPr>
-            <w:proofErr w:type="spellStart"/>
-            <w:r>
-              <w:t>Podaci</w:t>
-            </w:r>
-            <w:proofErr w:type="spellEnd"/>
-            <w:r>
-              <w:t xml:space="preserve"> </w:t>
-            </w:r>
-            <w:proofErr w:type="spellStart"/>
-            <w:r>
-              <w:t>višeg</w:t>
-            </w:r>
-            <w:proofErr w:type="spellEnd"/>
-            <w:r>
-              <w:t xml:space="preserve"> </w:t>
-            </w:r>
-            <w:proofErr w:type="spellStart"/>
-            <w:r>
-              <w:t>bita</w:t>
-            </w:r>
-            <w:proofErr w:type="spellEnd"/>
-            <w:r>
-              <w:t xml:space="preserve"> R</w:t>
+            <w:r>
+              <w:t>Podaci višeg bita R</w:t>
             </w:r>
           </w:p>
         </w:tc>
@@ -4139,29 +4143,8 @@
             <w:pPr>
               <w:cnfStyle w:val="000000000000" w:firstRow="0" w:lastRow="0" w:firstColumn="0" w:lastColumn="0" w:oddVBand="0" w:evenVBand="0" w:oddHBand="0" w:evenHBand="0" w:firstRowFirstColumn="0" w:firstRowLastColumn="0" w:lastRowFirstColumn="0" w:lastRowLastColumn="0"/>
             </w:pPr>
-            <w:proofErr w:type="spellStart"/>
-            <w:r>
-              <w:t>Podaci</w:t>
-            </w:r>
-            <w:proofErr w:type="spellEnd"/>
-            <w:r>
-              <w:t xml:space="preserve"> </w:t>
-            </w:r>
-            <w:proofErr w:type="spellStart"/>
-            <w:r>
-              <w:t>nižeg</w:t>
-            </w:r>
-            <w:proofErr w:type="spellEnd"/>
-            <w:r>
-              <w:t xml:space="preserve"> </w:t>
-            </w:r>
-            <w:proofErr w:type="spellStart"/>
-            <w:r>
-              <w:t>bita</w:t>
-            </w:r>
-            <w:proofErr w:type="spellEnd"/>
-            <w:r>
-              <w:t xml:space="preserve"> R</w:t>
+            <w:r>
+              <w:t>Podaci nižeg bita R</w:t>
             </w:r>
           </w:p>
         </w:tc>
@@ -4190,29 +4173,8 @@
             <w:pPr>
               <w:cnfStyle w:val="000000100000" w:firstRow="0" w:lastRow="0" w:firstColumn="0" w:lastColumn="0" w:oddVBand="0" w:evenVBand="0" w:oddHBand="1" w:evenHBand="0" w:firstRowFirstColumn="0" w:firstRowLastColumn="0" w:lastRowFirstColumn="0" w:lastRowLastColumn="0"/>
             </w:pPr>
-            <w:proofErr w:type="spellStart"/>
-            <w:r>
-              <w:t>Podaci</w:t>
-            </w:r>
-            <w:proofErr w:type="spellEnd"/>
-            <w:r>
-              <w:t xml:space="preserve"> </w:t>
-            </w:r>
-            <w:proofErr w:type="spellStart"/>
-            <w:r>
-              <w:t>višeg</w:t>
-            </w:r>
-            <w:proofErr w:type="spellEnd"/>
-            <w:r>
-              <w:t xml:space="preserve"> </w:t>
-            </w:r>
-            <w:proofErr w:type="spellStart"/>
-            <w:r>
-              <w:t>bita</w:t>
-            </w:r>
-            <w:proofErr w:type="spellEnd"/>
-            <w:r>
-              <w:t xml:space="preserve"> G</w:t>
+            <w:r>
+              <w:t>Podaci višeg bita G</w:t>
             </w:r>
           </w:p>
         </w:tc>
@@ -4247,29 +4209,8 @@
             <w:pPr>
               <w:cnfStyle w:val="000000100000" w:firstRow="0" w:lastRow="0" w:firstColumn="0" w:lastColumn="0" w:oddVBand="0" w:evenVBand="0" w:oddHBand="1" w:evenHBand="0" w:firstRowFirstColumn="0" w:firstRowLastColumn="0" w:lastRowFirstColumn="0" w:lastRowLastColumn="0"/>
             </w:pPr>
-            <w:proofErr w:type="spellStart"/>
-            <w:r>
-              <w:t>Podaci</w:t>
-            </w:r>
-            <w:proofErr w:type="spellEnd"/>
-            <w:r>
-              <w:t xml:space="preserve"> </w:t>
-            </w:r>
-            <w:proofErr w:type="spellStart"/>
-            <w:r>
-              <w:t>nižeg</w:t>
-            </w:r>
-            <w:proofErr w:type="spellEnd"/>
-            <w:r>
-              <w:t xml:space="preserve"> </w:t>
-            </w:r>
-            <w:proofErr w:type="spellStart"/>
-            <w:r>
-              <w:t>bita</w:t>
-            </w:r>
-            <w:proofErr w:type="spellEnd"/>
-            <w:r>
-              <w:t xml:space="preserve"> G</w:t>
+            <w:r>
+              <w:t>Podaci nižeg bita G</w:t>
             </w:r>
           </w:p>
         </w:tc>
@@ -4297,29 +4238,8 @@
             <w:pPr>
               <w:cnfStyle w:val="000000000000" w:firstRow="0" w:lastRow="0" w:firstColumn="0" w:lastColumn="0" w:oddVBand="0" w:evenVBand="0" w:oddHBand="0" w:evenHBand="0" w:firstRowFirstColumn="0" w:firstRowLastColumn="0" w:lastRowFirstColumn="0" w:lastRowLastColumn="0"/>
             </w:pPr>
-            <w:proofErr w:type="spellStart"/>
-            <w:r>
-              <w:t>Podaci</w:t>
-            </w:r>
-            <w:proofErr w:type="spellEnd"/>
-            <w:r>
-              <w:t xml:space="preserve"> </w:t>
-            </w:r>
-            <w:proofErr w:type="spellStart"/>
-            <w:r>
-              <w:t>višeg</w:t>
-            </w:r>
-            <w:proofErr w:type="spellEnd"/>
-            <w:r>
-              <w:t xml:space="preserve"> </w:t>
-            </w:r>
-            <w:proofErr w:type="spellStart"/>
-            <w:r>
-              <w:t>bita</w:t>
-            </w:r>
-            <w:proofErr w:type="spellEnd"/>
-            <w:r>
-              <w:t xml:space="preserve"> B</w:t>
+            <w:r>
+              <w:t>Podaci višeg bita B</w:t>
             </w:r>
           </w:p>
         </w:tc>
@@ -4354,29 +4274,8 @@
             <w:pPr>
               <w:cnfStyle w:val="000000000000" w:firstRow="0" w:lastRow="0" w:firstColumn="0" w:lastColumn="0" w:oddVBand="0" w:evenVBand="0" w:oddHBand="0" w:evenHBand="0" w:firstRowFirstColumn="0" w:firstRowLastColumn="0" w:lastRowFirstColumn="0" w:lastRowLastColumn="0"/>
             </w:pPr>
-            <w:proofErr w:type="spellStart"/>
-            <w:r>
-              <w:t>Podaci</w:t>
-            </w:r>
-            <w:proofErr w:type="spellEnd"/>
-            <w:r>
-              <w:t xml:space="preserve"> </w:t>
-            </w:r>
-            <w:proofErr w:type="spellStart"/>
-            <w:r>
-              <w:t>nižeg</w:t>
-            </w:r>
-            <w:proofErr w:type="spellEnd"/>
-            <w:r>
-              <w:t xml:space="preserve"> </w:t>
-            </w:r>
-            <w:proofErr w:type="spellStart"/>
-            <w:r>
-              <w:t>bita</w:t>
-            </w:r>
-            <w:proofErr w:type="spellEnd"/>
-            <w:r>
-              <w:t xml:space="preserve"> B</w:t>
+            <w:r>
+              <w:t>Podaci nižeg bita B</w:t>
             </w:r>
           </w:p>
         </w:tc>
@@ -4405,22 +4304,15 @@
             <w:pPr>
               <w:cnfStyle w:val="000000100000" w:firstRow="0" w:lastRow="0" w:firstColumn="0" w:lastColumn="0" w:oddVBand="0" w:evenVBand="0" w:oddHBand="1" w:evenHBand="0" w:firstRowFirstColumn="0" w:firstRowLastColumn="0" w:lastRowFirstColumn="0" w:lastRowLastColumn="0"/>
             </w:pPr>
-            <w:proofErr w:type="spellStart"/>
             <w:r>
               <w:t>Odabir</w:t>
             </w:r>
-            <w:proofErr w:type="spellEnd"/>
             <w:r>
               <w:t xml:space="preserve"> A</w:t>
             </w:r>
             <w:r>
-              <w:t xml:space="preserve"> </w:t>
-            </w:r>
-            <w:proofErr w:type="spellStart"/>
-            <w:r>
-              <w:t>linije</w:t>
-            </w:r>
-            <w:proofErr w:type="spellEnd"/>
+              <w:t xml:space="preserve"> linije</w:t>
+            </w:r>
           </w:p>
         </w:tc>
         <w:tc>
@@ -4454,19 +4346,9 @@
             <w:pPr>
               <w:cnfStyle w:val="000000100000" w:firstRow="0" w:lastRow="0" w:firstColumn="0" w:lastColumn="0" w:oddVBand="0" w:evenVBand="0" w:oddHBand="1" w:evenHBand="0" w:firstRowFirstColumn="0" w:firstRowLastColumn="0" w:lastRowFirstColumn="0" w:lastRowLastColumn="0"/>
             </w:pPr>
-            <w:proofErr w:type="spellStart"/>
-            <w:r>
-              <w:t>Odabir</w:t>
-            </w:r>
-            <w:proofErr w:type="spellEnd"/>
-            <w:r>
-              <w:t xml:space="preserve"> B </w:t>
-            </w:r>
-            <w:proofErr w:type="spellStart"/>
-            <w:r>
-              <w:t>linije</w:t>
-            </w:r>
-            <w:proofErr w:type="spellEnd"/>
+            <w:r>
+              <w:t>Odabir B linije</w:t>
+            </w:r>
           </w:p>
         </w:tc>
       </w:tr>
@@ -4493,19 +4375,9 @@
             <w:pPr>
               <w:cnfStyle w:val="000000000000" w:firstRow="0" w:lastRow="0" w:firstColumn="0" w:lastColumn="0" w:oddVBand="0" w:evenVBand="0" w:oddHBand="0" w:evenHBand="0" w:firstRowFirstColumn="0" w:firstRowLastColumn="0" w:lastRowFirstColumn="0" w:lastRowLastColumn="0"/>
             </w:pPr>
-            <w:proofErr w:type="spellStart"/>
-            <w:r>
-              <w:t>Odabir</w:t>
-            </w:r>
-            <w:proofErr w:type="spellEnd"/>
-            <w:r>
-              <w:t xml:space="preserve"> C </w:t>
-            </w:r>
-            <w:proofErr w:type="spellStart"/>
-            <w:r>
-              <w:t>linije</w:t>
-            </w:r>
-            <w:proofErr w:type="spellEnd"/>
+            <w:r>
+              <w:t>Odabir C linije</w:t>
+            </w:r>
           </w:p>
         </w:tc>
         <w:tc>
@@ -4539,19 +4411,9 @@
             <w:pPr>
               <w:cnfStyle w:val="000000000000" w:firstRow="0" w:lastRow="0" w:firstColumn="0" w:lastColumn="0" w:oddVBand="0" w:evenVBand="0" w:oddHBand="0" w:evenHBand="0" w:firstRowFirstColumn="0" w:firstRowLastColumn="0" w:lastRowFirstColumn="0" w:lastRowLastColumn="0"/>
             </w:pPr>
-            <w:proofErr w:type="spellStart"/>
-            <w:r>
-              <w:t>Odabir</w:t>
-            </w:r>
-            <w:proofErr w:type="spellEnd"/>
-            <w:r>
-              <w:t xml:space="preserve"> D </w:t>
-            </w:r>
-            <w:proofErr w:type="spellStart"/>
-            <w:r>
-              <w:t>linije</w:t>
-            </w:r>
-            <w:proofErr w:type="spellEnd"/>
+            <w:r>
+              <w:t>Odabir D linije</w:t>
+            </w:r>
           </w:p>
         </w:tc>
       </w:tr>
@@ -4579,19 +4441,9 @@
             <w:pPr>
               <w:cnfStyle w:val="000000100000" w:firstRow="0" w:lastRow="0" w:firstColumn="0" w:lastColumn="0" w:oddVBand="0" w:evenVBand="0" w:oddHBand="1" w:evenHBand="0" w:firstRowFirstColumn="0" w:firstRowLastColumn="0" w:lastRowFirstColumn="0" w:lastRowLastColumn="0"/>
             </w:pPr>
-            <w:proofErr w:type="spellStart"/>
-            <w:r>
-              <w:t>Izbor</w:t>
-            </w:r>
-            <w:proofErr w:type="spellEnd"/>
-            <w:r>
-              <w:t xml:space="preserve"> E </w:t>
-            </w:r>
-            <w:proofErr w:type="spellStart"/>
-            <w:r>
-              <w:t>linije</w:t>
-            </w:r>
-            <w:proofErr w:type="spellEnd"/>
+            <w:r>
+              <w:t>Izbor E linije</w:t>
+            </w:r>
           </w:p>
         </w:tc>
         <w:tc>
@@ -4625,19 +4477,9 @@
             <w:pPr>
               <w:cnfStyle w:val="000000100000" w:firstRow="0" w:lastRow="0" w:firstColumn="0" w:lastColumn="0" w:oddVBand="0" w:evenVBand="0" w:oddHBand="1" w:evenHBand="0" w:firstRowFirstColumn="0" w:firstRowLastColumn="0" w:lastRowFirstColumn="0" w:lastRowLastColumn="0"/>
             </w:pPr>
-            <w:proofErr w:type="spellStart"/>
-            <w:r>
-              <w:t>ulaz</w:t>
-            </w:r>
-            <w:proofErr w:type="spellEnd"/>
-            <w:r>
-              <w:t xml:space="preserve"> </w:t>
-            </w:r>
-            <w:proofErr w:type="spellStart"/>
-            <w:r>
-              <w:t>takta</w:t>
-            </w:r>
-            <w:proofErr w:type="spellEnd"/>
+            <w:r>
+              <w:t>ulaz takta</w:t>
+            </w:r>
           </w:p>
         </w:tc>
       </w:tr>
@@ -4828,75 +4670,11 @@
           <w:lang w:val="de-AT"/>
         </w:rPr>
       </w:pPr>
-      <w:proofErr w:type="spellStart"/>
       <w:r>
         <w:rPr>
           <w:lang w:val="en-GB"/>
         </w:rPr>
-        <w:t>Regulisani</w:t>
-      </w:r>
-      <w:proofErr w:type="spellEnd"/>
-      <w:r>
-        <w:rPr>
-          <w:lang w:val="en-GB"/>
-        </w:rPr>
-        <w:t xml:space="preserve"> </w:t>
-      </w:r>
-      <w:proofErr w:type="spellStart"/>
-      <w:r>
-        <w:rPr>
-          <w:lang w:val="en-GB"/>
-        </w:rPr>
-        <w:t>ulaz</w:t>
-      </w:r>
-      <w:proofErr w:type="spellEnd"/>
-      <w:r>
-        <w:rPr>
-          <w:lang w:val="en-GB"/>
-        </w:rPr>
-        <w:t xml:space="preserve"> </w:t>
-      </w:r>
-      <w:proofErr w:type="spellStart"/>
-      <w:r>
-        <w:rPr>
-          <w:lang w:val="en-GB"/>
-        </w:rPr>
-        <w:t>napajanja</w:t>
-      </w:r>
-      <w:proofErr w:type="spellEnd"/>
-      <w:r>
-        <w:rPr>
-          <w:lang w:val="en-GB"/>
-        </w:rPr>
-        <w:t xml:space="preserve"> </w:t>
-      </w:r>
-      <w:proofErr w:type="spellStart"/>
-      <w:r>
-        <w:rPr>
-          <w:lang w:val="en-GB"/>
-        </w:rPr>
-        <w:t>od</w:t>
-      </w:r>
-      <w:proofErr w:type="spellEnd"/>
-      <w:r>
-        <w:rPr>
-          <w:lang w:val="en-GB"/>
-        </w:rPr>
-        <w:t xml:space="preserve"> 5V, ~4A </w:t>
-      </w:r>
-      <w:proofErr w:type="spellStart"/>
-      <w:r>
-        <w:rPr>
-          <w:lang w:val="en-GB"/>
-        </w:rPr>
-        <w:t>maks</w:t>
-      </w:r>
-      <w:proofErr w:type="spellEnd"/>
-      <w:r>
-        <w:rPr>
-          <w:lang w:val="en-GB"/>
-        </w:rPr>
-        <w:t xml:space="preserve">. </w:t>
+        <w:t xml:space="preserve">Regulisani ulaz napajanja od 5V, ~4A maks. </w:t>
       </w:r>
       <w:r>
         <w:rPr>
@@ -4931,35 +4709,9 @@
           <w:numId w:val="8"/>
         </w:numPr>
       </w:pPr>
-      <w:proofErr w:type="spellStart"/>
-      <w:r>
-        <w:t>Unutrašnji</w:t>
-      </w:r>
-      <w:proofErr w:type="spellEnd"/>
-      <w:r>
-        <w:t xml:space="preserve"> </w:t>
-      </w:r>
-      <w:proofErr w:type="spellStart"/>
-      <w:r>
-        <w:t>ekran</w:t>
-      </w:r>
-      <w:proofErr w:type="spellEnd"/>
-      <w:r>
-        <w:t xml:space="preserve">, </w:t>
-      </w:r>
-      <w:proofErr w:type="spellStart"/>
-      <w:r>
-        <w:t>vidljivost</w:t>
-      </w:r>
-      <w:proofErr w:type="spellEnd"/>
-      <w:r>
-        <w:t xml:space="preserve"> od 160 </w:t>
-      </w:r>
-      <w:proofErr w:type="spellStart"/>
-      <w:r>
-        <w:t>stepeni</w:t>
-      </w:r>
-      <w:proofErr w:type="spellEnd"/>
+      <w:r>
+        <w:t>Unutrašnji ekran, vidljivost od 160 stepeni</w:t>
+      </w:r>
     </w:p>
     <w:p>
       <w:pPr>
@@ -4972,96 +4724,17 @@
           <w:lang w:val="hr-HR"/>
         </w:rPr>
       </w:pPr>
-      <w:proofErr w:type="spellStart"/>
-      <w:r>
-        <w:t>Ekrani</w:t>
-      </w:r>
-      <w:proofErr w:type="spellEnd"/>
-      <w:r>
-        <w:t xml:space="preserve"> se </w:t>
-      </w:r>
-      <w:proofErr w:type="spellStart"/>
-      <w:r>
-        <w:t>mogu</w:t>
-      </w:r>
-      <w:proofErr w:type="spellEnd"/>
-      <w:r>
-        <w:t xml:space="preserve"> </w:t>
-      </w:r>
-      <w:proofErr w:type="spellStart"/>
-      <w:r>
-        <w:t>lančano</w:t>
-      </w:r>
-      <w:proofErr w:type="spellEnd"/>
-      <w:r>
-        <w:t>/</w:t>
-      </w:r>
-      <w:proofErr w:type="spellStart"/>
-      <w:r>
-        <w:t>serijski</w:t>
-      </w:r>
-      <w:proofErr w:type="spellEnd"/>
-      <w:r>
-        <w:t xml:space="preserve"> </w:t>
-      </w:r>
-      <w:proofErr w:type="spellStart"/>
-      <w:r>
-        <w:t>povezivati</w:t>
-      </w:r>
-      <w:proofErr w:type="spellEnd"/>
-      <w:r>
-        <w:t xml:space="preserve"> - </w:t>
-      </w:r>
-      <w:proofErr w:type="spellStart"/>
-      <w:r>
-        <w:t>povezivanjem</w:t>
-      </w:r>
-      <w:proofErr w:type="spellEnd"/>
-      <w:r>
-        <w:t xml:space="preserve"> </w:t>
-      </w:r>
-      <w:proofErr w:type="spellStart"/>
-      <w:r>
-        <w:t>jednog</w:t>
-      </w:r>
-      <w:proofErr w:type="spellEnd"/>
-      <w:r>
-        <w:t xml:space="preserve"> </w:t>
-      </w:r>
-      <w:proofErr w:type="spellStart"/>
-      <w:r>
-        <w:t>izlaz</w:t>
+      <w:r>
+        <w:t>Ekrani se mogu lančano/serijski povezivati - povezivanjem jednog</w:t>
+      </w:r>
+      <w:r>
+        <w:t xml:space="preserve"> izlaz</w:t>
       </w:r>
       <w:r>
         <w:t>a</w:t>
       </w:r>
-      <w:proofErr w:type="spellEnd"/>
-      <w:r>
-        <w:t xml:space="preserve"> </w:t>
-      </w:r>
-      <w:proofErr w:type="spellStart"/>
-      <w:r>
-        <w:t>sa</w:t>
-      </w:r>
-      <w:proofErr w:type="spellEnd"/>
-      <w:r>
-        <w:t xml:space="preserve"> </w:t>
-      </w:r>
-      <w:proofErr w:type="spellStart"/>
-      <w:r>
-        <w:t>sljedećim</w:t>
-      </w:r>
-      <w:proofErr w:type="spellEnd"/>
-      <w:r>
-        <w:t xml:space="preserve"> </w:t>
-      </w:r>
-      <w:proofErr w:type="spellStart"/>
-      <w:r>
-        <w:t>ulazom</w:t>
-      </w:r>
-      <w:proofErr w:type="spellEnd"/>
-      <w:r>
-        <w:t xml:space="preserve"> </w:t>
+      <w:r>
+        <w:t xml:space="preserve"> sa sljedećim ulazom </w:t>
       </w:r>
     </w:p>
     <w:p>
@@ -5087,7 +4760,7 @@
           <w:lang w:val="hr-HR"/>
         </w:rPr>
       </w:pPr>
-      <w:bookmarkStart w:id="8" w:name="_Toc223859593"/>
+      <w:bookmarkStart w:id="7" w:name="_Toc224141963"/>
       <w:r>
         <w:t xml:space="preserve">2.3. </w:t>
       </w:r>
@@ -5097,7 +4770,7 @@
         </w:rPr>
         <w:t>Napojna jedinica</w:t>
       </w:r>
-      <w:bookmarkEnd w:id="8"/>
+      <w:bookmarkEnd w:id="7"/>
     </w:p>
     <w:p>
       <w:pPr>
@@ -5162,1087 +4835,77 @@
           <w:lang w:val="en-GB"/>
         </w:rPr>
       </w:pPr>
-      <w:proofErr w:type="spellStart"/>
       <w:r>
         <w:rPr>
           <w:lang w:val="en-GB"/>
         </w:rPr>
-        <w:t>Princip</w:t>
-      </w:r>
-      <w:proofErr w:type="spellEnd"/>
-      <w:r>
+        <w:t xml:space="preserve">Princip rada napojne jedinice zasniva se na pretvaranju i regulaciji električne energije. Ulazna struja se kroz transformator, ispravljač i filtere pretvara u jednosmernu struju odgovarajuće snage, dok regulator napona održava konstantan izlazni napon bez obzira na promjene u opterećenju ili ulaznoj struji. </w:t>
+      </w:r>
+    </w:p>
+    <w:p>
+      <w:pPr>
+        <w:jc w:val="both"/>
         <w:rPr>
           <w:lang w:val="en-GB"/>
         </w:rPr>
-        <w:t xml:space="preserve"> </w:t>
-      </w:r>
-      <w:proofErr w:type="spellStart"/>
-      <w:r>
+      </w:pPr>
+    </w:p>
+    <w:p>
+      <w:pPr>
+        <w:jc w:val="both"/>
         <w:rPr>
           <w:lang w:val="en-GB"/>
         </w:rPr>
-        <w:t>rada</w:t>
-      </w:r>
-      <w:proofErr w:type="spellEnd"/>
+      </w:pPr>
       <w:r>
         <w:rPr>
           <w:lang w:val="en-GB"/>
         </w:rPr>
-        <w:t xml:space="preserve"> </w:t>
-      </w:r>
-      <w:proofErr w:type="spellStart"/>
-      <w:r>
+        <w:t>Za naš projekat koristimo napojnu jedinicu od 5 V i 5 A, koja je dovoljna da napaja LED matricu i RGB trake na slovima. Ovaj izbor omogućava sigurno i stabilno napajanje svih LED dioda, bez fluktuacija napona ili prenapona, čime se osigurava pravilno i ujednačeno osvjetljenje i pouzdan rad sistema.</w:t>
+      </w:r>
+    </w:p>
+    <w:p>
+      <w:pPr>
+        <w:jc w:val="both"/>
         <w:rPr>
           <w:lang w:val="en-GB"/>
         </w:rPr>
-        <w:t>napojne</w:t>
-      </w:r>
-      <w:proofErr w:type="spellEnd"/>
-      <w:r>
+      </w:pPr>
+    </w:p>
+    <w:p>
+      <w:pPr>
+        <w:jc w:val="both"/>
         <w:rPr>
           <w:lang w:val="en-GB"/>
         </w:rPr>
-        <w:t xml:space="preserve"> </w:t>
-      </w:r>
-      <w:proofErr w:type="spellStart"/>
-      <w:r>
+      </w:pPr>
+    </w:p>
+    <w:p>
+      <w:pPr>
+        <w:jc w:val="both"/>
         <w:rPr>
           <w:lang w:val="en-GB"/>
         </w:rPr>
-        <w:t>jedinice</w:t>
-      </w:r>
-      <w:proofErr w:type="spellEnd"/>
-      <w:r>
+      </w:pPr>
+    </w:p>
+    <w:p>
+      <w:pPr>
+        <w:jc w:val="both"/>
         <w:rPr>
           <w:lang w:val="en-GB"/>
         </w:rPr>
-        <w:t xml:space="preserve"> </w:t>
-      </w:r>
-      <w:proofErr w:type="spellStart"/>
-      <w:r>
+      </w:pPr>
+    </w:p>
+    <w:p>
+      <w:pPr>
         <w:rPr>
           <w:lang w:val="en-GB"/>
         </w:rPr>
-        <w:t>zasniva</w:t>
-      </w:r>
-      <w:proofErr w:type="spellEnd"/>
+      </w:pPr>
       <w:r>
         <w:rPr>
           <w:lang w:val="en-GB"/>
         </w:rPr>
-        <w:t xml:space="preserve"> se </w:t>
-      </w:r>
-      <w:proofErr w:type="spellStart"/>
-      <w:r>
-        <w:rPr>
-          <w:lang w:val="en-GB"/>
-        </w:rPr>
-        <w:t>na</w:t>
-      </w:r>
-      <w:proofErr w:type="spellEnd"/>
-      <w:r>
-        <w:rPr>
-          <w:lang w:val="en-GB"/>
-        </w:rPr>
-        <w:t xml:space="preserve"> </w:t>
-      </w:r>
-      <w:proofErr w:type="spellStart"/>
-      <w:r>
-        <w:rPr>
-          <w:lang w:val="en-GB"/>
-        </w:rPr>
-        <w:t>pretvaranju</w:t>
-      </w:r>
-      <w:proofErr w:type="spellEnd"/>
-      <w:r>
-        <w:rPr>
-          <w:lang w:val="en-GB"/>
-        </w:rPr>
-        <w:t xml:space="preserve"> </w:t>
-      </w:r>
-      <w:proofErr w:type="spellStart"/>
-      <w:r>
-        <w:rPr>
-          <w:lang w:val="en-GB"/>
-        </w:rPr>
-        <w:t>i</w:t>
-      </w:r>
-      <w:proofErr w:type="spellEnd"/>
-      <w:r>
-        <w:rPr>
-          <w:lang w:val="en-GB"/>
-        </w:rPr>
-        <w:t xml:space="preserve"> </w:t>
-      </w:r>
-      <w:proofErr w:type="spellStart"/>
-      <w:r>
-        <w:rPr>
-          <w:lang w:val="en-GB"/>
-        </w:rPr>
-        <w:t>regulaciji</w:t>
-      </w:r>
-      <w:proofErr w:type="spellEnd"/>
-      <w:r>
-        <w:rPr>
-          <w:lang w:val="en-GB"/>
-        </w:rPr>
-        <w:t xml:space="preserve"> </w:t>
-      </w:r>
-      <w:proofErr w:type="spellStart"/>
-      <w:r>
-        <w:rPr>
-          <w:lang w:val="en-GB"/>
-        </w:rPr>
-        <w:t>električne</w:t>
-      </w:r>
-      <w:proofErr w:type="spellEnd"/>
-      <w:r>
-        <w:rPr>
-          <w:lang w:val="en-GB"/>
-        </w:rPr>
-        <w:t xml:space="preserve"> </w:t>
-      </w:r>
-      <w:proofErr w:type="spellStart"/>
-      <w:r>
-        <w:rPr>
-          <w:lang w:val="en-GB"/>
-        </w:rPr>
-        <w:t>energije</w:t>
-      </w:r>
-      <w:proofErr w:type="spellEnd"/>
-      <w:r>
-        <w:rPr>
-          <w:lang w:val="en-GB"/>
-        </w:rPr>
-        <w:t xml:space="preserve">. </w:t>
-      </w:r>
-      <w:proofErr w:type="spellStart"/>
-      <w:r>
-        <w:rPr>
-          <w:lang w:val="en-GB"/>
-        </w:rPr>
-        <w:t>Ulazna</w:t>
-      </w:r>
-      <w:proofErr w:type="spellEnd"/>
-      <w:r>
-        <w:rPr>
-          <w:lang w:val="en-GB"/>
-        </w:rPr>
-        <w:t xml:space="preserve"> </w:t>
-      </w:r>
-      <w:proofErr w:type="spellStart"/>
-      <w:r>
-        <w:rPr>
-          <w:lang w:val="en-GB"/>
-        </w:rPr>
-        <w:t>struja</w:t>
-      </w:r>
-      <w:proofErr w:type="spellEnd"/>
-      <w:r>
-        <w:rPr>
-          <w:lang w:val="en-GB"/>
-        </w:rPr>
-        <w:t xml:space="preserve"> se </w:t>
-      </w:r>
-      <w:proofErr w:type="spellStart"/>
-      <w:r>
-        <w:rPr>
-          <w:lang w:val="en-GB"/>
-        </w:rPr>
-        <w:t>kroz</w:t>
-      </w:r>
-      <w:proofErr w:type="spellEnd"/>
-      <w:r>
-        <w:rPr>
-          <w:lang w:val="en-GB"/>
-        </w:rPr>
-        <w:t xml:space="preserve"> </w:t>
-      </w:r>
-      <w:proofErr w:type="spellStart"/>
-      <w:r>
-        <w:rPr>
-          <w:lang w:val="en-GB"/>
-        </w:rPr>
-        <w:t>transformator</w:t>
-      </w:r>
-      <w:proofErr w:type="spellEnd"/>
-      <w:r>
-        <w:rPr>
-          <w:lang w:val="en-GB"/>
-        </w:rPr>
-        <w:t xml:space="preserve">, </w:t>
-      </w:r>
-      <w:proofErr w:type="spellStart"/>
-      <w:r>
-        <w:rPr>
-          <w:lang w:val="en-GB"/>
-        </w:rPr>
-        <w:t>ispravljač</w:t>
-      </w:r>
-      <w:proofErr w:type="spellEnd"/>
-      <w:r>
-        <w:rPr>
-          <w:lang w:val="en-GB"/>
-        </w:rPr>
-        <w:t xml:space="preserve"> </w:t>
-      </w:r>
-      <w:proofErr w:type="spellStart"/>
-      <w:r>
-        <w:rPr>
-          <w:lang w:val="en-GB"/>
-        </w:rPr>
-        <w:t>i</w:t>
-      </w:r>
-      <w:proofErr w:type="spellEnd"/>
-      <w:r>
-        <w:rPr>
-          <w:lang w:val="en-GB"/>
-        </w:rPr>
-        <w:t xml:space="preserve"> </w:t>
-      </w:r>
-      <w:proofErr w:type="spellStart"/>
-      <w:r>
-        <w:rPr>
-          <w:lang w:val="en-GB"/>
-        </w:rPr>
-        <w:t>filtere</w:t>
-      </w:r>
-      <w:proofErr w:type="spellEnd"/>
-      <w:r>
-        <w:rPr>
-          <w:lang w:val="en-GB"/>
-        </w:rPr>
-        <w:t xml:space="preserve"> </w:t>
-      </w:r>
-      <w:proofErr w:type="spellStart"/>
-      <w:r>
-        <w:rPr>
-          <w:lang w:val="en-GB"/>
-        </w:rPr>
-        <w:t>pretvara</w:t>
-      </w:r>
-      <w:proofErr w:type="spellEnd"/>
-      <w:r>
-        <w:rPr>
-          <w:lang w:val="en-GB"/>
-        </w:rPr>
-        <w:t xml:space="preserve"> u </w:t>
-      </w:r>
-      <w:proofErr w:type="spellStart"/>
-      <w:r>
-        <w:rPr>
-          <w:lang w:val="en-GB"/>
-        </w:rPr>
-        <w:t>jednosmernu</w:t>
-      </w:r>
-      <w:proofErr w:type="spellEnd"/>
-      <w:r>
-        <w:rPr>
-          <w:lang w:val="en-GB"/>
-        </w:rPr>
-        <w:t xml:space="preserve"> </w:t>
-      </w:r>
-      <w:proofErr w:type="spellStart"/>
-      <w:r>
-        <w:rPr>
-          <w:lang w:val="en-GB"/>
-        </w:rPr>
-        <w:t>struju</w:t>
-      </w:r>
-      <w:proofErr w:type="spellEnd"/>
-      <w:r>
-        <w:rPr>
-          <w:lang w:val="en-GB"/>
-        </w:rPr>
-        <w:t xml:space="preserve"> </w:t>
-      </w:r>
-      <w:proofErr w:type="spellStart"/>
-      <w:r>
-        <w:rPr>
-          <w:lang w:val="en-GB"/>
-        </w:rPr>
-        <w:t>odgovarajuće</w:t>
-      </w:r>
-      <w:proofErr w:type="spellEnd"/>
-      <w:r>
-        <w:rPr>
-          <w:lang w:val="en-GB"/>
-        </w:rPr>
-        <w:t xml:space="preserve"> </w:t>
-      </w:r>
-      <w:proofErr w:type="spellStart"/>
-      <w:r>
-        <w:rPr>
-          <w:lang w:val="en-GB"/>
-        </w:rPr>
-        <w:t>snage</w:t>
-      </w:r>
-      <w:proofErr w:type="spellEnd"/>
-      <w:r>
-        <w:rPr>
-          <w:lang w:val="en-GB"/>
-        </w:rPr>
-        <w:t xml:space="preserve">, </w:t>
-      </w:r>
-      <w:proofErr w:type="spellStart"/>
-      <w:r>
-        <w:rPr>
-          <w:lang w:val="en-GB"/>
-        </w:rPr>
-        <w:t>dok</w:t>
-      </w:r>
-      <w:proofErr w:type="spellEnd"/>
-      <w:r>
-        <w:rPr>
-          <w:lang w:val="en-GB"/>
-        </w:rPr>
-        <w:t xml:space="preserve"> regulator </w:t>
-      </w:r>
-      <w:proofErr w:type="spellStart"/>
-      <w:r>
-        <w:rPr>
-          <w:lang w:val="en-GB"/>
-        </w:rPr>
-        <w:t>napona</w:t>
-      </w:r>
-      <w:proofErr w:type="spellEnd"/>
-      <w:r>
-        <w:rPr>
-          <w:lang w:val="en-GB"/>
-        </w:rPr>
-        <w:t xml:space="preserve"> </w:t>
-      </w:r>
-      <w:proofErr w:type="spellStart"/>
-      <w:r>
-        <w:rPr>
-          <w:lang w:val="en-GB"/>
-        </w:rPr>
-        <w:t>održava</w:t>
-      </w:r>
-      <w:proofErr w:type="spellEnd"/>
-      <w:r>
-        <w:rPr>
-          <w:lang w:val="en-GB"/>
-        </w:rPr>
-        <w:t xml:space="preserve"> </w:t>
-      </w:r>
-      <w:proofErr w:type="spellStart"/>
-      <w:r>
-        <w:rPr>
-          <w:lang w:val="en-GB"/>
-        </w:rPr>
-        <w:t>konstantan</w:t>
-      </w:r>
-      <w:proofErr w:type="spellEnd"/>
-      <w:r>
-        <w:rPr>
-          <w:lang w:val="en-GB"/>
-        </w:rPr>
-        <w:t xml:space="preserve"> </w:t>
-      </w:r>
-      <w:proofErr w:type="spellStart"/>
-      <w:r>
-        <w:rPr>
-          <w:lang w:val="en-GB"/>
-        </w:rPr>
-        <w:t>izlazni</w:t>
-      </w:r>
-      <w:proofErr w:type="spellEnd"/>
-      <w:r>
-        <w:rPr>
-          <w:lang w:val="en-GB"/>
-        </w:rPr>
-        <w:t xml:space="preserve"> </w:t>
-      </w:r>
-      <w:proofErr w:type="spellStart"/>
-      <w:r>
-        <w:rPr>
-          <w:lang w:val="en-GB"/>
-        </w:rPr>
-        <w:t>napon</w:t>
-      </w:r>
-      <w:proofErr w:type="spellEnd"/>
-      <w:r>
-        <w:rPr>
-          <w:lang w:val="en-GB"/>
-        </w:rPr>
-        <w:t xml:space="preserve"> bez </w:t>
-      </w:r>
-      <w:proofErr w:type="spellStart"/>
-      <w:r>
-        <w:rPr>
-          <w:lang w:val="en-GB"/>
-        </w:rPr>
-        <w:t>obzira</w:t>
-      </w:r>
-      <w:proofErr w:type="spellEnd"/>
-      <w:r>
-        <w:rPr>
-          <w:lang w:val="en-GB"/>
-        </w:rPr>
-        <w:t xml:space="preserve"> </w:t>
-      </w:r>
-      <w:proofErr w:type="spellStart"/>
-      <w:r>
-        <w:rPr>
-          <w:lang w:val="en-GB"/>
-        </w:rPr>
-        <w:t>na</w:t>
-      </w:r>
-      <w:proofErr w:type="spellEnd"/>
-      <w:r>
-        <w:rPr>
-          <w:lang w:val="en-GB"/>
-        </w:rPr>
-        <w:t xml:space="preserve"> </w:t>
-      </w:r>
-      <w:proofErr w:type="spellStart"/>
-      <w:r>
-        <w:rPr>
-          <w:lang w:val="en-GB"/>
-        </w:rPr>
-        <w:t>promjene</w:t>
-      </w:r>
-      <w:proofErr w:type="spellEnd"/>
-      <w:r>
-        <w:rPr>
-          <w:lang w:val="en-GB"/>
-        </w:rPr>
-        <w:t xml:space="preserve"> u </w:t>
-      </w:r>
-      <w:proofErr w:type="spellStart"/>
-      <w:r>
-        <w:rPr>
-          <w:lang w:val="en-GB"/>
-        </w:rPr>
-        <w:t>opterećenju</w:t>
-      </w:r>
-      <w:proofErr w:type="spellEnd"/>
-      <w:r>
-        <w:rPr>
-          <w:lang w:val="en-GB"/>
-        </w:rPr>
-        <w:t xml:space="preserve"> </w:t>
-      </w:r>
-      <w:proofErr w:type="spellStart"/>
-      <w:r>
-        <w:rPr>
-          <w:lang w:val="en-GB"/>
-        </w:rPr>
-        <w:t>ili</w:t>
-      </w:r>
-      <w:proofErr w:type="spellEnd"/>
-      <w:r>
-        <w:rPr>
-          <w:lang w:val="en-GB"/>
-        </w:rPr>
-        <w:t xml:space="preserve"> </w:t>
-      </w:r>
-      <w:proofErr w:type="spellStart"/>
-      <w:r>
-        <w:rPr>
-          <w:lang w:val="en-GB"/>
-        </w:rPr>
-        <w:t>ulaznoj</w:t>
-      </w:r>
-      <w:proofErr w:type="spellEnd"/>
-      <w:r>
-        <w:rPr>
-          <w:lang w:val="en-GB"/>
-        </w:rPr>
-        <w:t xml:space="preserve"> </w:t>
-      </w:r>
-      <w:proofErr w:type="spellStart"/>
-      <w:r>
-        <w:rPr>
-          <w:lang w:val="en-GB"/>
-        </w:rPr>
-        <w:t>struji</w:t>
-      </w:r>
-      <w:proofErr w:type="spellEnd"/>
-      <w:r>
-        <w:rPr>
-          <w:lang w:val="en-GB"/>
-        </w:rPr>
-        <w:t xml:space="preserve">. </w:t>
-      </w:r>
-    </w:p>
-    <w:p>
-      <w:pPr>
-        <w:jc w:val="both"/>
-        <w:rPr>
-          <w:lang w:val="en-GB"/>
-        </w:rPr>
-      </w:pPr>
-    </w:p>
-    <w:p>
-      <w:pPr>
-        <w:jc w:val="both"/>
-        <w:rPr>
-          <w:lang w:val="en-GB"/>
-        </w:rPr>
-      </w:pPr>
-      <w:proofErr w:type="spellStart"/>
-      <w:r>
-        <w:rPr>
-          <w:lang w:val="en-GB"/>
-        </w:rPr>
-        <w:t>Za</w:t>
-      </w:r>
-      <w:proofErr w:type="spellEnd"/>
-      <w:r>
-        <w:rPr>
-          <w:lang w:val="en-GB"/>
-        </w:rPr>
-        <w:t xml:space="preserve"> </w:t>
-      </w:r>
-      <w:proofErr w:type="spellStart"/>
-      <w:r>
-        <w:rPr>
-          <w:lang w:val="en-GB"/>
-        </w:rPr>
-        <w:t>naš</w:t>
-      </w:r>
-      <w:proofErr w:type="spellEnd"/>
-      <w:r>
-        <w:rPr>
-          <w:lang w:val="en-GB"/>
-        </w:rPr>
-        <w:t xml:space="preserve"> </w:t>
-      </w:r>
-      <w:proofErr w:type="spellStart"/>
-      <w:r>
-        <w:rPr>
-          <w:lang w:val="en-GB"/>
-        </w:rPr>
-        <w:t>projekat</w:t>
-      </w:r>
-      <w:proofErr w:type="spellEnd"/>
-      <w:r>
-        <w:rPr>
-          <w:lang w:val="en-GB"/>
-        </w:rPr>
-        <w:t xml:space="preserve"> </w:t>
-      </w:r>
-      <w:proofErr w:type="spellStart"/>
-      <w:r>
-        <w:rPr>
-          <w:lang w:val="en-GB"/>
-        </w:rPr>
-        <w:t>koristimo</w:t>
-      </w:r>
-      <w:proofErr w:type="spellEnd"/>
-      <w:r>
-        <w:rPr>
-          <w:lang w:val="en-GB"/>
-        </w:rPr>
-        <w:t xml:space="preserve"> </w:t>
-      </w:r>
-      <w:proofErr w:type="spellStart"/>
-      <w:r>
-        <w:rPr>
-          <w:lang w:val="en-GB"/>
-        </w:rPr>
-        <w:t>napojnu</w:t>
-      </w:r>
-      <w:proofErr w:type="spellEnd"/>
-      <w:r>
-        <w:rPr>
-          <w:lang w:val="en-GB"/>
-        </w:rPr>
-        <w:t xml:space="preserve"> </w:t>
-      </w:r>
-      <w:proofErr w:type="spellStart"/>
-      <w:r>
-        <w:rPr>
-          <w:lang w:val="en-GB"/>
-        </w:rPr>
-        <w:t>jedinicu</w:t>
-      </w:r>
-      <w:proofErr w:type="spellEnd"/>
-      <w:r>
-        <w:rPr>
-          <w:lang w:val="en-GB"/>
-        </w:rPr>
-        <w:t xml:space="preserve"> od 5 V </w:t>
-      </w:r>
-      <w:proofErr w:type="spellStart"/>
-      <w:r>
-        <w:rPr>
-          <w:lang w:val="en-GB"/>
-        </w:rPr>
-        <w:t>i</w:t>
-      </w:r>
-      <w:proofErr w:type="spellEnd"/>
-      <w:r>
-        <w:rPr>
-          <w:lang w:val="en-GB"/>
-        </w:rPr>
-        <w:t xml:space="preserve"> 5 A, </w:t>
-      </w:r>
-      <w:proofErr w:type="spellStart"/>
-      <w:r>
-        <w:rPr>
-          <w:lang w:val="en-GB"/>
-        </w:rPr>
-        <w:t>koja</w:t>
-      </w:r>
-      <w:proofErr w:type="spellEnd"/>
-      <w:r>
-        <w:rPr>
-          <w:lang w:val="en-GB"/>
-        </w:rPr>
-        <w:t xml:space="preserve"> je </w:t>
-      </w:r>
-      <w:proofErr w:type="spellStart"/>
-      <w:r>
-        <w:rPr>
-          <w:lang w:val="en-GB"/>
-        </w:rPr>
-        <w:t>dovoljna</w:t>
-      </w:r>
-      <w:proofErr w:type="spellEnd"/>
-      <w:r>
-        <w:rPr>
-          <w:lang w:val="en-GB"/>
-        </w:rPr>
-        <w:t xml:space="preserve"> da </w:t>
-      </w:r>
-      <w:proofErr w:type="spellStart"/>
-      <w:r>
-        <w:rPr>
-          <w:lang w:val="en-GB"/>
-        </w:rPr>
-        <w:t>napaja</w:t>
-      </w:r>
-      <w:proofErr w:type="spellEnd"/>
-      <w:r>
-        <w:rPr>
-          <w:lang w:val="en-GB"/>
-        </w:rPr>
-        <w:t xml:space="preserve"> LED </w:t>
-      </w:r>
-      <w:proofErr w:type="spellStart"/>
-      <w:r>
-        <w:rPr>
-          <w:lang w:val="en-GB"/>
-        </w:rPr>
-        <w:t>matricu</w:t>
-      </w:r>
-      <w:proofErr w:type="spellEnd"/>
-      <w:r>
-        <w:rPr>
-          <w:lang w:val="en-GB"/>
-        </w:rPr>
-        <w:t xml:space="preserve"> </w:t>
-      </w:r>
-      <w:proofErr w:type="spellStart"/>
-      <w:r>
-        <w:rPr>
-          <w:lang w:val="en-GB"/>
-        </w:rPr>
-        <w:t>i</w:t>
-      </w:r>
-      <w:proofErr w:type="spellEnd"/>
-      <w:r>
-        <w:rPr>
-          <w:lang w:val="en-GB"/>
-        </w:rPr>
-        <w:t xml:space="preserve"> RGB </w:t>
-      </w:r>
-      <w:proofErr w:type="spellStart"/>
-      <w:r>
-        <w:rPr>
-          <w:lang w:val="en-GB"/>
-        </w:rPr>
-        <w:t>trake</w:t>
-      </w:r>
-      <w:proofErr w:type="spellEnd"/>
-      <w:r>
-        <w:rPr>
-          <w:lang w:val="en-GB"/>
-        </w:rPr>
-        <w:t xml:space="preserve"> </w:t>
-      </w:r>
-      <w:proofErr w:type="spellStart"/>
-      <w:r>
-        <w:rPr>
-          <w:lang w:val="en-GB"/>
-        </w:rPr>
-        <w:t>na</w:t>
-      </w:r>
-      <w:proofErr w:type="spellEnd"/>
-      <w:r>
-        <w:rPr>
-          <w:lang w:val="en-GB"/>
-        </w:rPr>
-        <w:t xml:space="preserve"> </w:t>
-      </w:r>
-      <w:proofErr w:type="spellStart"/>
-      <w:r>
-        <w:rPr>
-          <w:lang w:val="en-GB"/>
-        </w:rPr>
-        <w:t>slovima</w:t>
-      </w:r>
-      <w:proofErr w:type="spellEnd"/>
-      <w:r>
-        <w:rPr>
-          <w:lang w:val="en-GB"/>
-        </w:rPr>
-        <w:t xml:space="preserve">. </w:t>
-      </w:r>
-      <w:proofErr w:type="spellStart"/>
-      <w:r>
-        <w:rPr>
-          <w:lang w:val="en-GB"/>
-        </w:rPr>
-        <w:t>Ovaj</w:t>
-      </w:r>
-      <w:proofErr w:type="spellEnd"/>
-      <w:r>
-        <w:rPr>
-          <w:lang w:val="en-GB"/>
-        </w:rPr>
-        <w:t xml:space="preserve"> </w:t>
-      </w:r>
-      <w:proofErr w:type="spellStart"/>
-      <w:r>
-        <w:rPr>
-          <w:lang w:val="en-GB"/>
-        </w:rPr>
-        <w:t>izbor</w:t>
-      </w:r>
-      <w:proofErr w:type="spellEnd"/>
-      <w:r>
-        <w:rPr>
-          <w:lang w:val="en-GB"/>
-        </w:rPr>
-        <w:t xml:space="preserve"> </w:t>
-      </w:r>
-      <w:proofErr w:type="spellStart"/>
-      <w:r>
-        <w:rPr>
-          <w:lang w:val="en-GB"/>
-        </w:rPr>
-        <w:t>omogućava</w:t>
-      </w:r>
-      <w:proofErr w:type="spellEnd"/>
-      <w:r>
-        <w:rPr>
-          <w:lang w:val="en-GB"/>
-        </w:rPr>
-        <w:t xml:space="preserve"> </w:t>
-      </w:r>
-      <w:proofErr w:type="spellStart"/>
-      <w:r>
-        <w:rPr>
-          <w:lang w:val="en-GB"/>
-        </w:rPr>
-        <w:t>sigurno</w:t>
-      </w:r>
-      <w:proofErr w:type="spellEnd"/>
-      <w:r>
-        <w:rPr>
-          <w:lang w:val="en-GB"/>
-        </w:rPr>
-        <w:t xml:space="preserve"> </w:t>
-      </w:r>
-      <w:proofErr w:type="spellStart"/>
-      <w:r>
-        <w:rPr>
-          <w:lang w:val="en-GB"/>
-        </w:rPr>
-        <w:t>i</w:t>
-      </w:r>
-      <w:proofErr w:type="spellEnd"/>
-      <w:r>
-        <w:rPr>
-          <w:lang w:val="en-GB"/>
-        </w:rPr>
-        <w:t xml:space="preserve"> </w:t>
-      </w:r>
-      <w:proofErr w:type="spellStart"/>
-      <w:r>
-        <w:rPr>
-          <w:lang w:val="en-GB"/>
-        </w:rPr>
-        <w:t>stabilno</w:t>
-      </w:r>
-      <w:proofErr w:type="spellEnd"/>
-      <w:r>
-        <w:rPr>
-          <w:lang w:val="en-GB"/>
-        </w:rPr>
-        <w:t xml:space="preserve"> </w:t>
-      </w:r>
-      <w:proofErr w:type="spellStart"/>
-      <w:r>
-        <w:rPr>
-          <w:lang w:val="en-GB"/>
-        </w:rPr>
-        <w:t>napajanje</w:t>
-      </w:r>
-      <w:proofErr w:type="spellEnd"/>
-      <w:r>
-        <w:rPr>
-          <w:lang w:val="en-GB"/>
-        </w:rPr>
-        <w:t xml:space="preserve"> </w:t>
-      </w:r>
-      <w:proofErr w:type="spellStart"/>
-      <w:r>
-        <w:rPr>
-          <w:lang w:val="en-GB"/>
-        </w:rPr>
-        <w:t>svih</w:t>
-      </w:r>
-      <w:proofErr w:type="spellEnd"/>
-      <w:r>
-        <w:rPr>
-          <w:lang w:val="en-GB"/>
-        </w:rPr>
-        <w:t xml:space="preserve"> LED </w:t>
-      </w:r>
-      <w:proofErr w:type="spellStart"/>
-      <w:r>
-        <w:rPr>
-          <w:lang w:val="en-GB"/>
-        </w:rPr>
-        <w:t>dioda</w:t>
-      </w:r>
-      <w:proofErr w:type="spellEnd"/>
-      <w:r>
-        <w:rPr>
-          <w:lang w:val="en-GB"/>
-        </w:rPr>
-        <w:t xml:space="preserve">, bez </w:t>
-      </w:r>
-      <w:proofErr w:type="spellStart"/>
-      <w:r>
-        <w:rPr>
-          <w:lang w:val="en-GB"/>
-        </w:rPr>
-        <w:t>fluktuacija</w:t>
-      </w:r>
-      <w:proofErr w:type="spellEnd"/>
-      <w:r>
-        <w:rPr>
-          <w:lang w:val="en-GB"/>
-        </w:rPr>
-        <w:t xml:space="preserve"> </w:t>
-      </w:r>
-      <w:proofErr w:type="spellStart"/>
-      <w:r>
-        <w:rPr>
-          <w:lang w:val="en-GB"/>
-        </w:rPr>
-        <w:t>napona</w:t>
-      </w:r>
-      <w:proofErr w:type="spellEnd"/>
-      <w:r>
-        <w:rPr>
-          <w:lang w:val="en-GB"/>
-        </w:rPr>
-        <w:t xml:space="preserve"> </w:t>
-      </w:r>
-      <w:proofErr w:type="spellStart"/>
-      <w:r>
-        <w:rPr>
-          <w:lang w:val="en-GB"/>
-        </w:rPr>
-        <w:t>ili</w:t>
-      </w:r>
-      <w:proofErr w:type="spellEnd"/>
-      <w:r>
-        <w:rPr>
-          <w:lang w:val="en-GB"/>
-        </w:rPr>
-        <w:t xml:space="preserve"> </w:t>
-      </w:r>
-      <w:proofErr w:type="spellStart"/>
-      <w:r>
-        <w:rPr>
-          <w:lang w:val="en-GB"/>
-        </w:rPr>
-        <w:t>prenapona</w:t>
-      </w:r>
-      <w:proofErr w:type="spellEnd"/>
-      <w:r>
-        <w:rPr>
-          <w:lang w:val="en-GB"/>
-        </w:rPr>
-        <w:t xml:space="preserve">, </w:t>
-      </w:r>
-      <w:proofErr w:type="spellStart"/>
-      <w:r>
-        <w:rPr>
-          <w:lang w:val="en-GB"/>
-        </w:rPr>
-        <w:t>čime</w:t>
-      </w:r>
-      <w:proofErr w:type="spellEnd"/>
-      <w:r>
-        <w:rPr>
-          <w:lang w:val="en-GB"/>
-        </w:rPr>
-        <w:t xml:space="preserve"> se </w:t>
-      </w:r>
-      <w:proofErr w:type="spellStart"/>
-      <w:r>
-        <w:rPr>
-          <w:lang w:val="en-GB"/>
-        </w:rPr>
-        <w:t>osigurava</w:t>
-      </w:r>
-      <w:proofErr w:type="spellEnd"/>
-      <w:r>
-        <w:rPr>
-          <w:lang w:val="en-GB"/>
-        </w:rPr>
-        <w:t xml:space="preserve"> </w:t>
-      </w:r>
-      <w:proofErr w:type="spellStart"/>
-      <w:r>
-        <w:rPr>
-          <w:lang w:val="en-GB"/>
-        </w:rPr>
-        <w:t>pravilno</w:t>
-      </w:r>
-      <w:proofErr w:type="spellEnd"/>
-      <w:r>
-        <w:rPr>
-          <w:lang w:val="en-GB"/>
-        </w:rPr>
-        <w:t xml:space="preserve"> </w:t>
-      </w:r>
-      <w:proofErr w:type="spellStart"/>
-      <w:r>
-        <w:rPr>
-          <w:lang w:val="en-GB"/>
-        </w:rPr>
-        <w:t>i</w:t>
-      </w:r>
-      <w:proofErr w:type="spellEnd"/>
-      <w:r>
-        <w:rPr>
-          <w:lang w:val="en-GB"/>
-        </w:rPr>
-        <w:t xml:space="preserve"> </w:t>
-      </w:r>
-      <w:proofErr w:type="spellStart"/>
-      <w:r>
-        <w:rPr>
-          <w:lang w:val="en-GB"/>
-        </w:rPr>
-        <w:t>ujednačeno</w:t>
-      </w:r>
-      <w:proofErr w:type="spellEnd"/>
-      <w:r>
-        <w:rPr>
-          <w:lang w:val="en-GB"/>
-        </w:rPr>
-        <w:t xml:space="preserve"> </w:t>
-      </w:r>
-      <w:proofErr w:type="spellStart"/>
-      <w:r>
-        <w:rPr>
-          <w:lang w:val="en-GB"/>
-        </w:rPr>
-        <w:t>osvjetljenje</w:t>
-      </w:r>
-      <w:proofErr w:type="spellEnd"/>
-      <w:r>
-        <w:rPr>
-          <w:lang w:val="en-GB"/>
-        </w:rPr>
-        <w:t xml:space="preserve"> </w:t>
-      </w:r>
-      <w:proofErr w:type="spellStart"/>
-      <w:r>
-        <w:rPr>
-          <w:lang w:val="en-GB"/>
-        </w:rPr>
-        <w:t>i</w:t>
-      </w:r>
-      <w:proofErr w:type="spellEnd"/>
-      <w:r>
-        <w:rPr>
-          <w:lang w:val="en-GB"/>
-        </w:rPr>
-        <w:t xml:space="preserve"> </w:t>
-      </w:r>
-      <w:proofErr w:type="spellStart"/>
-      <w:r>
-        <w:rPr>
-          <w:lang w:val="en-GB"/>
-        </w:rPr>
-        <w:t>pouzdan</w:t>
-      </w:r>
-      <w:proofErr w:type="spellEnd"/>
-      <w:r>
-        <w:rPr>
-          <w:lang w:val="en-GB"/>
-        </w:rPr>
-        <w:t xml:space="preserve"> rad </w:t>
-      </w:r>
-      <w:proofErr w:type="spellStart"/>
-      <w:r>
-        <w:rPr>
-          <w:lang w:val="en-GB"/>
-        </w:rPr>
-        <w:t>sistema</w:t>
-      </w:r>
-      <w:proofErr w:type="spellEnd"/>
-      <w:r>
-        <w:rPr>
-          <w:lang w:val="en-GB"/>
-        </w:rPr>
-        <w:t>.</w:t>
-      </w:r>
-    </w:p>
-    <w:p>
-      <w:pPr>
-        <w:jc w:val="both"/>
-        <w:rPr>
-          <w:lang w:val="en-GB"/>
-        </w:rPr>
-      </w:pPr>
-    </w:p>
-    <w:p>
-      <w:pPr>
-        <w:jc w:val="both"/>
-        <w:rPr>
-          <w:lang w:val="en-GB"/>
-        </w:rPr>
-      </w:pPr>
-    </w:p>
-    <w:p>
-      <w:pPr>
-        <w:jc w:val="both"/>
-        <w:rPr>
-          <w:lang w:val="en-GB"/>
-        </w:rPr>
-      </w:pPr>
-    </w:p>
-    <w:p>
-      <w:pPr>
-        <w:jc w:val="both"/>
-        <w:rPr>
-          <w:lang w:val="en-GB"/>
-        </w:rPr>
-      </w:pPr>
-    </w:p>
-    <w:p>
-      <w:pPr>
-        <w:rPr>
-          <w:lang w:val="en-GB"/>
-        </w:rPr>
-      </w:pPr>
-      <w:r>
-        <w:rPr>
-          <w:lang w:val="en-GB"/>
-        </w:rPr>
         <w:br w:type="page"/>
       </w:r>
     </w:p>
@@ -6250,98 +4913,98 @@
       <w:pPr>
         <w:pStyle w:val="Heading1"/>
       </w:pPr>
-      <w:bookmarkStart w:id="9" w:name="_Toc223859594"/>
+      <w:bookmarkStart w:id="8" w:name="_Toc224141964"/>
       <w:r>
         <w:lastRenderedPageBreak/>
         <w:t>3. Korištene tehnologije</w:t>
       </w:r>
+      <w:bookmarkEnd w:id="8"/>
+    </w:p>
+    <w:p>
+      <w:pPr>
+        <w:rPr>
+          <w:lang w:val="bs-Latn-BA" w:eastAsia="bs-Latn-BA"/>
+        </w:rPr>
+      </w:pPr>
+    </w:p>
+    <w:p>
+      <w:pPr>
+        <w:jc w:val="both"/>
+        <w:rPr>
+          <w:lang w:val="hr-HR"/>
+        </w:rPr>
+      </w:pPr>
+      <w:r>
+        <w:rPr>
+          <w:lang w:val="hr-HR"/>
+        </w:rPr>
+        <w:t>U izradi ovog maturskog rada korišten je niz tehnologija i razvojnih okruženja koja su omogućila realizaciju funkcionalnosti sistema. Ključnu ulogu u razvoju imali su programski jezici C++ i C#, koji su korišteni za implementaciju logike mikrokontrolerskog sistema i desktop aplikacije. Pored njih, značajnu ulogu imao je i JavaScript, dok su za izradu korisničkog interfejsa web aplikacije korišteni označivački (markup) jezici HTML i CSS. Za praćenje promjena u kodu i međusobnu koordinaciju razvoja korišten je GitHub, pri čemu su izmjene slane i preuzimane putem PowerShell-a, omogućavajući efikasnu saradnju između članova tima.</w:t>
+      </w:r>
+    </w:p>
+    <w:p>
+      <w:pPr>
+        <w:jc w:val="both"/>
+        <w:rPr>
+          <w:lang w:val="hr-HR"/>
+        </w:rPr>
+      </w:pPr>
+    </w:p>
+    <w:p>
+      <w:pPr>
+        <w:jc w:val="both"/>
+        <w:rPr>
+          <w:lang w:val="hr-HR"/>
+        </w:rPr>
+      </w:pPr>
+      <w:r>
+        <w:rPr>
+          <w:lang w:val="hr-HR"/>
+        </w:rPr>
+        <w:t>Za razvoj i testiranje softvera korišteno je više razvojnih platformi. Microsoft Visual Studio korišten je za razvoj desktop aplikacije u .NET okruženju koristeći C#, dok je Visual Studio Code pružao efikasno okruženje za rad sa HTML, CSS i JavaScript tehnologijama. Programiranje i komunikacija sa ESP32 mikrokontrolerom realizovana je pomoću Arduino IDE, koja omogućava jednostavno pisanje, kompajliranje i učitavanje programa na mikrokontroler.</w:t>
+      </w:r>
+    </w:p>
+    <w:p>
+      <w:pPr>
+        <w:jc w:val="both"/>
+        <w:rPr>
+          <w:lang w:val="hr-HR"/>
+        </w:rPr>
+      </w:pPr>
+    </w:p>
+    <w:p>
+      <w:pPr>
+        <w:jc w:val="both"/>
+        <w:rPr>
+          <w:lang w:val="hr-HR"/>
+        </w:rPr>
+      </w:pPr>
+      <w:r>
+        <w:rPr>
+          <w:lang w:val="hr-HR"/>
+        </w:rPr>
+        <w:t>U nastavku slijedi detaljnije objašnjenje korištenih platformi i alata.</w:t>
+      </w:r>
+    </w:p>
+    <w:p>
+      <w:pPr>
+        <w:jc w:val="both"/>
+        <w:rPr>
+          <w:lang w:val="hr-HR"/>
+        </w:rPr>
+      </w:pPr>
+    </w:p>
+    <w:p>
+      <w:pPr>
+        <w:pStyle w:val="Heading2"/>
+      </w:pPr>
+      <w:bookmarkStart w:id="9" w:name="_Toc224141965"/>
+      <w:r>
+        <w:t xml:space="preserve">3.1. </w:t>
+      </w:r>
+      <w:r>
+        <w:t>Microsoft Visual Studio</w:t>
+      </w:r>
       <w:bookmarkEnd w:id="9"/>
-    </w:p>
-    <w:p>
-      <w:pPr>
-        <w:rPr>
-          <w:lang w:val="bs-Latn-BA" w:eastAsia="bs-Latn-BA"/>
-        </w:rPr>
-      </w:pPr>
-    </w:p>
-    <w:p>
-      <w:pPr>
-        <w:jc w:val="both"/>
-        <w:rPr>
-          <w:lang w:val="hr-HR"/>
-        </w:rPr>
-      </w:pPr>
-      <w:r>
-        <w:rPr>
-          <w:lang w:val="hr-HR"/>
-        </w:rPr>
-        <w:t>U izradi ovog maturskog rada korišten je niz tehnologija i razvojnih okruženja koja su omogućila realizaciju funkcionalnosti sistema. Ključnu ulogu u razvoju imali su programski jezici C++ i C#, koji su korišteni za implementaciju logike mikrokontrolerskog sistema i desktop aplikacije. Pored njih, značajnu ulogu imao je i JavaScript, dok su za izradu korisničkog interfejsa web aplikacije korišteni označivački (markup) jezici HTML i CSS. Za praćenje promjena u kodu i međusobnu koordinaciju razvoja korišten je GitHub, pri čemu su izmjene slane i preuzimane putem PowerShell-a, omogućavajući efikasnu saradnju između članova tima.</w:t>
-      </w:r>
-    </w:p>
-    <w:p>
-      <w:pPr>
-        <w:jc w:val="both"/>
-        <w:rPr>
-          <w:lang w:val="hr-HR"/>
-        </w:rPr>
-      </w:pPr>
-    </w:p>
-    <w:p>
-      <w:pPr>
-        <w:jc w:val="both"/>
-        <w:rPr>
-          <w:lang w:val="hr-HR"/>
-        </w:rPr>
-      </w:pPr>
-      <w:r>
-        <w:rPr>
-          <w:lang w:val="hr-HR"/>
-        </w:rPr>
-        <w:t>Za razvoj i testiranje softvera korišteno je više razvojnih platformi. Microsoft Visual Studio korišten je za razvoj desktop aplikacije u .NET okruženju koristeći C#, dok je Visual Studio Code pružao efikasno okruženje za rad sa HTML, CSS i JavaScript tehnologijama. Programiranje i komunikacija sa ESP32 mikrokontrolerom realizovana je pomoću Arduino IDE, koja omogućava jednostavno pisanje, kompajliranje i učitavanje programa na mikrokontroler.</w:t>
-      </w:r>
-    </w:p>
-    <w:p>
-      <w:pPr>
-        <w:jc w:val="both"/>
-        <w:rPr>
-          <w:lang w:val="hr-HR"/>
-        </w:rPr>
-      </w:pPr>
-    </w:p>
-    <w:p>
-      <w:pPr>
-        <w:jc w:val="both"/>
-        <w:rPr>
-          <w:lang w:val="hr-HR"/>
-        </w:rPr>
-      </w:pPr>
-      <w:r>
-        <w:rPr>
-          <w:lang w:val="hr-HR"/>
-        </w:rPr>
-        <w:t>U nastavku slijedi detaljnije objašnjenje korištenih platformi i alata.</w:t>
-      </w:r>
-    </w:p>
-    <w:p>
-      <w:pPr>
-        <w:jc w:val="both"/>
-        <w:rPr>
-          <w:lang w:val="hr-HR"/>
-        </w:rPr>
-      </w:pPr>
-    </w:p>
-    <w:p>
-      <w:pPr>
-        <w:pStyle w:val="Heading2"/>
-      </w:pPr>
-      <w:bookmarkStart w:id="10" w:name="_Toc223859595"/>
-      <w:r>
-        <w:t xml:space="preserve">3.1. </w:t>
-      </w:r>
-      <w:r>
-        <w:t>Microsoft Visual Studio</w:t>
-      </w:r>
-      <w:bookmarkEnd w:id="10"/>
       <w:r>
         <w:t xml:space="preserve"> </w:t>
       </w:r>
@@ -6453,7 +5116,7 @@
         <mc:AlternateContent>
           <mc:Choice Requires="wpg">
             <w:drawing>
-              <wp:inline distT="0" distB="0" distL="0" distR="0" wp14:anchorId="31FC5CC6" wp14:editId="397FDEAA">
+              <wp:inline distT="0" distB="0" distL="0" distR="0" wp14:anchorId="3383F566" wp14:editId="686A2B89">
                 <wp:extent cx="5745480" cy="2141220"/>
                 <wp:effectExtent l="0" t="0" r="7620" b="0"/>
                 <wp:docPr id="23" name="Group 23"/>
@@ -6559,7 +5222,7 @@
           </mc:Choice>
           <mc:Fallback>
             <w:pict>
-              <v:group w14:anchorId="27399B4C" id="Group 23" o:spid="_x0000_s1026" style="width:452.4pt;height:168.6pt;mso-position-horizontal-relative:char;mso-position-vertical-relative:line" coordsize="58826,21412" o:gfxdata="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">
+              <v:group w14:anchorId="7213491C" id="Group 23" o:spid="_x0000_s1026" style="width:452.4pt;height:168.6pt;mso-position-horizontal-relative:char;mso-position-vertical-relative:line" coordsize="58826,21412" o:gfxdata="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">
                 <v:shapetype id="_x0000_t75" coordsize="21600,21600" o:spt="75" o:preferrelative="t" path="m@4@5l@4@11@9@11@9@5xe" filled="f" stroked="f">
                   <v:stroke joinstyle="miter"/>
                   <v:formulas>
@@ -6676,11 +5339,11 @@
       <w:pPr>
         <w:pStyle w:val="Heading2"/>
       </w:pPr>
-      <w:bookmarkStart w:id="11" w:name="_Toc223859596"/>
+      <w:bookmarkStart w:id="10" w:name="_Toc224141966"/>
       <w:r>
         <w:t>3.2. Visual Studio Code</w:t>
       </w:r>
-      <w:bookmarkEnd w:id="11"/>
+      <w:bookmarkEnd w:id="10"/>
     </w:p>
     <w:p>
       <w:pPr>
@@ -6779,7 +5442,7 @@
         <mc:AlternateContent>
           <mc:Choice Requires="wpg">
             <w:drawing>
-              <wp:inline distT="0" distB="0" distL="0" distR="0" wp14:anchorId="798DE537" wp14:editId="539F576E">
+              <wp:inline distT="0" distB="0" distL="0" distR="0" wp14:anchorId="4C150CAC" wp14:editId="5E93FD85">
                 <wp:extent cx="5753100" cy="2545080"/>
                 <wp:effectExtent l="0" t="0" r="0" b="7620"/>
                 <wp:docPr id="22" name="Group 22"/>
@@ -6867,7 +5530,7 @@
           </mc:Choice>
           <mc:Fallback>
             <w:pict>
-              <v:group w14:anchorId="2F44E365" id="Group 22" o:spid="_x0000_s1026" style="width:453pt;height:200.4pt;mso-position-horizontal-relative:char;mso-position-vertical-relative:line" coordsize="54292,24917" o:gfxdata="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">
+              <v:group w14:anchorId="4ED0F142" id="Group 22" o:spid="_x0000_s1026" style="width:453pt;height:200.4pt;mso-position-horizontal-relative:char;mso-position-vertical-relative:line" coordsize="54292,24917" o:gfxdata="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">
                 <v:shape id="Picture 21" o:spid="_x0000_s1027" type="#_x0000_t75" alt="nedefinirano" style="position:absolute;top:6705;width:11430;height:11430;visibility:visible;mso-wrap-style:square" o:gfxdata="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">
                   <v:imagedata r:id="rId23" o:title="nedefinirano"/>
                   <v:path arrowok="t"/>
@@ -6995,12 +5658,12 @@
       <w:pPr>
         <w:pStyle w:val="Heading2"/>
       </w:pPr>
-      <w:bookmarkStart w:id="12" w:name="_Toc223859597"/>
+      <w:bookmarkStart w:id="11" w:name="_Toc224141967"/>
       <w:r>
         <w:lastRenderedPageBreak/>
         <w:t>3.3. Arduino IDE</w:t>
       </w:r>
-      <w:bookmarkEnd w:id="12"/>
+      <w:bookmarkEnd w:id="11"/>
     </w:p>
     <w:p>
       <w:pPr>
@@ -7086,7 +5749,7 @@
           <w:lang w:val="en-GB" w:eastAsia="en-GB"/>
         </w:rPr>
         <w:drawing>
-          <wp:inline distT="0" distB="0" distL="0" distR="0" wp14:anchorId="22E9F8E5" wp14:editId="04FE2C2E">
+          <wp:inline distT="0" distB="0" distL="0" distR="0" wp14:anchorId="6E71CBC1" wp14:editId="1EA28F4B">
             <wp:extent cx="5044440" cy="2935361"/>
             <wp:effectExtent l="0" t="0" r="3810" b="0"/>
             <wp:docPr id="24" name="Picture 24"/>
@@ -7148,183 +5811,7 @@
         <w:jc w:val="both"/>
       </w:pPr>
       <w:r>
-        <w:t xml:space="preserve">Pored </w:t>
-      </w:r>
-      <w:proofErr w:type="spellStart"/>
-      <w:r>
-        <w:t>osnovne</w:t>
-      </w:r>
-      <w:proofErr w:type="spellEnd"/>
-      <w:r>
-        <w:t xml:space="preserve"> </w:t>
-      </w:r>
-      <w:proofErr w:type="spellStart"/>
-      <w:r>
-        <w:t>funkcionalnosti</w:t>
-      </w:r>
-      <w:proofErr w:type="spellEnd"/>
-      <w:r>
-        <w:t xml:space="preserve"> </w:t>
-      </w:r>
-      <w:proofErr w:type="spellStart"/>
-      <w:r>
-        <w:t>pisanja</w:t>
-      </w:r>
-      <w:proofErr w:type="spellEnd"/>
-      <w:r>
-        <w:t xml:space="preserve"> </w:t>
-      </w:r>
-      <w:proofErr w:type="spellStart"/>
-      <w:r>
-        <w:t>i</w:t>
-      </w:r>
-      <w:proofErr w:type="spellEnd"/>
-      <w:r>
-        <w:t xml:space="preserve"> </w:t>
-      </w:r>
-      <w:proofErr w:type="spellStart"/>
-      <w:r>
-        <w:t>učitavanja</w:t>
-      </w:r>
-      <w:proofErr w:type="spellEnd"/>
-      <w:r>
-        <w:t xml:space="preserve"> </w:t>
-      </w:r>
-      <w:proofErr w:type="spellStart"/>
-      <w:r>
-        <w:t>koda</w:t>
-      </w:r>
-      <w:proofErr w:type="spellEnd"/>
-      <w:r>
-        <w:t xml:space="preserve"> </w:t>
-      </w:r>
-      <w:proofErr w:type="spellStart"/>
-      <w:r>
-        <w:t>na</w:t>
-      </w:r>
-      <w:proofErr w:type="spellEnd"/>
-      <w:r>
-        <w:t xml:space="preserve"> </w:t>
-      </w:r>
-      <w:proofErr w:type="spellStart"/>
-      <w:r>
-        <w:t>mikrokontroler</w:t>
-      </w:r>
-      <w:proofErr w:type="spellEnd"/>
-      <w:r>
-        <w:t xml:space="preserve">, Arduino IDE </w:t>
-      </w:r>
-      <w:proofErr w:type="spellStart"/>
-      <w:r>
-        <w:t>nudi</w:t>
-      </w:r>
-      <w:proofErr w:type="spellEnd"/>
-      <w:r>
-        <w:t xml:space="preserve"> </w:t>
-      </w:r>
-      <w:proofErr w:type="spellStart"/>
-      <w:r>
-        <w:t>niz</w:t>
-      </w:r>
-      <w:proofErr w:type="spellEnd"/>
-      <w:r>
-        <w:t xml:space="preserve"> </w:t>
-      </w:r>
-      <w:proofErr w:type="spellStart"/>
-      <w:r>
-        <w:t>korisnih</w:t>
-      </w:r>
-      <w:proofErr w:type="spellEnd"/>
-      <w:r>
-        <w:t xml:space="preserve"> </w:t>
-      </w:r>
-      <w:proofErr w:type="spellStart"/>
-      <w:r>
-        <w:t>opcija</w:t>
-      </w:r>
-      <w:proofErr w:type="spellEnd"/>
-      <w:r>
-        <w:t xml:space="preserve"> </w:t>
-      </w:r>
-      <w:proofErr w:type="spellStart"/>
-      <w:r>
-        <w:t>i</w:t>
-      </w:r>
-      <w:proofErr w:type="spellEnd"/>
-      <w:r>
-        <w:t xml:space="preserve"> </w:t>
-      </w:r>
-      <w:proofErr w:type="spellStart"/>
-      <w:r>
-        <w:t>alata</w:t>
-      </w:r>
-      <w:proofErr w:type="spellEnd"/>
-      <w:r>
-        <w:t xml:space="preserve"> </w:t>
-      </w:r>
-      <w:proofErr w:type="spellStart"/>
-      <w:r>
-        <w:t>koji</w:t>
-      </w:r>
-      <w:proofErr w:type="spellEnd"/>
-      <w:r>
-        <w:t xml:space="preserve"> </w:t>
-      </w:r>
-      <w:proofErr w:type="spellStart"/>
-      <w:r>
-        <w:t>olakšavaju</w:t>
-      </w:r>
-      <w:proofErr w:type="spellEnd"/>
-      <w:r>
-        <w:t xml:space="preserve"> </w:t>
-      </w:r>
-      <w:proofErr w:type="spellStart"/>
-      <w:r>
-        <w:t>razvoj</w:t>
-      </w:r>
-      <w:proofErr w:type="spellEnd"/>
-      <w:r>
-        <w:t xml:space="preserve"> </w:t>
-      </w:r>
-      <w:proofErr w:type="spellStart"/>
-      <w:r>
-        <w:t>i</w:t>
-      </w:r>
-      <w:proofErr w:type="spellEnd"/>
-      <w:r>
-        <w:t xml:space="preserve"> </w:t>
-      </w:r>
-      <w:proofErr w:type="spellStart"/>
-      <w:r>
-        <w:t>testiranje</w:t>
-      </w:r>
-      <w:proofErr w:type="spellEnd"/>
-      <w:r>
-        <w:t xml:space="preserve">. </w:t>
-      </w:r>
-      <w:proofErr w:type="spellStart"/>
-      <w:r>
-        <w:t>Najvažnije</w:t>
-      </w:r>
-      <w:proofErr w:type="spellEnd"/>
-      <w:r>
-        <w:t xml:space="preserve"> </w:t>
-      </w:r>
-      <w:proofErr w:type="spellStart"/>
-      <w:r>
-        <w:t>značajke</w:t>
-      </w:r>
-      <w:proofErr w:type="spellEnd"/>
-      <w:r>
-        <w:t xml:space="preserve"> Arduino IDE-a </w:t>
-      </w:r>
-      <w:proofErr w:type="spellStart"/>
-      <w:r>
-        <w:t>uključuju</w:t>
-      </w:r>
-      <w:proofErr w:type="spellEnd"/>
-      <w:r>
-        <w:t>:</w:t>
+        <w:t>Pored osnovne funkcionalnosti pisanja i učitavanja koda na mikrokontroler, Arduino IDE nudi niz korisnih opcija i alata koji olakšavaju razvoj i testiranje. Najvažnije značajke Arduino IDE-a uključuju:</w:t>
       </w:r>
     </w:p>
     <w:p>
@@ -7355,15 +5842,7 @@
         <w:jc w:val="both"/>
       </w:pPr>
       <w:r>
-        <w:t>Libraries (</w:t>
-      </w:r>
-      <w:proofErr w:type="spellStart"/>
-      <w:r>
-        <w:t>biblioteke</w:t>
-      </w:r>
-      <w:proofErr w:type="spellEnd"/>
-      <w:r>
-        <w:t>)</w:t>
+        <w:t>Libraries (biblioteke)</w:t>
       </w:r>
     </w:p>
     <w:p>
@@ -7376,15 +5855,7 @@
         <w:jc w:val="both"/>
       </w:pPr>
       <w:r>
-        <w:t>Boards (</w:t>
-      </w:r>
-      <w:proofErr w:type="spellStart"/>
-      <w:r>
-        <w:t>ploče</w:t>
-      </w:r>
-      <w:proofErr w:type="spellEnd"/>
-      <w:r>
-        <w:t xml:space="preserve">) </w:t>
+        <w:t xml:space="preserve">Boards (ploče) </w:t>
       </w:r>
     </w:p>
     <w:p>
@@ -7396,21 +5867,8 @@
         </w:numPr>
         <w:jc w:val="both"/>
       </w:pPr>
-      <w:proofErr w:type="spellStart"/>
-      <w:r>
-        <w:t>Primjeri</w:t>
-      </w:r>
-      <w:proofErr w:type="spellEnd"/>
-      <w:r>
-        <w:t xml:space="preserve"> </w:t>
-      </w:r>
-      <w:proofErr w:type="spellStart"/>
-      <w:r>
-        <w:t>koda</w:t>
-      </w:r>
-      <w:proofErr w:type="spellEnd"/>
-      <w:r>
-        <w:t xml:space="preserve"> </w:t>
+      <w:r>
+        <w:t xml:space="preserve">Primjeri koda </w:t>
       </w:r>
     </w:p>
     <w:p>
@@ -7422,19 +5880,9 @@
         </w:numPr>
         <w:jc w:val="both"/>
       </w:pPr>
-      <w:proofErr w:type="spellStart"/>
-      <w:r>
-        <w:t>Jednostavan</w:t>
-      </w:r>
-      <w:proofErr w:type="spellEnd"/>
-      <w:r>
-        <w:t xml:space="preserve"> </w:t>
-      </w:r>
-      <w:proofErr w:type="spellStart"/>
-      <w:r>
-        <w:t>interfejs</w:t>
-      </w:r>
-      <w:proofErr w:type="spellEnd"/>
+      <w:r>
+        <w:t>Jednostavan interfejs</w:t>
+      </w:r>
       <w:r>
         <w:br w:type="page"/>
       </w:r>
@@ -7443,7 +5891,7 @@
       <w:pPr>
         <w:pStyle w:val="Heading1"/>
       </w:pPr>
-      <w:bookmarkStart w:id="13" w:name="_Toc223859598"/>
+      <w:bookmarkStart w:id="12" w:name="_Toc224141968"/>
       <w:r>
         <w:lastRenderedPageBreak/>
         <w:t>4</w:t>
@@ -7454,7 +5902,7 @@
       <w:r>
         <w:t>Hardversko rješenje za School Bell System s LED reklamom</w:t>
       </w:r>
-      <w:bookmarkEnd w:id="13"/>
+      <w:bookmarkEnd w:id="12"/>
     </w:p>
     <w:p>
       <w:pPr>
@@ -7484,7 +5932,7 @@
           <w:lang w:val="en-GB" w:eastAsia="en-GB"/>
         </w:rPr>
         <w:drawing>
-          <wp:inline distT="114300" distB="114300" distL="114300" distR="114300" wp14:anchorId="25F1A306" wp14:editId="4207ED81">
+          <wp:inline distT="114300" distB="114300" distL="114300" distR="114300" wp14:anchorId="5D60048A" wp14:editId="479B093C">
             <wp:extent cx="3019425" cy="2225040"/>
             <wp:effectExtent l="0" t="0" r="9525" b="3810"/>
             <wp:docPr id="4" name="image1.png"/>
@@ -7558,7 +6006,7 @@
       <w:pPr>
         <w:pStyle w:val="Heading1"/>
       </w:pPr>
-      <w:bookmarkStart w:id="14" w:name="_Toc223859599"/>
+      <w:bookmarkStart w:id="13" w:name="_Toc224141969"/>
       <w:r>
         <w:lastRenderedPageBreak/>
         <w:t>5</w:t>
@@ -7569,6 +6017,128 @@
       <w:r>
         <w:t>Softversko rješenje za School Bell System s LED reklamom</w:t>
       </w:r>
+      <w:bookmarkEnd w:id="13"/>
+    </w:p>
+    <w:p>
+      <w:pPr>
+        <w:jc w:val="both"/>
+        <w:rPr>
+          <w:lang w:val="bs-Latn-BA" w:eastAsia="bs-Latn-BA"/>
+        </w:rPr>
+      </w:pPr>
+      <w:r>
+        <w:rPr>
+          <w:lang w:val="bs-Latn-BA" w:eastAsia="bs-Latn-BA"/>
+        </w:rPr>
+        <w:t>Softversko rješenje</w:t>
+      </w:r>
+      <w:r>
+        <w:rPr>
+          <w:lang w:val="bs-Latn-BA" w:eastAsia="bs-Latn-BA"/>
+        </w:rPr>
+        <w:t xml:space="preserve"> sastoji se iz dvije aplikacije</w:t>
+      </w:r>
+      <w:r>
+        <w:rPr>
+          <w:lang w:val="bs-Latn-BA" w:eastAsia="bs-Latn-BA"/>
+        </w:rPr>
+        <w:t xml:space="preserve"> kreirane na dvije različite platforme u dva različita okruženja. Za njihovu izradu korišteni su označeni (markup) jezici, poput HTML-a, CSS-a i JavaScript-a</w:t>
+      </w:r>
+      <w:r>
+        <w:rPr>
+          <w:lang w:val="bs-Latn-BA" w:eastAsia="bs-Latn-BA"/>
+        </w:rPr>
+        <w:t>, kao</w:t>
+      </w:r>
+      <w:r>
+        <w:rPr>
+          <w:lang w:val="bs-Latn-BA" w:eastAsia="bs-Latn-BA"/>
+        </w:rPr>
+        <w:t xml:space="preserve"> i programski jezik C#</w:t>
+      </w:r>
+      <w:r>
+        <w:rPr>
+          <w:lang w:val="bs-Latn-BA" w:eastAsia="bs-Latn-BA"/>
+        </w:rPr>
+        <w:t>, te programski jezik C++</w:t>
+      </w:r>
+      <w:r>
+        <w:rPr>
+          <w:lang w:val="bs-Latn-BA" w:eastAsia="bs-Latn-BA"/>
+        </w:rPr>
+        <w:t>.</w:t>
+      </w:r>
+      <w:r>
+        <w:rPr>
+          <w:lang w:val="bs-Latn-BA" w:eastAsia="bs-Latn-BA"/>
+        </w:rPr>
+        <w:t xml:space="preserve"> Također, za </w:t>
+      </w:r>
+      <w:r>
+        <w:rPr>
+          <w:lang w:val="bs-Latn-BA" w:eastAsia="bs-Latn-BA"/>
+        </w:rPr>
+        <w:t>izradu aplikacija korištena su d</w:t>
+      </w:r>
+      <w:r>
+        <w:rPr>
+          <w:lang w:val="bs-Latn-BA" w:eastAsia="bs-Latn-BA"/>
+        </w:rPr>
+        <w:t>v</w:t>
+      </w:r>
+      <w:r>
+        <w:rPr>
+          <w:lang w:val="bs-Latn-BA" w:eastAsia="bs-Latn-BA"/>
+        </w:rPr>
+        <w:t xml:space="preserve">a </w:t>
+      </w:r>
+      <w:r>
+        <w:rPr>
+          <w:lang w:val="bs-Latn-BA" w:eastAsia="bs-Latn-BA"/>
+        </w:rPr>
+        <w:t>editora: Microsoft Visual Studio 2022 (Windows aplikacija) i Visua</w:t>
+      </w:r>
+      <w:r>
+        <w:rPr>
+          <w:lang w:val="bs-Latn-BA" w:eastAsia="bs-Latn-BA"/>
+        </w:rPr>
+        <w:t>l Studio Code (Web-aplikacija). Razlika između dvije aplikacije jeste u povezivanju s ESP32 mikrokontrolerom i samim slanjem podataka na isti. Njegov rad definisan je kroz .ino fajl programiran unutar Arduino</w:t>
+      </w:r>
+      <w:r>
+        <w:rPr>
+          <w:lang w:val="bs-Latn-BA" w:eastAsia="bs-Latn-BA"/>
+        </w:rPr>
+        <w:t xml:space="preserve"> </w:t>
+      </w:r>
+      <w:r>
+        <w:rPr>
+          <w:lang w:val="bs-Latn-BA" w:eastAsia="bs-Latn-BA"/>
+        </w:rPr>
+        <w:t xml:space="preserve">IDE okruženja. </w:t>
+      </w:r>
+    </w:p>
+    <w:p>
+      <w:pPr>
+        <w:jc w:val="both"/>
+        <w:rPr>
+          <w:lang w:val="bs-Latn-BA" w:eastAsia="bs-Latn-BA"/>
+        </w:rPr>
+      </w:pPr>
+    </w:p>
+    <w:p>
+      <w:pPr>
+        <w:pStyle w:val="Heading2"/>
+      </w:pPr>
+      <w:bookmarkStart w:id="14" w:name="_Toc224141970"/>
+      <w:r>
+        <w:t>5</w:t>
+      </w:r>
+      <w:r>
+        <w:t xml:space="preserve">.1. </w:t>
+      </w:r>
+      <w:r>
+        <w:t>Windows .NET aplikacija</w:t>
+      </w:r>
       <w:bookmarkEnd w:id="14"/>
     </w:p>
     <w:p>
@@ -7582,313 +6152,146 @@
         <w:rPr>
           <w:lang w:val="bs-Latn-BA" w:eastAsia="bs-Latn-BA"/>
         </w:rPr>
-        <w:t>Softversko rješenje</w:t>
-      </w:r>
-      <w:r>
-        <w:rPr>
-          <w:lang w:val="bs-Latn-BA" w:eastAsia="bs-Latn-BA"/>
-        </w:rPr>
-        <w:t xml:space="preserve"> sastoji se iz dvije aplikacije</w:t>
-      </w:r>
-      <w:r>
-        <w:rPr>
-          <w:lang w:val="bs-Latn-BA" w:eastAsia="bs-Latn-BA"/>
-        </w:rPr>
-        <w:t xml:space="preserve"> kreirane na dvije različite platforme u dva različita okruženja. Za njihovu izradu korišteni su označeni (markup) jezici, poput HTML-a, CSS-a i JavaScript-a</w:t>
-      </w:r>
-      <w:r>
-        <w:rPr>
-          <w:lang w:val="bs-Latn-BA" w:eastAsia="bs-Latn-BA"/>
-        </w:rPr>
-        <w:t>, kao</w:t>
-      </w:r>
-      <w:r>
-        <w:rPr>
-          <w:lang w:val="bs-Latn-BA" w:eastAsia="bs-Latn-BA"/>
-        </w:rPr>
-        <w:t xml:space="preserve"> i programski jezik C#</w:t>
-      </w:r>
-      <w:r>
-        <w:rPr>
-          <w:lang w:val="bs-Latn-BA" w:eastAsia="bs-Latn-BA"/>
-        </w:rPr>
-        <w:t>, te programski jezik C++</w:t>
-      </w:r>
-      <w:r>
-        <w:rPr>
-          <w:lang w:val="bs-Latn-BA" w:eastAsia="bs-Latn-BA"/>
-        </w:rPr>
-        <w:t>.</w:t>
-      </w:r>
-      <w:r>
-        <w:rPr>
-          <w:lang w:val="bs-Latn-BA" w:eastAsia="bs-Latn-BA"/>
-        </w:rPr>
-        <w:t xml:space="preserve"> Također, za </w:t>
-      </w:r>
-      <w:r>
-        <w:rPr>
-          <w:lang w:val="bs-Latn-BA" w:eastAsia="bs-Latn-BA"/>
-        </w:rPr>
-        <w:t>izradu aplikacija korištena su d</w:t>
-      </w:r>
-      <w:r>
-        <w:rPr>
-          <w:lang w:val="bs-Latn-BA" w:eastAsia="bs-Latn-BA"/>
-        </w:rPr>
-        <w:t>v</w:t>
-      </w:r>
-      <w:r>
-        <w:rPr>
-          <w:lang w:val="bs-Latn-BA" w:eastAsia="bs-Latn-BA"/>
-        </w:rPr>
-        <w:t xml:space="preserve">a </w:t>
-      </w:r>
-      <w:r>
-        <w:rPr>
-          <w:lang w:val="bs-Latn-BA" w:eastAsia="bs-Latn-BA"/>
-        </w:rPr>
-        <w:t>editora: Microsoft Visual Studio 2022 (Windows aplikacija) i Visua</w:t>
-      </w:r>
-      <w:r>
-        <w:rPr>
-          <w:lang w:val="bs-Latn-BA" w:eastAsia="bs-Latn-BA"/>
-        </w:rPr>
-        <w:t>l Studio Code (Web-aplikacija). Razlika između dvije aplikacije jeste u povezivanju s ESP32 mikrokontrolerom i samim slanjem podataka na isti. Njegov rad definisan je kroz .ino fajl programiran unutar Arduino</w:t>
-      </w:r>
-      <w:r>
-        <w:rPr>
-          <w:lang w:val="bs-Latn-BA" w:eastAsia="bs-Latn-BA"/>
+        <w:t>Prva aplikacija izrađena je u .NET okruženju, odnosno u programu Microsoft Visual Studio 2022. Prvobitna svrha ove aplikacije bila je da predstavlja glavno softversko rješenje ovog maturskog rada. Međutim, tokom razvoja pojavio se problem pri prijenosu podataka.</w:t>
+      </w:r>
+    </w:p>
+    <w:p>
+      <w:pPr>
+        <w:jc w:val="both"/>
+        <w:rPr>
+          <w:lang w:val="bs-Latn-BA" w:eastAsia="bs-Latn-BA"/>
+        </w:rPr>
+      </w:pPr>
+    </w:p>
+    <w:p>
+      <w:pPr>
+        <w:jc w:val="both"/>
+        <w:rPr>
+          <w:lang w:val="bs-Latn-BA" w:eastAsia="bs-Latn-BA"/>
+        </w:rPr>
+      </w:pPr>
+      <w:r>
+        <w:rPr>
+          <w:lang w:val="bs-Latn-BA" w:eastAsia="bs-Latn-BA"/>
+        </w:rPr>
+        <w:t>Naime, kako bi komunikacija između mikrokontrolera ESP32 i LED matrice bila moguća, bio je potreban fizički kontakt, odnosno kablovska veza koja bi omogućila razmjenu podataka. To je dovodilo do dodatnog problema: svaki put kada bi se novi podaci trebali poslati na matricu za ispis (npr. obavještenja ili raspored dežurnih profesora), bilo je potrebno skinuti matricu sa ploče, povezati je s laptopom i ponovo učitati kod.</w:t>
+      </w:r>
+    </w:p>
+    <w:p>
+      <w:pPr>
+        <w:jc w:val="both"/>
+        <w:rPr>
+          <w:lang w:val="bs-Latn-BA" w:eastAsia="bs-Latn-BA"/>
+        </w:rPr>
+      </w:pPr>
+    </w:p>
+    <w:p>
+      <w:pPr>
+        <w:jc w:val="both"/>
+        <w:rPr>
+          <w:lang w:val="bs-Latn-BA" w:eastAsia="bs-Latn-BA"/>
+        </w:rPr>
+      </w:pPr>
+      <w:r>
+        <w:rPr>
+          <w:lang w:val="bs-Latn-BA" w:eastAsia="bs-Latn-BA"/>
+        </w:rPr>
+        <w:t>Takav proces pokazao se nepraktičnim i neefikasnim za svakodnevnu upotrebu sistema. Zbog toga je ova aplikacija proglašena neadekvatnim rješenjem i ostavljena je kao rezervna opcija u slučaju da web-aplikacija ima poteškoće pri povezivanju. Može se reći da predstavlja „manualni“ pristup upravljanju sistemom.</w:t>
+      </w:r>
+    </w:p>
+    <w:p>
+      <w:pPr>
+        <w:jc w:val="both"/>
+        <w:rPr>
+          <w:lang w:val="bs-Latn-BA" w:eastAsia="bs-Latn-BA"/>
+        </w:rPr>
+      </w:pPr>
+    </w:p>
+    <w:p>
+      <w:pPr>
+        <w:jc w:val="both"/>
+        <w:rPr>
+          <w:lang w:val="bs-Latn-BA" w:eastAsia="bs-Latn-BA"/>
+        </w:rPr>
+      </w:pPr>
+      <w:r>
+        <w:rPr>
+          <w:lang w:val="bs-Latn-BA" w:eastAsia="bs-Latn-BA"/>
+        </w:rPr>
+        <w:t>Iako nije korištena kao primarno rješenje, ova aplikacija bila je prvi razvijeni softverski dio projekta te je, kao takva, važna za razumijevanje procesa razvoja cijelog sistema.</w:t>
+      </w:r>
+    </w:p>
+    <w:p>
+      <w:pPr>
+        <w:rPr>
+          <w:lang w:val="bs-Latn-BA"/>
+        </w:rPr>
+      </w:pPr>
+    </w:p>
+    <w:p>
+      <w:pPr>
+        <w:pStyle w:val="Heading3"/>
+      </w:pPr>
+      <w:bookmarkStart w:id="15" w:name="_Toc224141971"/>
+      <w:r>
+        <w:t>Dizajn aplikacije</w:t>
+      </w:r>
+      <w:bookmarkEnd w:id="15"/>
+    </w:p>
+    <w:p>
+      <w:pPr>
+        <w:rPr>
+          <w:lang w:val="bs-Latn-BA" w:eastAsia="bs-Latn-BA"/>
+        </w:rPr>
+      </w:pPr>
+    </w:p>
+    <w:p>
+      <w:pPr>
+        <w:rPr>
+          <w:lang w:val="bs-Latn-BA" w:eastAsia="bs-Latn-BA"/>
+        </w:rPr>
+      </w:pPr>
+      <w:r>
+        <w:rPr>
+          <w:lang w:val="bs-Latn-BA" w:eastAsia="bs-Latn-BA"/>
+        </w:rPr>
+        <w:t>Dizajn aplika</w:t>
+      </w:r>
+      <w:r>
+        <w:rPr>
+          <w:lang w:val="bs-Latn-BA" w:eastAsia="bs-Latn-BA"/>
+        </w:rPr>
+        <w:t>cije sastoji se od dvije forme.</w:t>
+      </w:r>
+    </w:p>
+    <w:p>
+      <w:pPr>
+        <w:rPr>
+          <w:lang w:val="bs-Latn-BA" w:eastAsia="bs-Latn-BA"/>
+        </w:rPr>
+      </w:pPr>
+    </w:p>
+    <w:p>
+      <w:pPr>
+        <w:jc w:val="both"/>
+        <w:rPr>
+          <w:noProof/>
+          <w:lang w:val="bs-Latn-BA" w:eastAsia="en-GB"/>
+        </w:rPr>
+      </w:pPr>
+      <w:r>
+        <w:rPr>
+          <w:lang w:val="bs-Latn-BA" w:eastAsia="bs-Latn-BA"/>
+        </w:rPr>
+        <w:t>Prva forma koja se učitava pri pokretanju aplikacije zapravo predstavlja sekundarnu formu ovog projekta i služi kao log-in forma. Njen izgled prikazan je na slici 5.1.1.</w:t>
+      </w:r>
+      <w:r>
+        <w:rPr>
+          <w:noProof/>
+          <w:lang w:val="bs-Latn-BA" w:eastAsia="en-GB"/>
         </w:rPr>
         <w:t xml:space="preserve"> </w:t>
       </w:r>
-      <w:r>
-        <w:rPr>
-          <w:lang w:val="bs-Latn-BA" w:eastAsia="bs-Latn-BA"/>
-        </w:rPr>
-        <w:t xml:space="preserve">IDE okruženja. </w:t>
-      </w:r>
-    </w:p>
-    <w:p>
-      <w:pPr>
-        <w:jc w:val="both"/>
-        <w:rPr>
-          <w:lang w:val="bs-Latn-BA" w:eastAsia="bs-Latn-BA"/>
-        </w:rPr>
-      </w:pPr>
-    </w:p>
-    <w:p>
-      <w:pPr>
-        <w:pStyle w:val="Heading2"/>
-      </w:pPr>
-      <w:bookmarkStart w:id="15" w:name="_Toc223859600"/>
-      <w:r>
-        <w:t>5</w:t>
-      </w:r>
-      <w:r>
-        <w:t xml:space="preserve">.1. </w:t>
-      </w:r>
-      <w:r>
-        <w:t>Windows .NET aplikacija</w:t>
-      </w:r>
-      <w:bookmarkEnd w:id="15"/>
-    </w:p>
-    <w:p>
-      <w:pPr>
-        <w:jc w:val="both"/>
-        <w:rPr>
-          <w:lang w:val="bs-Latn-BA" w:eastAsia="bs-Latn-BA"/>
-        </w:rPr>
-      </w:pPr>
-      <w:r>
-        <w:rPr>
-          <w:lang w:val="bs-Latn-BA" w:eastAsia="bs-Latn-BA"/>
-        </w:rPr>
-        <w:t>Prva aplikacija izrađena je u .NET okruženju, odnosno u programu Microsoft Visual Studio 2022. Prvobitna svrha ove aplikacije bila je da predstavlja glavno softversko rješenje ovog maturskog rada. Međutim, tokom razvoja pojavio se problem pri prijenosu podataka.</w:t>
-      </w:r>
-    </w:p>
-    <w:p>
-      <w:pPr>
-        <w:jc w:val="both"/>
-        <w:rPr>
-          <w:lang w:val="bs-Latn-BA" w:eastAsia="bs-Latn-BA"/>
-        </w:rPr>
-      </w:pPr>
-    </w:p>
-    <w:p>
-      <w:pPr>
-        <w:jc w:val="both"/>
-        <w:rPr>
-          <w:lang w:val="bs-Latn-BA" w:eastAsia="bs-Latn-BA"/>
-        </w:rPr>
-      </w:pPr>
-      <w:r>
-        <w:rPr>
-          <w:lang w:val="bs-Latn-BA" w:eastAsia="bs-Latn-BA"/>
-        </w:rPr>
-        <w:t>Naime, kako bi komunikacija između mikrokontrolera ESP32 i LED matrice bila moguća, bio je potreban fizički kontakt, odnosno kablovska veza koja bi omogućila razmjenu podataka. To je dovodilo do dodatnog problema: svaki put kada bi se novi podaci trebali poslati na matricu za ispis (npr. obavještenja ili raspored dežurnih profesora), bilo je potrebno skinuti matricu sa ploče, povezati je s laptopom i ponovo učitati kod.</w:t>
-      </w:r>
-    </w:p>
-    <w:p>
-      <w:pPr>
-        <w:jc w:val="both"/>
-        <w:rPr>
-          <w:lang w:val="bs-Latn-BA" w:eastAsia="bs-Latn-BA"/>
-        </w:rPr>
-      </w:pPr>
-    </w:p>
-    <w:p>
-      <w:pPr>
-        <w:jc w:val="both"/>
-        <w:rPr>
-          <w:lang w:val="bs-Latn-BA" w:eastAsia="bs-Latn-BA"/>
-        </w:rPr>
-      </w:pPr>
-      <w:r>
-        <w:rPr>
-          <w:lang w:val="bs-Latn-BA" w:eastAsia="bs-Latn-BA"/>
-        </w:rPr>
-        <w:t>Takav proces pokazao se nepraktičnim i neefikasnim za svakodnevnu upotrebu sistema. Zbog toga je ova aplikacija proglašena neadekvatnim rješenjem i ostavljena je kao rezervna opcija u slučaju da web-aplikacija ima poteškoće pri povezivanju. Može se reći da predstavlja „manualni“ pristup upravljanju sistemom.</w:t>
-      </w:r>
-    </w:p>
-    <w:p>
-      <w:pPr>
-        <w:jc w:val="both"/>
-        <w:rPr>
-          <w:lang w:val="bs-Latn-BA" w:eastAsia="bs-Latn-BA"/>
-        </w:rPr>
-      </w:pPr>
-    </w:p>
-    <w:p>
-      <w:pPr>
-        <w:jc w:val="both"/>
-        <w:rPr>
-          <w:lang w:val="bs-Latn-BA" w:eastAsia="bs-Latn-BA"/>
-        </w:rPr>
-      </w:pPr>
-      <w:r>
-        <w:rPr>
-          <w:lang w:val="bs-Latn-BA" w:eastAsia="bs-Latn-BA"/>
-        </w:rPr>
-        <w:t>Iako nije korištena kao primarno rješenje, ova aplikacija bila je prvi razvijeni softverski dio projekta te je, kao takva, važna za razumijevanje procesa razvoja cijelog sistema.</w:t>
-      </w:r>
-    </w:p>
-    <w:p/>
-    <w:p>
-      <w:pPr>
-        <w:pStyle w:val="Heading3"/>
-      </w:pPr>
-      <w:bookmarkStart w:id="16" w:name="_Toc223859601"/>
-      <w:r>
-        <w:t>Dizajn aplikacije</w:t>
-      </w:r>
-      <w:bookmarkEnd w:id="16"/>
-    </w:p>
-    <w:p>
-      <w:pPr>
-        <w:rPr>
-          <w:lang w:val="bs-Latn-BA" w:eastAsia="bs-Latn-BA"/>
-        </w:rPr>
-      </w:pPr>
-    </w:p>
-    <w:p>
-      <w:pPr>
-        <w:rPr>
-          <w:lang w:val="bs-Latn-BA" w:eastAsia="bs-Latn-BA"/>
-        </w:rPr>
-      </w:pPr>
-      <w:r>
-        <w:rPr>
-          <w:lang w:val="bs-Latn-BA" w:eastAsia="bs-Latn-BA"/>
-        </w:rPr>
-        <w:t>Dizajn aplika</w:t>
-      </w:r>
-      <w:r>
-        <w:rPr>
-          <w:lang w:val="bs-Latn-BA" w:eastAsia="bs-Latn-BA"/>
-        </w:rPr>
-        <w:t>cije sastoji se od dvije forme.</w:t>
-      </w:r>
-    </w:p>
-    <w:p>
-      <w:pPr>
-        <w:rPr>
-          <w:lang w:val="bs-Latn-BA" w:eastAsia="bs-Latn-BA"/>
-        </w:rPr>
-      </w:pPr>
-    </w:p>
-    <w:p>
-      <w:pPr>
-        <w:jc w:val="both"/>
-        <w:rPr>
-          <w:lang w:val="bs-Latn-BA" w:eastAsia="bs-Latn-BA"/>
-        </w:rPr>
-      </w:pPr>
-      <w:r>
-        <w:rPr>
-          <w:lang w:val="bs-Latn-BA" w:eastAsia="bs-Latn-BA"/>
-        </w:rPr>
-        <w:t>Prva forma koja se učitava pri pokretanju aplikacije zapravo predstavlja sekundarnu formu ovog projekta i služi kao log-in forma. Njen izgled prikazan je na slici 5.1.1.</w:t>
-      </w:r>
-    </w:p>
-    <w:p>
-      <w:pPr>
-        <w:jc w:val="both"/>
-        <w:rPr>
-          <w:lang w:val="bs-Latn-BA" w:eastAsia="bs-Latn-BA"/>
-        </w:rPr>
-      </w:pPr>
-    </w:p>
-    <w:p>
-      <w:pPr>
-        <w:jc w:val="both"/>
-        <w:rPr>
-          <w:lang w:val="bs-Latn-BA" w:eastAsia="bs-Latn-BA"/>
-        </w:rPr>
-      </w:pPr>
-      <w:r>
-        <w:rPr>
-          <w:lang w:val="bs-Latn-BA" w:eastAsia="bs-Latn-BA"/>
-        </w:rPr>
-        <w:t>Njena osnovna svrha je da osigura pristup sistemu tako što je u prva dva polja potrebno unijeti validne korisničke podatke kako bi se omogućio prelazak na primarnu formu aplikacije. Opcija odabira COM porta uvedena je zbog potrebe za povezivanjem mikrokontrolera ESP32 sa računarom prilikom učitavanja novih podataka. Bez ove opcije bilo bi potrebno definisati statički port direktno u kodu, što bi moglo uzrokovati probleme prilikom promjene računara ili komunikacijskog porta.</w:t>
-      </w:r>
-    </w:p>
-    <w:p>
-      <w:pPr>
-        <w:jc w:val="both"/>
-        <w:rPr>
-          <w:lang w:val="bs-Latn-BA" w:eastAsia="bs-Latn-BA"/>
-        </w:rPr>
-      </w:pPr>
-    </w:p>
-    <w:p>
-      <w:pPr>
-        <w:jc w:val="both"/>
-        <w:rPr>
-          <w:lang w:val="bs-Latn-BA" w:eastAsia="bs-Latn-BA"/>
-        </w:rPr>
-      </w:pPr>
-      <w:r>
-        <w:rPr>
-          <w:lang w:val="bs-Latn-BA" w:eastAsia="bs-Latn-BA"/>
-        </w:rPr>
-        <w:t xml:space="preserve">Pritiskom na dugme „Login“ vrši se provjera unesenih podataka, nakon čega se prikazuje odgovarajuća poruka u zavisnosti od njihove validnosti. Ukoliko su uneseni podaci ispravni, aplikacija se automatski povezuje sa mikrokontrolerom, a zatim se u MessageBox prozoru </w:t>
-      </w:r>
-      <w:r>
-        <w:rPr>
-          <w:lang w:val="bs-Latn-BA" w:eastAsia="bs-Latn-BA"/>
-        </w:rPr>
-        <w:lastRenderedPageBreak/>
-        <w:t>prikazuje potvrda o uspješnom povezivanju. Nakon toga korisnik se preusmjerava na početnu (Home) stranicu aplikacije.</w:t>
-      </w:r>
-    </w:p>
-    <w:p>
-      <w:pPr>
-        <w:jc w:val="both"/>
-        <w:rPr>
-          <w:lang w:val="bs-Latn-BA" w:eastAsia="bs-Latn-BA"/>
-        </w:rPr>
-      </w:pPr>
     </w:p>
     <w:p>
       <w:pPr>
@@ -7902,8 +6305,9 @@
           <w:noProof/>
           <w:lang w:val="en-GB" w:eastAsia="en-GB"/>
         </w:rPr>
+        <w:lastRenderedPageBreak/>
         <w:drawing>
-          <wp:inline distT="0" distB="0" distL="0" distR="0" wp14:anchorId="452F3CEA" wp14:editId="4040A8B0">
+          <wp:inline distT="0" distB="0" distL="0" distR="0" wp14:anchorId="21BE1A3E" wp14:editId="15016F07">
             <wp:extent cx="5073650" cy="2773680"/>
             <wp:effectExtent l="0" t="0" r="0" b="7620"/>
             <wp:docPr id="14" name="Picture 14"/>
@@ -7967,27 +6371,77 @@
     </w:p>
     <w:p>
       <w:pPr>
-        <w:rPr>
-          <w:lang w:val="bs-Latn-BA" w:eastAsia="bs-Latn-BA"/>
-        </w:rPr>
-      </w:pPr>
-    </w:p>
-    <w:p>
-      <w:pPr>
-        <w:rPr>
-          <w:lang w:val="bs-Latn-BA" w:eastAsia="bs-Latn-BA"/>
-        </w:rPr>
-      </w:pPr>
-    </w:p>
-    <w:p>
-      <w:pPr>
-        <w:rPr>
-          <w:lang w:val="bs-Latn-BA" w:eastAsia="bs-Latn-BA"/>
-        </w:rPr>
-      </w:pPr>
-    </w:p>
-    <w:p>
-      <w:pPr>
+        <w:jc w:val="both"/>
+        <w:rPr>
+          <w:lang w:val="bs-Latn-BA" w:eastAsia="bs-Latn-BA"/>
+        </w:rPr>
+      </w:pPr>
+    </w:p>
+    <w:p>
+      <w:pPr>
+        <w:jc w:val="both"/>
+        <w:rPr>
+          <w:lang w:val="bs-Latn-BA" w:eastAsia="bs-Latn-BA"/>
+        </w:rPr>
+      </w:pPr>
+      <w:r>
+        <w:rPr>
+          <w:lang w:val="bs-Latn-BA" w:eastAsia="bs-Latn-BA"/>
+        </w:rPr>
+        <w:t>Njena osnovna svrha je da osigura pristup sistemu tako što je u prva dva polja potrebno unijeti validne korisničke podatke kako bi se omogućio prelazak na primarnu formu aplikacije. Opcija odabira COM porta uvedena je zbog potrebe za povezivanjem mikrokontrolera ESP32 sa računarom prilikom učitavanja novih podataka. Bez ove opcije bilo bi potrebno definisati statički port direktno u kodu, što bi moglo uzrokovati probleme prilikom promjene računara ili komunikacijskog porta.</w:t>
+      </w:r>
+    </w:p>
+    <w:p>
+      <w:pPr>
+        <w:jc w:val="both"/>
+        <w:rPr>
+          <w:lang w:val="bs-Latn-BA" w:eastAsia="bs-Latn-BA"/>
+        </w:rPr>
+      </w:pPr>
+    </w:p>
+    <w:p>
+      <w:pPr>
+        <w:jc w:val="both"/>
+        <w:rPr>
+          <w:lang w:val="bs-Latn-BA" w:eastAsia="bs-Latn-BA"/>
+        </w:rPr>
+      </w:pPr>
+      <w:r>
+        <w:rPr>
+          <w:lang w:val="bs-Latn-BA" w:eastAsia="bs-Latn-BA"/>
+        </w:rPr>
+        <w:t>Pritiskom na dugme „Login“ vrši se provjera unesenih podataka, nakon čega se prikazuje odgovarajuća poruka u zavisnosti od njihove validnosti. Ukoliko su uneseni podaci ispravni, aplikacija se automatski povezuje sa mikrokontrolerom, a zatim se u MessageBox prozoru prikazuje potvrda o uspješnom povezivanju. Nakon toga korisnik se preusmjerava na početnu (Home) stranicu aplikacije</w:t>
+      </w:r>
+      <w:r>
+        <w:rPr>
+          <w:lang w:val="bs-Latn-BA" w:eastAsia="bs-Latn-BA"/>
+        </w:rPr>
+        <w:t xml:space="preserve"> prikazanu na slici 5.1.2</w:t>
+      </w:r>
+      <w:r>
+        <w:rPr>
+          <w:lang w:val="bs-Latn-BA" w:eastAsia="bs-Latn-BA"/>
+        </w:rPr>
+        <w:t>.</w:t>
+      </w:r>
+    </w:p>
+    <w:p>
+      <w:pPr>
+        <w:rPr>
+          <w:lang w:val="bs-Latn-BA" w:eastAsia="bs-Latn-BA"/>
+        </w:rPr>
+      </w:pPr>
+    </w:p>
+    <w:p>
+      <w:pPr>
+        <w:rPr>
+          <w:lang w:val="bs-Latn-BA" w:eastAsia="bs-Latn-BA"/>
+        </w:rPr>
+      </w:pPr>
+    </w:p>
+    <w:p>
+      <w:pPr>
+        <w:jc w:val="center"/>
         <w:rPr>
           <w:lang w:val="bs-Latn-BA" w:eastAsia="bs-Latn-BA"/>
         </w:rPr>
@@ -7998,7 +6452,7 @@
           <w:lang w:val="en-GB" w:eastAsia="en-GB"/>
         </w:rPr>
         <w:drawing>
-          <wp:inline distT="0" distB="0" distL="0" distR="0" wp14:anchorId="0B942CF3" wp14:editId="4E8D24EB">
+          <wp:inline distT="0" distB="0" distL="0" distR="0" wp14:anchorId="730D235A" wp14:editId="5A121C4B">
             <wp:extent cx="5135880" cy="2763819"/>
             <wp:effectExtent l="0" t="0" r="7620" b="0"/>
             <wp:docPr id="18" name="Picture 18"/>
@@ -8036,36 +6490,276 @@
     </w:p>
     <w:p>
       <w:pPr>
-        <w:rPr>
-          <w:lang w:val="bs-Latn-BA" w:eastAsia="bs-Latn-BA"/>
-        </w:rPr>
-      </w:pPr>
+        <w:jc w:val="center"/>
+        <w:rPr>
+          <w:i/>
+          <w:sz w:val="18"/>
+          <w:szCs w:val="18"/>
+          <w:lang w:val="bs-Latn-BA" w:eastAsia="bs-Latn-BA"/>
+        </w:rPr>
+      </w:pPr>
+      <w:r>
+        <w:rPr>
+          <w:i/>
+          <w:sz w:val="18"/>
+          <w:szCs w:val="18"/>
+          <w:lang w:val="bs-Latn-BA" w:eastAsia="bs-Latn-BA"/>
+        </w:rPr>
+        <w:t>Slika 5.1.2. prikaz glavne</w:t>
+      </w:r>
+      <w:r>
+        <w:rPr>
+          <w:i/>
+          <w:sz w:val="18"/>
+          <w:szCs w:val="18"/>
+          <w:lang w:val="bs-Latn-BA" w:eastAsia="bs-Latn-BA"/>
+        </w:rPr>
+        <w:t xml:space="preserve"> forme</w:t>
+      </w:r>
+    </w:p>
+    <w:p>
+      <w:pPr>
+        <w:jc w:val="center"/>
+        <w:rPr>
+          <w:lang w:val="bs-Latn-BA" w:eastAsia="bs-Latn-BA"/>
+        </w:rPr>
+      </w:pPr>
+    </w:p>
+    <w:p>
+      <w:pPr>
+        <w:rPr>
+          <w:lang w:val="bs-Latn-BA" w:eastAsia="bs-Latn-BA"/>
+        </w:rPr>
+      </w:pPr>
+    </w:p>
+    <w:p>
+      <w:pPr>
+        <w:jc w:val="both"/>
+        <w:rPr>
+          <w:lang w:val="bs-Latn-BA"/>
+        </w:rPr>
+      </w:pPr>
+      <w:r>
+        <w:rPr>
+          <w:lang w:val="bs-Latn-BA"/>
+        </w:rPr>
+        <w:lastRenderedPageBreak/>
+        <w:t>Na glavnoj formi nalazi se kontrola TabControl, koja omogućava kreiranje više tabova unutar jedne forme i korištenje istog .cs fajla za sve tabove. Ova kontrola izabrana je zbog praktičnosti i lakše navigacije korisnika između stranica.</w:t>
+      </w:r>
+    </w:p>
+    <w:p>
+      <w:pPr>
+        <w:jc w:val="both"/>
+        <w:rPr>
+          <w:lang w:val="bs-Latn-BA"/>
+        </w:rPr>
+      </w:pPr>
+    </w:p>
+    <w:p>
+      <w:pPr>
+        <w:jc w:val="both"/>
+        <w:rPr>
+          <w:lang w:val="bs-Latn-BA"/>
+        </w:rPr>
+      </w:pPr>
+      <w:r>
+        <w:rPr>
+          <w:lang w:val="bs-Latn-BA"/>
+        </w:rPr>
+        <w:t>Finalna verzija dizajna aplikacije sastoji se od šest tabova: Home, Raspored, Dežurstvo, Obavijesti, Testiranje i Postavke. Svaki tab izvršava odgovarajuće zadatke za koje je programiran. U nastavku slijedi detaljno objašnjenje:</w:t>
+      </w:r>
+    </w:p>
+    <w:p>
+      <w:pPr>
+        <w:jc w:val="both"/>
+        <w:rPr>
+          <w:lang w:val="bs-Latn-BA"/>
+        </w:rPr>
+      </w:pPr>
+    </w:p>
+    <w:p>
+      <w:pPr>
+        <w:pStyle w:val="ListParagraph"/>
+        <w:numPr>
+          <w:ilvl w:val="0"/>
+          <w:numId w:val="11"/>
+        </w:numPr>
+        <w:jc w:val="both"/>
+        <w:rPr>
+          <w:lang w:val="bs-Latn-BA"/>
+        </w:rPr>
+      </w:pPr>
+      <w:r>
+        <w:rPr>
+          <w:lang w:val="bs-Latn-BA"/>
+        </w:rPr>
+        <w:t>Home – predstavlja početnu stranicu. Na njoj je prikazan grb elektrotehničke škole s nazivom ispod i poznatim sloganom. U donjem desnom uglu nalazi se dugme za hitne slučajeve, namjerno postavljeno radi preglednosti i brzog pristupa. Ova stranica služi kao uvod u sistem i nema kompleksnu funkcionalnost.</w:t>
+      </w:r>
+    </w:p>
+    <w:p>
+      <w:pPr>
+        <w:pStyle w:val="ListParagraph"/>
+        <w:jc w:val="both"/>
+        <w:rPr>
+          <w:lang w:val="bs-Latn-BA"/>
+        </w:rPr>
+      </w:pPr>
+    </w:p>
+    <w:p>
+      <w:pPr>
+        <w:pStyle w:val="ListParagraph"/>
+        <w:numPr>
+          <w:ilvl w:val="0"/>
+          <w:numId w:val="11"/>
+        </w:numPr>
+        <w:jc w:val="both"/>
+        <w:rPr>
+          <w:lang w:val="bs-Latn-BA"/>
+        </w:rPr>
+      </w:pPr>
+      <w:r>
+        <w:rPr>
+          <w:lang w:val="bs-Latn-BA"/>
+        </w:rPr>
+        <w:t>Raspored – sadrži dvije DataGridView kontrole za redovnu i skraćenu nastavu. Kontrole prikazuju tabelu sa 3 kolone (broj časa, početak i kraj) i 13 redova s podacima. Također sadrže radio dugmad za izbor redovnog ili skraćenog rasporeda te dugme „Pošalji na ESP“ koje šalje podatke na mikrokontroler.</w:t>
+      </w:r>
+    </w:p>
+    <w:p>
+      <w:pPr>
+        <w:pStyle w:val="ListParagraph"/>
+        <w:jc w:val="both"/>
+        <w:rPr>
+          <w:lang w:val="bs-Latn-BA"/>
+        </w:rPr>
+      </w:pPr>
+    </w:p>
+    <w:p>
+      <w:pPr>
+        <w:pStyle w:val="ListParagraph"/>
+        <w:numPr>
+          <w:ilvl w:val="0"/>
+          <w:numId w:val="11"/>
+        </w:numPr>
+        <w:jc w:val="both"/>
+        <w:rPr>
+          <w:lang w:val="bs-Latn-BA"/>
+        </w:rPr>
+      </w:pPr>
+      <w:r>
+        <w:rPr>
+          <w:lang w:val="bs-Latn-BA"/>
+        </w:rPr>
+        <w:t>Dežurstvo – [ovdje je potrebno dodati opis funkcionalnosti ovog taba].</w:t>
+      </w:r>
+    </w:p>
+    <w:p>
+      <w:pPr>
+        <w:pStyle w:val="ListParagraph"/>
+        <w:jc w:val="both"/>
+        <w:rPr>
+          <w:lang w:val="bs-Latn-BA"/>
+        </w:rPr>
+      </w:pPr>
+    </w:p>
+    <w:p>
+      <w:pPr>
+        <w:pStyle w:val="ListParagraph"/>
+        <w:numPr>
+          <w:ilvl w:val="0"/>
+          <w:numId w:val="11"/>
+        </w:numPr>
+        <w:jc w:val="both"/>
+        <w:rPr>
+          <w:lang w:val="bs-Latn-BA"/>
+        </w:rPr>
+      </w:pPr>
+      <w:r>
+        <w:rPr>
+          <w:lang w:val="bs-Latn-BA"/>
+        </w:rPr>
+        <w:t>Obavijesti – služe za slanje obavještenja na LED matricu. Sadrže dva DateTimePicker kontrola (za datum i vrijeme obavještenja) i tekstbox za unos naziva obavještenja. Tekstbox nema ograničenje broja karaktera, što omogućava unos više podataka u jednoj obavijesti (npr. raspored takmičara, osvojena mjesta ili lokacija kabineta). Obavijesti se prikazuju u ListBoxu, a dugmići „Dodaj“ i „Obriši“ omogućavaju upravljanje stavkama. Podaci se šalju na ESP klikom na odgovarajuće dugme, a nakon izvršenja obavijest se briše iz liste.</w:t>
+      </w:r>
+    </w:p>
+    <w:p>
+      <w:pPr>
+        <w:pStyle w:val="ListParagraph"/>
+        <w:jc w:val="both"/>
+        <w:rPr>
+          <w:lang w:val="bs-Latn-BA"/>
+        </w:rPr>
+      </w:pPr>
+    </w:p>
+    <w:p>
+      <w:pPr>
+        <w:pStyle w:val="ListParagraph"/>
+        <w:numPr>
+          <w:ilvl w:val="0"/>
+          <w:numId w:val="11"/>
+        </w:numPr>
+        <w:jc w:val="both"/>
+        <w:rPr>
+          <w:lang w:val="bs-Latn-BA"/>
+        </w:rPr>
+      </w:pPr>
+      <w:r>
+        <w:rPr>
+          <w:lang w:val="bs-Latn-BA"/>
+        </w:rPr>
+        <w:t>Testiranje – koristi dvije dugmeta za početak i kraj zvona. Njegova svrha je testiranje ispravnosti rada zvona.</w:t>
+      </w:r>
+    </w:p>
+    <w:p>
+      <w:pPr>
+        <w:pStyle w:val="ListParagraph"/>
+        <w:jc w:val="both"/>
+        <w:rPr>
+          <w:lang w:val="bs-Latn-BA"/>
+        </w:rPr>
+      </w:pPr>
+    </w:p>
+    <w:p>
+      <w:pPr>
+        <w:pStyle w:val="ListParagraph"/>
+        <w:numPr>
+          <w:ilvl w:val="0"/>
+          <w:numId w:val="11"/>
+        </w:numPr>
+        <w:jc w:val="both"/>
+        <w:rPr>
+          <w:lang w:val="bs-Latn-BA"/>
+        </w:rPr>
+      </w:pPr>
+      <w:r>
+        <w:rPr>
+          <w:lang w:val="bs-Latn-BA"/>
+        </w:rPr>
+        <w:t>Postavke – sadrži dva panela. Prvi panel omogućava promjenu podataka o adminu (ime, trenutna i nova šifra), a drugi panel služi za podešavanje Wi-Fi mreže (naziv i šifra). Podaci se spremaju klikom na dugmad „Sačuvaj“ ili „Novi podaci za login“, a pogrešni unosi prikazuju odgovarajuće poruke kroz MessageBox. Dodatno, unutar taba Postavke nalazi se dugme za čišćenje EEPROM-a, koje briše sve podatke na mikrokontroleru i postavlja prikaz na „Nema časa“.</w:t>
+      </w:r>
+    </w:p>
+    <w:p>
+      <w:pPr>
+        <w:rPr>
+          <w:lang w:val="bs-Latn-BA"/>
+        </w:rPr>
+      </w:pPr>
+    </w:p>
+    <w:p>
+      <w:pPr>
+        <w:pStyle w:val="Heading3"/>
+      </w:pPr>
+      <w:bookmarkStart w:id="16" w:name="_Toc224141972"/>
+      <w:r>
+        <w:t>Funkcionalnost aplikacije</w:t>
+      </w:r>
+      <w:bookmarkEnd w:id="16"/>
     </w:p>
     <w:p/>
     <w:p/>
-    <w:p/>
-    <w:p>
-      <w:pPr>
-        <w:rPr>
-          <w:lang w:val="bs-Latn-BA" w:eastAsia="bs-Latn-BA"/>
-        </w:rPr>
-      </w:pPr>
-    </w:p>
-    <w:p>
-      <w:pPr>
-        <w:rPr>
-          <w:lang w:val="bs-Latn-BA" w:eastAsia="bs-Latn-BA"/>
-        </w:rPr>
-      </w:pPr>
-    </w:p>
-    <w:p>
-      <w:pPr>
-        <w:rPr>
-          <w:lang w:val="bs-Latn-BA" w:eastAsia="bs-Latn-BA"/>
-        </w:rPr>
-      </w:pPr>
-    </w:p>
-    <w:p/>
+    <w:p>
+      <w:r>
+        <w:tab/>
+      </w:r>
+    </w:p>
     <w:p>
       <w:r>
         <w:br w:type="page"/>
@@ -8073,35 +6767,9 @@
     </w:p>
     <w:p>
       <w:pPr>
-        <w:pStyle w:val="Heading3"/>
-      </w:pPr>
-      <w:bookmarkStart w:id="17" w:name="_Toc223859602"/>
-      <w:r>
-        <w:lastRenderedPageBreak/>
-        <w:t>Funkcionalnost</w:t>
-      </w:r>
-      <w:r>
-        <w:t xml:space="preserve"> aplikacije</w:t>
-      </w:r>
-      <w:bookmarkEnd w:id="17"/>
-    </w:p>
-    <w:p/>
-    <w:p/>
-    <w:p>
-      <w:r>
-        <w:tab/>
-      </w:r>
-    </w:p>
-    <w:p>
-      <w:r>
-        <w:br w:type="page"/>
-      </w:r>
-    </w:p>
-    <w:p>
-      <w:pPr>
         <w:pStyle w:val="Heading2"/>
       </w:pPr>
-      <w:bookmarkStart w:id="18" w:name="_Toc223859603"/>
+      <w:bookmarkStart w:id="17" w:name="_Toc224141973"/>
       <w:r>
         <w:lastRenderedPageBreak/>
         <w:t>5</w:t>
@@ -8110,39 +6778,36 @@
         <w:t>.2</w:t>
       </w:r>
       <w:r>
-        <w:t xml:space="preserve">. </w:t>
-      </w:r>
-      <w:r>
-        <w:t>Web aplikacija</w:t>
+        <w:t>. Web aplikacija</w:t>
+      </w:r>
+      <w:bookmarkEnd w:id="17"/>
+    </w:p>
+    <w:p>
+      <w:pPr>
+        <w:pStyle w:val="Heading3"/>
+      </w:pPr>
+      <w:bookmarkStart w:id="18" w:name="_Toc224141974"/>
+      <w:r>
+        <w:t>Dizajn aplikacije</w:t>
       </w:r>
       <w:bookmarkEnd w:id="18"/>
     </w:p>
     <w:p>
       <w:pPr>
+        <w:rPr>
+          <w:lang w:val="bs-Latn-BA" w:eastAsia="bs-Latn-BA"/>
+        </w:rPr>
+      </w:pPr>
+    </w:p>
+    <w:p>
+      <w:pPr>
         <w:pStyle w:val="Heading3"/>
       </w:pPr>
-      <w:bookmarkStart w:id="19" w:name="_Toc223859604"/>
-      <w:r>
-        <w:t>Dizajn aplikacije</w:t>
+      <w:bookmarkStart w:id="19" w:name="_Toc224141975"/>
+      <w:r>
+        <w:t>Funkcionalnost aplikacije</w:t>
       </w:r>
       <w:bookmarkEnd w:id="19"/>
-    </w:p>
-    <w:p>
-      <w:pPr>
-        <w:rPr>
-          <w:lang w:val="bs-Latn-BA" w:eastAsia="bs-Latn-BA"/>
-        </w:rPr>
-      </w:pPr>
-    </w:p>
-    <w:p>
-      <w:pPr>
-        <w:pStyle w:val="Heading3"/>
-      </w:pPr>
-      <w:bookmarkStart w:id="20" w:name="_Toc223859605"/>
-      <w:r>
-        <w:t>Funkcionalnost aplikacije</w:t>
-      </w:r>
-      <w:bookmarkEnd w:id="20"/>
     </w:p>
     <w:p>
       <w:pPr>
@@ -8157,14 +6822,19 @@
         </w:rPr>
       </w:pPr>
       <w:r>
+        <w:rPr>
+          <w:lang w:val="bs-Latn-BA"/>
+        </w:rPr>
         <w:br w:type="page"/>
       </w:r>
+      <w:bookmarkStart w:id="20" w:name="_GoBack"/>
+      <w:bookmarkEnd w:id="20"/>
     </w:p>
     <w:p>
       <w:pPr>
         <w:pStyle w:val="Heading2"/>
       </w:pPr>
-      <w:bookmarkStart w:id="21" w:name="_Toc223859606"/>
+      <w:bookmarkStart w:id="21" w:name="_Toc224141976"/>
       <w:r>
         <w:lastRenderedPageBreak/>
         <w:t>5</w:t>
@@ -8173,14 +6843,10 @@
         <w:t>.3</w:t>
       </w:r>
       <w:r>
-        <w:t xml:space="preserve">. </w:t>
-      </w:r>
-      <w:r>
-        <w:t>.ino rješenje</w:t>
+        <w:t>. .ino rješenje</w:t>
       </w:r>
       <w:bookmarkEnd w:id="21"/>
     </w:p>
-    <w:p/>
     <w:p>
       <w:pPr>
         <w:rPr>
@@ -8188,7 +6854,20 @@
         </w:rPr>
       </w:pPr>
     </w:p>
-    <w:p/>
+    <w:p>
+      <w:pPr>
+        <w:rPr>
+          <w:lang w:val="bs-Latn-BA"/>
+        </w:rPr>
+      </w:pPr>
+    </w:p>
+    <w:p>
+      <w:pPr>
+        <w:rPr>
+          <w:lang w:val="bs-Latn-BA"/>
+        </w:rPr>
+      </w:pPr>
+    </w:p>
     <w:p>
       <w:pPr>
         <w:pStyle w:val="Heading1"/>
@@ -8197,7 +6876,7 @@
         <w:br w:type="page"/>
       </w:r>
       <w:bookmarkStart w:id="22" w:name="_Toc247374830"/>
-      <w:bookmarkStart w:id="23" w:name="_Toc223859607"/>
+      <w:bookmarkStart w:id="23" w:name="_Toc224141977"/>
       <w:r>
         <w:lastRenderedPageBreak/>
         <w:t>6</w:t>
@@ -8223,94 +6902,25 @@
     </w:p>
     <w:p>
       <w:pPr>
-        <w:spacing w:after="120"/>
-        <w:ind w:firstLine="709"/>
-        <w:rPr>
-          <w:lang w:val="hr-HR"/>
-        </w:rPr>
-      </w:pPr>
-      <w:r>
-        <w:rPr>
-          <w:lang w:val="hr-HR"/>
-        </w:rPr>
-        <w:t>U ovom dijelu iznjeti zaključak o radu...</w:t>
-      </w:r>
-    </w:p>
-    <w:p>
-      <w:pPr>
-        <w:autoSpaceDE w:val="0"/>
-        <w:autoSpaceDN w:val="0"/>
-        <w:adjustRightInd w:val="0"/>
-        <w:spacing w:after="120"/>
-        <w:ind w:firstLine="709"/>
-        <w:jc w:val="both"/>
-        <w:rPr>
-          <w:lang w:val="hr-HR"/>
-        </w:rPr>
-      </w:pPr>
-      <w:r>
-        <w:rPr>
-          <w:lang w:val="hr-HR"/>
-        </w:rPr>
-        <w:t xml:space="preserve">Zaključak je završni dio rada. U njega se </w:t>
-      </w:r>
-      <w:r>
-        <w:rPr>
-          <w:b/>
-          <w:bCs/>
-          <w:lang w:val="hr-HR"/>
-        </w:rPr>
-        <w:t xml:space="preserve">ne </w:t>
-      </w:r>
-      <w:r>
-        <w:rPr>
-          <w:lang w:val="hr-HR"/>
-        </w:rPr>
-        <w:t>unose novi podaci ili novi materijal. Zaključak može biti stranica, najviše dvije stranice teksta, gdje se naglašavaju se samo najvažniji rezultati i praktični značaj rada. Po pravilu zaključak ne sadrži tabele, ilustracije i citate.</w:t>
-      </w:r>
-    </w:p>
-    <w:p>
-      <w:pPr>
-        <w:autoSpaceDE w:val="0"/>
-        <w:autoSpaceDN w:val="0"/>
-        <w:adjustRightInd w:val="0"/>
-        <w:spacing w:after="120"/>
-        <w:ind w:firstLine="709"/>
-        <w:jc w:val="both"/>
-        <w:rPr>
-          <w:lang w:val="hr-HR"/>
-        </w:rPr>
-      </w:pPr>
-      <w:r>
-        <w:rPr>
-          <w:lang w:val="hr-HR"/>
-        </w:rPr>
-        <w:t>Zaključak sadrži objektivnu ocjenu završnog rada i povezuje je s problemom postavljenim na početku teksta. Predložena su takoder moguća daljnja poboljšanja, odnosno modifikacije.</w:t>
-      </w:r>
-    </w:p>
-    <w:p>
-      <w:pPr>
-        <w:ind w:firstLine="709"/>
-        <w:rPr>
-          <w:lang w:val="hr-HR"/>
-        </w:rPr>
-      </w:pPr>
-    </w:p>
-    <w:p>
-      <w:pPr>
-        <w:pStyle w:val="Heading1"/>
-        <w:rPr>
-          <w:lang w:val="hr-HR"/>
-        </w:rPr>
-      </w:pPr>
-      <w:r>
-        <w:rPr>
-          <w:lang w:val="hr-HR"/>
+        <w:rPr>
+          <w:lang w:val="hr-HR"/>
+        </w:rPr>
+      </w:pPr>
+    </w:p>
+    <w:p>
+      <w:pPr>
+        <w:rPr>
+          <w:lang w:val="hr-HR"/>
+        </w:rPr>
+      </w:pPr>
+      <w:r>
+        <w:rPr>
+          <w:lang w:val="hr-HR" w:eastAsia="bs-Latn-BA"/>
         </w:rPr>
         <w:br w:type="page"/>
       </w:r>
       <w:bookmarkStart w:id="24" w:name="_Toc247374831"/>
-      <w:bookmarkStart w:id="25" w:name="_Toc223859608"/>
+      <w:bookmarkStart w:id="25" w:name="_Toc224141978"/>
       <w:r>
         <w:rPr>
           <w:lang w:val="hr-HR"/>
@@ -9064,7 +7674,7 @@
           </mc:Choice>
           <mc:Fallback>
             <w:pict>
-              <v:shapetype w14:anchorId="607283DE" id="_x0000_t32" coordsize="21600,21600" o:spt="32" o:oned="t" path="m,l21600,21600e" filled="f">
+              <v:shapetype w14:anchorId="566AA1C0" id="_x0000_t32" coordsize="21600,21600" o:spt="32" o:oned="t" path="m,l21600,21600e" filled="f">
                 <v:path arrowok="t" fillok="f" o:connecttype="none"/>
                 <o:lock v:ext="edit" shapetype="t"/>
               </v:shapetype>
@@ -9160,7 +7770,7 @@
           </mc:Choice>
           <mc:Fallback>
             <w:pict>
-              <v:shape w14:anchorId="4899CCBF" id="Straight Arrow Connector 8" o:spid="_x0000_s1026" type="#_x0000_t32" style="position:absolute;margin-left:-.95pt;margin-top:64.95pt;width:454.7pt;height:0;z-index:251657216;visibility:visible;mso-wrap-style:square;mso-width-percent:0;mso-height-percent:0;mso-wrap-distance-left:9pt;mso-wrap-distance-top:-3e-5mm;mso-wrap-distance-right:9pt;mso-wrap-distance-bottom:-3e-5mm;mso-position-horizontal:absolute;mso-position-horizontal-relative:text;mso-position-vertical:absolute;mso-position-vertical-relative:text;mso-width-percent:0;mso-height-percent:0;mso-width-relative:page;mso-height-relative:page" o:gfxdata="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"/>
+              <v:shape w14:anchorId="0C4082C5" id="Straight Arrow Connector 8" o:spid="_x0000_s1026" type="#_x0000_t32" style="position:absolute;margin-left:-.95pt;margin-top:64.95pt;width:454.7pt;height:0;z-index:251657216;visibility:visible;mso-wrap-style:square;mso-width-percent:0;mso-height-percent:0;mso-wrap-distance-left:9pt;mso-wrap-distance-top:-3e-5mm;mso-wrap-distance-right:9pt;mso-wrap-distance-bottom:-3e-5mm;mso-position-horizontal:absolute;mso-position-horizontal-relative:text;mso-position-vertical:absolute;mso-position-vertical-relative:text;mso-width-percent:0;mso-height-percent:0;mso-width-relative:page;mso-height-relative:page" o:gfxdata="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"/>
             </w:pict>
           </mc:Fallback>
         </mc:AlternateContent>
@@ -9234,7 +7844,7 @@
           </mc:Choice>
           <mc:Fallback>
             <w:pict>
-              <v:shape w14:anchorId="5CC948A9" id="Straight Arrow Connector 7" o:spid="_x0000_s1026" type="#_x0000_t32" style="position:absolute;margin-left:-.95pt;margin-top:46.2pt;width:454.7pt;height:0;z-index:251656192;visibility:visible;mso-wrap-style:square;mso-width-percent:0;mso-height-percent:0;mso-wrap-distance-left:9pt;mso-wrap-distance-top:-3e-5mm;mso-wrap-distance-right:9pt;mso-wrap-distance-bottom:-3e-5mm;mso-position-horizontal:absolute;mso-position-horizontal-relative:text;mso-position-vertical:absolute;mso-position-vertical-relative:text;mso-width-percent:0;mso-height-percent:0;mso-width-relative:page;mso-height-relative:page" o:gfxdata="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"/>
+              <v:shape w14:anchorId="3125C688" id="Straight Arrow Connector 7" o:spid="_x0000_s1026" type="#_x0000_t32" style="position:absolute;margin-left:-.95pt;margin-top:46.2pt;width:454.7pt;height:0;z-index:251656192;visibility:visible;mso-wrap-style:square;mso-width-percent:0;mso-height-percent:0;mso-wrap-distance-left:9pt;mso-wrap-distance-top:-3e-5mm;mso-wrap-distance-right:9pt;mso-wrap-distance-bottom:-3e-5mm;mso-position-horizontal:absolute;mso-position-horizontal-relative:text;mso-position-vertical:absolute;mso-position-vertical-relative:text;mso-width-percent:0;mso-height-percent:0;mso-width-relative:page;mso-height-relative:page" o:gfxdata="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"/>
             </w:pict>
           </mc:Fallback>
         </mc:AlternateContent>
@@ -9308,7 +7918,7 @@
           </mc:Choice>
           <mc:Fallback>
             <w:pict>
-              <v:shape w14:anchorId="5F42B6D1" id="Straight Arrow Connector 6" o:spid="_x0000_s1026" type="#_x0000_t32" style="position:absolute;margin-left:-.95pt;margin-top:27.45pt;width:454.7pt;height:0;z-index:251655168;visibility:visible;mso-wrap-style:square;mso-width-percent:0;mso-height-percent:0;mso-wrap-distance-left:9pt;mso-wrap-distance-top:-3e-5mm;mso-wrap-distance-right:9pt;mso-wrap-distance-bottom:-3e-5mm;mso-position-horizontal:absolute;mso-position-horizontal-relative:text;mso-position-vertical:absolute;mso-position-vertical-relative:text;mso-width-percent:0;mso-height-percent:0;mso-width-relative:page;mso-height-relative:page" o:gfxdata="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"/>
+              <v:shape w14:anchorId="3EA68A0E" id="Straight Arrow Connector 6" o:spid="_x0000_s1026" type="#_x0000_t32" style="position:absolute;margin-left:-.95pt;margin-top:27.45pt;width:454.7pt;height:0;z-index:251655168;visibility:visible;mso-wrap-style:square;mso-width-percent:0;mso-height-percent:0;mso-wrap-distance-left:9pt;mso-wrap-distance-top:-3e-5mm;mso-wrap-distance-right:9pt;mso-wrap-distance-bottom:-3e-5mm;mso-position-horizontal:absolute;mso-position-horizontal-relative:text;mso-position-vertical:absolute;mso-position-vertical-relative:text;mso-width-percent:0;mso-height-percent:0;mso-width-relative:page;mso-height-relative:page" o:gfxdata="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"/>
             </w:pict>
           </mc:Fallback>
         </mc:AlternateContent>
@@ -9382,7 +7992,7 @@
           </mc:Choice>
           <mc:Fallback>
             <w:pict>
-              <v:shape w14:anchorId="0B7C4CA6" id="Straight Arrow Connector 5" o:spid="_x0000_s1026" type="#_x0000_t32" style="position:absolute;margin-left:-.95pt;margin-top:9.45pt;width:454.7pt;height:0;z-index:251654144;visibility:visible;mso-wrap-style:square;mso-width-percent:0;mso-height-percent:0;mso-wrap-distance-left:9pt;mso-wrap-distance-top:-3e-5mm;mso-wrap-distance-right:9pt;mso-wrap-distance-bottom:-3e-5mm;mso-position-horizontal:absolute;mso-position-horizontal-relative:text;mso-position-vertical:absolute;mso-position-vertical-relative:text;mso-width-percent:0;mso-height-percent:0;mso-width-relative:page;mso-height-relative:page" o:gfxdata="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"/>
+              <v:shape w14:anchorId="24CB96C0" id="Straight Arrow Connector 5" o:spid="_x0000_s1026" type="#_x0000_t32" style="position:absolute;margin-left:-.95pt;margin-top:9.45pt;width:454.7pt;height:0;z-index:251654144;visibility:visible;mso-wrap-style:square;mso-width-percent:0;mso-height-percent:0;mso-wrap-distance-left:9pt;mso-wrap-distance-top:-3e-5mm;mso-wrap-distance-right:9pt;mso-wrap-distance-bottom:-3e-5mm;mso-position-horizontal:absolute;mso-position-horizontal-relative:text;mso-position-vertical:absolute;mso-position-vertical-relative:text;mso-width-percent:0;mso-height-percent:0;mso-width-relative:page;mso-height-relative:page" o:gfxdata="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"/>
             </w:pict>
           </mc:Fallback>
         </mc:AlternateContent>
@@ -9543,6 +8153,119 @@
 <file path=word/numbering.xml><?xml version="1.0" encoding="utf-8"?>
 <w:numbering xmlns:wpc="http://schemas.microsoft.com/office/word/2010/wordprocessingCanvas" xmlns:cx="http://schemas.microsoft.com/office/drawing/2014/chartex" xmlns:mc="http://schemas.openxmlformats.org/markup-compatibility/2006" xmlns:o="urn:schemas-microsoft-com:office:office" xmlns:r="http://schemas.openxmlformats.org/officeDocument/2006/relationships" xmlns:m="http://schemas.openxmlformats.org/officeDocument/2006/math" xmlns:v="urn:schemas-microsoft-com:vml" xmlns:wp14="http://schemas.microsoft.com/office/word/2010/wordprocessingDrawing" xmlns:wp="http://schemas.openxmlformats.org/drawingml/2006/wordprocessingDrawing" xmlns:w10="urn:schemas-microsoft-com:office:word" xmlns:w="http://schemas.openxmlformats.org/wordprocessingml/2006/main" xmlns:w14="http://schemas.microsoft.com/office/word/2010/wordml" xmlns:w15="http://schemas.microsoft.com/office/word/2012/wordml" xmlns:w16se="http://schemas.microsoft.com/office/word/2015/wordml/symex" xmlns:wpg="http://schemas.microsoft.com/office/word/2010/wordprocessingGroup" xmlns:wpi="http://schemas.microsoft.com/office/word/2010/wordprocessingInk" xmlns:wne="http://schemas.microsoft.com/office/word/2006/wordml" xmlns:wps="http://schemas.microsoft.com/office/word/2010/wordprocessingShape" mc:Ignorable="w14 w15 w16se wp14">
   <w:abstractNum w:abstractNumId="0" w15:restartNumberingAfterBreak="0">
+    <w:nsid w:val="16DA56AE"/>
+    <w:multiLevelType w:val="hybridMultilevel"/>
+    <w:tmpl w:val="29C26BFC"/>
+    <w:lvl w:ilvl="0" w:tplc="08090001">
+      <w:start w:val="1"/>
+      <w:numFmt w:val="bullet"/>
+      <w:lvlText w:val=""/>
+      <w:lvlJc w:val="left"/>
+      <w:pPr>
+        <w:ind w:left="720" w:hanging="360"/>
+      </w:pPr>
+      <w:rPr>
+        <w:rFonts w:ascii="Symbol" w:hAnsi="Symbol" w:hint="default"/>
+      </w:rPr>
+    </w:lvl>
+    <w:lvl w:ilvl="1" w:tplc="08090003" w:tentative="1">
+      <w:start w:val="1"/>
+      <w:numFmt w:val="bullet"/>
+      <w:lvlText w:val="o"/>
+      <w:lvlJc w:val="left"/>
+      <w:pPr>
+        <w:ind w:left="1440" w:hanging="360"/>
+      </w:pPr>
+      <w:rPr>
+        <w:rFonts w:ascii="Courier New" w:hAnsi="Courier New" w:cs="Courier New" w:hint="default"/>
+      </w:rPr>
+    </w:lvl>
+    <w:lvl w:ilvl="2" w:tplc="08090005" w:tentative="1">
+      <w:start w:val="1"/>
+      <w:numFmt w:val="bullet"/>
+      <w:lvlText w:val=""/>
+      <w:lvlJc w:val="left"/>
+      <w:pPr>
+        <w:ind w:left="2160" w:hanging="360"/>
+      </w:pPr>
+      <w:rPr>
+        <w:rFonts w:ascii="Wingdings" w:hAnsi="Wingdings" w:hint="default"/>
+      </w:rPr>
+    </w:lvl>
+    <w:lvl w:ilvl="3" w:tplc="08090001" w:tentative="1">
+      <w:start w:val="1"/>
+      <w:numFmt w:val="bullet"/>
+      <w:lvlText w:val=""/>
+      <w:lvlJc w:val="left"/>
+      <w:pPr>
+        <w:ind w:left="2880" w:hanging="360"/>
+      </w:pPr>
+      <w:rPr>
+        <w:rFonts w:ascii="Symbol" w:hAnsi="Symbol" w:hint="default"/>
+      </w:rPr>
+    </w:lvl>
+    <w:lvl w:ilvl="4" w:tplc="08090003" w:tentative="1">
+      <w:start w:val="1"/>
+      <w:numFmt w:val="bullet"/>
+      <w:lvlText w:val="o"/>
+      <w:lvlJc w:val="left"/>
+      <w:pPr>
+        <w:ind w:left="3600" w:hanging="360"/>
+      </w:pPr>
+      <w:rPr>
+        <w:rFonts w:ascii="Courier New" w:hAnsi="Courier New" w:cs="Courier New" w:hint="default"/>
+      </w:rPr>
+    </w:lvl>
+    <w:lvl w:ilvl="5" w:tplc="08090005" w:tentative="1">
+      <w:start w:val="1"/>
+      <w:numFmt w:val="bullet"/>
+      <w:lvlText w:val=""/>
+      <w:lvlJc w:val="left"/>
+      <w:pPr>
+        <w:ind w:left="4320" w:hanging="360"/>
+      </w:pPr>
+      <w:rPr>
+        <w:rFonts w:ascii="Wingdings" w:hAnsi="Wingdings" w:hint="default"/>
+      </w:rPr>
+    </w:lvl>
+    <w:lvl w:ilvl="6" w:tplc="08090001" w:tentative="1">
+      <w:start w:val="1"/>
+      <w:numFmt w:val="bullet"/>
+      <w:lvlText w:val=""/>
+      <w:lvlJc w:val="left"/>
+      <w:pPr>
+        <w:ind w:left="5040" w:hanging="360"/>
+      </w:pPr>
+      <w:rPr>
+        <w:rFonts w:ascii="Symbol" w:hAnsi="Symbol" w:hint="default"/>
+      </w:rPr>
+    </w:lvl>
+    <w:lvl w:ilvl="7" w:tplc="08090003" w:tentative="1">
+      <w:start w:val="1"/>
+      <w:numFmt w:val="bullet"/>
+      <w:lvlText w:val="o"/>
+      <w:lvlJc w:val="left"/>
+      <w:pPr>
+        <w:ind w:left="5760" w:hanging="360"/>
+      </w:pPr>
+      <w:rPr>
+        <w:rFonts w:ascii="Courier New" w:hAnsi="Courier New" w:cs="Courier New" w:hint="default"/>
+      </w:rPr>
+    </w:lvl>
+    <w:lvl w:ilvl="8" w:tplc="08090005" w:tentative="1">
+      <w:start w:val="1"/>
+      <w:numFmt w:val="bullet"/>
+      <w:lvlText w:val=""/>
+      <w:lvlJc w:val="left"/>
+      <w:pPr>
+        <w:ind w:left="6480" w:hanging="360"/>
+      </w:pPr>
+      <w:rPr>
+        <w:rFonts w:ascii="Wingdings" w:hAnsi="Wingdings" w:hint="default"/>
+      </w:rPr>
+    </w:lvl>
+  </w:abstractNum>
+  <w:abstractNum w:abstractNumId="1" w15:restartNumberingAfterBreak="0">
     <w:nsid w:val="19C12DD2"/>
     <w:multiLevelType w:val="hybridMultilevel"/>
     <w:tmpl w:val="3CDC15AC"/>
@@ -9655,7 +8378,7 @@
       </w:rPr>
     </w:lvl>
   </w:abstractNum>
-  <w:abstractNum w:abstractNumId="1" w15:restartNumberingAfterBreak="0">
+  <w:abstractNum w:abstractNumId="2" w15:restartNumberingAfterBreak="0">
     <w:nsid w:val="1A782087"/>
     <w:multiLevelType w:val="hybridMultilevel"/>
     <w:tmpl w:val="0B4A7664"/>
@@ -9768,7 +8491,7 @@
       </w:rPr>
     </w:lvl>
   </w:abstractNum>
-  <w:abstractNum w:abstractNumId="2" w15:restartNumberingAfterBreak="0">
+  <w:abstractNum w:abstractNumId="3" w15:restartNumberingAfterBreak="0">
     <w:nsid w:val="282C487B"/>
     <w:multiLevelType w:val="hybridMultilevel"/>
     <w:tmpl w:val="D18C91DA"/>
@@ -9908,7 +8631,7 @@
       </w:rPr>
     </w:lvl>
   </w:abstractNum>
-  <w:abstractNum w:abstractNumId="3" w15:restartNumberingAfterBreak="0">
+  <w:abstractNum w:abstractNumId="4" w15:restartNumberingAfterBreak="0">
     <w:nsid w:val="386D7FB0"/>
     <w:multiLevelType w:val="hybridMultilevel"/>
     <w:tmpl w:val="A6A802C2"/>
@@ -10021,7 +8744,7 @@
       </w:rPr>
     </w:lvl>
   </w:abstractNum>
-  <w:abstractNum w:abstractNumId="4" w15:restartNumberingAfterBreak="0">
+  <w:abstractNum w:abstractNumId="5" w15:restartNumberingAfterBreak="0">
     <w:nsid w:val="43067BD4"/>
     <w:multiLevelType w:val="hybridMultilevel"/>
     <w:tmpl w:val="7BB8C598"/>
@@ -10161,7 +8884,7 @@
       </w:rPr>
     </w:lvl>
   </w:abstractNum>
-  <w:abstractNum w:abstractNumId="5" w15:restartNumberingAfterBreak="0">
+  <w:abstractNum w:abstractNumId="6" w15:restartNumberingAfterBreak="0">
     <w:nsid w:val="4CA34940"/>
     <w:multiLevelType w:val="hybridMultilevel"/>
     <w:tmpl w:val="9E547AC4"/>
@@ -10301,7 +9024,7 @@
       </w:rPr>
     </w:lvl>
   </w:abstractNum>
-  <w:abstractNum w:abstractNumId="6" w15:restartNumberingAfterBreak="0">
+  <w:abstractNum w:abstractNumId="7" w15:restartNumberingAfterBreak="0">
     <w:nsid w:val="4D614E43"/>
     <w:multiLevelType w:val="hybridMultilevel"/>
     <w:tmpl w:val="5DF27BB0"/>
@@ -10441,7 +9164,7 @@
       </w:rPr>
     </w:lvl>
   </w:abstractNum>
-  <w:abstractNum w:abstractNumId="7" w15:restartNumberingAfterBreak="0">
+  <w:abstractNum w:abstractNumId="8" w15:restartNumberingAfterBreak="0">
     <w:nsid w:val="5BBC127A"/>
     <w:multiLevelType w:val="hybridMultilevel"/>
     <w:tmpl w:val="F0AE0908"/>
@@ -10581,7 +9304,7 @@
       </w:rPr>
     </w:lvl>
   </w:abstractNum>
-  <w:abstractNum w:abstractNumId="8" w15:restartNumberingAfterBreak="0">
+  <w:abstractNum w:abstractNumId="9" w15:restartNumberingAfterBreak="0">
     <w:nsid w:val="5E6C1C71"/>
     <w:multiLevelType w:val="hybridMultilevel"/>
     <w:tmpl w:val="A75AC7C0"/>
@@ -10721,7 +9444,7 @@
       </w:rPr>
     </w:lvl>
   </w:abstractNum>
-  <w:abstractNum w:abstractNumId="9" w15:restartNumberingAfterBreak="0">
+  <w:abstractNum w:abstractNumId="10" w15:restartNumberingAfterBreak="0">
     <w:nsid w:val="778A3808"/>
     <w:multiLevelType w:val="hybridMultilevel"/>
     <w:tmpl w:val="6BF02EEA"/>
@@ -10835,33 +9558,36 @@
     </w:lvl>
   </w:abstractNum>
   <w:num w:numId="1">
+    <w:abstractNumId w:val="8"/>
+  </w:num>
+  <w:num w:numId="2">
+    <w:abstractNumId w:val="6"/>
+  </w:num>
+  <w:num w:numId="3">
+    <w:abstractNumId w:val="3"/>
+  </w:num>
+  <w:num w:numId="4">
+    <w:abstractNumId w:val="9"/>
+  </w:num>
+  <w:num w:numId="5">
     <w:abstractNumId w:val="7"/>
   </w:num>
-  <w:num w:numId="2">
+  <w:num w:numId="6">
     <w:abstractNumId w:val="5"/>
   </w:num>
-  <w:num w:numId="3">
+  <w:num w:numId="7">
+    <w:abstractNumId w:val="10"/>
+  </w:num>
+  <w:num w:numId="8">
     <w:abstractNumId w:val="2"/>
   </w:num>
-  <w:num w:numId="4">
-    <w:abstractNumId w:val="8"/>
-  </w:num>
-  <w:num w:numId="5">
-    <w:abstractNumId w:val="6"/>
-  </w:num>
-  <w:num w:numId="6">
+  <w:num w:numId="9">
     <w:abstractNumId w:val="4"/>
   </w:num>
-  <w:num w:numId="7">
-    <w:abstractNumId w:val="9"/>
-  </w:num>
-  <w:num w:numId="8">
+  <w:num w:numId="10">
     <w:abstractNumId w:val="1"/>
   </w:num>
-  <w:num w:numId="9">
-    <w:abstractNumId w:val="3"/>
-  </w:num>
-  <w:num w:numId="10">
+  <w:num w:numId="11">
     <w:abstractNumId w:val="0"/>
   </w:num>
 </w:numbering>
@@ -11992,7 +10718,7 @@
 </file>
 
 <file path=customXml/itemProps1.xml><?xml version="1.0" encoding="utf-8"?>
-<ds:datastoreItem xmlns:ds="http://schemas.openxmlformats.org/officeDocument/2006/customXml" ds:itemID="{1139EC5B-D8D0-443B-BF13-33CED05BF082}">
+<ds:datastoreItem xmlns:ds="http://schemas.openxmlformats.org/officeDocument/2006/customXml" ds:itemID="{20F8E01F-AC82-46C6-86CB-D988C08E6523}">
   <ds:schemaRefs>
     <ds:schemaRef ds:uri="http://schemas.openxmlformats.org/officeDocument/2006/bibliography"/>
   </ds:schemaRefs>

</xml_diff>